<commit_message>
Manage product image when update
</commit_message>
<xml_diff>
--- a/baocao.docx
+++ b/baocao.docx
@@ -843,50 +843,50 @@
       </w:r>
     </w:p>
     <w:p>
+      <w:r>
+        <w:br w:type="page"/>
+      </w:r>
+    </w:p>
+    <w:p>
+      <w:pPr>
+        <w:spacing w:before="120" w:after="120" w:line="360" w:lineRule="auto"/>
+        <w:jc w:val="center"/>
+        <w:rPr>
+          <w:b/>
+        </w:rPr>
+      </w:pPr>
+      <w:r>
+        <w:rPr>
+          <w:b/>
+        </w:rPr>
+        <w:lastRenderedPageBreak/>
+        <w:t>MỤC LỤC</w:t>
+      </w:r>
+    </w:p>
+    <w:p>
+      <w:r>
+        <w:br w:type="page"/>
+      </w:r>
+    </w:p>
+    <w:p>
+      <w:pPr>
+        <w:spacing w:before="120" w:after="120" w:line="360" w:lineRule="auto"/>
+        <w:jc w:val="center"/>
+        <w:rPr>
+          <w:b/>
+        </w:rPr>
+      </w:pPr>
+      <w:r>
+        <w:rPr>
+          <w:b/>
+        </w:rPr>
+        <w:lastRenderedPageBreak/>
+        <w:t>DANH MỤC CHỮ VIẾT TẮT</w:t>
+      </w:r>
+    </w:p>
+    <w:p>
       <w:bookmarkStart w:id="0" w:name="_GoBack"/>
       <w:bookmarkEnd w:id="0"/>
-      <w:r>
-        <w:br w:type="page"/>
-      </w:r>
-    </w:p>
-    <w:p>
-      <w:pPr>
-        <w:spacing w:before="120" w:after="120" w:line="360" w:lineRule="auto"/>
-        <w:jc w:val="center"/>
-        <w:rPr>
-          <w:b/>
-        </w:rPr>
-      </w:pPr>
-      <w:r>
-        <w:rPr>
-          <w:b/>
-        </w:rPr>
-        <w:lastRenderedPageBreak/>
-        <w:t>MỤC LỤC</w:t>
-      </w:r>
-    </w:p>
-    <w:p>
-      <w:r>
-        <w:br w:type="page"/>
-      </w:r>
-    </w:p>
-    <w:p>
-      <w:pPr>
-        <w:spacing w:before="120" w:after="120" w:line="360" w:lineRule="auto"/>
-        <w:jc w:val="center"/>
-        <w:rPr>
-          <w:b/>
-        </w:rPr>
-      </w:pPr>
-      <w:r>
-        <w:rPr>
-          <w:b/>
-        </w:rPr>
-        <w:lastRenderedPageBreak/>
-        <w:t>DANH MỤC CHỮ VIẾT TẮT</w:t>
-      </w:r>
-    </w:p>
-    <w:p>
       <w:r>
         <w:br w:type="page"/>
       </w:r>
@@ -2087,9 +2087,9 @@
     <w:name w:val="Style"/>
     <w:link w:val="StyleChar"/>
     <w:qFormat/>
-    <w:rsid w:val="0065313C"/>
+    <w:rsid w:val="004247E4"/>
     <w:pPr>
-      <w:spacing w:before="120" w:after="120" w:line="360" w:lineRule="auto"/>
+      <w:spacing w:before="120" w:after="120" w:line="240" w:lineRule="auto"/>
     </w:pPr>
     <w:rPr>
       <w:b/>
@@ -2119,7 +2119,7 @@
     <w:name w:val="Style Char"/>
     <w:basedOn w:val="ChuongChar"/>
     <w:link w:val="Style"/>
-    <w:rsid w:val="0065313C"/>
+    <w:rsid w:val="004247E4"/>
     <w:rPr>
       <w:b/>
       <w:color w:val="000000" w:themeColor="text1"/>
@@ -2406,7 +2406,7 @@
 </file>
 
 <file path=customXml/itemProps1.xml><?xml version="1.0" encoding="utf-8"?>
-<ds:datastoreItem xmlns:ds="http://schemas.openxmlformats.org/officeDocument/2006/customXml" ds:itemID="{F965EB4D-3B10-4850-8B75-B59D761EBB5C}">
+<ds:datastoreItem xmlns:ds="http://schemas.openxmlformats.org/officeDocument/2006/customXml" ds:itemID="{8E6F87FF-7608-4968-AFF8-38F4AB3803F2}">
   <ds:schemaRefs>
     <ds:schemaRef ds:uri="http://schemas.openxmlformats.org/officeDocument/2006/bibliography"/>
   </ds:schemaRefs>

</xml_diff>

<commit_message>
Hoan thanh chuong mo dau
</commit_message>
<xml_diff>
--- a/baocao.docx
+++ b/baocao.docx
@@ -1,6 +1,6 @@
 
 <file path=word/document.xml><?xml version="1.0" encoding="utf-8"?>
-<w:document xmlns:wpc="http://schemas.microsoft.com/office/word/2010/wordprocessingCanvas" xmlns:mc="http://schemas.openxmlformats.org/markup-compatibility/2006" xmlns:o="urn:schemas-microsoft-com:office:office" xmlns:r="http://schemas.openxmlformats.org/officeDocument/2006/relationships" xmlns:m="http://schemas.openxmlformats.org/officeDocument/2006/math" xmlns:v="urn:schemas-microsoft-com:vml" xmlns:wp14="http://schemas.microsoft.com/office/word/2010/wordprocessingDrawing" xmlns:wp="http://schemas.openxmlformats.org/drawingml/2006/wordprocessingDrawing" xmlns:w10="urn:schemas-microsoft-com:office:word" xmlns:w="http://schemas.openxmlformats.org/wordprocessingml/2006/main" xmlns:w14="http://schemas.microsoft.com/office/word/2010/wordml" xmlns:w15="http://schemas.microsoft.com/office/word/2012/wordml" xmlns:wpg="http://schemas.microsoft.com/office/word/2010/wordprocessingGroup" xmlns:wpi="http://schemas.microsoft.com/office/word/2010/wordprocessingInk" xmlns:wne="http://schemas.microsoft.com/office/word/2006/wordml" xmlns:wps="http://schemas.microsoft.com/office/word/2010/wordprocessingShape" mc:Ignorable="w14 w15 wp14">
+<w:document xmlns:wpc="http://schemas.microsoft.com/office/word/2010/wordprocessingCanvas" xmlns:cx="http://schemas.microsoft.com/office/drawing/2014/chartex" xmlns:cx1="http://schemas.microsoft.com/office/drawing/2015/9/8/chartex" xmlns:cx2="http://schemas.microsoft.com/office/drawing/2015/10/21/chartex" xmlns:cx3="http://schemas.microsoft.com/office/drawing/2016/5/9/chartex" xmlns:cx4="http://schemas.microsoft.com/office/drawing/2016/5/10/chartex" xmlns:cx5="http://schemas.microsoft.com/office/drawing/2016/5/11/chartex" xmlns:cx6="http://schemas.microsoft.com/office/drawing/2016/5/12/chartex" xmlns:cx7="http://schemas.microsoft.com/office/drawing/2016/5/13/chartex" xmlns:cx8="http://schemas.microsoft.com/office/drawing/2016/5/14/chartex" xmlns:mc="http://schemas.openxmlformats.org/markup-compatibility/2006" xmlns:aink="http://schemas.microsoft.com/office/drawing/2016/ink" xmlns:am3d="http://schemas.microsoft.com/office/drawing/2017/model3d" xmlns:o="urn:schemas-microsoft-com:office:office" xmlns:oel="http://schemas.microsoft.com/office/2019/extlst" xmlns:r="http://schemas.openxmlformats.org/officeDocument/2006/relationships" xmlns:m="http://schemas.openxmlformats.org/officeDocument/2006/math" xmlns:v="urn:schemas-microsoft-com:vml" xmlns:wp14="http://schemas.microsoft.com/office/word/2010/wordprocessingDrawing" xmlns:wp="http://schemas.openxmlformats.org/drawingml/2006/wordprocessingDrawing" xmlns:w10="urn:schemas-microsoft-com:office:word" xmlns:w="http://schemas.openxmlformats.org/wordprocessingml/2006/main" xmlns:w14="http://schemas.microsoft.com/office/word/2010/wordml" xmlns:w15="http://schemas.microsoft.com/office/word/2012/wordml" xmlns:w16cex="http://schemas.microsoft.com/office/word/2018/wordml/cex" xmlns:w16cid="http://schemas.microsoft.com/office/word/2016/wordml/cid" xmlns:w16="http://schemas.microsoft.com/office/word/2018/wordml" xmlns:w16du="http://schemas.microsoft.com/office/word/2023/wordml/word16du" xmlns:w16sdtdh="http://schemas.microsoft.com/office/word/2020/wordml/sdtdatahash" xmlns:w16sdtfl="http://schemas.microsoft.com/office/word/2024/wordml/sdtformatlock" xmlns:w16se="http://schemas.microsoft.com/office/word/2015/wordml/symex" xmlns:wpg="http://schemas.microsoft.com/office/word/2010/wordprocessingGroup" xmlns:wpi="http://schemas.microsoft.com/office/word/2010/wordprocessingInk" xmlns:wne="http://schemas.microsoft.com/office/word/2006/wordml" xmlns:wps="http://schemas.microsoft.com/office/word/2010/wordprocessingShape" mc:Ignorable="w14 w15 w16se w16cid w16 w16cex w16sdtdh w16sdtfl w16du wp14">
   <w:body>
     <w:p>
       <w:pPr>
@@ -60,7 +60,7 @@
                     <pic:cNvPicPr/>
                   </pic:nvPicPr>
                   <pic:blipFill>
-                    <a:blip r:embed="rId7" cstate="print">
+                    <a:blip r:embed="rId8" cstate="print">
                       <a:extLst>
                         <a:ext uri="{28A0092B-C50C-407E-A947-70E740481C1C}">
                           <a14:useLocalDpi xmlns:a14="http://schemas.microsoft.com/office/drawing/2010/main" val="0"/>
@@ -686,8 +686,167 @@
     </w:p>
     <w:p>
       <w:pPr>
-        <w:pStyle w:val="Style"/>
-      </w:pPr>
+        <w:pStyle w:val="VanBan"/>
+        <w:jc w:val="both"/>
+      </w:pPr>
+      <w:r>
+        <w:t>Em</w:t>
+      </w:r>
+      <w:r>
+        <w:t xml:space="preserve"> xin cam đoan đồ án môn học </w:t>
+      </w:r>
+      <w:r>
+        <w:rPr>
+          <w:i/>
+          <w:iCs/>
+        </w:rPr>
+        <w:t>"</w:t>
+      </w:r>
+      <w:r>
+        <w:t>Phát triển ứng dụng Web với mã nguồn mở</w:t>
+      </w:r>
+      <w:r>
+        <w:rPr>
+          <w:i/>
+          <w:iCs/>
+        </w:rPr>
+        <w:t>"</w:t>
+      </w:r>
+      <w:r>
+        <w:t xml:space="preserve"> với đề tài </w:t>
+      </w:r>
+      <w:r>
+        <w:rPr>
+          <w:bCs/>
+        </w:rPr>
+        <w:t>"XÂY DỰNG HỆ THỐNG QUẢN LÝ BÁN HÀNG"</w:t>
+      </w:r>
+      <w:r>
+        <w:t xml:space="preserve"> là </w:t>
+      </w:r>
+      <w:r>
+        <w:t>cả quá</w:t>
+      </w:r>
+      <w:r>
+        <w:t xml:space="preserve"> trình nghiên cứu và thực hiện của cá nhân </w:t>
+      </w:r>
+      <w:r>
+        <w:t>em</w:t>
+      </w:r>
+      <w:r>
+        <w:t xml:space="preserve">, dưới sự hướng dẫn tận tình của giảng viên </w:t>
+      </w:r>
+      <w:r>
+        <w:rPr>
+          <w:bCs/>
+        </w:rPr>
+        <w:t>ThS. Nguyễn Ngọc Đan Thanh</w:t>
+      </w:r>
+      <w:r>
+        <w:t xml:space="preserve">. </w:t>
+      </w:r>
+    </w:p>
+    <w:p>
+      <w:pPr>
+        <w:pStyle w:val="VanBan"/>
+        <w:jc w:val="both"/>
+      </w:pPr>
+      <w:r>
+        <w:t>Em</w:t>
+      </w:r>
+      <w:r>
+        <w:t xml:space="preserve"> xin khẳng định</w:t>
+      </w:r>
+      <w:r>
+        <w:t xml:space="preserve"> </w:t>
+      </w:r>
+      <w:r>
+        <w:t>:</w:t>
+      </w:r>
+    </w:p>
+    <w:p>
+      <w:pPr>
+        <w:pStyle w:val="VanBan"/>
+        <w:numPr>
+          <w:ilvl w:val="0"/>
+          <w:numId w:val="2"/>
+        </w:numPr>
+        <w:jc w:val="both"/>
+      </w:pPr>
+      <w:r>
+        <w:t xml:space="preserve">Các số liệu, kết quả trình bày trong báo cáo đồ án này </w:t>
+      </w:r>
+      <w:r>
+        <w:t>hoàn toàn trong phạm vi kham khảo</w:t>
+      </w:r>
+      <w:r>
+        <w:t xml:space="preserve">, phản ánh đúng quá trình tự tìm hiểu và phát triển ứng dụng của bản thân. </w:t>
+      </w:r>
+    </w:p>
+    <w:p>
+      <w:pPr>
+        <w:pStyle w:val="VanBan"/>
+        <w:numPr>
+          <w:ilvl w:val="0"/>
+          <w:numId w:val="2"/>
+        </w:numPr>
+        <w:jc w:val="both"/>
+      </w:pPr>
+      <w:r>
+        <w:t xml:space="preserve">Tất cả các nguồn tài liệu, công cụ và kiến thức tham khảo được sử dụng trong đồ án đều được trích dẫn và ghi nhận rõ ràng, đầy đủ theo đúng quy định. </w:t>
+      </w:r>
+    </w:p>
+    <w:p>
+      <w:pPr>
+        <w:pStyle w:val="VanBan"/>
+        <w:numPr>
+          <w:ilvl w:val="0"/>
+          <w:numId w:val="2"/>
+        </w:numPr>
+        <w:jc w:val="both"/>
+      </w:pPr>
+      <w:r>
+        <w:t xml:space="preserve">Nội dung báo cáo đồ án này </w:t>
+      </w:r>
+      <w:r>
+        <w:t>có</w:t>
+      </w:r>
+      <w:r>
+        <w:t xml:space="preserve"> sao chép</w:t>
+      </w:r>
+      <w:r>
+        <w:t xml:space="preserve"> chọn lọc</w:t>
+      </w:r>
+      <w:r>
+        <w:t xml:space="preserve"> từ </w:t>
+      </w:r>
+      <w:r>
+        <w:t>nhiều nguồn và không đạo văn</w:t>
+      </w:r>
+      <w:r>
+        <w:t xml:space="preserve">, báo cáo nào khác đã được công bố. </w:t>
+      </w:r>
+    </w:p>
+    <w:p>
+      <w:pPr>
+        <w:pStyle w:val="VanBan"/>
+        <w:jc w:val="both"/>
+      </w:pPr>
+      <w:r>
+        <w:t xml:space="preserve">Nếu vi phạm bất kỳ điều nào nêu trên, </w:t>
+      </w:r>
+      <w:r>
+        <w:t>em</w:t>
+      </w:r>
+      <w:r>
+        <w:t xml:space="preserve"> xin chịu hoàn toàn trách nhiệm trước Bộ môn, Khoa Công nghệ Thông tin và Trường Kỹ thuật và Công nghệ </w:t>
+      </w:r>
+      <w:r>
+        <w:t>-</w:t>
+      </w:r>
+      <w:r>
+        <w:t xml:space="preserve"> Đại học Trà Vinh.</w:t>
+      </w:r>
     </w:p>
     <w:p>
       <w:pPr>
@@ -697,51 +856,6 @@
     <w:p>
       <w:pPr>
         <w:pStyle w:val="NoiDung"/>
-      </w:pPr>
-    </w:p>
-    <w:p>
-      <w:pPr>
-        <w:pStyle w:val="NoiDung"/>
-      </w:pPr>
-    </w:p>
-    <w:p>
-      <w:pPr>
-        <w:pStyle w:val="NoiDung"/>
-      </w:pPr>
-    </w:p>
-    <w:p>
-      <w:pPr>
-        <w:pStyle w:val="NoiDung"/>
-      </w:pPr>
-    </w:p>
-    <w:p>
-      <w:pPr>
-        <w:pStyle w:val="NoiDung"/>
-      </w:pPr>
-    </w:p>
-    <w:p>
-      <w:pPr>
-        <w:pStyle w:val="NoiDung"/>
-      </w:pPr>
-    </w:p>
-    <w:p>
-      <w:pPr>
-        <w:pStyle w:val="NoiDung"/>
-      </w:pPr>
-    </w:p>
-    <w:p>
-      <w:pPr>
-        <w:pStyle w:val="NoiDung"/>
-      </w:pPr>
-    </w:p>
-    <w:p>
-      <w:pPr>
-        <w:pStyle w:val="NoiDung"/>
-      </w:pPr>
-    </w:p>
-    <w:p>
-      <w:pPr>
-        <w:pStyle w:val="TieuMuc"/>
       </w:pPr>
     </w:p>
     <w:p>
@@ -815,11 +929,258 @@
     </w:p>
     <w:p>
       <w:pPr>
-        <w:ind w:left="4395"/>
-      </w:pPr>
-      <w:r>
-        <w:t xml:space="preserve">      </w:t>
-      </w:r>
+        <w:jc w:val="center"/>
+        <w:rPr>
+          <w:b/>
+        </w:rPr>
+      </w:pPr>
+      <w:r>
+        <w:rPr>
+          <w:b/>
+        </w:rPr>
+        <w:lastRenderedPageBreak/>
+        <w:t>LỜI CẢM ƠN</w:t>
+      </w:r>
+    </w:p>
+    <w:p>
+      <w:pPr>
+        <w:pStyle w:val="VanBan"/>
+        <w:jc w:val="both"/>
+      </w:pPr>
+      <w:r>
+        <w:t xml:space="preserve">Lời đầu tiên, em xin gửi lời cảm ơn chân thành và sâu sắc nhất đến Ban Giám hiệu Trường Kỹ thuật và Công nghệ </w:t>
+      </w:r>
+      <w:r>
+        <w:t>-</w:t>
+      </w:r>
+      <w:r>
+        <w:t xml:space="preserve"> Đại</w:t>
+      </w:r>
+      <w:r>
+        <w:t xml:space="preserve"> </w:t>
+      </w:r>
+      <w:r>
+        <w:t xml:space="preserve">học Trà Vinh, cùng quý thầy cô Khoa Công nghệ thông tin đã tạo điều kiện và môi trường học tập tốt nhất cho em trong suốt thời gian qua. </w:t>
+      </w:r>
+    </w:p>
+    <w:p>
+      <w:pPr>
+        <w:pStyle w:val="VanBan"/>
+        <w:jc w:val="both"/>
+      </w:pPr>
+      <w:r>
+        <w:t xml:space="preserve">Đặc biệt, em xin gửi lời </w:t>
+      </w:r>
+      <w:r>
+        <w:t xml:space="preserve">cảm ơn </w:t>
+      </w:r>
+      <w:r>
+        <w:t xml:space="preserve">đến giảng viên hướng dẫn </w:t>
+      </w:r>
+      <w:r>
+        <w:t>-</w:t>
+      </w:r>
+      <w:r>
+        <w:t xml:space="preserve"> </w:t>
+      </w:r>
+      <w:r>
+        <w:t>ThS. Nguyễn Ngọc Đan Thanh</w:t>
+      </w:r>
+      <w:r>
+        <w:t xml:space="preserve">. Cô luôn chỉ bảo, định hướng và giúp đỡ em tháo gỡ những khó khăn trong suốt quá trình nghiên cứu và thực hiện đồ án môn học </w:t>
+      </w:r>
+      <w:r>
+        <w:rPr>
+          <w:i/>
+          <w:iCs/>
+        </w:rPr>
+        <w:t>"</w:t>
+      </w:r>
+      <w:r>
+        <w:t>Phát triển ứng dụng Web với mã nguồn mở</w:t>
+      </w:r>
+      <w:r>
+        <w:rPr>
+          <w:i/>
+          <w:iCs/>
+        </w:rPr>
+        <w:t>"</w:t>
+      </w:r>
+      <w:r>
+        <w:t xml:space="preserve"> với đề tài </w:t>
+      </w:r>
+      <w:r>
+        <w:rPr>
+          <w:b/>
+          <w:bCs/>
+        </w:rPr>
+        <w:t>"</w:t>
+      </w:r>
+      <w:r>
+        <w:t>XÂY DỰNG HỆ THỐNG QUẢN LÝ BÁN HÀNG</w:t>
+      </w:r>
+      <w:r>
+        <w:rPr>
+          <w:b/>
+          <w:bCs/>
+        </w:rPr>
+        <w:t>"</w:t>
+      </w:r>
+      <w:r>
+        <w:t xml:space="preserve">. </w:t>
+      </w:r>
+    </w:p>
+    <w:p>
+      <w:pPr>
+        <w:pStyle w:val="VanBan"/>
+        <w:jc w:val="both"/>
+      </w:pPr>
+      <w:r>
+        <w:t>Trong quá trình thực hiện dự án này, em đã nỗ lực vận dụng các kiến thức được học</w:t>
+      </w:r>
+      <w:r>
+        <w:t xml:space="preserve"> qua các bài tập Hand-On của cô và </w:t>
+      </w:r>
+      <w:r>
+        <w:t>kết hợp với các công nghệ như Docker, SQL Server và PHP để xây dựng hệ thống. Tuy nhiên, do thời gian thực hiện có hạn cũng như kinh nghiệm thực tế của bản thân em còn nhiều thiếu sót, báo cáo đồ án chắc chắn sẽ không tránh khỏi những hạn chế nhất định. Em rất mong nhận được những nhận xét, góp ý quý báu từ quý thầy cô để em có thể hoàn thiện sản phẩm tốt hơn và tích lũy thêm kinh nghiệm cho bản thân trong tương lai.</w:t>
+      </w:r>
+    </w:p>
+    <w:p>
+      <w:pPr>
+        <w:pStyle w:val="VanBan"/>
+        <w:jc w:val="both"/>
+      </w:pPr>
+      <w:r>
+        <w:t>Cuối cùng, em xin chúc quý thầy cô luôn dồi dào sức khỏe, hạnh phúc và gặt hái được nhiều thành công trong sự nghiệp giảng dạy.</w:t>
+      </w:r>
+    </w:p>
+    <w:p>
+      <w:pPr>
+        <w:pStyle w:val="VanBan"/>
+        <w:jc w:val="both"/>
+      </w:pPr>
+      <w:r>
+        <w:t>Em xin chân thành cảm ơn!</w:t>
+      </w:r>
+    </w:p>
+    <w:p>
+      <w:pPr>
+        <w:pStyle w:val="VanBan"/>
+        <w:jc w:val="both"/>
+      </w:pPr>
+    </w:p>
+    <w:p>
+      <w:pPr>
+        <w:pStyle w:val="VanBan"/>
+        <w:jc w:val="both"/>
+      </w:pPr>
+    </w:p>
+    <w:p>
+      <w:pPr>
+        <w:pStyle w:val="VanBan"/>
+        <w:jc w:val="both"/>
+      </w:pPr>
+    </w:p>
+    <w:p>
+      <w:pPr>
+        <w:pStyle w:val="VanBan"/>
+        <w:jc w:val="both"/>
+      </w:pPr>
+    </w:p>
+    <w:p>
+      <w:pPr>
+        <w:pStyle w:val="VanBan"/>
+        <w:jc w:val="both"/>
+      </w:pPr>
+    </w:p>
+    <w:tbl>
+      <w:tblPr>
+        <w:tblStyle w:val="TableGrid"/>
+        <w:tblW w:w="0" w:type="auto"/>
+        <w:tblBorders>
+          <w:top w:val="none" w:sz="0" w:space="0" w:color="auto"/>
+          <w:left w:val="none" w:sz="0" w:space="0" w:color="auto"/>
+          <w:bottom w:val="none" w:sz="0" w:space="0" w:color="auto"/>
+          <w:right w:val="none" w:sz="0" w:space="0" w:color="auto"/>
+          <w:insideH w:val="none" w:sz="0" w:space="0" w:color="auto"/>
+          <w:insideV w:val="none" w:sz="0" w:space="0" w:color="auto"/>
+        </w:tblBorders>
+        <w:tblLook w:val="04A0" w:firstRow="1" w:lastRow="0" w:firstColumn="1" w:lastColumn="0" w:noHBand="0" w:noVBand="1"/>
+      </w:tblPr>
+      <w:tblGrid>
+        <w:gridCol w:w="4389"/>
+        <w:gridCol w:w="4389"/>
+      </w:tblGrid>
+      <w:tr>
+        <w:tc>
+          <w:tcPr>
+            <w:tcW w:w="4389" w:type="dxa"/>
+          </w:tcPr>
+          <w:p>
+            <w:pPr>
+              <w:pStyle w:val="VanBan"/>
+              <w:jc w:val="both"/>
+            </w:pPr>
+          </w:p>
+        </w:tc>
+        <w:tc>
+          <w:tcPr>
+            <w:tcW w:w="4389" w:type="dxa"/>
+          </w:tcPr>
+          <w:p>
+            <w:pPr>
+              <w:pStyle w:val="VanBan"/>
+              <w:jc w:val="both"/>
+            </w:pPr>
+            <w:r>
+              <w:t>Vĩnh Long, ngày….tháng….năm 2026</w:t>
+            </w:r>
+          </w:p>
+          <w:p>
+            <w:pPr>
+              <w:pStyle w:val="VanBan"/>
+              <w:jc w:val="center"/>
+            </w:pPr>
+            <w:r>
+              <w:t>Sinh viên thực hiện</w:t>
+            </w:r>
+          </w:p>
+        </w:tc>
+      </w:tr>
+    </w:tbl>
+    <w:p>
+      <w:pPr>
+        <w:pStyle w:val="VanBan"/>
+        <w:jc w:val="both"/>
+      </w:pPr>
+    </w:p>
+    <w:p>
+      <w:pPr>
+        <w:pStyle w:val="VanBan"/>
+      </w:pPr>
+    </w:p>
+    <w:p>
+      <w:pPr>
+        <w:jc w:val="center"/>
+        <w:rPr>
+          <w:b/>
+        </w:rPr>
+      </w:pPr>
+      <w:r>
+        <w:br w:type="page"/>
+      </w:r>
+      <w:r>
+        <w:rPr>
+          <w:b/>
+        </w:rPr>
+        <w:lastRenderedPageBreak/>
+        <w:t>MỤC LỤC</w:t>
+      </w:r>
+    </w:p>
+    <w:p>
+      <w:pPr>
+        <w:jc w:val="center"/>
+      </w:pPr>
     </w:p>
     <w:p>
       <w:r>
@@ -839,54 +1200,10 @@
           <w:b/>
         </w:rPr>
         <w:lastRenderedPageBreak/>
-        <w:t>LỜI CẢM ƠN</w:t>
-      </w:r>
-    </w:p>
-    <w:p>
-      <w:r>
-        <w:br w:type="page"/>
-      </w:r>
-    </w:p>
-    <w:p>
-      <w:pPr>
-        <w:spacing w:before="120" w:after="120" w:line="360" w:lineRule="auto"/>
-        <w:jc w:val="center"/>
-        <w:rPr>
-          <w:b/>
-        </w:rPr>
-      </w:pPr>
-      <w:r>
-        <w:rPr>
-          <w:b/>
-        </w:rPr>
-        <w:lastRenderedPageBreak/>
-        <w:t>MỤC LỤC</w:t>
-      </w:r>
-    </w:p>
-    <w:p>
-      <w:r>
-        <w:br w:type="page"/>
-      </w:r>
-    </w:p>
-    <w:p>
-      <w:pPr>
-        <w:spacing w:before="120" w:after="120" w:line="360" w:lineRule="auto"/>
-        <w:jc w:val="center"/>
-        <w:rPr>
-          <w:b/>
-        </w:rPr>
-      </w:pPr>
-      <w:r>
-        <w:rPr>
-          <w:b/>
-        </w:rPr>
-        <w:lastRenderedPageBreak/>
         <w:t>DANH MỤC CHỮ VIẾT TẮT</w:t>
       </w:r>
     </w:p>
     <w:p>
-      <w:bookmarkStart w:id="0" w:name="_GoBack"/>
-      <w:bookmarkEnd w:id="0"/>
       <w:r>
         <w:br w:type="page"/>
       </w:r>
@@ -966,6 +1283,8 @@
           <w:b/>
         </w:rPr>
         <w:sectPr>
+          <w:headerReference w:type="default" r:id="rId9"/>
+          <w:footerReference w:type="default" r:id="rId10"/>
           <w:pgSz w:w="11907" w:h="16840" w:code="9"/>
           <w:pgMar w:top="1134" w:right="1134" w:bottom="1134" w:left="1985" w:header="680" w:footer="680" w:gutter="0"/>
           <w:cols w:space="720"/>
@@ -983,7 +1302,6 @@
     <w:p>
       <w:pPr>
         <w:pStyle w:val="Chuong"/>
-        <w:outlineLvl w:val="0"/>
       </w:pPr>
       <w:r>
         <w:lastRenderedPageBreak/>
@@ -992,6 +1310,683 @@
     </w:p>
     <w:p>
       <w:pPr>
+        <w:pStyle w:val="VanBan"/>
+        <w:rPr>
+          <w:b/>
+          <w:bCs/>
+        </w:rPr>
+      </w:pPr>
+      <w:r>
+        <w:rPr>
+          <w:b/>
+          <w:bCs/>
+        </w:rPr>
+        <w:t>1. Lý do chọn đề tài</w:t>
+      </w:r>
+    </w:p>
+    <w:p>
+      <w:pPr>
+        <w:pStyle w:val="VanBan"/>
+        <w:jc w:val="both"/>
+      </w:pPr>
+      <w:r>
+        <w:tab/>
+      </w:r>
+      <w:r>
+        <w:t>Trong kỷ nguyên số hiện nay, việc ứng dụng công nghệ thông tin vào quản lý hoạt động kinh doanh đã trở thành xu hướng tất yếu của các cửa hàng và doanh nghiệp. Một hệ thống quản lý bán hàng hiệu quả giúp tối ưu hóa quy trình kiểm soát sản phẩm, đơn hàng, khách hàng, đồng thời hạn chế tối đa sai sót phát sinh từ công việc quản lý thủ công.</w:t>
+      </w:r>
+    </w:p>
+    <w:p>
+      <w:pPr>
+        <w:pStyle w:val="VanBan"/>
+        <w:jc w:val="both"/>
+      </w:pPr>
+      <w:r>
+        <w:t xml:space="preserve">Song song đó, việc nắm vững quy trình phát triển ứng dụng Web mã nguồn mở kết hợp với quản trị dữ liệu là mục tiêu cốt lõi của môn học </w:t>
+      </w:r>
+      <w:r>
+        <w:rPr>
+          <w:i/>
+          <w:iCs/>
+        </w:rPr>
+        <w:t>"</w:t>
+      </w:r>
+      <w:r>
+        <w:t>Phát triển ứng dụng Web với mã nguồn mở</w:t>
+      </w:r>
+      <w:r>
+        <w:rPr>
+          <w:i/>
+          <w:iCs/>
+        </w:rPr>
+        <w:t>"</w:t>
+      </w:r>
+      <w:r>
+        <w:t>. Xuất phát từ nhu cầu thực tế cùng mong muốn củng cố kiến thức đã được tích lũy qua các bài học và bài tập thực hành, tác giả quyết định lựa chọn đề tài "XÂY DỰNG HỆ THỐNG QUẢN LÝ BÁN HÀNG" làm đồ án môn học.</w:t>
+      </w:r>
+    </w:p>
+    <w:p>
+      <w:pPr>
+        <w:pStyle w:val="VanBan"/>
+        <w:rPr>
+          <w:b/>
+          <w:bCs/>
+        </w:rPr>
+      </w:pPr>
+      <w:r>
+        <w:rPr>
+          <w:b/>
+          <w:bCs/>
+        </w:rPr>
+        <w:t>2. Mục tiêu của đề tài</w:t>
+      </w:r>
+    </w:p>
+    <w:p>
+      <w:pPr>
+        <w:pStyle w:val="VanBan"/>
+        <w:jc w:val="both"/>
+      </w:pPr>
+      <w:r>
+        <w:tab/>
+      </w:r>
+      <w:r>
+        <w:t>Mục tiêu tổng quát</w:t>
+      </w:r>
+      <w:r>
+        <w:t xml:space="preserve"> </w:t>
+      </w:r>
+      <w:r>
+        <w:t>: Xây dựng thành công một ứng dụng Web quản lý bán hàng hoàn chỉnh, đáp ứng được các nghiệp vụ cơ bản như xem</w:t>
+      </w:r>
+      <w:r>
+        <w:t xml:space="preserve">, </w:t>
+      </w:r>
+      <w:r>
+        <w:t>tìm kiếm sản phẩm, quản lý giỏ hàng, đặt hàng và quản lý dữ liệu bán hàng.</w:t>
+      </w:r>
+    </w:p>
+    <w:p>
+      <w:pPr>
+        <w:pStyle w:val="VanBan"/>
+        <w:jc w:val="both"/>
+      </w:pPr>
+      <w:r>
+        <w:t>Mục tiêu cụ thể</w:t>
+      </w:r>
+      <w:r>
+        <w:t xml:space="preserve"> </w:t>
+      </w:r>
+      <w:r>
+        <w:t>:</w:t>
+      </w:r>
+    </w:p>
+    <w:p>
+      <w:pPr>
+        <w:pStyle w:val="VanBan"/>
+        <w:numPr>
+          <w:ilvl w:val="0"/>
+          <w:numId w:val="6"/>
+        </w:numPr>
+        <w:jc w:val="both"/>
+      </w:pPr>
+      <w:r>
+        <w:t>Nghiên cứu công nghệ</w:t>
+      </w:r>
+      <w:r>
+        <w:t xml:space="preserve"> </w:t>
+      </w:r>
+      <w:r>
+        <w:t>: Tìm hiểu và ứng dụng ngôn ngữ kịch bản PHP trong việc xử lý logic ứng dụng, truy vấn dữ liệu và hiển thị giao diện.</w:t>
+      </w:r>
+    </w:p>
+    <w:p>
+      <w:pPr>
+        <w:pStyle w:val="VanBan"/>
+        <w:numPr>
+          <w:ilvl w:val="0"/>
+          <w:numId w:val="6"/>
+        </w:numPr>
+        <w:jc w:val="both"/>
+      </w:pPr>
+      <w:r>
+        <w:t>Quản trị cơ sở dữ liệu</w:t>
+      </w:r>
+      <w:r>
+        <w:t xml:space="preserve"> </w:t>
+      </w:r>
+      <w:r>
+        <w:t>: Thiết kế và triển khai CSDL</w:t>
+      </w:r>
+      <w:r>
+        <w:t xml:space="preserve"> </w:t>
+      </w:r>
+      <w:r>
+        <w:t>trên hệ quản trị cơ sở dữ liệu SQL Server.</w:t>
+      </w:r>
+    </w:p>
+    <w:p>
+      <w:pPr>
+        <w:pStyle w:val="VanBan"/>
+        <w:numPr>
+          <w:ilvl w:val="0"/>
+          <w:numId w:val="6"/>
+        </w:numPr>
+        <w:jc w:val="both"/>
+      </w:pPr>
+      <w:r>
+        <w:t>Chuẩn hóa môi trường</w:t>
+      </w:r>
+      <w:r>
+        <w:t xml:space="preserve"> </w:t>
+      </w:r>
+      <w:r>
+        <w:t>: Sử dụng công nghệ ảo hóa container Docker để đóng gói toàn bộ ứng dụng và CSDL, giúp đảm bảo tính đồng nhất môi trường phát triển và dễ dàng triển khai.</w:t>
+      </w:r>
+    </w:p>
+    <w:p>
+      <w:pPr>
+        <w:pStyle w:val="VanBan"/>
+        <w:numPr>
+          <w:ilvl w:val="0"/>
+          <w:numId w:val="6"/>
+        </w:numPr>
+        <w:jc w:val="both"/>
+      </w:pPr>
+      <w:r>
+        <w:t>Hoàn thiện chức năng</w:t>
+      </w:r>
+      <w:r>
+        <w:t xml:space="preserve"> </w:t>
+      </w:r>
+      <w:r>
+        <w:t>: Thiết kế các chức năng cơ bản cho người dùng (xem sản phẩm, thêm vào giỏ hàng, đặt hàng) và quản trị viên</w:t>
+      </w:r>
+      <w:r>
+        <w:t xml:space="preserve">, </w:t>
+      </w:r>
+      <w:r>
+        <w:t>quản lý danh mục, sản phẩm, đơn hàng.</w:t>
+      </w:r>
+    </w:p>
+    <w:p>
+      <w:pPr>
+        <w:pStyle w:val="VanBan"/>
+        <w:rPr>
+          <w:b/>
+          <w:bCs/>
+        </w:rPr>
+      </w:pPr>
+    </w:p>
+    <w:p>
+      <w:pPr>
+        <w:pStyle w:val="VanBan"/>
+        <w:rPr>
+          <w:b/>
+          <w:bCs/>
+        </w:rPr>
+      </w:pPr>
+    </w:p>
+    <w:p>
+      <w:pPr>
+        <w:pStyle w:val="VanBan"/>
+        <w:rPr>
+          <w:b/>
+          <w:bCs/>
+        </w:rPr>
+      </w:pPr>
+      <w:r>
+        <w:rPr>
+          <w:b/>
+          <w:bCs/>
+        </w:rPr>
+        <w:lastRenderedPageBreak/>
+        <w:t>3. Đối tượng và phạm vi nghiên cứu</w:t>
+      </w:r>
+    </w:p>
+    <w:p>
+      <w:pPr>
+        <w:pStyle w:val="VanBan"/>
+        <w:jc w:val="both"/>
+      </w:pPr>
+      <w:r>
+        <w:t>Đối tượng nghiên cứu</w:t>
+      </w:r>
+      <w:r>
+        <w:t xml:space="preserve"> </w:t>
+      </w:r>
+      <w:r>
+        <w:t>:</w:t>
+      </w:r>
+    </w:p>
+    <w:p>
+      <w:pPr>
+        <w:pStyle w:val="VanBan"/>
+        <w:numPr>
+          <w:ilvl w:val="0"/>
+          <w:numId w:val="7"/>
+        </w:numPr>
+        <w:jc w:val="both"/>
+      </w:pPr>
+      <w:r>
+        <w:t>Quy trình nghiệp vụ bán hàng và quản lý sản phẩm.</w:t>
+      </w:r>
+    </w:p>
+    <w:p>
+      <w:pPr>
+        <w:pStyle w:val="VanBan"/>
+        <w:numPr>
+          <w:ilvl w:val="0"/>
+          <w:numId w:val="7"/>
+        </w:numPr>
+        <w:jc w:val="both"/>
+      </w:pPr>
+      <w:r>
+        <w:t>Môi trường đóng gói ứng dụng Docker.</w:t>
+      </w:r>
+    </w:p>
+    <w:p>
+      <w:pPr>
+        <w:pStyle w:val="VanBan"/>
+        <w:numPr>
+          <w:ilvl w:val="0"/>
+          <w:numId w:val="7"/>
+        </w:numPr>
+        <w:jc w:val="both"/>
+      </w:pPr>
+      <w:r>
+        <w:t>Ngôn ngữ kịch bản phía Server PHP kết hợp giao diện Web (HTML, CSS, JavaScript).</w:t>
+      </w:r>
+    </w:p>
+    <w:p>
+      <w:pPr>
+        <w:pStyle w:val="VanBan"/>
+        <w:numPr>
+          <w:ilvl w:val="0"/>
+          <w:numId w:val="7"/>
+        </w:numPr>
+        <w:jc w:val="both"/>
+      </w:pPr>
+      <w:r>
+        <w:t>Hệ quản trị cơ sở dữ liệu SQL Server.</w:t>
+      </w:r>
+    </w:p>
+    <w:p>
+      <w:pPr>
+        <w:pStyle w:val="VanBan"/>
+        <w:jc w:val="both"/>
+      </w:pPr>
+      <w:r>
+        <w:t>Phạm vi nghiên cứu</w:t>
+      </w:r>
+      <w:r>
+        <w:t xml:space="preserve"> </w:t>
+      </w:r>
+      <w:r>
+        <w:t>:</w:t>
+      </w:r>
+    </w:p>
+    <w:p>
+      <w:pPr>
+        <w:pStyle w:val="VanBan"/>
+        <w:numPr>
+          <w:ilvl w:val="0"/>
+          <w:numId w:val="8"/>
+        </w:numPr>
+        <w:jc w:val="both"/>
+      </w:pPr>
+      <w:r>
+        <w:t>Về nghiệp vụ</w:t>
+      </w:r>
+      <w:r>
+        <w:t xml:space="preserve"> </w:t>
+      </w:r>
+      <w:r>
+        <w:t>: Đồ án tập trung vào các chức năng cốt lõi của hệ thống quản lý bán hàng ở quy mô đồ án môn học.</w:t>
+      </w:r>
+    </w:p>
+    <w:p>
+      <w:pPr>
+        <w:pStyle w:val="VanBan"/>
+        <w:numPr>
+          <w:ilvl w:val="0"/>
+          <w:numId w:val="8"/>
+        </w:numPr>
+        <w:jc w:val="both"/>
+      </w:pPr>
+      <w:r>
+        <w:t>Về kỹ thuật</w:t>
+      </w:r>
+      <w:r>
+        <w:t xml:space="preserve"> </w:t>
+      </w:r>
+      <w:r>
+        <w:t>: Tích hợp trực tiếp các đoạn kịch bản xử lý, mã HTML/CSS/JS và câu lệnh truy vấn SQL Server ngay trong các tệp tin PHP</w:t>
+      </w:r>
+      <w:r>
+        <w:t>,</w:t>
+      </w:r>
+      <w:r>
+        <w:t xml:space="preserve"> đóng gói và vận hành hệ thống thông qua các container Docker.</w:t>
+      </w:r>
+    </w:p>
+    <w:p>
+      <w:pPr>
+        <w:pStyle w:val="VanBan"/>
+        <w:rPr>
+          <w:b/>
+          <w:bCs/>
+        </w:rPr>
+      </w:pPr>
+      <w:r>
+        <w:rPr>
+          <w:b/>
+          <w:bCs/>
+        </w:rPr>
+        <w:t>4. Phương pháp thực hiện</w:t>
+      </w:r>
+    </w:p>
+    <w:p>
+      <w:pPr>
+        <w:pStyle w:val="VanBan"/>
+        <w:jc w:val="both"/>
+      </w:pPr>
+      <w:r>
+        <w:tab/>
+      </w:r>
+      <w:r>
+        <w:t>Phương pháp thu thập và phân tích</w:t>
+      </w:r>
+      <w:r>
+        <w:t xml:space="preserve"> </w:t>
+      </w:r>
+      <w:r>
+        <w:t>: Tìm hiểu các yêu cầu nghiệp vụ quản lý bán hàng thực tế và tham khảo kiến thức hướng dẫn từ giảng viên ThS. Nguyễn Ngọc Đan Thanh.</w:t>
+      </w:r>
+    </w:p>
+    <w:p>
+      <w:pPr>
+        <w:pStyle w:val="VanBan"/>
+        <w:jc w:val="both"/>
+      </w:pPr>
+      <w:r>
+        <w:t>Phương pháp thiết kế và phát triển</w:t>
+      </w:r>
+      <w:r>
+        <w:t xml:space="preserve"> </w:t>
+      </w:r>
+      <w:r>
+        <w:t>:</w:t>
+      </w:r>
+    </w:p>
+    <w:p>
+      <w:pPr>
+        <w:pStyle w:val="VanBan"/>
+        <w:numPr>
+          <w:ilvl w:val="0"/>
+          <w:numId w:val="9"/>
+        </w:numPr>
+        <w:jc w:val="both"/>
+      </w:pPr>
+      <w:r>
+        <w:t>P</w:t>
+      </w:r>
+      <w:r>
+        <w:t>hân tích, thiết kế mô hình dữ liệu ERD và sơ đồ luồng dữ liệu DFD.</w:t>
+      </w:r>
+    </w:p>
+    <w:p>
+      <w:pPr>
+        <w:pStyle w:val="VanBan"/>
+        <w:numPr>
+          <w:ilvl w:val="0"/>
+          <w:numId w:val="9"/>
+        </w:numPr>
+        <w:jc w:val="both"/>
+      </w:pPr>
+      <w:r>
+        <w:t>Viết mã nguồn ứng dụng Web bằng PHP, tích hợp HTML/CSS/JS và truy vấn SQL Server.</w:t>
+      </w:r>
+    </w:p>
+    <w:p>
+      <w:pPr>
+        <w:pStyle w:val="VanBan"/>
+        <w:numPr>
+          <w:ilvl w:val="0"/>
+          <w:numId w:val="9"/>
+        </w:numPr>
+        <w:jc w:val="both"/>
+      </w:pPr>
+      <w:r>
+        <w:t>Đóng gói dịch vụ bằng Dockerfile/Docker Compose.</w:t>
+      </w:r>
+    </w:p>
+    <w:p>
+      <w:pPr>
+        <w:pStyle w:val="VanBan"/>
+        <w:jc w:val="both"/>
+      </w:pPr>
+      <w:r>
+        <w:t>Phương pháp kiểm thử</w:t>
+      </w:r>
+      <w:r>
+        <w:t xml:space="preserve"> </w:t>
+      </w:r>
+      <w:r>
+        <w:t>: Thực hiện kiểm thử chức năng trực tiếp trên môi trường chạy thử nghiệm để phát hiện và sửa lỗi hệ thống.</w:t>
+      </w:r>
+    </w:p>
+    <w:p>
+      <w:pPr>
+        <w:pStyle w:val="VanBan"/>
+        <w:jc w:val="both"/>
+      </w:pPr>
+    </w:p>
+    <w:p>
+      <w:pPr>
+        <w:pStyle w:val="VanBan"/>
+        <w:jc w:val="both"/>
+      </w:pPr>
+    </w:p>
+    <w:p>
+      <w:pPr>
+        <w:pStyle w:val="VanBan"/>
+        <w:jc w:val="both"/>
+      </w:pPr>
+    </w:p>
+    <w:p>
+      <w:pPr>
+        <w:pStyle w:val="VanBan"/>
+        <w:rPr>
+          <w:b/>
+          <w:bCs/>
+        </w:rPr>
+      </w:pPr>
+      <w:r>
+        <w:rPr>
+          <w:b/>
+          <w:bCs/>
+        </w:rPr>
+        <w:lastRenderedPageBreak/>
+        <w:t>5. Cấu trúc của báo cáo</w:t>
+      </w:r>
+    </w:p>
+    <w:p>
+      <w:pPr>
+        <w:pStyle w:val="VanBan"/>
+        <w:jc w:val="both"/>
+      </w:pPr>
+      <w:r>
+        <w:t>Báo cáo đồ án được bố cục gồm các phần chính sau</w:t>
+      </w:r>
+      <w:r>
+        <w:t xml:space="preserve"> </w:t>
+      </w:r>
+      <w:r>
+        <w:t>:</w:t>
+      </w:r>
+    </w:p>
+    <w:p>
+      <w:pPr>
+        <w:pStyle w:val="VanBan"/>
+        <w:numPr>
+          <w:ilvl w:val="0"/>
+          <w:numId w:val="10"/>
+        </w:numPr>
+        <w:jc w:val="both"/>
+      </w:pPr>
+      <w:r>
+        <w:t>CHƯƠNG MỞ ĐẦU</w:t>
+      </w:r>
+      <w:r>
+        <w:t xml:space="preserve"> </w:t>
+      </w:r>
+      <w:r>
+        <w:t xml:space="preserve">: Giới thiệu bối cảnh, mục tiêu, phạm vi và phương pháp thực hiện đề tài. </w:t>
+      </w:r>
+    </w:p>
+    <w:p>
+      <w:pPr>
+        <w:pStyle w:val="VanBan"/>
+        <w:numPr>
+          <w:ilvl w:val="0"/>
+          <w:numId w:val="10"/>
+        </w:numPr>
+        <w:jc w:val="both"/>
+      </w:pPr>
+      <w:r>
+        <w:t>CHƯƠNG 1</w:t>
+      </w:r>
+      <w:r>
+        <w:t xml:space="preserve"> </w:t>
+      </w:r>
+      <w:r>
+        <w:t>: TỔNG QUAN NGHIÊN CỨU</w:t>
+      </w:r>
+      <w:r>
+        <w:t xml:space="preserve"> </w:t>
+      </w:r>
+      <w:r>
+        <w:t xml:space="preserve">: Tổng quan về lĩnh vực quản lý bán hàng và các giải pháp hiện có. </w:t>
+      </w:r>
+    </w:p>
+    <w:p>
+      <w:pPr>
+        <w:pStyle w:val="VanBan"/>
+        <w:numPr>
+          <w:ilvl w:val="0"/>
+          <w:numId w:val="10"/>
+        </w:numPr>
+        <w:jc w:val="both"/>
+      </w:pPr>
+      <w:r>
+        <w:t>CHƯƠNG 2</w:t>
+      </w:r>
+      <w:r>
+        <w:t xml:space="preserve"> </w:t>
+      </w:r>
+      <w:r>
+        <w:t>: CƠ SỞ LÝ THUYẾT</w:t>
+      </w:r>
+      <w:r>
+        <w:t xml:space="preserve"> </w:t>
+      </w:r>
+      <w:r>
+        <w:t xml:space="preserve">: Trình bày tổng quan các công nghệ sử dụng như Docker, PHP và SQL Server. </w:t>
+      </w:r>
+    </w:p>
+    <w:p>
+      <w:pPr>
+        <w:pStyle w:val="VanBan"/>
+        <w:numPr>
+          <w:ilvl w:val="0"/>
+          <w:numId w:val="10"/>
+        </w:numPr>
+        <w:jc w:val="both"/>
+      </w:pPr>
+      <w:r>
+        <w:t>CHƯƠNG 3</w:t>
+      </w:r>
+      <w:r>
+        <w:t xml:space="preserve"> </w:t>
+      </w:r>
+      <w:r>
+        <w:t>: THIẾT KẾ VÀ TRIỂN KHAI HỆ THỐNG</w:t>
+      </w:r>
+      <w:r>
+        <w:t xml:space="preserve"> </w:t>
+      </w:r>
+      <w:r>
+        <w:t xml:space="preserve">: Mô tả bài toán, đặc tả yêu cầu, kiến trúc hệ thống, thiết kế CSDL ERD, thiết kế xử lý DFD và phác thảo giao diện. </w:t>
+      </w:r>
+    </w:p>
+    <w:p>
+      <w:pPr>
+        <w:pStyle w:val="VanBan"/>
+        <w:numPr>
+          <w:ilvl w:val="0"/>
+          <w:numId w:val="10"/>
+        </w:numPr>
+        <w:jc w:val="both"/>
+      </w:pPr>
+      <w:r>
+        <w:t>CHƯƠNG 4</w:t>
+      </w:r>
+      <w:r>
+        <w:t xml:space="preserve"> </w:t>
+      </w:r>
+      <w:r>
+        <w:t>: KẾT QUẢ THỰC HIỆN VÀ KIỂM THỬ</w:t>
+      </w:r>
+      <w:r>
+        <w:t xml:space="preserve"> </w:t>
+      </w:r>
+      <w:r>
+        <w:t xml:space="preserve">: Trình bày kết quả đạt được, hình ảnh giao diện thực tế và kết quả thử nghiệm. </w:t>
+      </w:r>
+    </w:p>
+    <w:p>
+      <w:pPr>
+        <w:pStyle w:val="VanBan"/>
+        <w:numPr>
+          <w:ilvl w:val="0"/>
+          <w:numId w:val="10"/>
+        </w:numPr>
+        <w:jc w:val="both"/>
+      </w:pPr>
+      <w:r>
+        <w:t>CHƯƠNG 5</w:t>
+      </w:r>
+      <w:r>
+        <w:t xml:space="preserve"> </w:t>
+      </w:r>
+      <w:r>
+        <w:t>: KẾT LUẬN VÀ HƯỚNG PHÁT TRIỂN</w:t>
+      </w:r>
+      <w:r>
+        <w:t xml:space="preserve"> </w:t>
+      </w:r>
+      <w:r>
+        <w:t>: Đánh giá ưu</w:t>
+      </w:r>
+      <w:r>
+        <w:t xml:space="preserve"> và </w:t>
+      </w:r>
+      <w:r>
+        <w:t xml:space="preserve">nhược điểm của hệ thống và đề xuất hướng nâng cấp trong tương lai. </w:t>
+      </w:r>
+    </w:p>
+    <w:p>
+      <w:pPr>
+        <w:pStyle w:val="VanBan"/>
+      </w:pPr>
+    </w:p>
+    <w:p>
+      <w:pPr>
+        <w:pStyle w:val="VanBan"/>
+      </w:pPr>
+    </w:p>
+    <w:p>
+      <w:pPr>
         <w:pStyle w:val="Style"/>
       </w:pPr>
       <w:r>
@@ -1001,29 +1996,30 @@
     <w:p>
       <w:pPr>
         <w:pStyle w:val="Chuong"/>
-        <w:outlineLvl w:val="0"/>
       </w:pPr>
       <w:r>
         <w:lastRenderedPageBreak/>
         <w:t>CHƯƠNG 1.</w:t>
       </w:r>
       <w:r>
-        <w:t xml:space="preserve"> TỔNG QUAN NGHIÊN CỨU</w:t>
-      </w:r>
-    </w:p>
-    <w:p>
-      <w:pPr>
-        <w:pStyle w:val="Style"/>
+        <w:t xml:space="preserve"> TỔNG QUAN NGHIÊN CỨ</w:t>
+      </w:r>
+      <w:r>
+        <w:t>U</w:t>
+      </w:r>
+    </w:p>
+    <w:p>
+      <w:pPr>
+        <w:pStyle w:val="VanBan"/>
+      </w:pPr>
+    </w:p>
+    <w:p>
+      <w:pPr>
+        <w:pStyle w:val="Chuong"/>
       </w:pPr>
       <w:r>
         <w:br w:type="page"/>
       </w:r>
-    </w:p>
-    <w:p>
-      <w:pPr>
-        <w:pStyle w:val="Chuong"/>
-        <w:outlineLvl w:val="0"/>
-      </w:pPr>
       <w:r>
         <w:lastRenderedPageBreak/>
         <w:t>CHƯƠNG 2.</w:t>
@@ -1089,7 +2085,6 @@
     <w:p>
       <w:pPr>
         <w:pStyle w:val="Chuong"/>
-        <w:outlineLvl w:val="0"/>
       </w:pPr>
       <w:r>
         <w:lastRenderedPageBreak/>
@@ -1386,7 +2381,6 @@
     <w:p>
       <w:pPr>
         <w:pStyle w:val="Chuong"/>
-        <w:outlineLvl w:val="0"/>
       </w:pPr>
       <w:r>
         <w:lastRenderedPageBreak/>
@@ -1407,7 +2401,6 @@
     <w:p>
       <w:pPr>
         <w:pStyle w:val="Chuong"/>
-        <w:outlineLvl w:val="0"/>
       </w:pPr>
       <w:r>
         <w:lastRenderedPageBreak/>
@@ -1428,7 +2421,6 @@
     <w:p>
       <w:pPr>
         <w:pStyle w:val="Chuong"/>
-        <w:outlineLvl w:val="0"/>
       </w:pPr>
       <w:r>
         <w:lastRenderedPageBreak/>
@@ -1446,7 +2438,6 @@
     <w:p>
       <w:pPr>
         <w:pStyle w:val="Chuong"/>
-        <w:outlineLvl w:val="0"/>
       </w:pPr>
       <w:r>
         <w:lastRenderedPageBreak/>
@@ -1464,7 +2455,7 @@
 </file>
 
 <file path=word/endnotes.xml><?xml version="1.0" encoding="utf-8"?>
-<w:endnotes xmlns:wpc="http://schemas.microsoft.com/office/word/2010/wordprocessingCanvas" xmlns:mc="http://schemas.openxmlformats.org/markup-compatibility/2006" xmlns:o="urn:schemas-microsoft-com:office:office" xmlns:r="http://schemas.openxmlformats.org/officeDocument/2006/relationships" xmlns:m="http://schemas.openxmlformats.org/officeDocument/2006/math" xmlns:v="urn:schemas-microsoft-com:vml" xmlns:wp14="http://schemas.microsoft.com/office/word/2010/wordprocessingDrawing" xmlns:wp="http://schemas.openxmlformats.org/drawingml/2006/wordprocessingDrawing" xmlns:w10="urn:schemas-microsoft-com:office:word" xmlns:w="http://schemas.openxmlformats.org/wordprocessingml/2006/main" xmlns:w14="http://schemas.microsoft.com/office/word/2010/wordml" xmlns:w15="http://schemas.microsoft.com/office/word/2012/wordml" xmlns:wpg="http://schemas.microsoft.com/office/word/2010/wordprocessingGroup" xmlns:wpi="http://schemas.microsoft.com/office/word/2010/wordprocessingInk" xmlns:wne="http://schemas.microsoft.com/office/word/2006/wordml" xmlns:wps="http://schemas.microsoft.com/office/word/2010/wordprocessingShape" mc:Ignorable="w14 w15 wp14">
+<w:endnotes xmlns:wpc="http://schemas.microsoft.com/office/word/2010/wordprocessingCanvas" xmlns:cx="http://schemas.microsoft.com/office/drawing/2014/chartex" xmlns:cx1="http://schemas.microsoft.com/office/drawing/2015/9/8/chartex" xmlns:cx2="http://schemas.microsoft.com/office/drawing/2015/10/21/chartex" xmlns:cx3="http://schemas.microsoft.com/office/drawing/2016/5/9/chartex" xmlns:cx4="http://schemas.microsoft.com/office/drawing/2016/5/10/chartex" xmlns:cx5="http://schemas.microsoft.com/office/drawing/2016/5/11/chartex" xmlns:cx6="http://schemas.microsoft.com/office/drawing/2016/5/12/chartex" xmlns:cx7="http://schemas.microsoft.com/office/drawing/2016/5/13/chartex" xmlns:cx8="http://schemas.microsoft.com/office/drawing/2016/5/14/chartex" xmlns:mc="http://schemas.openxmlformats.org/markup-compatibility/2006" xmlns:aink="http://schemas.microsoft.com/office/drawing/2016/ink" xmlns:am3d="http://schemas.microsoft.com/office/drawing/2017/model3d" xmlns:o="urn:schemas-microsoft-com:office:office" xmlns:oel="http://schemas.microsoft.com/office/2019/extlst" xmlns:r="http://schemas.openxmlformats.org/officeDocument/2006/relationships" xmlns:m="http://schemas.openxmlformats.org/officeDocument/2006/math" xmlns:v="urn:schemas-microsoft-com:vml" xmlns:wp14="http://schemas.microsoft.com/office/word/2010/wordprocessingDrawing" xmlns:wp="http://schemas.openxmlformats.org/drawingml/2006/wordprocessingDrawing" xmlns:w10="urn:schemas-microsoft-com:office:word" xmlns:w="http://schemas.openxmlformats.org/wordprocessingml/2006/main" xmlns:w14="http://schemas.microsoft.com/office/word/2010/wordml" xmlns:w15="http://schemas.microsoft.com/office/word/2012/wordml" xmlns:w16cex="http://schemas.microsoft.com/office/word/2018/wordml/cex" xmlns:w16cid="http://schemas.microsoft.com/office/word/2016/wordml/cid" xmlns:w16="http://schemas.microsoft.com/office/word/2018/wordml" xmlns:w16du="http://schemas.microsoft.com/office/word/2023/wordml/word16du" xmlns:w16sdtdh="http://schemas.microsoft.com/office/word/2020/wordml/sdtdatahash" xmlns:w16sdtfl="http://schemas.microsoft.com/office/word/2024/wordml/sdtformatlock" xmlns:w16se="http://schemas.microsoft.com/office/word/2015/wordml/symex" xmlns:wpg="http://schemas.microsoft.com/office/word/2010/wordprocessingGroup" xmlns:wpi="http://schemas.microsoft.com/office/word/2010/wordprocessingInk" xmlns:wne="http://schemas.microsoft.com/office/word/2006/wordml" xmlns:wps="http://schemas.microsoft.com/office/word/2010/wordprocessingShape" mc:Ignorable="w14 w15 w16se w16cid w16 w16cex w16sdtdh w16sdtfl w16du wp14">
   <w:endnote w:type="separator" w:id="-1">
     <w:p>
       <w:pPr>
@@ -1488,8 +2479,24 @@
 </w:endnotes>
 </file>
 
+<file path=word/footer1.xml><?xml version="1.0" encoding="utf-8"?>
+<w:ftr xmlns:wpc="http://schemas.microsoft.com/office/word/2010/wordprocessingCanvas" xmlns:cx="http://schemas.microsoft.com/office/drawing/2014/chartex" xmlns:cx1="http://schemas.microsoft.com/office/drawing/2015/9/8/chartex" xmlns:cx2="http://schemas.microsoft.com/office/drawing/2015/10/21/chartex" xmlns:cx3="http://schemas.microsoft.com/office/drawing/2016/5/9/chartex" xmlns:cx4="http://schemas.microsoft.com/office/drawing/2016/5/10/chartex" xmlns:cx5="http://schemas.microsoft.com/office/drawing/2016/5/11/chartex" xmlns:cx6="http://schemas.microsoft.com/office/drawing/2016/5/12/chartex" xmlns:cx7="http://schemas.microsoft.com/office/drawing/2016/5/13/chartex" xmlns:cx8="http://schemas.microsoft.com/office/drawing/2016/5/14/chartex" xmlns:mc="http://schemas.openxmlformats.org/markup-compatibility/2006" xmlns:aink="http://schemas.microsoft.com/office/drawing/2016/ink" xmlns:am3d="http://schemas.microsoft.com/office/drawing/2017/model3d" xmlns:o="urn:schemas-microsoft-com:office:office" xmlns:oel="http://schemas.microsoft.com/office/2019/extlst" xmlns:r="http://schemas.openxmlformats.org/officeDocument/2006/relationships" xmlns:m="http://schemas.openxmlformats.org/officeDocument/2006/math" xmlns:v="urn:schemas-microsoft-com:vml" xmlns:wp14="http://schemas.microsoft.com/office/word/2010/wordprocessingDrawing" xmlns:wp="http://schemas.openxmlformats.org/drawingml/2006/wordprocessingDrawing" xmlns:w10="urn:schemas-microsoft-com:office:word" xmlns:w="http://schemas.openxmlformats.org/wordprocessingml/2006/main" xmlns:w14="http://schemas.microsoft.com/office/word/2010/wordml" xmlns:w15="http://schemas.microsoft.com/office/word/2012/wordml" xmlns:w16cex="http://schemas.microsoft.com/office/word/2018/wordml/cex" xmlns:w16cid="http://schemas.microsoft.com/office/word/2016/wordml/cid" xmlns:w16="http://schemas.microsoft.com/office/word/2018/wordml" xmlns:w16du="http://schemas.microsoft.com/office/word/2023/wordml/word16du" xmlns:w16sdtdh="http://schemas.microsoft.com/office/word/2020/wordml/sdtdatahash" xmlns:w16sdtfl="http://schemas.microsoft.com/office/word/2024/wordml/sdtformatlock" xmlns:w16se="http://schemas.microsoft.com/office/word/2015/wordml/symex" xmlns:wpg="http://schemas.microsoft.com/office/word/2010/wordprocessingGroup" xmlns:wpi="http://schemas.microsoft.com/office/word/2010/wordprocessingInk" xmlns:wne="http://schemas.microsoft.com/office/word/2006/wordml" xmlns:wps="http://schemas.microsoft.com/office/word/2010/wordprocessingShape" mc:Ignorable="w14 w15 w16se w16cid w16 w16cex w16sdtdh w16sdtfl w16du wp14">
+  <w:p>
+    <w:pPr>
+      <w:pStyle w:val="Footer"/>
+      <w:pBdr>
+        <w:bottom w:val="single" w:sz="4" w:space="1" w:color="auto"/>
+      </w:pBdr>
+    </w:pPr>
+    <w:r>
+      <w:t>Trương Quang Khải - DA23TTA</w:t>
+    </w:r>
+  </w:p>
+</w:ftr>
+</file>
+
 <file path=word/footnotes.xml><?xml version="1.0" encoding="utf-8"?>
-<w:footnotes xmlns:wpc="http://schemas.microsoft.com/office/word/2010/wordprocessingCanvas" xmlns:mc="http://schemas.openxmlformats.org/markup-compatibility/2006" xmlns:o="urn:schemas-microsoft-com:office:office" xmlns:r="http://schemas.openxmlformats.org/officeDocument/2006/relationships" xmlns:m="http://schemas.openxmlformats.org/officeDocument/2006/math" xmlns:v="urn:schemas-microsoft-com:vml" xmlns:wp14="http://schemas.microsoft.com/office/word/2010/wordprocessingDrawing" xmlns:wp="http://schemas.openxmlformats.org/drawingml/2006/wordprocessingDrawing" xmlns:w10="urn:schemas-microsoft-com:office:word" xmlns:w="http://schemas.openxmlformats.org/wordprocessingml/2006/main" xmlns:w14="http://schemas.microsoft.com/office/word/2010/wordml" xmlns:w15="http://schemas.microsoft.com/office/word/2012/wordml" xmlns:wpg="http://schemas.microsoft.com/office/word/2010/wordprocessingGroup" xmlns:wpi="http://schemas.microsoft.com/office/word/2010/wordprocessingInk" xmlns:wne="http://schemas.microsoft.com/office/word/2006/wordml" xmlns:wps="http://schemas.microsoft.com/office/word/2010/wordprocessingShape" mc:Ignorable="w14 w15 wp14">
+<w:footnotes xmlns:wpc="http://schemas.microsoft.com/office/word/2010/wordprocessingCanvas" xmlns:cx="http://schemas.microsoft.com/office/drawing/2014/chartex" xmlns:cx1="http://schemas.microsoft.com/office/drawing/2015/9/8/chartex" xmlns:cx2="http://schemas.microsoft.com/office/drawing/2015/10/21/chartex" xmlns:cx3="http://schemas.microsoft.com/office/drawing/2016/5/9/chartex" xmlns:cx4="http://schemas.microsoft.com/office/drawing/2016/5/10/chartex" xmlns:cx5="http://schemas.microsoft.com/office/drawing/2016/5/11/chartex" xmlns:cx6="http://schemas.microsoft.com/office/drawing/2016/5/12/chartex" xmlns:cx7="http://schemas.microsoft.com/office/drawing/2016/5/13/chartex" xmlns:cx8="http://schemas.microsoft.com/office/drawing/2016/5/14/chartex" xmlns:mc="http://schemas.openxmlformats.org/markup-compatibility/2006" xmlns:aink="http://schemas.microsoft.com/office/drawing/2016/ink" xmlns:am3d="http://schemas.microsoft.com/office/drawing/2017/model3d" xmlns:o="urn:schemas-microsoft-com:office:office" xmlns:oel="http://schemas.microsoft.com/office/2019/extlst" xmlns:r="http://schemas.openxmlformats.org/officeDocument/2006/relationships" xmlns:m="http://schemas.openxmlformats.org/officeDocument/2006/math" xmlns:v="urn:schemas-microsoft-com:vml" xmlns:wp14="http://schemas.microsoft.com/office/word/2010/wordprocessingDrawing" xmlns:wp="http://schemas.openxmlformats.org/drawingml/2006/wordprocessingDrawing" xmlns:w10="urn:schemas-microsoft-com:office:word" xmlns:w="http://schemas.openxmlformats.org/wordprocessingml/2006/main" xmlns:w14="http://schemas.microsoft.com/office/word/2010/wordml" xmlns:w15="http://schemas.microsoft.com/office/word/2012/wordml" xmlns:w16cex="http://schemas.microsoft.com/office/word/2018/wordml/cex" xmlns:w16cid="http://schemas.microsoft.com/office/word/2016/wordml/cid" xmlns:w16="http://schemas.microsoft.com/office/word/2018/wordml" xmlns:w16du="http://schemas.microsoft.com/office/word/2023/wordml/word16du" xmlns:w16sdtdh="http://schemas.microsoft.com/office/word/2020/wordml/sdtdatahash" xmlns:w16sdtfl="http://schemas.microsoft.com/office/word/2024/wordml/sdtformatlock" xmlns:w16se="http://schemas.microsoft.com/office/word/2015/wordml/symex" xmlns:wpg="http://schemas.microsoft.com/office/word/2010/wordprocessingGroup" xmlns:wpi="http://schemas.microsoft.com/office/word/2010/wordprocessingInk" xmlns:wne="http://schemas.microsoft.com/office/word/2006/wordml" xmlns:wps="http://schemas.microsoft.com/office/word/2010/wordprocessingShape" mc:Ignorable="w14 w15 w16se w16cid w16 w16cex w16sdtdh w16sdtfl w16du wp14">
   <w:footnote w:type="separator" w:id="-1">
     <w:p>
       <w:pPr>
@@ -1513,8 +2520,1270 @@
 </w:footnotes>
 </file>
 
+<file path=word/header1.xml><?xml version="1.0" encoding="utf-8"?>
+<w:hdr xmlns:wpc="http://schemas.microsoft.com/office/word/2010/wordprocessingCanvas" xmlns:cx="http://schemas.microsoft.com/office/drawing/2014/chartex" xmlns:cx1="http://schemas.microsoft.com/office/drawing/2015/9/8/chartex" xmlns:cx2="http://schemas.microsoft.com/office/drawing/2015/10/21/chartex" xmlns:cx3="http://schemas.microsoft.com/office/drawing/2016/5/9/chartex" xmlns:cx4="http://schemas.microsoft.com/office/drawing/2016/5/10/chartex" xmlns:cx5="http://schemas.microsoft.com/office/drawing/2016/5/11/chartex" xmlns:cx6="http://schemas.microsoft.com/office/drawing/2016/5/12/chartex" xmlns:cx7="http://schemas.microsoft.com/office/drawing/2016/5/13/chartex" xmlns:cx8="http://schemas.microsoft.com/office/drawing/2016/5/14/chartex" xmlns:mc="http://schemas.openxmlformats.org/markup-compatibility/2006" xmlns:aink="http://schemas.microsoft.com/office/drawing/2016/ink" xmlns:am3d="http://schemas.microsoft.com/office/drawing/2017/model3d" xmlns:o="urn:schemas-microsoft-com:office:office" xmlns:oel="http://schemas.microsoft.com/office/2019/extlst" xmlns:r="http://schemas.openxmlformats.org/officeDocument/2006/relationships" xmlns:m="http://schemas.openxmlformats.org/officeDocument/2006/math" xmlns:v="urn:schemas-microsoft-com:vml" xmlns:wp14="http://schemas.microsoft.com/office/word/2010/wordprocessingDrawing" xmlns:wp="http://schemas.openxmlformats.org/drawingml/2006/wordprocessingDrawing" xmlns:w10="urn:schemas-microsoft-com:office:word" xmlns:w="http://schemas.openxmlformats.org/wordprocessingml/2006/main" xmlns:w14="http://schemas.microsoft.com/office/word/2010/wordml" xmlns:w15="http://schemas.microsoft.com/office/word/2012/wordml" xmlns:w16cex="http://schemas.microsoft.com/office/word/2018/wordml/cex" xmlns:w16cid="http://schemas.microsoft.com/office/word/2016/wordml/cid" xmlns:w16="http://schemas.microsoft.com/office/word/2018/wordml" xmlns:w16du="http://schemas.microsoft.com/office/word/2023/wordml/word16du" xmlns:w16sdtdh="http://schemas.microsoft.com/office/word/2020/wordml/sdtdatahash" xmlns:w16sdtfl="http://schemas.microsoft.com/office/word/2024/wordml/sdtformatlock" xmlns:w16se="http://schemas.microsoft.com/office/word/2015/wordml/symex" xmlns:wpg="http://schemas.microsoft.com/office/word/2010/wordprocessingGroup" xmlns:wpi="http://schemas.microsoft.com/office/word/2010/wordprocessingInk" xmlns:wne="http://schemas.microsoft.com/office/word/2006/wordml" xmlns:wps="http://schemas.microsoft.com/office/word/2010/wordprocessingShape" mc:Ignorable="w14 w15 w16se w16cid w16 w16cex w16sdtdh w16sdtfl w16du wp14">
+  <w:p>
+    <w:pPr>
+      <w:pStyle w:val="Header"/>
+      <w:pBdr>
+        <w:bottom w:val="single" w:sz="4" w:space="1" w:color="auto"/>
+      </w:pBdr>
+    </w:pPr>
+    <w:r>
+      <w:t>Xây Dựng Hệ Thống Quản Lý Bán Hàng</w:t>
+    </w:r>
+  </w:p>
+</w:hdr>
+</file>
+
+<file path=word/numbering.xml><?xml version="1.0" encoding="utf-8"?>
+<w:numbering xmlns:wpc="http://schemas.microsoft.com/office/word/2010/wordprocessingCanvas" xmlns:cx="http://schemas.microsoft.com/office/drawing/2014/chartex" xmlns:cx1="http://schemas.microsoft.com/office/drawing/2015/9/8/chartex" xmlns:cx2="http://schemas.microsoft.com/office/drawing/2015/10/21/chartex" xmlns:cx3="http://schemas.microsoft.com/office/drawing/2016/5/9/chartex" xmlns:cx4="http://schemas.microsoft.com/office/drawing/2016/5/10/chartex" xmlns:cx5="http://schemas.microsoft.com/office/drawing/2016/5/11/chartex" xmlns:cx6="http://schemas.microsoft.com/office/drawing/2016/5/12/chartex" xmlns:cx7="http://schemas.microsoft.com/office/drawing/2016/5/13/chartex" xmlns:cx8="http://schemas.microsoft.com/office/drawing/2016/5/14/chartex" xmlns:mc="http://schemas.openxmlformats.org/markup-compatibility/2006" xmlns:aink="http://schemas.microsoft.com/office/drawing/2016/ink" xmlns:am3d="http://schemas.microsoft.com/office/drawing/2017/model3d" xmlns:o="urn:schemas-microsoft-com:office:office" xmlns:oel="http://schemas.microsoft.com/office/2019/extlst" xmlns:r="http://schemas.openxmlformats.org/officeDocument/2006/relationships" xmlns:m="http://schemas.openxmlformats.org/officeDocument/2006/math" xmlns:v="urn:schemas-microsoft-com:vml" xmlns:wp14="http://schemas.microsoft.com/office/word/2010/wordprocessingDrawing" xmlns:wp="http://schemas.openxmlformats.org/drawingml/2006/wordprocessingDrawing" xmlns:w10="urn:schemas-microsoft-com:office:word" xmlns:w="http://schemas.openxmlformats.org/wordprocessingml/2006/main" xmlns:w14="http://schemas.microsoft.com/office/word/2010/wordml" xmlns:w15="http://schemas.microsoft.com/office/word/2012/wordml" xmlns:w16cex="http://schemas.microsoft.com/office/word/2018/wordml/cex" xmlns:w16cid="http://schemas.microsoft.com/office/word/2016/wordml/cid" xmlns:w16="http://schemas.microsoft.com/office/word/2018/wordml" xmlns:w16du="http://schemas.microsoft.com/office/word/2023/wordml/word16du" xmlns:w16sdtdh="http://schemas.microsoft.com/office/word/2020/wordml/sdtdatahash" xmlns:w16sdtfl="http://schemas.microsoft.com/office/word/2024/wordml/sdtformatlock" xmlns:w16se="http://schemas.microsoft.com/office/word/2015/wordml/symex" xmlns:wpg="http://schemas.microsoft.com/office/word/2010/wordprocessingGroup" xmlns:wpi="http://schemas.microsoft.com/office/word/2010/wordprocessingInk" xmlns:wne="http://schemas.microsoft.com/office/word/2006/wordml" xmlns:wps="http://schemas.microsoft.com/office/word/2010/wordprocessingShape" mc:Ignorable="w14 w15 w16se w16cid w16 w16cex w16sdtdh w16sdtfl w16du wp14">
+  <w:abstractNum w:abstractNumId="0" w15:restartNumberingAfterBreak="0">
+    <w:nsid w:val="011F204A"/>
+    <w:multiLevelType w:val="hybridMultilevel"/>
+    <w:tmpl w:val="C49AF46A"/>
+    <w:lvl w:ilvl="0" w:tplc="735CEB80">
+      <w:start w:val="1"/>
+      <w:numFmt w:val="bullet"/>
+      <w:lvlText w:val=""/>
+      <w:lvlJc w:val="left"/>
+      <w:pPr>
+        <w:ind w:left="720" w:hanging="360"/>
+      </w:pPr>
+      <w:rPr>
+        <w:rFonts w:ascii="Symbol" w:hAnsi="Symbol" w:hint="default"/>
+      </w:rPr>
+    </w:lvl>
+    <w:lvl w:ilvl="1" w:tplc="04090003" w:tentative="1">
+      <w:start w:val="1"/>
+      <w:numFmt w:val="bullet"/>
+      <w:lvlText w:val="o"/>
+      <w:lvlJc w:val="left"/>
+      <w:pPr>
+        <w:ind w:left="1440" w:hanging="360"/>
+      </w:pPr>
+      <w:rPr>
+        <w:rFonts w:ascii="Courier New" w:hAnsi="Courier New" w:cs="Courier New" w:hint="default"/>
+      </w:rPr>
+    </w:lvl>
+    <w:lvl w:ilvl="2" w:tplc="04090005" w:tentative="1">
+      <w:start w:val="1"/>
+      <w:numFmt w:val="bullet"/>
+      <w:lvlText w:val=""/>
+      <w:lvlJc w:val="left"/>
+      <w:pPr>
+        <w:ind w:left="2160" w:hanging="360"/>
+      </w:pPr>
+      <w:rPr>
+        <w:rFonts w:ascii="Wingdings" w:hAnsi="Wingdings" w:hint="default"/>
+      </w:rPr>
+    </w:lvl>
+    <w:lvl w:ilvl="3" w:tplc="04090001" w:tentative="1">
+      <w:start w:val="1"/>
+      <w:numFmt w:val="bullet"/>
+      <w:lvlText w:val=""/>
+      <w:lvlJc w:val="left"/>
+      <w:pPr>
+        <w:ind w:left="2880" w:hanging="360"/>
+      </w:pPr>
+      <w:rPr>
+        <w:rFonts w:ascii="Symbol" w:hAnsi="Symbol" w:hint="default"/>
+      </w:rPr>
+    </w:lvl>
+    <w:lvl w:ilvl="4" w:tplc="04090003" w:tentative="1">
+      <w:start w:val="1"/>
+      <w:numFmt w:val="bullet"/>
+      <w:lvlText w:val="o"/>
+      <w:lvlJc w:val="left"/>
+      <w:pPr>
+        <w:ind w:left="3600" w:hanging="360"/>
+      </w:pPr>
+      <w:rPr>
+        <w:rFonts w:ascii="Courier New" w:hAnsi="Courier New" w:cs="Courier New" w:hint="default"/>
+      </w:rPr>
+    </w:lvl>
+    <w:lvl w:ilvl="5" w:tplc="04090005" w:tentative="1">
+      <w:start w:val="1"/>
+      <w:numFmt w:val="bullet"/>
+      <w:lvlText w:val=""/>
+      <w:lvlJc w:val="left"/>
+      <w:pPr>
+        <w:ind w:left="4320" w:hanging="360"/>
+      </w:pPr>
+      <w:rPr>
+        <w:rFonts w:ascii="Wingdings" w:hAnsi="Wingdings" w:hint="default"/>
+      </w:rPr>
+    </w:lvl>
+    <w:lvl w:ilvl="6" w:tplc="04090001" w:tentative="1">
+      <w:start w:val="1"/>
+      <w:numFmt w:val="bullet"/>
+      <w:lvlText w:val=""/>
+      <w:lvlJc w:val="left"/>
+      <w:pPr>
+        <w:ind w:left="5040" w:hanging="360"/>
+      </w:pPr>
+      <w:rPr>
+        <w:rFonts w:ascii="Symbol" w:hAnsi="Symbol" w:hint="default"/>
+      </w:rPr>
+    </w:lvl>
+    <w:lvl w:ilvl="7" w:tplc="04090003" w:tentative="1">
+      <w:start w:val="1"/>
+      <w:numFmt w:val="bullet"/>
+      <w:lvlText w:val="o"/>
+      <w:lvlJc w:val="left"/>
+      <w:pPr>
+        <w:ind w:left="5760" w:hanging="360"/>
+      </w:pPr>
+      <w:rPr>
+        <w:rFonts w:ascii="Courier New" w:hAnsi="Courier New" w:cs="Courier New" w:hint="default"/>
+      </w:rPr>
+    </w:lvl>
+    <w:lvl w:ilvl="8" w:tplc="04090005" w:tentative="1">
+      <w:start w:val="1"/>
+      <w:numFmt w:val="bullet"/>
+      <w:lvlText w:val=""/>
+      <w:lvlJc w:val="left"/>
+      <w:pPr>
+        <w:ind w:left="6480" w:hanging="360"/>
+      </w:pPr>
+      <w:rPr>
+        <w:rFonts w:ascii="Wingdings" w:hAnsi="Wingdings" w:hint="default"/>
+      </w:rPr>
+    </w:lvl>
+  </w:abstractNum>
+  <w:abstractNum w:abstractNumId="1" w15:restartNumberingAfterBreak="0">
+    <w:nsid w:val="080C634C"/>
+    <w:multiLevelType w:val="hybridMultilevel"/>
+    <w:tmpl w:val="4BFA1D82"/>
+    <w:lvl w:ilvl="0" w:tplc="735CEB80">
+      <w:start w:val="1"/>
+      <w:numFmt w:val="bullet"/>
+      <w:lvlText w:val=""/>
+      <w:lvlJc w:val="left"/>
+      <w:pPr>
+        <w:ind w:left="720" w:hanging="360"/>
+      </w:pPr>
+      <w:rPr>
+        <w:rFonts w:ascii="Symbol" w:hAnsi="Symbol" w:hint="default"/>
+      </w:rPr>
+    </w:lvl>
+    <w:lvl w:ilvl="1" w:tplc="04090003" w:tentative="1">
+      <w:start w:val="1"/>
+      <w:numFmt w:val="bullet"/>
+      <w:lvlText w:val="o"/>
+      <w:lvlJc w:val="left"/>
+      <w:pPr>
+        <w:ind w:left="1440" w:hanging="360"/>
+      </w:pPr>
+      <w:rPr>
+        <w:rFonts w:ascii="Courier New" w:hAnsi="Courier New" w:cs="Courier New" w:hint="default"/>
+      </w:rPr>
+    </w:lvl>
+    <w:lvl w:ilvl="2" w:tplc="04090005" w:tentative="1">
+      <w:start w:val="1"/>
+      <w:numFmt w:val="bullet"/>
+      <w:lvlText w:val=""/>
+      <w:lvlJc w:val="left"/>
+      <w:pPr>
+        <w:ind w:left="2160" w:hanging="360"/>
+      </w:pPr>
+      <w:rPr>
+        <w:rFonts w:ascii="Wingdings" w:hAnsi="Wingdings" w:hint="default"/>
+      </w:rPr>
+    </w:lvl>
+    <w:lvl w:ilvl="3" w:tplc="04090001" w:tentative="1">
+      <w:start w:val="1"/>
+      <w:numFmt w:val="bullet"/>
+      <w:lvlText w:val=""/>
+      <w:lvlJc w:val="left"/>
+      <w:pPr>
+        <w:ind w:left="2880" w:hanging="360"/>
+      </w:pPr>
+      <w:rPr>
+        <w:rFonts w:ascii="Symbol" w:hAnsi="Symbol" w:hint="default"/>
+      </w:rPr>
+    </w:lvl>
+    <w:lvl w:ilvl="4" w:tplc="04090003" w:tentative="1">
+      <w:start w:val="1"/>
+      <w:numFmt w:val="bullet"/>
+      <w:lvlText w:val="o"/>
+      <w:lvlJc w:val="left"/>
+      <w:pPr>
+        <w:ind w:left="3600" w:hanging="360"/>
+      </w:pPr>
+      <w:rPr>
+        <w:rFonts w:ascii="Courier New" w:hAnsi="Courier New" w:cs="Courier New" w:hint="default"/>
+      </w:rPr>
+    </w:lvl>
+    <w:lvl w:ilvl="5" w:tplc="04090005" w:tentative="1">
+      <w:start w:val="1"/>
+      <w:numFmt w:val="bullet"/>
+      <w:lvlText w:val=""/>
+      <w:lvlJc w:val="left"/>
+      <w:pPr>
+        <w:ind w:left="4320" w:hanging="360"/>
+      </w:pPr>
+      <w:rPr>
+        <w:rFonts w:ascii="Wingdings" w:hAnsi="Wingdings" w:hint="default"/>
+      </w:rPr>
+    </w:lvl>
+    <w:lvl w:ilvl="6" w:tplc="04090001" w:tentative="1">
+      <w:start w:val="1"/>
+      <w:numFmt w:val="bullet"/>
+      <w:lvlText w:val=""/>
+      <w:lvlJc w:val="left"/>
+      <w:pPr>
+        <w:ind w:left="5040" w:hanging="360"/>
+      </w:pPr>
+      <w:rPr>
+        <w:rFonts w:ascii="Symbol" w:hAnsi="Symbol" w:hint="default"/>
+      </w:rPr>
+    </w:lvl>
+    <w:lvl w:ilvl="7" w:tplc="04090003" w:tentative="1">
+      <w:start w:val="1"/>
+      <w:numFmt w:val="bullet"/>
+      <w:lvlText w:val="o"/>
+      <w:lvlJc w:val="left"/>
+      <w:pPr>
+        <w:ind w:left="5760" w:hanging="360"/>
+      </w:pPr>
+      <w:rPr>
+        <w:rFonts w:ascii="Courier New" w:hAnsi="Courier New" w:cs="Courier New" w:hint="default"/>
+      </w:rPr>
+    </w:lvl>
+    <w:lvl w:ilvl="8" w:tplc="04090005" w:tentative="1">
+      <w:start w:val="1"/>
+      <w:numFmt w:val="bullet"/>
+      <w:lvlText w:val=""/>
+      <w:lvlJc w:val="left"/>
+      <w:pPr>
+        <w:ind w:left="6480" w:hanging="360"/>
+      </w:pPr>
+      <w:rPr>
+        <w:rFonts w:ascii="Wingdings" w:hAnsi="Wingdings" w:hint="default"/>
+      </w:rPr>
+    </w:lvl>
+  </w:abstractNum>
+  <w:abstractNum w:abstractNumId="2" w15:restartNumberingAfterBreak="0">
+    <w:nsid w:val="0FDA4815"/>
+    <w:multiLevelType w:val="multilevel"/>
+    <w:tmpl w:val="4880C468"/>
+    <w:lvl w:ilvl="0">
+      <w:start w:val="1"/>
+      <w:numFmt w:val="bullet"/>
+      <w:lvlText w:val=""/>
+      <w:lvlJc w:val="left"/>
+      <w:pPr>
+        <w:tabs>
+          <w:tab w:val="num" w:pos="720"/>
+        </w:tabs>
+        <w:ind w:left="720" w:hanging="360"/>
+      </w:pPr>
+      <w:rPr>
+        <w:rFonts w:ascii="Symbol" w:hAnsi="Symbol" w:hint="default"/>
+        <w:sz w:val="20"/>
+      </w:rPr>
+    </w:lvl>
+    <w:lvl w:ilvl="1" w:tentative="1">
+      <w:start w:val="1"/>
+      <w:numFmt w:val="bullet"/>
+      <w:lvlText w:val="o"/>
+      <w:lvlJc w:val="left"/>
+      <w:pPr>
+        <w:tabs>
+          <w:tab w:val="num" w:pos="1440"/>
+        </w:tabs>
+        <w:ind w:left="1440" w:hanging="360"/>
+      </w:pPr>
+      <w:rPr>
+        <w:rFonts w:ascii="Courier New" w:hAnsi="Courier New" w:hint="default"/>
+        <w:sz w:val="20"/>
+      </w:rPr>
+    </w:lvl>
+    <w:lvl w:ilvl="2" w:tentative="1">
+      <w:start w:val="1"/>
+      <w:numFmt w:val="bullet"/>
+      <w:lvlText w:val=""/>
+      <w:lvlJc w:val="left"/>
+      <w:pPr>
+        <w:tabs>
+          <w:tab w:val="num" w:pos="2160"/>
+        </w:tabs>
+        <w:ind w:left="2160" w:hanging="360"/>
+      </w:pPr>
+      <w:rPr>
+        <w:rFonts w:ascii="Wingdings" w:hAnsi="Wingdings" w:hint="default"/>
+        <w:sz w:val="20"/>
+      </w:rPr>
+    </w:lvl>
+    <w:lvl w:ilvl="3" w:tentative="1">
+      <w:start w:val="1"/>
+      <w:numFmt w:val="bullet"/>
+      <w:lvlText w:val=""/>
+      <w:lvlJc w:val="left"/>
+      <w:pPr>
+        <w:tabs>
+          <w:tab w:val="num" w:pos="2880"/>
+        </w:tabs>
+        <w:ind w:left="2880" w:hanging="360"/>
+      </w:pPr>
+      <w:rPr>
+        <w:rFonts w:ascii="Wingdings" w:hAnsi="Wingdings" w:hint="default"/>
+        <w:sz w:val="20"/>
+      </w:rPr>
+    </w:lvl>
+    <w:lvl w:ilvl="4" w:tentative="1">
+      <w:start w:val="1"/>
+      <w:numFmt w:val="bullet"/>
+      <w:lvlText w:val=""/>
+      <w:lvlJc w:val="left"/>
+      <w:pPr>
+        <w:tabs>
+          <w:tab w:val="num" w:pos="3600"/>
+        </w:tabs>
+        <w:ind w:left="3600" w:hanging="360"/>
+      </w:pPr>
+      <w:rPr>
+        <w:rFonts w:ascii="Wingdings" w:hAnsi="Wingdings" w:hint="default"/>
+        <w:sz w:val="20"/>
+      </w:rPr>
+    </w:lvl>
+    <w:lvl w:ilvl="5" w:tentative="1">
+      <w:start w:val="1"/>
+      <w:numFmt w:val="bullet"/>
+      <w:lvlText w:val=""/>
+      <w:lvlJc w:val="left"/>
+      <w:pPr>
+        <w:tabs>
+          <w:tab w:val="num" w:pos="4320"/>
+        </w:tabs>
+        <w:ind w:left="4320" w:hanging="360"/>
+      </w:pPr>
+      <w:rPr>
+        <w:rFonts w:ascii="Wingdings" w:hAnsi="Wingdings" w:hint="default"/>
+        <w:sz w:val="20"/>
+      </w:rPr>
+    </w:lvl>
+    <w:lvl w:ilvl="6" w:tentative="1">
+      <w:start w:val="1"/>
+      <w:numFmt w:val="bullet"/>
+      <w:lvlText w:val=""/>
+      <w:lvlJc w:val="left"/>
+      <w:pPr>
+        <w:tabs>
+          <w:tab w:val="num" w:pos="5040"/>
+        </w:tabs>
+        <w:ind w:left="5040" w:hanging="360"/>
+      </w:pPr>
+      <w:rPr>
+        <w:rFonts w:ascii="Wingdings" w:hAnsi="Wingdings" w:hint="default"/>
+        <w:sz w:val="20"/>
+      </w:rPr>
+    </w:lvl>
+    <w:lvl w:ilvl="7" w:tentative="1">
+      <w:start w:val="1"/>
+      <w:numFmt w:val="bullet"/>
+      <w:lvlText w:val=""/>
+      <w:lvlJc w:val="left"/>
+      <w:pPr>
+        <w:tabs>
+          <w:tab w:val="num" w:pos="5760"/>
+        </w:tabs>
+        <w:ind w:left="5760" w:hanging="360"/>
+      </w:pPr>
+      <w:rPr>
+        <w:rFonts w:ascii="Wingdings" w:hAnsi="Wingdings" w:hint="default"/>
+        <w:sz w:val="20"/>
+      </w:rPr>
+    </w:lvl>
+    <w:lvl w:ilvl="8" w:tentative="1">
+      <w:start w:val="1"/>
+      <w:numFmt w:val="bullet"/>
+      <w:lvlText w:val=""/>
+      <w:lvlJc w:val="left"/>
+      <w:pPr>
+        <w:tabs>
+          <w:tab w:val="num" w:pos="6480"/>
+        </w:tabs>
+        <w:ind w:left="6480" w:hanging="360"/>
+      </w:pPr>
+      <w:rPr>
+        <w:rFonts w:ascii="Wingdings" w:hAnsi="Wingdings" w:hint="default"/>
+        <w:sz w:val="20"/>
+      </w:rPr>
+    </w:lvl>
+  </w:abstractNum>
+  <w:abstractNum w:abstractNumId="3" w15:restartNumberingAfterBreak="0">
+    <w:nsid w:val="1D56361E"/>
+    <w:multiLevelType w:val="hybridMultilevel"/>
+    <w:tmpl w:val="C6D437DC"/>
+    <w:lvl w:ilvl="0" w:tplc="735CEB80">
+      <w:start w:val="1"/>
+      <w:numFmt w:val="bullet"/>
+      <w:lvlText w:val=""/>
+      <w:lvlJc w:val="left"/>
+      <w:pPr>
+        <w:ind w:left="720" w:hanging="360"/>
+      </w:pPr>
+      <w:rPr>
+        <w:rFonts w:ascii="Symbol" w:hAnsi="Symbol" w:hint="default"/>
+      </w:rPr>
+    </w:lvl>
+    <w:lvl w:ilvl="1" w:tplc="04090003" w:tentative="1">
+      <w:start w:val="1"/>
+      <w:numFmt w:val="bullet"/>
+      <w:lvlText w:val="o"/>
+      <w:lvlJc w:val="left"/>
+      <w:pPr>
+        <w:ind w:left="1440" w:hanging="360"/>
+      </w:pPr>
+      <w:rPr>
+        <w:rFonts w:ascii="Courier New" w:hAnsi="Courier New" w:cs="Courier New" w:hint="default"/>
+      </w:rPr>
+    </w:lvl>
+    <w:lvl w:ilvl="2" w:tplc="04090005" w:tentative="1">
+      <w:start w:val="1"/>
+      <w:numFmt w:val="bullet"/>
+      <w:lvlText w:val=""/>
+      <w:lvlJc w:val="left"/>
+      <w:pPr>
+        <w:ind w:left="2160" w:hanging="360"/>
+      </w:pPr>
+      <w:rPr>
+        <w:rFonts w:ascii="Wingdings" w:hAnsi="Wingdings" w:hint="default"/>
+      </w:rPr>
+    </w:lvl>
+    <w:lvl w:ilvl="3" w:tplc="04090001" w:tentative="1">
+      <w:start w:val="1"/>
+      <w:numFmt w:val="bullet"/>
+      <w:lvlText w:val=""/>
+      <w:lvlJc w:val="left"/>
+      <w:pPr>
+        <w:ind w:left="2880" w:hanging="360"/>
+      </w:pPr>
+      <w:rPr>
+        <w:rFonts w:ascii="Symbol" w:hAnsi="Symbol" w:hint="default"/>
+      </w:rPr>
+    </w:lvl>
+    <w:lvl w:ilvl="4" w:tplc="04090003" w:tentative="1">
+      <w:start w:val="1"/>
+      <w:numFmt w:val="bullet"/>
+      <w:lvlText w:val="o"/>
+      <w:lvlJc w:val="left"/>
+      <w:pPr>
+        <w:ind w:left="3600" w:hanging="360"/>
+      </w:pPr>
+      <w:rPr>
+        <w:rFonts w:ascii="Courier New" w:hAnsi="Courier New" w:cs="Courier New" w:hint="default"/>
+      </w:rPr>
+    </w:lvl>
+    <w:lvl w:ilvl="5" w:tplc="04090005" w:tentative="1">
+      <w:start w:val="1"/>
+      <w:numFmt w:val="bullet"/>
+      <w:lvlText w:val=""/>
+      <w:lvlJc w:val="left"/>
+      <w:pPr>
+        <w:ind w:left="4320" w:hanging="360"/>
+      </w:pPr>
+      <w:rPr>
+        <w:rFonts w:ascii="Wingdings" w:hAnsi="Wingdings" w:hint="default"/>
+      </w:rPr>
+    </w:lvl>
+    <w:lvl w:ilvl="6" w:tplc="04090001" w:tentative="1">
+      <w:start w:val="1"/>
+      <w:numFmt w:val="bullet"/>
+      <w:lvlText w:val=""/>
+      <w:lvlJc w:val="left"/>
+      <w:pPr>
+        <w:ind w:left="5040" w:hanging="360"/>
+      </w:pPr>
+      <w:rPr>
+        <w:rFonts w:ascii="Symbol" w:hAnsi="Symbol" w:hint="default"/>
+      </w:rPr>
+    </w:lvl>
+    <w:lvl w:ilvl="7" w:tplc="04090003" w:tentative="1">
+      <w:start w:val="1"/>
+      <w:numFmt w:val="bullet"/>
+      <w:lvlText w:val="o"/>
+      <w:lvlJc w:val="left"/>
+      <w:pPr>
+        <w:ind w:left="5760" w:hanging="360"/>
+      </w:pPr>
+      <w:rPr>
+        <w:rFonts w:ascii="Courier New" w:hAnsi="Courier New" w:cs="Courier New" w:hint="default"/>
+      </w:rPr>
+    </w:lvl>
+    <w:lvl w:ilvl="8" w:tplc="04090005" w:tentative="1">
+      <w:start w:val="1"/>
+      <w:numFmt w:val="bullet"/>
+      <w:lvlText w:val=""/>
+      <w:lvlJc w:val="left"/>
+      <w:pPr>
+        <w:ind w:left="6480" w:hanging="360"/>
+      </w:pPr>
+      <w:rPr>
+        <w:rFonts w:ascii="Wingdings" w:hAnsi="Wingdings" w:hint="default"/>
+      </w:rPr>
+    </w:lvl>
+  </w:abstractNum>
+  <w:abstractNum w:abstractNumId="4" w15:restartNumberingAfterBreak="0">
+    <w:nsid w:val="39D30AA9"/>
+    <w:multiLevelType w:val="multilevel"/>
+    <w:tmpl w:val="28466B58"/>
+    <w:lvl w:ilvl="0">
+      <w:start w:val="1"/>
+      <w:numFmt w:val="bullet"/>
+      <w:lvlText w:val=""/>
+      <w:lvlJc w:val="left"/>
+      <w:pPr>
+        <w:tabs>
+          <w:tab w:val="num" w:pos="720"/>
+        </w:tabs>
+        <w:ind w:left="720" w:hanging="360"/>
+      </w:pPr>
+      <w:rPr>
+        <w:rFonts w:ascii="Symbol" w:hAnsi="Symbol" w:hint="default"/>
+        <w:sz w:val="20"/>
+      </w:rPr>
+    </w:lvl>
+    <w:lvl w:ilvl="1" w:tentative="1">
+      <w:start w:val="1"/>
+      <w:numFmt w:val="bullet"/>
+      <w:lvlText w:val="o"/>
+      <w:lvlJc w:val="left"/>
+      <w:pPr>
+        <w:tabs>
+          <w:tab w:val="num" w:pos="1440"/>
+        </w:tabs>
+        <w:ind w:left="1440" w:hanging="360"/>
+      </w:pPr>
+      <w:rPr>
+        <w:rFonts w:ascii="Courier New" w:hAnsi="Courier New" w:hint="default"/>
+        <w:sz w:val="20"/>
+      </w:rPr>
+    </w:lvl>
+    <w:lvl w:ilvl="2" w:tentative="1">
+      <w:start w:val="1"/>
+      <w:numFmt w:val="bullet"/>
+      <w:lvlText w:val=""/>
+      <w:lvlJc w:val="left"/>
+      <w:pPr>
+        <w:tabs>
+          <w:tab w:val="num" w:pos="2160"/>
+        </w:tabs>
+        <w:ind w:left="2160" w:hanging="360"/>
+      </w:pPr>
+      <w:rPr>
+        <w:rFonts w:ascii="Wingdings" w:hAnsi="Wingdings" w:hint="default"/>
+        <w:sz w:val="20"/>
+      </w:rPr>
+    </w:lvl>
+    <w:lvl w:ilvl="3" w:tentative="1">
+      <w:start w:val="1"/>
+      <w:numFmt w:val="bullet"/>
+      <w:lvlText w:val=""/>
+      <w:lvlJc w:val="left"/>
+      <w:pPr>
+        <w:tabs>
+          <w:tab w:val="num" w:pos="2880"/>
+        </w:tabs>
+        <w:ind w:left="2880" w:hanging="360"/>
+      </w:pPr>
+      <w:rPr>
+        <w:rFonts w:ascii="Wingdings" w:hAnsi="Wingdings" w:hint="default"/>
+        <w:sz w:val="20"/>
+      </w:rPr>
+    </w:lvl>
+    <w:lvl w:ilvl="4" w:tentative="1">
+      <w:start w:val="1"/>
+      <w:numFmt w:val="bullet"/>
+      <w:lvlText w:val=""/>
+      <w:lvlJc w:val="left"/>
+      <w:pPr>
+        <w:tabs>
+          <w:tab w:val="num" w:pos="3600"/>
+        </w:tabs>
+        <w:ind w:left="3600" w:hanging="360"/>
+      </w:pPr>
+      <w:rPr>
+        <w:rFonts w:ascii="Wingdings" w:hAnsi="Wingdings" w:hint="default"/>
+        <w:sz w:val="20"/>
+      </w:rPr>
+    </w:lvl>
+    <w:lvl w:ilvl="5" w:tentative="1">
+      <w:start w:val="1"/>
+      <w:numFmt w:val="bullet"/>
+      <w:lvlText w:val=""/>
+      <w:lvlJc w:val="left"/>
+      <w:pPr>
+        <w:tabs>
+          <w:tab w:val="num" w:pos="4320"/>
+        </w:tabs>
+        <w:ind w:left="4320" w:hanging="360"/>
+      </w:pPr>
+      <w:rPr>
+        <w:rFonts w:ascii="Wingdings" w:hAnsi="Wingdings" w:hint="default"/>
+        <w:sz w:val="20"/>
+      </w:rPr>
+    </w:lvl>
+    <w:lvl w:ilvl="6" w:tentative="1">
+      <w:start w:val="1"/>
+      <w:numFmt w:val="bullet"/>
+      <w:lvlText w:val=""/>
+      <w:lvlJc w:val="left"/>
+      <w:pPr>
+        <w:tabs>
+          <w:tab w:val="num" w:pos="5040"/>
+        </w:tabs>
+        <w:ind w:left="5040" w:hanging="360"/>
+      </w:pPr>
+      <w:rPr>
+        <w:rFonts w:ascii="Wingdings" w:hAnsi="Wingdings" w:hint="default"/>
+        <w:sz w:val="20"/>
+      </w:rPr>
+    </w:lvl>
+    <w:lvl w:ilvl="7" w:tentative="1">
+      <w:start w:val="1"/>
+      <w:numFmt w:val="bullet"/>
+      <w:lvlText w:val=""/>
+      <w:lvlJc w:val="left"/>
+      <w:pPr>
+        <w:tabs>
+          <w:tab w:val="num" w:pos="5760"/>
+        </w:tabs>
+        <w:ind w:left="5760" w:hanging="360"/>
+      </w:pPr>
+      <w:rPr>
+        <w:rFonts w:ascii="Wingdings" w:hAnsi="Wingdings" w:hint="default"/>
+        <w:sz w:val="20"/>
+      </w:rPr>
+    </w:lvl>
+    <w:lvl w:ilvl="8" w:tentative="1">
+      <w:start w:val="1"/>
+      <w:numFmt w:val="bullet"/>
+      <w:lvlText w:val=""/>
+      <w:lvlJc w:val="left"/>
+      <w:pPr>
+        <w:tabs>
+          <w:tab w:val="num" w:pos="6480"/>
+        </w:tabs>
+        <w:ind w:left="6480" w:hanging="360"/>
+      </w:pPr>
+      <w:rPr>
+        <w:rFonts w:ascii="Wingdings" w:hAnsi="Wingdings" w:hint="default"/>
+        <w:sz w:val="20"/>
+      </w:rPr>
+    </w:lvl>
+  </w:abstractNum>
+  <w:abstractNum w:abstractNumId="5" w15:restartNumberingAfterBreak="0">
+    <w:nsid w:val="401A66E2"/>
+    <w:multiLevelType w:val="hybridMultilevel"/>
+    <w:tmpl w:val="98405DDA"/>
+    <w:lvl w:ilvl="0" w:tplc="735CEB80">
+      <w:start w:val="1"/>
+      <w:numFmt w:val="bullet"/>
+      <w:lvlText w:val=""/>
+      <w:lvlJc w:val="left"/>
+      <w:pPr>
+        <w:ind w:left="720" w:hanging="360"/>
+      </w:pPr>
+      <w:rPr>
+        <w:rFonts w:ascii="Symbol" w:hAnsi="Symbol" w:hint="default"/>
+      </w:rPr>
+    </w:lvl>
+    <w:lvl w:ilvl="1" w:tplc="04090003" w:tentative="1">
+      <w:start w:val="1"/>
+      <w:numFmt w:val="bullet"/>
+      <w:lvlText w:val="o"/>
+      <w:lvlJc w:val="left"/>
+      <w:pPr>
+        <w:ind w:left="1440" w:hanging="360"/>
+      </w:pPr>
+      <w:rPr>
+        <w:rFonts w:ascii="Courier New" w:hAnsi="Courier New" w:cs="Courier New" w:hint="default"/>
+      </w:rPr>
+    </w:lvl>
+    <w:lvl w:ilvl="2" w:tplc="04090005" w:tentative="1">
+      <w:start w:val="1"/>
+      <w:numFmt w:val="bullet"/>
+      <w:lvlText w:val=""/>
+      <w:lvlJc w:val="left"/>
+      <w:pPr>
+        <w:ind w:left="2160" w:hanging="360"/>
+      </w:pPr>
+      <w:rPr>
+        <w:rFonts w:ascii="Wingdings" w:hAnsi="Wingdings" w:hint="default"/>
+      </w:rPr>
+    </w:lvl>
+    <w:lvl w:ilvl="3" w:tplc="04090001" w:tentative="1">
+      <w:start w:val="1"/>
+      <w:numFmt w:val="bullet"/>
+      <w:lvlText w:val=""/>
+      <w:lvlJc w:val="left"/>
+      <w:pPr>
+        <w:ind w:left="2880" w:hanging="360"/>
+      </w:pPr>
+      <w:rPr>
+        <w:rFonts w:ascii="Symbol" w:hAnsi="Symbol" w:hint="default"/>
+      </w:rPr>
+    </w:lvl>
+    <w:lvl w:ilvl="4" w:tplc="04090003" w:tentative="1">
+      <w:start w:val="1"/>
+      <w:numFmt w:val="bullet"/>
+      <w:lvlText w:val="o"/>
+      <w:lvlJc w:val="left"/>
+      <w:pPr>
+        <w:ind w:left="3600" w:hanging="360"/>
+      </w:pPr>
+      <w:rPr>
+        <w:rFonts w:ascii="Courier New" w:hAnsi="Courier New" w:cs="Courier New" w:hint="default"/>
+      </w:rPr>
+    </w:lvl>
+    <w:lvl w:ilvl="5" w:tplc="04090005" w:tentative="1">
+      <w:start w:val="1"/>
+      <w:numFmt w:val="bullet"/>
+      <w:lvlText w:val=""/>
+      <w:lvlJc w:val="left"/>
+      <w:pPr>
+        <w:ind w:left="4320" w:hanging="360"/>
+      </w:pPr>
+      <w:rPr>
+        <w:rFonts w:ascii="Wingdings" w:hAnsi="Wingdings" w:hint="default"/>
+      </w:rPr>
+    </w:lvl>
+    <w:lvl w:ilvl="6" w:tplc="04090001" w:tentative="1">
+      <w:start w:val="1"/>
+      <w:numFmt w:val="bullet"/>
+      <w:lvlText w:val=""/>
+      <w:lvlJc w:val="left"/>
+      <w:pPr>
+        <w:ind w:left="5040" w:hanging="360"/>
+      </w:pPr>
+      <w:rPr>
+        <w:rFonts w:ascii="Symbol" w:hAnsi="Symbol" w:hint="default"/>
+      </w:rPr>
+    </w:lvl>
+    <w:lvl w:ilvl="7" w:tplc="04090003" w:tentative="1">
+      <w:start w:val="1"/>
+      <w:numFmt w:val="bullet"/>
+      <w:lvlText w:val="o"/>
+      <w:lvlJc w:val="left"/>
+      <w:pPr>
+        <w:ind w:left="5760" w:hanging="360"/>
+      </w:pPr>
+      <w:rPr>
+        <w:rFonts w:ascii="Courier New" w:hAnsi="Courier New" w:cs="Courier New" w:hint="default"/>
+      </w:rPr>
+    </w:lvl>
+    <w:lvl w:ilvl="8" w:tplc="04090005" w:tentative="1">
+      <w:start w:val="1"/>
+      <w:numFmt w:val="bullet"/>
+      <w:lvlText w:val=""/>
+      <w:lvlJc w:val="left"/>
+      <w:pPr>
+        <w:ind w:left="6480" w:hanging="360"/>
+      </w:pPr>
+      <w:rPr>
+        <w:rFonts w:ascii="Wingdings" w:hAnsi="Wingdings" w:hint="default"/>
+      </w:rPr>
+    </w:lvl>
+  </w:abstractNum>
+  <w:abstractNum w:abstractNumId="6" w15:restartNumberingAfterBreak="0">
+    <w:nsid w:val="45E77F97"/>
+    <w:multiLevelType w:val="multilevel"/>
+    <w:tmpl w:val="3B8A7398"/>
+    <w:lvl w:ilvl="0">
+      <w:start w:val="1"/>
+      <w:numFmt w:val="bullet"/>
+      <w:lvlText w:val=""/>
+      <w:lvlJc w:val="left"/>
+      <w:pPr>
+        <w:tabs>
+          <w:tab w:val="num" w:pos="720"/>
+        </w:tabs>
+        <w:ind w:left="720" w:hanging="360"/>
+      </w:pPr>
+      <w:rPr>
+        <w:rFonts w:ascii="Symbol" w:hAnsi="Symbol" w:hint="default"/>
+        <w:sz w:val="20"/>
+      </w:rPr>
+    </w:lvl>
+    <w:lvl w:ilvl="1" w:tentative="1">
+      <w:start w:val="1"/>
+      <w:numFmt w:val="bullet"/>
+      <w:lvlText w:val="o"/>
+      <w:lvlJc w:val="left"/>
+      <w:pPr>
+        <w:tabs>
+          <w:tab w:val="num" w:pos="1440"/>
+        </w:tabs>
+        <w:ind w:left="1440" w:hanging="360"/>
+      </w:pPr>
+      <w:rPr>
+        <w:rFonts w:ascii="Courier New" w:hAnsi="Courier New" w:hint="default"/>
+        <w:sz w:val="20"/>
+      </w:rPr>
+    </w:lvl>
+    <w:lvl w:ilvl="2" w:tentative="1">
+      <w:start w:val="1"/>
+      <w:numFmt w:val="bullet"/>
+      <w:lvlText w:val=""/>
+      <w:lvlJc w:val="left"/>
+      <w:pPr>
+        <w:tabs>
+          <w:tab w:val="num" w:pos="2160"/>
+        </w:tabs>
+        <w:ind w:left="2160" w:hanging="360"/>
+      </w:pPr>
+      <w:rPr>
+        <w:rFonts w:ascii="Wingdings" w:hAnsi="Wingdings" w:hint="default"/>
+        <w:sz w:val="20"/>
+      </w:rPr>
+    </w:lvl>
+    <w:lvl w:ilvl="3" w:tentative="1">
+      <w:start w:val="1"/>
+      <w:numFmt w:val="bullet"/>
+      <w:lvlText w:val=""/>
+      <w:lvlJc w:val="left"/>
+      <w:pPr>
+        <w:tabs>
+          <w:tab w:val="num" w:pos="2880"/>
+        </w:tabs>
+        <w:ind w:left="2880" w:hanging="360"/>
+      </w:pPr>
+      <w:rPr>
+        <w:rFonts w:ascii="Wingdings" w:hAnsi="Wingdings" w:hint="default"/>
+        <w:sz w:val="20"/>
+      </w:rPr>
+    </w:lvl>
+    <w:lvl w:ilvl="4" w:tentative="1">
+      <w:start w:val="1"/>
+      <w:numFmt w:val="bullet"/>
+      <w:lvlText w:val=""/>
+      <w:lvlJc w:val="left"/>
+      <w:pPr>
+        <w:tabs>
+          <w:tab w:val="num" w:pos="3600"/>
+        </w:tabs>
+        <w:ind w:left="3600" w:hanging="360"/>
+      </w:pPr>
+      <w:rPr>
+        <w:rFonts w:ascii="Wingdings" w:hAnsi="Wingdings" w:hint="default"/>
+        <w:sz w:val="20"/>
+      </w:rPr>
+    </w:lvl>
+    <w:lvl w:ilvl="5" w:tentative="1">
+      <w:start w:val="1"/>
+      <w:numFmt w:val="bullet"/>
+      <w:lvlText w:val=""/>
+      <w:lvlJc w:val="left"/>
+      <w:pPr>
+        <w:tabs>
+          <w:tab w:val="num" w:pos="4320"/>
+        </w:tabs>
+        <w:ind w:left="4320" w:hanging="360"/>
+      </w:pPr>
+      <w:rPr>
+        <w:rFonts w:ascii="Wingdings" w:hAnsi="Wingdings" w:hint="default"/>
+        <w:sz w:val="20"/>
+      </w:rPr>
+    </w:lvl>
+    <w:lvl w:ilvl="6" w:tentative="1">
+      <w:start w:val="1"/>
+      <w:numFmt w:val="bullet"/>
+      <w:lvlText w:val=""/>
+      <w:lvlJc w:val="left"/>
+      <w:pPr>
+        <w:tabs>
+          <w:tab w:val="num" w:pos="5040"/>
+        </w:tabs>
+        <w:ind w:left="5040" w:hanging="360"/>
+      </w:pPr>
+      <w:rPr>
+        <w:rFonts w:ascii="Wingdings" w:hAnsi="Wingdings" w:hint="default"/>
+        <w:sz w:val="20"/>
+      </w:rPr>
+    </w:lvl>
+    <w:lvl w:ilvl="7" w:tentative="1">
+      <w:start w:val="1"/>
+      <w:numFmt w:val="bullet"/>
+      <w:lvlText w:val=""/>
+      <w:lvlJc w:val="left"/>
+      <w:pPr>
+        <w:tabs>
+          <w:tab w:val="num" w:pos="5760"/>
+        </w:tabs>
+        <w:ind w:left="5760" w:hanging="360"/>
+      </w:pPr>
+      <w:rPr>
+        <w:rFonts w:ascii="Wingdings" w:hAnsi="Wingdings" w:hint="default"/>
+        <w:sz w:val="20"/>
+      </w:rPr>
+    </w:lvl>
+    <w:lvl w:ilvl="8" w:tentative="1">
+      <w:start w:val="1"/>
+      <w:numFmt w:val="bullet"/>
+      <w:lvlText w:val=""/>
+      <w:lvlJc w:val="left"/>
+      <w:pPr>
+        <w:tabs>
+          <w:tab w:val="num" w:pos="6480"/>
+        </w:tabs>
+        <w:ind w:left="6480" w:hanging="360"/>
+      </w:pPr>
+      <w:rPr>
+        <w:rFonts w:ascii="Wingdings" w:hAnsi="Wingdings" w:hint="default"/>
+        <w:sz w:val="20"/>
+      </w:rPr>
+    </w:lvl>
+  </w:abstractNum>
+  <w:abstractNum w:abstractNumId="7" w15:restartNumberingAfterBreak="0">
+    <w:nsid w:val="4C4E1BDA"/>
+    <w:multiLevelType w:val="hybridMultilevel"/>
+    <w:tmpl w:val="446EC110"/>
+    <w:lvl w:ilvl="0" w:tplc="0409000F">
+      <w:start w:val="1"/>
+      <w:numFmt w:val="decimal"/>
+      <w:lvlText w:val="%1."/>
+      <w:lvlJc w:val="left"/>
+      <w:pPr>
+        <w:ind w:left="720" w:hanging="360"/>
+      </w:pPr>
+    </w:lvl>
+    <w:lvl w:ilvl="1" w:tplc="04090019" w:tentative="1">
+      <w:start w:val="1"/>
+      <w:numFmt w:val="lowerLetter"/>
+      <w:lvlText w:val="%2."/>
+      <w:lvlJc w:val="left"/>
+      <w:pPr>
+        <w:ind w:left="1440" w:hanging="360"/>
+      </w:pPr>
+    </w:lvl>
+    <w:lvl w:ilvl="2" w:tplc="0409001B" w:tentative="1">
+      <w:start w:val="1"/>
+      <w:numFmt w:val="lowerRoman"/>
+      <w:lvlText w:val="%3."/>
+      <w:lvlJc w:val="right"/>
+      <w:pPr>
+        <w:ind w:left="2160" w:hanging="180"/>
+      </w:pPr>
+    </w:lvl>
+    <w:lvl w:ilvl="3" w:tplc="0409000F" w:tentative="1">
+      <w:start w:val="1"/>
+      <w:numFmt w:val="decimal"/>
+      <w:lvlText w:val="%4."/>
+      <w:lvlJc w:val="left"/>
+      <w:pPr>
+        <w:ind w:left="2880" w:hanging="360"/>
+      </w:pPr>
+    </w:lvl>
+    <w:lvl w:ilvl="4" w:tplc="04090019" w:tentative="1">
+      <w:start w:val="1"/>
+      <w:numFmt w:val="lowerLetter"/>
+      <w:lvlText w:val="%5."/>
+      <w:lvlJc w:val="left"/>
+      <w:pPr>
+        <w:ind w:left="3600" w:hanging="360"/>
+      </w:pPr>
+    </w:lvl>
+    <w:lvl w:ilvl="5" w:tplc="0409001B" w:tentative="1">
+      <w:start w:val="1"/>
+      <w:numFmt w:val="lowerRoman"/>
+      <w:lvlText w:val="%6."/>
+      <w:lvlJc w:val="right"/>
+      <w:pPr>
+        <w:ind w:left="4320" w:hanging="180"/>
+      </w:pPr>
+    </w:lvl>
+    <w:lvl w:ilvl="6" w:tplc="0409000F" w:tentative="1">
+      <w:start w:val="1"/>
+      <w:numFmt w:val="decimal"/>
+      <w:lvlText w:val="%7."/>
+      <w:lvlJc w:val="left"/>
+      <w:pPr>
+        <w:ind w:left="5040" w:hanging="360"/>
+      </w:pPr>
+    </w:lvl>
+    <w:lvl w:ilvl="7" w:tplc="04090019" w:tentative="1">
+      <w:start w:val="1"/>
+      <w:numFmt w:val="lowerLetter"/>
+      <w:lvlText w:val="%8."/>
+      <w:lvlJc w:val="left"/>
+      <w:pPr>
+        <w:ind w:left="5760" w:hanging="360"/>
+      </w:pPr>
+    </w:lvl>
+    <w:lvl w:ilvl="8" w:tplc="0409001B" w:tentative="1">
+      <w:start w:val="1"/>
+      <w:numFmt w:val="lowerRoman"/>
+      <w:lvlText w:val="%9."/>
+      <w:lvlJc w:val="right"/>
+      <w:pPr>
+        <w:ind w:left="6480" w:hanging="180"/>
+      </w:pPr>
+    </w:lvl>
+  </w:abstractNum>
+  <w:abstractNum w:abstractNumId="8" w15:restartNumberingAfterBreak="0">
+    <w:nsid w:val="6A772E60"/>
+    <w:multiLevelType w:val="multilevel"/>
+    <w:tmpl w:val="AF9CA93E"/>
+    <w:lvl w:ilvl="0">
+      <w:start w:val="1"/>
+      <w:numFmt w:val="decimal"/>
+      <w:lvlText w:val="%1."/>
+      <w:lvlJc w:val="left"/>
+      <w:pPr>
+        <w:tabs>
+          <w:tab w:val="num" w:pos="720"/>
+        </w:tabs>
+        <w:ind w:left="720" w:hanging="360"/>
+      </w:pPr>
+    </w:lvl>
+    <w:lvl w:ilvl="1" w:tentative="1">
+      <w:start w:val="1"/>
+      <w:numFmt w:val="decimal"/>
+      <w:lvlText w:val="%2."/>
+      <w:lvlJc w:val="left"/>
+      <w:pPr>
+        <w:tabs>
+          <w:tab w:val="num" w:pos="1440"/>
+        </w:tabs>
+        <w:ind w:left="1440" w:hanging="360"/>
+      </w:pPr>
+    </w:lvl>
+    <w:lvl w:ilvl="2" w:tentative="1">
+      <w:start w:val="1"/>
+      <w:numFmt w:val="decimal"/>
+      <w:lvlText w:val="%3."/>
+      <w:lvlJc w:val="left"/>
+      <w:pPr>
+        <w:tabs>
+          <w:tab w:val="num" w:pos="2160"/>
+        </w:tabs>
+        <w:ind w:left="2160" w:hanging="360"/>
+      </w:pPr>
+    </w:lvl>
+    <w:lvl w:ilvl="3" w:tentative="1">
+      <w:start w:val="1"/>
+      <w:numFmt w:val="decimal"/>
+      <w:lvlText w:val="%4."/>
+      <w:lvlJc w:val="left"/>
+      <w:pPr>
+        <w:tabs>
+          <w:tab w:val="num" w:pos="2880"/>
+        </w:tabs>
+        <w:ind w:left="2880" w:hanging="360"/>
+      </w:pPr>
+    </w:lvl>
+    <w:lvl w:ilvl="4" w:tentative="1">
+      <w:start w:val="1"/>
+      <w:numFmt w:val="decimal"/>
+      <w:lvlText w:val="%5."/>
+      <w:lvlJc w:val="left"/>
+      <w:pPr>
+        <w:tabs>
+          <w:tab w:val="num" w:pos="3600"/>
+        </w:tabs>
+        <w:ind w:left="3600" w:hanging="360"/>
+      </w:pPr>
+    </w:lvl>
+    <w:lvl w:ilvl="5" w:tentative="1">
+      <w:start w:val="1"/>
+      <w:numFmt w:val="decimal"/>
+      <w:lvlText w:val="%6."/>
+      <w:lvlJc w:val="left"/>
+      <w:pPr>
+        <w:tabs>
+          <w:tab w:val="num" w:pos="4320"/>
+        </w:tabs>
+        <w:ind w:left="4320" w:hanging="360"/>
+      </w:pPr>
+    </w:lvl>
+    <w:lvl w:ilvl="6" w:tentative="1">
+      <w:start w:val="1"/>
+      <w:numFmt w:val="decimal"/>
+      <w:lvlText w:val="%7."/>
+      <w:lvlJc w:val="left"/>
+      <w:pPr>
+        <w:tabs>
+          <w:tab w:val="num" w:pos="5040"/>
+        </w:tabs>
+        <w:ind w:left="5040" w:hanging="360"/>
+      </w:pPr>
+    </w:lvl>
+    <w:lvl w:ilvl="7" w:tentative="1">
+      <w:start w:val="1"/>
+      <w:numFmt w:val="decimal"/>
+      <w:lvlText w:val="%8."/>
+      <w:lvlJc w:val="left"/>
+      <w:pPr>
+        <w:tabs>
+          <w:tab w:val="num" w:pos="5760"/>
+        </w:tabs>
+        <w:ind w:left="5760" w:hanging="360"/>
+      </w:pPr>
+    </w:lvl>
+    <w:lvl w:ilvl="8" w:tentative="1">
+      <w:start w:val="1"/>
+      <w:numFmt w:val="decimal"/>
+      <w:lvlText w:val="%9."/>
+      <w:lvlJc w:val="left"/>
+      <w:pPr>
+        <w:tabs>
+          <w:tab w:val="num" w:pos="6480"/>
+        </w:tabs>
+        <w:ind w:left="6480" w:hanging="360"/>
+      </w:pPr>
+    </w:lvl>
+  </w:abstractNum>
+  <w:abstractNum w:abstractNumId="9" w15:restartNumberingAfterBreak="0">
+    <w:nsid w:val="6CBC43C9"/>
+    <w:multiLevelType w:val="hybridMultilevel"/>
+    <w:tmpl w:val="4DC63066"/>
+    <w:lvl w:ilvl="0" w:tplc="735CEB80">
+      <w:start w:val="1"/>
+      <w:numFmt w:val="bullet"/>
+      <w:lvlText w:val=""/>
+      <w:lvlJc w:val="left"/>
+      <w:pPr>
+        <w:ind w:left="720" w:hanging="360"/>
+      </w:pPr>
+      <w:rPr>
+        <w:rFonts w:ascii="Symbol" w:hAnsi="Symbol" w:hint="default"/>
+      </w:rPr>
+    </w:lvl>
+    <w:lvl w:ilvl="1" w:tplc="04090003" w:tentative="1">
+      <w:start w:val="1"/>
+      <w:numFmt w:val="bullet"/>
+      <w:lvlText w:val="o"/>
+      <w:lvlJc w:val="left"/>
+      <w:pPr>
+        <w:ind w:left="1440" w:hanging="360"/>
+      </w:pPr>
+      <w:rPr>
+        <w:rFonts w:ascii="Courier New" w:hAnsi="Courier New" w:cs="Courier New" w:hint="default"/>
+      </w:rPr>
+    </w:lvl>
+    <w:lvl w:ilvl="2" w:tplc="04090005" w:tentative="1">
+      <w:start w:val="1"/>
+      <w:numFmt w:val="bullet"/>
+      <w:lvlText w:val=""/>
+      <w:lvlJc w:val="left"/>
+      <w:pPr>
+        <w:ind w:left="2160" w:hanging="360"/>
+      </w:pPr>
+      <w:rPr>
+        <w:rFonts w:ascii="Wingdings" w:hAnsi="Wingdings" w:hint="default"/>
+      </w:rPr>
+    </w:lvl>
+    <w:lvl w:ilvl="3" w:tplc="04090001" w:tentative="1">
+      <w:start w:val="1"/>
+      <w:numFmt w:val="bullet"/>
+      <w:lvlText w:val=""/>
+      <w:lvlJc w:val="left"/>
+      <w:pPr>
+        <w:ind w:left="2880" w:hanging="360"/>
+      </w:pPr>
+      <w:rPr>
+        <w:rFonts w:ascii="Symbol" w:hAnsi="Symbol" w:hint="default"/>
+      </w:rPr>
+    </w:lvl>
+    <w:lvl w:ilvl="4" w:tplc="04090003" w:tentative="1">
+      <w:start w:val="1"/>
+      <w:numFmt w:val="bullet"/>
+      <w:lvlText w:val="o"/>
+      <w:lvlJc w:val="left"/>
+      <w:pPr>
+        <w:ind w:left="3600" w:hanging="360"/>
+      </w:pPr>
+      <w:rPr>
+        <w:rFonts w:ascii="Courier New" w:hAnsi="Courier New" w:cs="Courier New" w:hint="default"/>
+      </w:rPr>
+    </w:lvl>
+    <w:lvl w:ilvl="5" w:tplc="04090005" w:tentative="1">
+      <w:start w:val="1"/>
+      <w:numFmt w:val="bullet"/>
+      <w:lvlText w:val=""/>
+      <w:lvlJc w:val="left"/>
+      <w:pPr>
+        <w:ind w:left="4320" w:hanging="360"/>
+      </w:pPr>
+      <w:rPr>
+        <w:rFonts w:ascii="Wingdings" w:hAnsi="Wingdings" w:hint="default"/>
+      </w:rPr>
+    </w:lvl>
+    <w:lvl w:ilvl="6" w:tplc="04090001" w:tentative="1">
+      <w:start w:val="1"/>
+      <w:numFmt w:val="bullet"/>
+      <w:lvlText w:val=""/>
+      <w:lvlJc w:val="left"/>
+      <w:pPr>
+        <w:ind w:left="5040" w:hanging="360"/>
+      </w:pPr>
+      <w:rPr>
+        <w:rFonts w:ascii="Symbol" w:hAnsi="Symbol" w:hint="default"/>
+      </w:rPr>
+    </w:lvl>
+    <w:lvl w:ilvl="7" w:tplc="04090003" w:tentative="1">
+      <w:start w:val="1"/>
+      <w:numFmt w:val="bullet"/>
+      <w:lvlText w:val="o"/>
+      <w:lvlJc w:val="left"/>
+      <w:pPr>
+        <w:ind w:left="5760" w:hanging="360"/>
+      </w:pPr>
+      <w:rPr>
+        <w:rFonts w:ascii="Courier New" w:hAnsi="Courier New" w:cs="Courier New" w:hint="default"/>
+      </w:rPr>
+    </w:lvl>
+    <w:lvl w:ilvl="8" w:tplc="04090005" w:tentative="1">
+      <w:start w:val="1"/>
+      <w:numFmt w:val="bullet"/>
+      <w:lvlText w:val=""/>
+      <w:lvlJc w:val="left"/>
+      <w:pPr>
+        <w:ind w:left="6480" w:hanging="360"/>
+      </w:pPr>
+      <w:rPr>
+        <w:rFonts w:ascii="Wingdings" w:hAnsi="Wingdings" w:hint="default"/>
+      </w:rPr>
+    </w:lvl>
+  </w:abstractNum>
+  <w:num w:numId="1" w16cid:durableId="408385506">
+    <w:abstractNumId w:val="8"/>
+  </w:num>
+  <w:num w:numId="2" w16cid:durableId="1595093323">
+    <w:abstractNumId w:val="7"/>
+  </w:num>
+  <w:num w:numId="3" w16cid:durableId="1043794736">
+    <w:abstractNumId w:val="4"/>
+  </w:num>
+  <w:num w:numId="4" w16cid:durableId="105933096">
+    <w:abstractNumId w:val="6"/>
+  </w:num>
+  <w:num w:numId="5" w16cid:durableId="757674649">
+    <w:abstractNumId w:val="2"/>
+  </w:num>
+  <w:num w:numId="6" w16cid:durableId="156657523">
+    <w:abstractNumId w:val="0"/>
+  </w:num>
+  <w:num w:numId="7" w16cid:durableId="40324540">
+    <w:abstractNumId w:val="9"/>
+  </w:num>
+  <w:num w:numId="8" w16cid:durableId="953515887">
+    <w:abstractNumId w:val="1"/>
+  </w:num>
+  <w:num w:numId="9" w16cid:durableId="1103039426">
+    <w:abstractNumId w:val="5"/>
+  </w:num>
+  <w:num w:numId="10" w16cid:durableId="710424099">
+    <w:abstractNumId w:val="3"/>
+  </w:num>
+</w:numbering>
+</file>
+
 <file path=word/styles.xml><?xml version="1.0" encoding="utf-8"?>
-<w:styles xmlns:mc="http://schemas.openxmlformats.org/markup-compatibility/2006" xmlns:r="http://schemas.openxmlformats.org/officeDocument/2006/relationships" xmlns:w="http://schemas.openxmlformats.org/wordprocessingml/2006/main" xmlns:w14="http://schemas.microsoft.com/office/word/2010/wordml" xmlns:w15="http://schemas.microsoft.com/office/word/2012/wordml" mc:Ignorable="w14 w15">
+<w:styles xmlns:mc="http://schemas.openxmlformats.org/markup-compatibility/2006" xmlns:r="http://schemas.openxmlformats.org/officeDocument/2006/relationships" xmlns:w="http://schemas.openxmlformats.org/wordprocessingml/2006/main" xmlns:w14="http://schemas.microsoft.com/office/word/2010/wordml" xmlns:w15="http://schemas.microsoft.com/office/word/2012/wordml" xmlns:w16cex="http://schemas.microsoft.com/office/word/2018/wordml/cex" xmlns:w16cid="http://schemas.microsoft.com/office/word/2016/wordml/cid" xmlns:w16="http://schemas.microsoft.com/office/word/2018/wordml" xmlns:w16du="http://schemas.microsoft.com/office/word/2023/wordml/word16du" xmlns:w16sdtdh="http://schemas.microsoft.com/office/word/2020/wordml/sdtdatahash" xmlns:w16sdtfl="http://schemas.microsoft.com/office/word/2024/wordml/sdtformatlock" xmlns:w16se="http://schemas.microsoft.com/office/word/2015/wordml/symex" mc:Ignorable="w14 w15 w16se w16cid w16 w16cex w16sdtdh w16sdtfl w16du">
   <w:docDefaults>
     <w:rPrDefault>
       <w:rPr>
@@ -1530,7 +3799,7 @@
       </w:pPr>
     </w:pPrDefault>
   </w:docDefaults>
-  <w:latentStyles w:defLockedState="0" w:defUIPriority="99" w:defSemiHidden="0" w:defUnhideWhenUsed="0" w:defQFormat="0" w:count="371">
+  <w:latentStyles w:defLockedState="0" w:defUIPriority="99" w:defSemiHidden="0" w:defUnhideWhenUsed="0" w:defQFormat="0" w:count="376">
     <w:lsdException w:name="Normal" w:uiPriority="0"/>
     <w:lsdException w:name="heading 1" w:uiPriority="9"/>
     <w:lsdException w:name="heading 2" w:semiHidden="1" w:uiPriority="9" w:unhideWhenUsed="1"/>
@@ -1902,6 +4171,11 @@
     <w:lsdException w:name="List Table 5 Dark Accent 6" w:uiPriority="50"/>
     <w:lsdException w:name="List Table 6 Colorful Accent 6" w:uiPriority="51"/>
     <w:lsdException w:name="List Table 7 Colorful Accent 6" w:uiPriority="52"/>
+    <w:lsdException w:name="Mention" w:semiHidden="1" w:unhideWhenUsed="1"/>
+    <w:lsdException w:name="Smart Hyperlink" w:semiHidden="1" w:unhideWhenUsed="1"/>
+    <w:lsdException w:name="Hashtag" w:semiHidden="1" w:unhideWhenUsed="1"/>
+    <w:lsdException w:name="Unresolved Mention" w:semiHidden="1" w:unhideWhenUsed="1"/>
+    <w:lsdException w:name="Smart Link" w:semiHidden="1" w:unhideWhenUsed="1"/>
   </w:latentStyles>
   <w:style w:type="paragraph" w:default="1" w:styleId="Normal">
     <w:name w:val="Normal"/>
@@ -1910,7 +4184,6 @@
   <w:style w:type="character" w:default="1" w:styleId="DefaultParagraphFont">
     <w:name w:val="Default Paragraph Font"/>
     <w:uiPriority w:val="1"/>
-    <w:semiHidden/>
     <w:unhideWhenUsed/>
   </w:style>
   <w:style w:type="table" w:default="1" w:styleId="TableNormal">
@@ -2024,10 +4297,11 @@
     <w:basedOn w:val="Normal"/>
     <w:link w:val="ChuongChar"/>
     <w:qFormat/>
-    <w:rsid w:val="003140BE"/>
+    <w:rsid w:val="0017370E"/>
     <w:pPr>
       <w:spacing w:before="120" w:after="120" w:line="360" w:lineRule="auto"/>
       <w:jc w:val="center"/>
+      <w:outlineLvl w:val="0"/>
     </w:pPr>
     <w:rPr>
       <w:b/>
@@ -2058,7 +4332,7 @@
     <w:name w:val="Chuong Char"/>
     <w:basedOn w:val="NoiDungChar"/>
     <w:link w:val="Chuong"/>
-    <w:rsid w:val="003140BE"/>
+    <w:rsid w:val="0017370E"/>
     <w:rPr>
       <w:b/>
       <w:color w:val="000000" w:themeColor="text1"/>
@@ -2086,7 +4360,6 @@
   <w:style w:type="paragraph" w:customStyle="1" w:styleId="Style">
     <w:name w:val="Style"/>
     <w:link w:val="StyleChar"/>
-    <w:qFormat/>
     <w:rsid w:val="004247E4"/>
     <w:pPr>
       <w:spacing w:before="120" w:after="120" w:line="240" w:lineRule="auto"/>
@@ -2136,6 +4409,51 @@
       <w:color w:val="000000" w:themeColor="text1"/>
       <w:sz w:val="26"/>
     </w:rPr>
+  </w:style>
+  <w:style w:type="paragraph" w:customStyle="1" w:styleId="VanBan">
+    <w:name w:val="VanBan"/>
+    <w:basedOn w:val="Chuong"/>
+    <w:link w:val="VanBanChar"/>
+    <w:qFormat/>
+    <w:rsid w:val="00B8799B"/>
+    <w:pPr>
+      <w:jc w:val="left"/>
+      <w:outlineLvl w:val="9"/>
+    </w:pPr>
+    <w:rPr>
+      <w:b w:val="0"/>
+      <w:sz w:val="26"/>
+    </w:rPr>
+  </w:style>
+  <w:style w:type="character" w:customStyle="1" w:styleId="VanBanChar">
+    <w:name w:val="VanBan Char"/>
+    <w:basedOn w:val="ChuongChar"/>
+    <w:link w:val="VanBan"/>
+    <w:rsid w:val="00B8799B"/>
+    <w:rPr>
+      <w:b w:val="0"/>
+      <w:color w:val="000000" w:themeColor="text1"/>
+      <w:sz w:val="26"/>
+    </w:rPr>
+  </w:style>
+  <w:style w:type="table" w:styleId="TableGrid">
+    <w:name w:val="Table Grid"/>
+    <w:basedOn w:val="TableNormal"/>
+    <w:uiPriority w:val="39"/>
+    <w:rsid w:val="00913D52"/>
+    <w:pPr>
+      <w:spacing w:after="0" w:line="240" w:lineRule="auto"/>
+    </w:pPr>
+    <w:tblPr>
+      <w:tblBorders>
+        <w:top w:val="single" w:sz="4" w:space="0" w:color="auto"/>
+        <w:left w:val="single" w:sz="4" w:space="0" w:color="auto"/>
+        <w:bottom w:val="single" w:sz="4" w:space="0" w:color="auto"/>
+        <w:right w:val="single" w:sz="4" w:space="0" w:color="auto"/>
+        <w:insideH w:val="single" w:sz="4" w:space="0" w:color="auto"/>
+        <w:insideV w:val="single" w:sz="4" w:space="0" w:color="auto"/>
+      </w:tblBorders>
+    </w:tblPr>
   </w:style>
 </w:styles>
 </file>

</xml_diff>

<commit_message>
Hoan thanh chuong 1 va chuong 2
</commit_message>
<xml_diff>
--- a/baocao.docx
+++ b/baocao.docx
@@ -1549,13 +1549,7 @@
         <w:jc w:val="both"/>
       </w:pPr>
       <w:r>
-        <w:t>Đối tượng nghiên cứu</w:t>
-      </w:r>
-      <w:r>
-        <w:t xml:space="preserve"> </w:t>
-      </w:r>
-      <w:r>
-        <w:t>:</w:t>
+        <w:t>Đối tượng nghiên cứu :</w:t>
       </w:r>
     </w:p>
     <w:p>
@@ -1616,13 +1610,7 @@
         <w:jc w:val="both"/>
       </w:pPr>
       <w:r>
-        <w:t>Phạm vi nghiên cứu</w:t>
-      </w:r>
-      <w:r>
-        <w:t xml:space="preserve"> </w:t>
-      </w:r>
-      <w:r>
-        <w:t>:</w:t>
+        <w:t>Phạm vi nghiên cứu :</w:t>
       </w:r>
     </w:p>
     <w:p>
@@ -1728,10 +1716,7 @@
         <w:jc w:val="both"/>
       </w:pPr>
       <w:r>
-        <w:t>P</w:t>
-      </w:r>
-      <w:r>
-        <w:t>hân tích, thiết kế mô hình dữ liệu ERD và sơ đồ luồng dữ liệu DFD.</w:t>
+        <w:t>Phân tích, thiết kế mô hình dữ liệu ERD và sơ đồ luồng dữ liệu DFD.</w:t>
       </w:r>
     </w:p>
     <w:p>
@@ -2010,8 +1995,232 @@
     </w:p>
     <w:p>
       <w:pPr>
-        <w:pStyle w:val="VanBan"/>
-      </w:pPr>
+        <w:pStyle w:val="Muc"/>
+        <w:rPr>
+          <w:bCs/>
+        </w:rPr>
+      </w:pPr>
+      <w:r>
+        <w:rPr>
+          <w:bCs/>
+        </w:rPr>
+        <w:t>1.1. Bối cảnh và sự cần thiết của đề tài</w:t>
+      </w:r>
+    </w:p>
+    <w:p>
+      <w:pPr>
+        <w:pStyle w:val="VanBan"/>
+        <w:jc w:val="both"/>
+      </w:pPr>
+      <w:r>
+        <w:tab/>
+      </w:r>
+      <w:r>
+        <w:t>Hiện nay, thương mại điện tử và các hoạt động kinh doanh trực tuyến đang phát triển mạnh mẽ. Đối với bất kỳ doanh nghiệp hay cửa hàng bán lẻ nào, việc sở hữu một hệ thống quản lý bán hàng là điều kiện tiên quyết để duy trì khả năng cạnh tranh. Trước đây, nhiều cửa hàng vẫn sử dụng sổ sách hoặc các bảng tính Excel để quản lý hàng hóa, ghi nhận đơn hàng và lưu trữ thông tin khách hàng. Phương pháp thủ công này bộc lộ nhiều hạn chế như</w:t>
+      </w:r>
+      <w:r>
+        <w:t xml:space="preserve"> </w:t>
+      </w:r>
+      <w:r>
+        <w:t>:</w:t>
+      </w:r>
+    </w:p>
+    <w:p>
+      <w:pPr>
+        <w:pStyle w:val="VanBan"/>
+        <w:numPr>
+          <w:ilvl w:val="0"/>
+          <w:numId w:val="11"/>
+        </w:numPr>
+        <w:jc w:val="both"/>
+      </w:pPr>
+      <w:r>
+        <w:t>Dễ xảy ra sai sót trong quá trình nhập liệu.</w:t>
+      </w:r>
+    </w:p>
+    <w:p>
+      <w:pPr>
+        <w:pStyle w:val="VanBan"/>
+        <w:numPr>
+          <w:ilvl w:val="0"/>
+          <w:numId w:val="11"/>
+        </w:numPr>
+        <w:jc w:val="both"/>
+      </w:pPr>
+      <w:r>
+        <w:t>Khó khăn trong việc tìm kiếm, tra cứu thông tin sản phẩm và lịch sử giao dịch.</w:t>
+      </w:r>
+    </w:p>
+    <w:p>
+      <w:pPr>
+        <w:pStyle w:val="VanBan"/>
+        <w:numPr>
+          <w:ilvl w:val="0"/>
+          <w:numId w:val="11"/>
+        </w:numPr>
+        <w:jc w:val="both"/>
+      </w:pPr>
+      <w:r>
+        <w:t>Không thể quản lý hàng hóa và đơn hàng theo thời gian thực (real-time).</w:t>
+      </w:r>
+    </w:p>
+    <w:p>
+      <w:pPr>
+        <w:pStyle w:val="VanBan"/>
+        <w:numPr>
+          <w:ilvl w:val="0"/>
+          <w:numId w:val="11"/>
+        </w:numPr>
+        <w:jc w:val="both"/>
+      </w:pPr>
+      <w:r>
+        <w:t>Khả năng mở rộng kém khi quy mô kinh doanh tăng lên.</w:t>
+      </w:r>
+    </w:p>
+    <w:p>
+      <w:pPr>
+        <w:pStyle w:val="VanBan"/>
+        <w:jc w:val="both"/>
+      </w:pPr>
+      <w:r>
+        <w:t>Từ những hạn chế đó, việc phát triển một Ứng dụng Web Quản lý bán hàng đóng vai trò thiết yếu. Hệ thống này không chỉ giúp tự động hóa quy trình nghiệp vụ mà còn mang lại trải nghiệm mua sắm tiện lợi cho khách hàng thông qua giao diện trực tuyến.</w:t>
+      </w:r>
+    </w:p>
+    <w:p>
+      <w:pPr>
+        <w:pStyle w:val="Muc"/>
+      </w:pPr>
+      <w:r>
+        <w:t>1.2. Hiện trạng các giải pháp quản lý bán hàng</w:t>
+      </w:r>
+    </w:p>
+    <w:p>
+      <w:pPr>
+        <w:pStyle w:val="VanBan"/>
+        <w:jc w:val="both"/>
+      </w:pPr>
+      <w:r>
+        <w:tab/>
+      </w:r>
+      <w:r>
+        <w:t>Trên thị trường hiện có rất nhiều nền tảng và phần mềm quản lý bán hàng (như KiotViet, Sapo, Haravan,...). Các hệ thống này cung cấp giải pháp toàn diện và chuyên nghiệp, tuy nhiên chúng thường đi kèm với chi phí sử dụng hàng tháng hoặc hàng năm, đồng thời chứa nhiều tính năng phức tạp mà một cửa hàng quy mô nhỏ có thể không cần tới.</w:t>
+      </w:r>
+    </w:p>
+    <w:p>
+      <w:pPr>
+        <w:pStyle w:val="VanBan"/>
+        <w:jc w:val="both"/>
+      </w:pPr>
+      <w:r>
+        <w:t>Mặt khác, đối với môi trường học thuật, việc tự tay xây dựng một hệ thống từ đầu mang ý nghĩa to lớn trong việc rèn luyện tư duy lập trình và kỹ năng giải quyết vấn đề. Thay vì sử dụng một framework đồ sộ, việc tích hợp trực tiếp HTML, CSS, JavaScript và các truy vấn cơ sở dữ liệu SQL Server vào trong một file kịch bản PHP giúp sinh viên hiểu rõ luồng đi của dữ liệu từ Client đến Server và ngược lại.</w:t>
+      </w:r>
+    </w:p>
+    <w:p>
+      <w:pPr>
+        <w:pStyle w:val="VanBan"/>
+      </w:pPr>
+    </w:p>
+    <w:p>
+      <w:pPr>
+        <w:pStyle w:val="VanBan"/>
+      </w:pPr>
+    </w:p>
+    <w:p>
+      <w:pPr>
+        <w:pStyle w:val="Muc"/>
+      </w:pPr>
+      <w:r>
+        <w:lastRenderedPageBreak/>
+        <w:t>1.3. Phương pháp tiếp cận và công nghệ áp dụng</w:t>
+      </w:r>
+    </w:p>
+    <w:p>
+      <w:pPr>
+        <w:pStyle w:val="VanBan"/>
+        <w:jc w:val="both"/>
+      </w:pPr>
+      <w:r>
+        <w:tab/>
+      </w:r>
+      <w:r>
+        <w:t>Để giải quyết bài toán trên và hoàn thành mục tiêu môn học, đồ án lựa chọn hướng tiếp cận thực tế, sử dụng các công nghệ mã nguồn mở và nền tảng cơ sở dữ liệu mạnh mẽ</w:t>
+      </w:r>
+      <w:r>
+        <w:t xml:space="preserve"> : </w:t>
+      </w:r>
+    </w:p>
+    <w:p>
+      <w:pPr>
+        <w:pStyle w:val="VanBan"/>
+        <w:numPr>
+          <w:ilvl w:val="0"/>
+          <w:numId w:val="13"/>
+        </w:numPr>
+        <w:jc w:val="both"/>
+      </w:pPr>
+      <w:r>
+        <w:t>Môi trường vận hành</w:t>
+      </w:r>
+      <w:r>
+        <w:t xml:space="preserve"> </w:t>
+      </w:r>
+      <w:r>
+        <w:t>: Đề tài sử dụng nền tảng Docker để đóng gói toàn bộ môi trường chạy ứng dụng. Việc ảo hóa bằng container giúp giải quyết triệt để vấn đề "chạy được trên máy này nhưng lỗi trên máy khác", đồng thời giúp quá trình triển khai (deploy) trở nên nhanh chóng và đồng nhất.</w:t>
+      </w:r>
+    </w:p>
+    <w:p>
+      <w:pPr>
+        <w:pStyle w:val="VanBan"/>
+        <w:numPr>
+          <w:ilvl w:val="0"/>
+          <w:numId w:val="13"/>
+        </w:numPr>
+        <w:jc w:val="both"/>
+      </w:pPr>
+      <w:r>
+        <w:t>Ngôn ngữ phát triển</w:t>
+      </w:r>
+      <w:r>
+        <w:t xml:space="preserve"> </w:t>
+      </w:r>
+      <w:r>
+        <w:t>: Ứng dụng được xây dựng chủ yếu bằng PHP – một ngôn ngữ kịch bản phía máy chủ mạnh mẽ và phổ biến nhất trong phát triển Web. PHP sẽ đóng vai trò xử lý logic, nhận yêu cầu từ người dùng, thao tác với CSDL và trả về kết quả dưới dạng giao diện (HTML/CSS/JS).</w:t>
+      </w:r>
+    </w:p>
+    <w:p>
+      <w:pPr>
+        <w:pStyle w:val="VanBan"/>
+        <w:numPr>
+          <w:ilvl w:val="0"/>
+          <w:numId w:val="13"/>
+        </w:numPr>
+        <w:jc w:val="both"/>
+      </w:pPr>
+      <w:r>
+        <w:t>Hệ quản trị CSDL</w:t>
+      </w:r>
+      <w:r>
+        <w:t xml:space="preserve"> </w:t>
+      </w:r>
+      <w:r>
+        <w:t>: Dữ liệu của hệ thống được lưu trữ và quản lý tập trung bằng SQL Server. Đây là một hệ quản trị cơ sở dữ liệu quan hệ (RDBMS) ổn định, an toàn và tối ưu cho các bài toán quản lý.</w:t>
+      </w:r>
+    </w:p>
+    <w:p>
+      <w:pPr>
+        <w:pStyle w:val="Muc"/>
+      </w:pPr>
+      <w:r>
+        <w:t>1.4. Tóm tắt định hướng chương tiếp theo</w:t>
+      </w:r>
+    </w:p>
+    <w:p>
+      <w:pPr>
+        <w:pStyle w:val="VanBan"/>
+      </w:pPr>
+      <w:r>
+        <w:t>Sau khi đã làm rõ bức tranh tổng quan, sự cần thiết của đề tài và hiện trạng công nghệ ở Chương 1, đồ án sẽ tiếp tục đi sâu vào việc phân tích các công nghệ cốt lõi được sử dụng. Cụ thể, Chương 2 sẽ trình bày chi tiết về cơ sở lý thuyết, bao gồm kiến trúc của Docker, cơ chế hoạt động của PHP và cú pháp truy vấn SQL Server, tạo tiền đề vững chắc cho việc thiết kế và xây dựng hệ thống ở các chương sau.</w:t>
+      </w:r>
     </w:p>
     <w:p>
       <w:pPr>
@@ -2031,6 +2240,1139 @@
     <w:p>
       <w:pPr>
         <w:pStyle w:val="Muc"/>
+      </w:pPr>
+      <w:r>
+        <w:t>2.1. Môi trường và công nghệ đóng gói</w:t>
+      </w:r>
+    </w:p>
+    <w:p>
+      <w:pPr>
+        <w:pStyle w:val="TieuMuc"/>
+      </w:pPr>
+      <w:r>
+        <w:t xml:space="preserve">   </w:t>
+      </w:r>
+      <w:r>
+        <w:t>2.1.1. Khái niệm về Docker</w:t>
+      </w:r>
+    </w:p>
+    <w:p>
+      <w:pPr>
+        <w:pStyle w:val="VanBan"/>
+        <w:jc w:val="both"/>
+      </w:pPr>
+      <w:r>
+        <w:tab/>
+      </w:r>
+      <w:r>
+        <w:t>Docker là một nền tảng phần mềm mã nguồn mở cho phép các nhà phát triển tự động hóa việc triển khai ứng dụng bên trong các container (vùng chứa) phần mềm. Thay vì sử dụng các máy ảo Virtual Machine với hệ điều hành đầy đủ gây tốn kém tài nguyên, Docker sử dụng kỹ thuật ảo hóa cấp hệ điều hành. Điều này cho phép nhiều container chạy độc lập trên cùng một máy chủ (host) nhưng vẫn dùng chung một nhân (kernel) hệ điều hành, giúp hệ thống hoạt động nhẹ, nhanh và tiết kiệm tài nguyên.</w:t>
+      </w:r>
+    </w:p>
+    <w:p>
+      <w:pPr>
+        <w:pStyle w:val="VanBan"/>
+        <w:jc w:val="both"/>
+      </w:pPr>
+    </w:p>
+    <w:p>
+      <w:pPr>
+        <w:pStyle w:val="VanBan"/>
+        <w:jc w:val="center"/>
+      </w:pPr>
+      <w:r>
+        <w:rPr>
+          <w:noProof/>
+        </w:rPr>
+        <w:drawing>
+          <wp:inline distT="0" distB="0" distL="0" distR="0" wp14:anchorId="644BB081" wp14:editId="01DCBB26">
+            <wp:extent cx="3264913" cy="1836420"/>
+            <wp:effectExtent l="0" t="0" r="0" b="0"/>
+            <wp:docPr id="191782173" name="Picture 1" descr="SIT Portfolio"/>
+            <wp:cNvGraphicFramePr>
+              <a:graphicFrameLocks xmlns:a="http://schemas.openxmlformats.org/drawingml/2006/main" noChangeAspect="1"/>
+            </wp:cNvGraphicFramePr>
+            <a:graphic xmlns:a="http://schemas.openxmlformats.org/drawingml/2006/main">
+              <a:graphicData uri="http://schemas.openxmlformats.org/drawingml/2006/picture">
+                <pic:pic xmlns:pic="http://schemas.openxmlformats.org/drawingml/2006/picture">
+                  <pic:nvPicPr>
+                    <pic:cNvPr id="0" name="Picture 1" descr="SIT Portfolio"/>
+                    <pic:cNvPicPr>
+                      <a:picLocks noChangeAspect="1" noChangeArrowheads="1"/>
+                    </pic:cNvPicPr>
+                  </pic:nvPicPr>
+                  <pic:blipFill>
+                    <a:blip r:embed="rId11" cstate="print">
+                      <a:extLst>
+                        <a:ext uri="{28A0092B-C50C-407E-A947-70E740481C1C}">
+                          <a14:useLocalDpi xmlns:a14="http://schemas.microsoft.com/office/drawing/2010/main" val="0"/>
+                        </a:ext>
+                      </a:extLst>
+                    </a:blip>
+                    <a:srcRect/>
+                    <a:stretch>
+                      <a:fillRect/>
+                    </a:stretch>
+                  </pic:blipFill>
+                  <pic:spPr bwMode="auto">
+                    <a:xfrm>
+                      <a:off x="0" y="0"/>
+                      <a:ext cx="3290286" cy="1850692"/>
+                    </a:xfrm>
+                    <a:prstGeom prst="rect">
+                      <a:avLst/>
+                    </a:prstGeom>
+                    <a:noFill/>
+                    <a:ln>
+                      <a:noFill/>
+                    </a:ln>
+                  </pic:spPr>
+                </pic:pic>
+              </a:graphicData>
+            </a:graphic>
+          </wp:inline>
+        </w:drawing>
+      </w:r>
+    </w:p>
+    <w:p>
+      <w:pPr>
+        <w:pStyle w:val="Hinh"/>
+      </w:pPr>
+      <w:r>
+        <w:t>Hình 2.1. Docker</w:t>
+      </w:r>
+    </w:p>
+    <w:p>
+      <w:pPr>
+        <w:pStyle w:val="VanBan"/>
+      </w:pPr>
+    </w:p>
+    <w:p>
+      <w:pPr>
+        <w:pStyle w:val="TieuMuc"/>
+      </w:pPr>
+      <w:r>
+        <w:t xml:space="preserve">   </w:t>
+      </w:r>
+      <w:r>
+        <w:t>2.1.2. Vai trò của Docker trong dự án</w:t>
+      </w:r>
+    </w:p>
+    <w:p>
+      <w:pPr>
+        <w:pStyle w:val="VanBan"/>
+        <w:jc w:val="both"/>
+      </w:pPr>
+      <w:r>
+        <w:tab/>
+      </w:r>
+      <w:r>
+        <w:t>Trong đồ án này, môi trường phát triển đòi hỏi sự phối hợp giữa nhiều thành phần như Web Server và Database Server. Docker giải quyết các vấn đề sau</w:t>
+      </w:r>
+      <w:r>
+        <w:t xml:space="preserve"> </w:t>
+      </w:r>
+      <w:r>
+        <w:t>:</w:t>
+      </w:r>
+    </w:p>
+    <w:p>
+      <w:pPr>
+        <w:pStyle w:val="VanBan"/>
+        <w:numPr>
+          <w:ilvl w:val="0"/>
+          <w:numId w:val="15"/>
+        </w:numPr>
+        <w:jc w:val="both"/>
+      </w:pPr>
+      <w:r>
+        <w:t>Tính nhất quán</w:t>
+      </w:r>
+      <w:r>
+        <w:t xml:space="preserve"> </w:t>
+      </w:r>
+      <w:r>
+        <w:t>: Đảm bảo ứng dụng hoạt động giống hệt nhau trên máy tính cá nhân của người phát triển, máy chủ thử nghiệm hay môi trường thực tế, triệt tiêu lỗi "it works on my machine".</w:t>
+      </w:r>
+    </w:p>
+    <w:p>
+      <w:pPr>
+        <w:pStyle w:val="VanBan"/>
+        <w:numPr>
+          <w:ilvl w:val="0"/>
+          <w:numId w:val="15"/>
+        </w:numPr>
+        <w:jc w:val="both"/>
+      </w:pPr>
+      <w:r>
+        <w:t>Đóng gói và triển khai dễ dàng</w:t>
+      </w:r>
+      <w:r>
+        <w:t xml:space="preserve"> </w:t>
+      </w:r>
+      <w:r>
+        <w:t xml:space="preserve">: Thông qua Dockerfile (định nghĩa môi trường cho PHP) và docker-compose.yml (định nghĩa và liên kết các dịch vụ PHP, </w:t>
+      </w:r>
+      <w:r>
+        <w:lastRenderedPageBreak/>
+        <w:t>SQL Server), toàn bộ hệ thống có thể được khởi động chỉ với một câu lệnh đơn giản, không cần cài đặt thủ công từng phần mềm rườm rà.</w:t>
+      </w:r>
+    </w:p>
+    <w:p>
+      <w:pPr>
+        <w:pStyle w:val="VanBan"/>
+        <w:numPr>
+          <w:ilvl w:val="0"/>
+          <w:numId w:val="15"/>
+        </w:numPr>
+        <w:jc w:val="both"/>
+      </w:pPr>
+      <w:r>
+        <w:t>Tính cô lập</w:t>
+      </w:r>
+      <w:r>
+        <w:t xml:space="preserve"> </w:t>
+      </w:r>
+      <w:r>
+        <w:t>: Các dịch vụ như Web Server và CSDL chạy trong các container riêng biệt, tránh xung đột về thư viện hay cổng mạng với các ứng dụng khác đang chạy trên máy chủ.</w:t>
+      </w:r>
+    </w:p>
+    <w:p>
+      <w:pPr>
+        <w:pStyle w:val="Muc"/>
+      </w:pPr>
+      <w:r>
+        <w:t>2.2. Ngôn ngữ kịch bản phía Server</w:t>
+      </w:r>
+    </w:p>
+    <w:p>
+      <w:pPr>
+        <w:pStyle w:val="TieuMuc"/>
+      </w:pPr>
+      <w:r>
+        <w:t xml:space="preserve">   </w:t>
+      </w:r>
+      <w:r>
+        <w:t>2.2.1. Giới thiệu về PHP</w:t>
+      </w:r>
+    </w:p>
+    <w:p>
+      <w:pPr>
+        <w:pStyle w:val="VanBan"/>
+        <w:jc w:val="both"/>
+      </w:pPr>
+      <w:r>
+        <w:tab/>
+      </w:r>
+      <w:r>
+        <w:t>PHP (viết tắt hồi quy của Hypertext Preprocessor) là một ngôn ngữ lập trình kịch bản mã nguồn mở, hoạt động ở phía máy chủ (Server-side) và được thiết kế đặc biệt để phát triển ứng dụng Web. Các tệp PHP có thể chứa văn bản, HTML, CSS, JavaScript và mã PHP.</w:t>
+      </w:r>
+    </w:p>
+    <w:p>
+      <w:pPr>
+        <w:pStyle w:val="VanBan"/>
+        <w:jc w:val="both"/>
+      </w:pPr>
+      <w:r>
+        <w:t>Khi một người dùng (Client) gửi yêu cầu truy cập một trang web, máy chủ Web sẽ thực thi mã PHP, sau đó trả về kết quả cho trình duyệt của người dùng dưới dạng mã HTML thuần túy.</w:t>
+      </w:r>
+    </w:p>
+    <w:p>
+      <w:pPr>
+        <w:pStyle w:val="VanBan"/>
+        <w:jc w:val="both"/>
+      </w:pPr>
+    </w:p>
+    <w:p>
+      <w:pPr>
+        <w:pStyle w:val="VanBan"/>
+        <w:jc w:val="center"/>
+      </w:pPr>
+      <w:r>
+        <w:rPr>
+          <w:noProof/>
+        </w:rPr>
+        <w:drawing>
+          <wp:inline distT="0" distB="0" distL="0" distR="0" wp14:anchorId="5315C178" wp14:editId="5D773CF9">
+            <wp:extent cx="3947160" cy="1973580"/>
+            <wp:effectExtent l="0" t="0" r="0" b="7620"/>
+            <wp:docPr id="1922874511" name="Picture 5" descr="Php Logo large resolution 2048x1024 PNG picture - Transparent ..."/>
+            <wp:cNvGraphicFramePr>
+              <a:graphicFrameLocks xmlns:a="http://schemas.openxmlformats.org/drawingml/2006/main" noChangeAspect="1"/>
+            </wp:cNvGraphicFramePr>
+            <a:graphic xmlns:a="http://schemas.openxmlformats.org/drawingml/2006/main">
+              <a:graphicData uri="http://schemas.openxmlformats.org/drawingml/2006/picture">
+                <pic:pic xmlns:pic="http://schemas.openxmlformats.org/drawingml/2006/picture">
+                  <pic:nvPicPr>
+                    <pic:cNvPr id="0" name="Picture 18" descr="Php Logo large resolution 2048x1024 PNG picture - Transparent ..."/>
+                    <pic:cNvPicPr>
+                      <a:picLocks noChangeAspect="1" noChangeArrowheads="1"/>
+                    </pic:cNvPicPr>
+                  </pic:nvPicPr>
+                  <pic:blipFill>
+                    <a:blip r:embed="rId12" cstate="print">
+                      <a:extLst>
+                        <a:ext uri="{28A0092B-C50C-407E-A947-70E740481C1C}">
+                          <a14:useLocalDpi xmlns:a14="http://schemas.microsoft.com/office/drawing/2010/main" val="0"/>
+                        </a:ext>
+                      </a:extLst>
+                    </a:blip>
+                    <a:srcRect/>
+                    <a:stretch>
+                      <a:fillRect/>
+                    </a:stretch>
+                  </pic:blipFill>
+                  <pic:spPr bwMode="auto">
+                    <a:xfrm>
+                      <a:off x="0" y="0"/>
+                      <a:ext cx="3947160" cy="1973580"/>
+                    </a:xfrm>
+                    <a:prstGeom prst="rect">
+                      <a:avLst/>
+                    </a:prstGeom>
+                    <a:noFill/>
+                    <a:ln>
+                      <a:noFill/>
+                    </a:ln>
+                  </pic:spPr>
+                </pic:pic>
+              </a:graphicData>
+            </a:graphic>
+          </wp:inline>
+        </w:drawing>
+      </w:r>
+    </w:p>
+    <w:p>
+      <w:pPr>
+        <w:pStyle w:val="Hinh"/>
+      </w:pPr>
+      <w:r>
+        <w:t>Hình 2.2. PHP</w:t>
+      </w:r>
+    </w:p>
+    <w:p>
+      <w:pPr>
+        <w:pStyle w:val="VanBan"/>
+      </w:pPr>
+    </w:p>
+    <w:p>
+      <w:pPr>
+        <w:pStyle w:val="TieuMuc"/>
+      </w:pPr>
+      <w:r>
+        <w:t xml:space="preserve">   </w:t>
+      </w:r>
+      <w:r>
+        <w:t>2.2.2. Đặc điểm kỹ thuật áp dụng trong đồ án</w:t>
+      </w:r>
+    </w:p>
+    <w:p>
+      <w:pPr>
+        <w:pStyle w:val="VanBan"/>
+        <w:jc w:val="both"/>
+      </w:pPr>
+      <w:r>
+        <w:tab/>
+      </w:r>
+      <w:r>
+        <w:t>Với định hướng tích hợp toàn bộ các thành phần trong cùng một tệp, PHP thể hiện sự linh hoạt mạnh mẽ</w:t>
+      </w:r>
+      <w:r>
+        <w:t xml:space="preserve"> </w:t>
+      </w:r>
+      <w:r>
+        <w:t>:</w:t>
+      </w:r>
+    </w:p>
+    <w:p>
+      <w:pPr>
+        <w:pStyle w:val="VanBan"/>
+        <w:numPr>
+          <w:ilvl w:val="0"/>
+          <w:numId w:val="16"/>
+        </w:numPr>
+        <w:jc w:val="both"/>
+      </w:pPr>
+      <w:r>
+        <w:lastRenderedPageBreak/>
+        <w:t>Nhúng trực tiếp vào HTML</w:t>
+      </w:r>
+      <w:r>
+        <w:t xml:space="preserve"> </w:t>
+      </w:r>
+      <w:r>
+        <w:t>: Mã PHP được đặt bên trong các thẻ &lt;?php ... ?&gt; và có thể xen kẽ trực tiếp với cấu trúc HTML. Điều này giúp dễ dàng hiển thị động các dữ liệu, chẳng hạn như danh sách sản phẩm hay thông tin giỏ hàng.</w:t>
+      </w:r>
+    </w:p>
+    <w:p>
+      <w:pPr>
+        <w:pStyle w:val="VanBan"/>
+        <w:numPr>
+          <w:ilvl w:val="0"/>
+          <w:numId w:val="16"/>
+        </w:numPr>
+        <w:jc w:val="both"/>
+      </w:pPr>
+      <w:r>
+        <w:t>Xử lý form và dữ liệu người dùng</w:t>
+      </w:r>
+      <w:r>
+        <w:t xml:space="preserve"> </w:t>
+      </w:r>
+      <w:r>
+        <w:t>: PHP có khả năng thu thập dữ liệu từ các form HTML (thông qua phương thức GET, POST), xử lý các logic như tính toán tổng tiền, kiểm tra đăng nhập.</w:t>
+      </w:r>
+    </w:p>
+    <w:p>
+      <w:pPr>
+        <w:pStyle w:val="VanBan"/>
+        <w:numPr>
+          <w:ilvl w:val="0"/>
+          <w:numId w:val="16"/>
+        </w:numPr>
+        <w:jc w:val="both"/>
+      </w:pPr>
+      <w:r>
+        <w:t>Quản lý Session/Cookie</w:t>
+      </w:r>
+      <w:r>
+        <w:t xml:space="preserve"> </w:t>
+      </w:r>
+      <w:r>
+        <w:t>: PHP hỗ trợ mạnh mẽ việc lưu trữ trạng thái người dùng (ví dụ</w:t>
+      </w:r>
+      <w:r>
+        <w:t xml:space="preserve"> </w:t>
+      </w:r>
+      <w:r>
+        <w:t>: lưu thông tin giỏ hàng hoặc phiên đăng nhập của quản trị viên) mà không cần truy xuất cơ sở dữ liệu liên tục.</w:t>
+      </w:r>
+    </w:p>
+    <w:p>
+      <w:pPr>
+        <w:pStyle w:val="VanBan"/>
+        <w:numPr>
+          <w:ilvl w:val="0"/>
+          <w:numId w:val="16"/>
+        </w:numPr>
+        <w:jc w:val="both"/>
+      </w:pPr>
+      <w:r>
+        <w:t>Kết nối cơ sở dữ liệu</w:t>
+      </w:r>
+      <w:r>
+        <w:t xml:space="preserve"> </w:t>
+      </w:r>
+      <w:r>
+        <w:t>: PHP cung cấp các phần mở rộng (extensions) như PDO hoặc SQLSRV, cho phép thực thi trực tiếp các câu lệnh truy vấn tới SQL Server ngay bên trong tệp nguồn PHP.</w:t>
+      </w:r>
+    </w:p>
+    <w:p>
+      <w:pPr>
+        <w:pStyle w:val="Muc"/>
+      </w:pPr>
+      <w:r>
+        <w:t>2.3. Hệ quản trị Cơ sở dữ liệu và Ngôn ngữ truy vấn SQL</w:t>
+      </w:r>
+    </w:p>
+    <w:p>
+      <w:pPr>
+        <w:pStyle w:val="TieuMuc"/>
+      </w:pPr>
+      <w:r>
+        <w:t xml:space="preserve">   </w:t>
+      </w:r>
+      <w:r>
+        <w:t>2.3.1. Hệ quản trị cơ sở dữ liệu SQL Server</w:t>
+      </w:r>
+    </w:p>
+    <w:p>
+      <w:pPr>
+        <w:pStyle w:val="VanBan"/>
+        <w:jc w:val="both"/>
+      </w:pPr>
+      <w:r>
+        <w:tab/>
+      </w:r>
+      <w:r>
+        <w:t>Microsoft SQL Server là một Hệ quản trị cơ sở dữ liệu quan hệ (RDBMS) mạnh mẽ, được sử dụng rộng rãi trong môi trường doanh nghiệp. Chức năng chính của nó là lưu trữ và truy xuất dữ liệu theo yêu cầu của các ứng dụng phần mềm.</w:t>
+      </w:r>
+    </w:p>
+    <w:p>
+      <w:pPr>
+        <w:pStyle w:val="VanBan"/>
+        <w:jc w:val="both"/>
+      </w:pPr>
+      <w:r>
+        <w:t>Trong đồ án này, SQL Server được chọn làm nơi lưu trữ toàn bộ dữ liệu của hệ thống bán hàng bao gồm: thông tin người dùng, danh mục, sản phẩm, đơn hàng và chi tiết hóa đơn. Tính toàn vẹn dữ liệu, khả năng xử lý giao dịch (Transaction) an toàn và hiệu suất truy vấn cao là những lý do chính để lựa chọn SQL Server thay vì các hệ thống cơ sở dữ liệu nhỏ hơn.</w:t>
+      </w:r>
+    </w:p>
+    <w:p>
+      <w:pPr>
+        <w:pStyle w:val="VanBan"/>
+        <w:jc w:val="both"/>
+      </w:pPr>
+    </w:p>
+    <w:p>
+      <w:pPr>
+        <w:pStyle w:val="VanBan"/>
+        <w:jc w:val="center"/>
+      </w:pPr>
+      <w:r>
+        <w:rPr>
+          <w:noProof/>
+        </w:rPr>
+        <w:lastRenderedPageBreak/>
+        <w:drawing>
+          <wp:inline distT="0" distB="0" distL="0" distR="0" wp14:anchorId="391ABC14" wp14:editId="36A15F33">
+            <wp:extent cx="3576501" cy="2011680"/>
+            <wp:effectExtent l="0" t="0" r="5080" b="7620"/>
+            <wp:docPr id="1030256449" name="Picture 6" descr="Beherrschung von Microsoft SQL Server Management Studio: Ein ..."/>
+            <wp:cNvGraphicFramePr>
+              <a:graphicFrameLocks xmlns:a="http://schemas.openxmlformats.org/drawingml/2006/main" noChangeAspect="1"/>
+            </wp:cNvGraphicFramePr>
+            <a:graphic xmlns:a="http://schemas.openxmlformats.org/drawingml/2006/main">
+              <a:graphicData uri="http://schemas.openxmlformats.org/drawingml/2006/picture">
+                <pic:pic xmlns:pic="http://schemas.openxmlformats.org/drawingml/2006/picture">
+                  <pic:nvPicPr>
+                    <pic:cNvPr id="0" name="Picture 20" descr="Beherrschung von Microsoft SQL Server Management Studio: Ein ..."/>
+                    <pic:cNvPicPr>
+                      <a:picLocks noChangeAspect="1" noChangeArrowheads="1"/>
+                    </pic:cNvPicPr>
+                  </pic:nvPicPr>
+                  <pic:blipFill>
+                    <a:blip r:embed="rId13" cstate="print">
+                      <a:extLst>
+                        <a:ext uri="{28A0092B-C50C-407E-A947-70E740481C1C}">
+                          <a14:useLocalDpi xmlns:a14="http://schemas.microsoft.com/office/drawing/2010/main" val="0"/>
+                        </a:ext>
+                      </a:extLst>
+                    </a:blip>
+                    <a:srcRect/>
+                    <a:stretch>
+                      <a:fillRect/>
+                    </a:stretch>
+                  </pic:blipFill>
+                  <pic:spPr bwMode="auto">
+                    <a:xfrm>
+                      <a:off x="0" y="0"/>
+                      <a:ext cx="3580977" cy="2014198"/>
+                    </a:xfrm>
+                    <a:prstGeom prst="rect">
+                      <a:avLst/>
+                    </a:prstGeom>
+                    <a:noFill/>
+                    <a:ln>
+                      <a:noFill/>
+                    </a:ln>
+                  </pic:spPr>
+                </pic:pic>
+              </a:graphicData>
+            </a:graphic>
+          </wp:inline>
+        </w:drawing>
+      </w:r>
+    </w:p>
+    <w:p>
+      <w:pPr>
+        <w:pStyle w:val="Hinh"/>
+      </w:pPr>
+      <w:r>
+        <w:t>Hình 2.3. SQL Server</w:t>
+      </w:r>
+    </w:p>
+    <w:p>
+      <w:pPr>
+        <w:pStyle w:val="VanBan"/>
+      </w:pPr>
+    </w:p>
+    <w:p>
+      <w:pPr>
+        <w:pStyle w:val="TieuMuc"/>
+      </w:pPr>
+      <w:r>
+        <w:t xml:space="preserve">   </w:t>
+      </w:r>
+      <w:r>
+        <w:t>2.3.2. Ngôn ngữ truy vấn có cấu trúc</w:t>
+      </w:r>
+    </w:p>
+    <w:p>
+      <w:pPr>
+        <w:pStyle w:val="VanBan"/>
+        <w:jc w:val="both"/>
+      </w:pPr>
+      <w:r>
+        <w:tab/>
+      </w:r>
+      <w:r>
+        <w:t>SQL là ngôn ngữ tiêu chuẩn dùng để giao tiếp, thao tác và quản lý dữ liệu trong hệ quản trị CSDL quan hệ. Trong mã nguồn PHP của dự án, các câu lệnh SQL sẽ được nhúng trực tiếp để thực hiện các thao tác CRUD (Create, Read, Update, Delete) cơ bản, cụ thể</w:t>
+      </w:r>
+      <w:r>
+        <w:t xml:space="preserve"> </w:t>
+      </w:r>
+      <w:r>
+        <w:t>:</w:t>
+      </w:r>
+    </w:p>
+    <w:p>
+      <w:pPr>
+        <w:pStyle w:val="VanBan"/>
+        <w:numPr>
+          <w:ilvl w:val="0"/>
+          <w:numId w:val="18"/>
+        </w:numPr>
+        <w:jc w:val="both"/>
+      </w:pPr>
+      <w:r>
+        <w:t>DDL (Data Definition Language)</w:t>
+      </w:r>
+      <w:r>
+        <w:t xml:space="preserve"> </w:t>
+      </w:r>
+      <w:r>
+        <w:t>: Các câu lệnh như CREATE TABLE, ALTER TABLE được dùng để thiết kế cấu trúc các bảng dữ liệu (Bảng Sản phẩm, Bảng Đơn hàng,...) ở giai đoạn khởi tạo.</w:t>
+      </w:r>
+    </w:p>
+    <w:p>
+      <w:pPr>
+        <w:pStyle w:val="VanBan"/>
+        <w:numPr>
+          <w:ilvl w:val="0"/>
+          <w:numId w:val="18"/>
+        </w:numPr>
+        <w:jc w:val="both"/>
+      </w:pPr>
+      <w:r>
+        <w:t>DML (Data Manipulation Language)</w:t>
+      </w:r>
+      <w:r>
+        <w:t xml:space="preserve"> </w:t>
+      </w:r>
+      <w:r>
+        <w:t>: Đây là nhóm lệnh được sử dụng nhiều nhất trong mã nguồn PHP:</w:t>
+      </w:r>
+    </w:p>
+    <w:p>
+      <w:pPr>
+        <w:pStyle w:val="VanBan"/>
+        <w:numPr>
+          <w:ilvl w:val="0"/>
+          <w:numId w:val="19"/>
+        </w:numPr>
+        <w:jc w:val="both"/>
+      </w:pPr>
+      <w:r>
+        <w:t>SELECT</w:t>
+      </w:r>
+      <w:r>
+        <w:t xml:space="preserve"> </w:t>
+      </w:r>
+      <w:r>
+        <w:t>: Truy xuất danh sách sản phẩm, hiển thị chi tiết hóa đơn.</w:t>
+      </w:r>
+    </w:p>
+    <w:p>
+      <w:pPr>
+        <w:pStyle w:val="VanBan"/>
+        <w:numPr>
+          <w:ilvl w:val="0"/>
+          <w:numId w:val="19"/>
+        </w:numPr>
+        <w:jc w:val="both"/>
+      </w:pPr>
+      <w:r>
+        <w:t>INSERT</w:t>
+      </w:r>
+      <w:r>
+        <w:t xml:space="preserve"> </w:t>
+      </w:r>
+      <w:r>
+        <w:t>: Thêm đơn hàng mới khi khách hàng nhấn đặt mua.</w:t>
+      </w:r>
+    </w:p>
+    <w:p>
+      <w:pPr>
+        <w:pStyle w:val="VanBan"/>
+        <w:numPr>
+          <w:ilvl w:val="0"/>
+          <w:numId w:val="19"/>
+        </w:numPr>
+        <w:jc w:val="both"/>
+      </w:pPr>
+      <w:r>
+        <w:t>UPDATE</w:t>
+      </w:r>
+      <w:r>
+        <w:t xml:space="preserve"> </w:t>
+      </w:r>
+      <w:r>
+        <w:t>: Cập nhật trạng thái đơn hàng, điều chỉnh số lượng tồn kho.</w:t>
+      </w:r>
+    </w:p>
+    <w:p>
+      <w:pPr>
+        <w:pStyle w:val="VanBan"/>
+        <w:numPr>
+          <w:ilvl w:val="0"/>
+          <w:numId w:val="19"/>
+        </w:numPr>
+        <w:jc w:val="both"/>
+      </w:pPr>
+      <w:r>
+        <w:t>DELETE</w:t>
+      </w:r>
+      <w:r>
+        <w:t xml:space="preserve"> </w:t>
+      </w:r>
+      <w:r>
+        <w:t>: Xóa sản phẩm khỏi giỏ hàng hoặc xóa danh mục (đối với quyền Admin).</w:t>
+      </w:r>
+    </w:p>
+    <w:p>
+      <w:pPr>
+        <w:pStyle w:val="VanBan"/>
+        <w:numPr>
+          <w:ilvl w:val="0"/>
+          <w:numId w:val="18"/>
+        </w:numPr>
+        <w:jc w:val="both"/>
+      </w:pPr>
+      <w:r>
+        <w:t>Kết nối các bảng (JOIN)</w:t>
+      </w:r>
+      <w:r>
+        <w:t xml:space="preserve"> </w:t>
+      </w:r>
+      <w:r>
+        <w:t>: Sử dụng INNER JOIN, LEFT JOIN để lấy dữ liệu kết hợp từ nhiều bảng, ví dụ lấy tên sản phẩm và tên danh mục cùng lúc để hiển thị ra giao diện.</w:t>
+      </w:r>
+    </w:p>
+    <w:p>
+      <w:pPr>
+        <w:pStyle w:val="VanBan"/>
+        <w:jc w:val="both"/>
+      </w:pPr>
+      <w:r>
+        <w:lastRenderedPageBreak/>
+        <w:t>Việc viết trực tiếp các câu lệnh SQL thuần vào tệp PHP yêu cầu người lập trình phải nắm vững cú pháp truy vấn cũng như chú ý đến các vấn đề bảo mật, đặc biệt là phòng chống lỗ hổng SQL Injection (thường xử lý bằng cách sử dụng Prepared Statements).</w:t>
+      </w:r>
+    </w:p>
+    <w:p>
+      <w:pPr>
+        <w:pStyle w:val="Muc"/>
+      </w:pPr>
+      <w:r>
+        <w:t>2.4. Các công cụ hỗ trợ phát triển</w:t>
+      </w:r>
+    </w:p>
+    <w:p>
+      <w:pPr>
+        <w:pStyle w:val="TieuMuc"/>
+      </w:pPr>
+      <w:r>
+        <w:t xml:space="preserve">   </w:t>
+      </w:r>
+      <w:r>
+        <w:t>2.4.1. Trình soạn thảo mã nguồn Visual Studio Code</w:t>
+      </w:r>
+    </w:p>
+    <w:p>
+      <w:pPr>
+        <w:pStyle w:val="VanBan"/>
+        <w:jc w:val="both"/>
+      </w:pPr>
+      <w:r>
+        <w:tab/>
+      </w:r>
+      <w:r>
+        <w:t>Visual Studio Code là một trình soạn thảo mã nguồn mở, đa nền tảng và cực kỳ gọn nhẹ do Microsoft phát triển. Hệ sinh thái tiện ích mở rộng khổng lồ giúp VS Code có sức mạnh ngang tầm với một môi trường phát triển tích hợp chuyên nghiệp.</w:t>
+      </w:r>
+    </w:p>
+    <w:p>
+      <w:pPr>
+        <w:pStyle w:val="VanBan"/>
+        <w:jc w:val="both"/>
+      </w:pPr>
+      <w:r>
+        <w:t>Trong quá trình thực hiện đồ án, VS Code đóng vai trò là công cụ lập trình cốt lõi với các nhiệm vụ chính</w:t>
+      </w:r>
+      <w:r>
+        <w:t xml:space="preserve"> </w:t>
+      </w:r>
+      <w:r>
+        <w:t>:</w:t>
+      </w:r>
+    </w:p>
+    <w:p>
+      <w:pPr>
+        <w:pStyle w:val="VanBan"/>
+        <w:numPr>
+          <w:ilvl w:val="0"/>
+          <w:numId w:val="20"/>
+        </w:numPr>
+        <w:jc w:val="both"/>
+      </w:pPr>
+      <w:r>
+        <w:t>Soạn thảo và tích hợp mã nguồn</w:t>
+      </w:r>
+      <w:r>
+        <w:t xml:space="preserve"> </w:t>
+      </w:r>
+      <w:r>
+        <w:t>: Cung cấp môi trường để viết và định dạng mã kịch bản PHP, kết hợp linh hoạt với HTML/CSS/JavaScript và các câu truy vấn SQL Server trực tiếp bên trong cùng một tệp.</w:t>
+      </w:r>
+    </w:p>
+    <w:p>
+      <w:pPr>
+        <w:pStyle w:val="VanBan"/>
+        <w:numPr>
+          <w:ilvl w:val="0"/>
+          <w:numId w:val="20"/>
+        </w:numPr>
+        <w:jc w:val="both"/>
+      </w:pPr>
+      <w:r>
+        <w:t>Quản lý Docker tích hợp</w:t>
+      </w:r>
+      <w:r>
+        <w:t xml:space="preserve"> </w:t>
+      </w:r>
+      <w:r>
+        <w:t>: Cấu trúc dự án với Dockerfile và docker-compose.yml được soạn thảo dễ dàng nhờ tính năng nhận diện cú pháp thông minh. Terminal tích hợp sẵn trong VS Code cho phép thực thi trực tiếp các câu lệnh khởi chạy, quản lý và gỡ lỗi container Docker mà không cần chuyển đổi qua lại giữa các cửa sổ.</w:t>
+      </w:r>
+    </w:p>
+    <w:p>
+      <w:pPr>
+        <w:pStyle w:val="VanBan"/>
+        <w:numPr>
+          <w:ilvl w:val="0"/>
+          <w:numId w:val="20"/>
+        </w:numPr>
+        <w:jc w:val="both"/>
+      </w:pPr>
+      <w:r>
+        <w:t>Hỗ trợ gỡ lỗi và làm sạch mã</w:t>
+      </w:r>
+      <w:r>
+        <w:t xml:space="preserve"> </w:t>
+      </w:r>
+      <w:r>
+        <w:t>: Các tiện ích mở rộng về định dạng (formatter) và gợi ý mã (IntelliSense) giúp quá trình viết code PHP, SQL hạn chế tối đa các lỗi cú pháp cơ bản.</w:t>
+      </w:r>
+    </w:p>
+    <w:p>
+      <w:pPr>
+        <w:pStyle w:val="VanBan"/>
+        <w:jc w:val="center"/>
+      </w:pPr>
+      <w:r>
+        <w:rPr>
+          <w:noProof/>
+        </w:rPr>
+        <w:drawing>
+          <wp:inline distT="0" distB="0" distL="0" distR="0" wp14:anchorId="3630A82D" wp14:editId="7CAFB38A">
+            <wp:extent cx="4053840" cy="2026920"/>
+            <wp:effectExtent l="0" t="0" r="0" b="0"/>
+            <wp:docPr id="222490279" name="Picture 7" descr="Visual Studio Code | Ubuntu"/>
+            <wp:cNvGraphicFramePr>
+              <a:graphicFrameLocks xmlns:a="http://schemas.openxmlformats.org/drawingml/2006/main" noChangeAspect="1"/>
+            </wp:cNvGraphicFramePr>
+            <a:graphic xmlns:a="http://schemas.openxmlformats.org/drawingml/2006/main">
+              <a:graphicData uri="http://schemas.openxmlformats.org/drawingml/2006/picture">
+                <pic:pic xmlns:pic="http://schemas.openxmlformats.org/drawingml/2006/picture">
+                  <pic:nvPicPr>
+                    <pic:cNvPr id="0" name="Picture 22" descr="Visual Studio Code | Ubuntu"/>
+                    <pic:cNvPicPr>
+                      <a:picLocks noChangeAspect="1" noChangeArrowheads="1"/>
+                    </pic:cNvPicPr>
+                  </pic:nvPicPr>
+                  <pic:blipFill>
+                    <a:blip r:embed="rId14">
+                      <a:extLst>
+                        <a:ext uri="{28A0092B-C50C-407E-A947-70E740481C1C}">
+                          <a14:useLocalDpi xmlns:a14="http://schemas.microsoft.com/office/drawing/2010/main" val="0"/>
+                        </a:ext>
+                      </a:extLst>
+                    </a:blip>
+                    <a:srcRect/>
+                    <a:stretch>
+                      <a:fillRect/>
+                    </a:stretch>
+                  </pic:blipFill>
+                  <pic:spPr bwMode="auto">
+                    <a:xfrm>
+                      <a:off x="0" y="0"/>
+                      <a:ext cx="4053840" cy="2026920"/>
+                    </a:xfrm>
+                    <a:prstGeom prst="rect">
+                      <a:avLst/>
+                    </a:prstGeom>
+                    <a:noFill/>
+                    <a:ln>
+                      <a:noFill/>
+                    </a:ln>
+                  </pic:spPr>
+                </pic:pic>
+              </a:graphicData>
+            </a:graphic>
+          </wp:inline>
+        </w:drawing>
+      </w:r>
+    </w:p>
+    <w:p>
+      <w:pPr>
+        <w:pStyle w:val="Hinh"/>
+      </w:pPr>
+      <w:r>
+        <w:t>Hình 2.4. Visual Studio Code</w:t>
+      </w:r>
+    </w:p>
+    <w:p>
+      <w:pPr>
+        <w:pStyle w:val="TieuMuc"/>
+      </w:pPr>
+      <w:r>
+        <w:lastRenderedPageBreak/>
+        <w:t xml:space="preserve">   </w:t>
+      </w:r>
+      <w:r>
+        <w:t>2.4.2. Công cụ thiết kế kiến trúc PowerDesigner</w:t>
+      </w:r>
+    </w:p>
+    <w:p>
+      <w:pPr>
+        <w:pStyle w:val="VanBan"/>
+        <w:jc w:val="both"/>
+      </w:pPr>
+      <w:r>
+        <w:tab/>
+      </w:r>
+      <w:r>
+        <w:t>PowerDesigner là một công cụ phân tích và thiết kế hệ thống chuyên dụng, hỗ trợ mạnh mẽ trong việc mô hình hóa dữ liệu và trực quan hóa các quy trình nghiệp vụ phần mềm. Việc sử dụng công cụ này trước khi bắt tay vào viết code giúp định hình rõ ràng cấu trúc và luồng hoạt động của ứng dụng.</w:t>
+      </w:r>
+    </w:p>
+    <w:p>
+      <w:pPr>
+        <w:pStyle w:val="VanBan"/>
+        <w:jc w:val="both"/>
+      </w:pPr>
+      <w:r>
+        <w:t>Đối với hệ thống quản lý bán hàng, PowerDesigner được sử dụng để thực hiện các bước thiết kế quan trọng</w:t>
+      </w:r>
+      <w:r>
+        <w:t xml:space="preserve"> </w:t>
+      </w:r>
+      <w:r>
+        <w:t>:</w:t>
+      </w:r>
+    </w:p>
+    <w:p>
+      <w:pPr>
+        <w:pStyle w:val="VanBan"/>
+        <w:numPr>
+          <w:ilvl w:val="0"/>
+          <w:numId w:val="21"/>
+        </w:numPr>
+        <w:jc w:val="both"/>
+      </w:pPr>
+      <w:r>
+        <w:t>Thiết kế CSDL</w:t>
+      </w:r>
+      <w:r>
+        <w:t xml:space="preserve"> </w:t>
+      </w:r>
+      <w:r>
+        <w:t>: Xây dựng Mô hình thực thể kết hợp ERD. Công cụ này giúp phân tích và biểu diễn trực quan các thực thể (như Người dùng, Sản phẩm, Danh mục, Đơn hàng), các thuộc tính đi kèm và thiết lập chuẩn xác các mối quan hệ (1-1, 1-n, n-n) trước khi chuyển đổi thành các bảng vật lý trên SQL Server.</w:t>
+      </w:r>
+    </w:p>
+    <w:p>
+      <w:pPr>
+        <w:pStyle w:val="VanBan"/>
+        <w:numPr>
+          <w:ilvl w:val="0"/>
+          <w:numId w:val="21"/>
+        </w:numPr>
+        <w:jc w:val="both"/>
+      </w:pPr>
+      <w:r>
+        <w:t>Thiết kế xử lý</w:t>
+      </w:r>
+      <w:r>
+        <w:t xml:space="preserve"> </w:t>
+      </w:r>
+      <w:r>
+        <w:t>: Xây dựng Sơ đồ luồng dữ liệu DFD từ mức ngữ cảnh đến mức phân rã chức năng chi tiết. Việc này giúp vẽ ra lộ trình di chuyển của luồng thông tin (từ khi khách hàng xem sản phẩm, thêm vào giỏ hàng đến khi hoàn tất thanh toán) cũng như phân định rõ các chức năng quản lý của hệ thống.</w:t>
+      </w:r>
+    </w:p>
+    <w:p>
+      <w:pPr>
+        <w:pStyle w:val="VanBan"/>
+        <w:jc w:val="center"/>
+      </w:pPr>
+      <w:r>
+        <w:rPr>
+          <w:noProof/>
+        </w:rPr>
+        <w:drawing>
+          <wp:inline distT="0" distB="0" distL="0" distR="0" wp14:anchorId="6A1E53E8" wp14:editId="336B5089">
+            <wp:extent cx="2628900" cy="2628900"/>
+            <wp:effectExtent l="0" t="0" r="0" b="0"/>
+            <wp:docPr id="1268204625" name="Picture 8" descr="Data Modeling - SAP PowerDesigner Trial"/>
+            <wp:cNvGraphicFramePr>
+              <a:graphicFrameLocks xmlns:a="http://schemas.openxmlformats.org/drawingml/2006/main" noChangeAspect="1"/>
+            </wp:cNvGraphicFramePr>
+            <a:graphic xmlns:a="http://schemas.openxmlformats.org/drawingml/2006/main">
+              <a:graphicData uri="http://schemas.openxmlformats.org/drawingml/2006/picture">
+                <pic:pic xmlns:pic="http://schemas.openxmlformats.org/drawingml/2006/picture">
+                  <pic:nvPicPr>
+                    <pic:cNvPr id="0" name="Picture 24" descr="Data Modeling - SAP PowerDesigner Trial"/>
+                    <pic:cNvPicPr>
+                      <a:picLocks noChangeAspect="1" noChangeArrowheads="1"/>
+                    </pic:cNvPicPr>
+                  </pic:nvPicPr>
+                  <pic:blipFill>
+                    <a:blip r:embed="rId15">
+                      <a:extLst>
+                        <a:ext uri="{28A0092B-C50C-407E-A947-70E740481C1C}">
+                          <a14:useLocalDpi xmlns:a14="http://schemas.microsoft.com/office/drawing/2010/main" val="0"/>
+                        </a:ext>
+                      </a:extLst>
+                    </a:blip>
+                    <a:srcRect/>
+                    <a:stretch>
+                      <a:fillRect/>
+                    </a:stretch>
+                  </pic:blipFill>
+                  <pic:spPr bwMode="auto">
+                    <a:xfrm>
+                      <a:off x="0" y="0"/>
+                      <a:ext cx="2628900" cy="2628900"/>
+                    </a:xfrm>
+                    <a:prstGeom prst="rect">
+                      <a:avLst/>
+                    </a:prstGeom>
+                    <a:noFill/>
+                    <a:ln>
+                      <a:noFill/>
+                    </a:ln>
+                  </pic:spPr>
+                </pic:pic>
+              </a:graphicData>
+            </a:graphic>
+          </wp:inline>
+        </w:drawing>
+      </w:r>
+    </w:p>
+    <w:p>
+      <w:pPr>
+        <w:pStyle w:val="Hinh"/>
+      </w:pPr>
+      <w:r>
+        <w:t>Hình 2.5. Power Designer</w:t>
+      </w:r>
+    </w:p>
+    <w:p>
+      <w:pPr>
+        <w:pStyle w:val="VanBan"/>
+      </w:pPr>
+    </w:p>
+    <w:p>
+      <w:pPr>
+        <w:pStyle w:val="VanBan"/>
+      </w:pPr>
+    </w:p>
+    <w:p>
+      <w:pPr>
+        <w:pStyle w:val="VanBan"/>
+      </w:pPr>
+    </w:p>
+    <w:p>
+      <w:pPr>
+        <w:pStyle w:val="VanBan"/>
+      </w:pPr>
+    </w:p>
+    <w:p>
+      <w:pPr>
+        <w:pStyle w:val="VanBan"/>
+      </w:pPr>
+    </w:p>
+    <w:p>
+      <w:pPr>
+        <w:pStyle w:val="VanBan"/>
+      </w:pPr>
+    </w:p>
+    <w:p>
+      <w:pPr>
+        <w:pStyle w:val="VanBan"/>
+      </w:pPr>
+    </w:p>
+    <w:p>
+      <w:pPr>
+        <w:pStyle w:val="VanBan"/>
+      </w:pPr>
+    </w:p>
+    <w:p>
+      <w:pPr>
+        <w:pStyle w:val="VanBan"/>
+      </w:pPr>
+    </w:p>
+    <w:p>
+      <w:pPr>
+        <w:pStyle w:val="VanBan"/>
+      </w:pPr>
+    </w:p>
+    <w:p>
+      <w:pPr>
+        <w:pStyle w:val="VanBan"/>
+      </w:pPr>
+    </w:p>
+    <w:p>
+      <w:pPr>
+        <w:pStyle w:val="VanBan"/>
+      </w:pPr>
+    </w:p>
+    <w:p>
+      <w:pPr>
+        <w:pStyle w:val="VanBan"/>
+      </w:pPr>
+    </w:p>
+    <w:p>
+      <w:pPr>
+        <w:pStyle w:val="VanBan"/>
+      </w:pPr>
+    </w:p>
+    <w:p>
+      <w:pPr>
+        <w:pStyle w:val="VanBan"/>
+      </w:pPr>
+    </w:p>
+    <w:p>
+      <w:pPr>
+        <w:pStyle w:val="VanBan"/>
+      </w:pPr>
+    </w:p>
+    <w:p>
+      <w:pPr>
+        <w:pStyle w:val="VanBan"/>
+      </w:pPr>
+    </w:p>
+    <w:p>
+      <w:pPr>
+        <w:pStyle w:val="Chuong"/>
+      </w:pPr>
+      <w:r>
+        <w:t>CHƯƠNG 3.</w:t>
+      </w:r>
+      <w:r>
+        <w:t xml:space="preserve"> </w:t>
+      </w:r>
+      <w:r>
+        <w:t>TIÊU ĐỀ CHƯƠNG 3</w:t>
+      </w:r>
+    </w:p>
+    <w:p>
+      <w:pPr>
+        <w:pStyle w:val="Muc"/>
         <w:rPr>
           <w:sz w:val="26"/>
           <w:szCs w:val="26"/>
@@ -2041,83 +3383,62 @@
           <w:sz w:val="26"/>
           <w:szCs w:val="26"/>
         </w:rPr>
-        <w:t>2.1. Môi trường và công nghệ sử dụng</w:t>
-      </w:r>
-    </w:p>
-    <w:p>
-      <w:pPr>
-        <w:pStyle w:val="Muc"/>
+        <w:t xml:space="preserve">3.1. </w:t>
+      </w:r>
+      <w:r>
         <w:rPr>
           <w:sz w:val="26"/>
           <w:szCs w:val="26"/>
         </w:rPr>
-      </w:pPr>
-      <w:r>
+        <w:t>Mô tả bài toán</w:t>
+      </w:r>
+    </w:p>
+    <w:p>
+      <w:pPr>
+        <w:pStyle w:val="Muc"/>
         <w:rPr>
           <w:sz w:val="26"/>
           <w:szCs w:val="26"/>
         </w:rPr>
-        <w:t xml:space="preserve">2.2. </w:t>
-      </w:r>
+      </w:pPr>
       <w:r>
         <w:rPr>
           <w:sz w:val="26"/>
           <w:szCs w:val="26"/>
         </w:rPr>
-        <w:t>Ngôn ngữ kịch bản phi server</w:t>
-      </w:r>
-    </w:p>
-    <w:p>
-      <w:pPr>
-        <w:pStyle w:val="Muc"/>
-      </w:pPr>
-      <w:r>
+        <w:t>3.2. Đặc tả yêu cầu</w:t>
+      </w:r>
+    </w:p>
+    <w:p>
+      <w:pPr>
+        <w:pStyle w:val="TieuMuc"/>
         <w:rPr>
           <w:sz w:val="26"/>
           <w:szCs w:val="26"/>
         </w:rPr>
-        <w:t>2.3. Ngôn ngữ truy vấn SQL</w:t>
-      </w:r>
-      <w:r>
-        <w:br w:type="page"/>
-      </w:r>
-    </w:p>
-    <w:p>
-      <w:pPr>
-        <w:pStyle w:val="Chuong"/>
-      </w:pPr>
-      <w:r>
-        <w:lastRenderedPageBreak/>
-        <w:t>CHƯƠNG 3.</w:t>
-      </w:r>
-      <w:r>
-        <w:t xml:space="preserve"> </w:t>
-      </w:r>
-      <w:r>
-        <w:t>TIÊU ĐỀ CHƯƠNG 3</w:t>
-      </w:r>
-    </w:p>
-    <w:p>
-      <w:pPr>
-        <w:pStyle w:val="Muc"/>
+      </w:pPr>
+      <w:r>
         <w:rPr>
           <w:sz w:val="26"/>
           <w:szCs w:val="26"/>
         </w:rPr>
-      </w:pPr>
-      <w:r>
+        <w:t xml:space="preserve">   3.2.1. Yêu cầu chức năng</w:t>
+      </w:r>
+    </w:p>
+    <w:p>
+      <w:pPr>
+        <w:pStyle w:val="TieuMuc"/>
         <w:rPr>
           <w:sz w:val="26"/>
           <w:szCs w:val="26"/>
         </w:rPr>
-        <w:t xml:space="preserve">3.1. </w:t>
-      </w:r>
+      </w:pPr>
       <w:r>
         <w:rPr>
           <w:sz w:val="26"/>
           <w:szCs w:val="26"/>
         </w:rPr>
-        <w:t>Mô tả bài toán</w:t>
+        <w:t xml:space="preserve">   3.2.2. Yêu cầu phi chức năng</w:t>
       </w:r>
     </w:p>
     <w:p>
@@ -2133,12 +3454,12 @@
           <w:sz w:val="26"/>
           <w:szCs w:val="26"/>
         </w:rPr>
-        <w:t>3.2. Đặc tả yêu cầu</w:t>
-      </w:r>
-    </w:p>
-    <w:p>
-      <w:pPr>
-        <w:pStyle w:val="TieuMuc"/>
+        <w:t>3.3. Kiến trúc hệ thống</w:t>
+      </w:r>
+    </w:p>
+    <w:p>
+      <w:pPr>
+        <w:pStyle w:val="Muc"/>
         <w:rPr>
           <w:sz w:val="26"/>
           <w:szCs w:val="26"/>
@@ -2149,7 +3470,7 @@
           <w:sz w:val="26"/>
           <w:szCs w:val="26"/>
         </w:rPr>
-        <w:t xml:space="preserve">   3.2.1. Yêu cầu chức năng</w:t>
+        <w:t>3.4. Thiết kế dữ liệu</w:t>
       </w:r>
     </w:p>
     <w:p>
@@ -2165,12 +3486,12 @@
           <w:sz w:val="26"/>
           <w:szCs w:val="26"/>
         </w:rPr>
-        <w:t xml:space="preserve">   3.2.2. Yêu cầu phi chức năng</w:t>
-      </w:r>
-    </w:p>
-    <w:p>
-      <w:pPr>
-        <w:pStyle w:val="Muc"/>
+        <w:t xml:space="preserve">   3.4.1. Mô hình ERD</w:t>
+      </w:r>
+    </w:p>
+    <w:p>
+      <w:pPr>
+        <w:pStyle w:val="TieuMuc"/>
         <w:rPr>
           <w:sz w:val="26"/>
           <w:szCs w:val="26"/>
@@ -2181,7 +3502,7 @@
           <w:sz w:val="26"/>
           <w:szCs w:val="26"/>
         </w:rPr>
-        <w:t>3.3. Kiến trúc hệ thống</w:t>
+        <w:t xml:space="preserve">   3.4.2. Chi tiết các thực thể</w:t>
       </w:r>
     </w:p>
     <w:p>
@@ -2197,7 +3518,7 @@
           <w:sz w:val="26"/>
           <w:szCs w:val="26"/>
         </w:rPr>
-        <w:t>3.4. Thiết kế dữ liệu</w:t>
+        <w:t>3.5. Thiết kế xử lý</w:t>
       </w:r>
     </w:p>
     <w:p>
@@ -2213,7 +3534,7 @@
           <w:sz w:val="26"/>
           <w:szCs w:val="26"/>
         </w:rPr>
-        <w:t xml:space="preserve">   3.4.1. Mô hình ERD</w:t>
+        <w:t xml:space="preserve">   3.5.1. Mô hình DFD mức ngữ cảnh</w:t>
       </w:r>
     </w:p>
     <w:p>
@@ -2229,7 +3550,7 @@
           <w:sz w:val="26"/>
           <w:szCs w:val="26"/>
         </w:rPr>
-        <w:t xml:space="preserve">   3.4.2. Chi tiết các thực thể</w:t>
+        <w:t xml:space="preserve">   3.5.2. Mô hình DFD mức phân rã chức năng</w:t>
       </w:r>
     </w:p>
     <w:p>
@@ -2245,54 +3566,7 @@
           <w:sz w:val="26"/>
           <w:szCs w:val="26"/>
         </w:rPr>
-        <w:t>3.5. Thiết kế xử lý</w:t>
-      </w:r>
-    </w:p>
-    <w:p>
-      <w:pPr>
-        <w:pStyle w:val="TieuMuc"/>
-        <w:rPr>
-          <w:sz w:val="26"/>
-          <w:szCs w:val="26"/>
-        </w:rPr>
-      </w:pPr>
-      <w:r>
-        <w:rPr>
-          <w:sz w:val="26"/>
-          <w:szCs w:val="26"/>
-        </w:rPr>
-        <w:t xml:space="preserve">   3.5.1. Mô hình DFD mức ngữ cảnh</w:t>
-      </w:r>
-    </w:p>
-    <w:p>
-      <w:pPr>
-        <w:pStyle w:val="TieuMuc"/>
-        <w:rPr>
-          <w:sz w:val="26"/>
-          <w:szCs w:val="26"/>
-        </w:rPr>
-      </w:pPr>
-      <w:r>
-        <w:rPr>
-          <w:sz w:val="26"/>
-          <w:szCs w:val="26"/>
-        </w:rPr>
-        <w:t xml:space="preserve">   3.5.2. Mô hình DFD mức phân rã chức năng</w:t>
-      </w:r>
-    </w:p>
-    <w:p>
-      <w:pPr>
-        <w:pStyle w:val="Muc"/>
-        <w:rPr>
-          <w:sz w:val="26"/>
-          <w:szCs w:val="26"/>
-        </w:rPr>
-      </w:pPr>
-      <w:r>
-        <w:rPr>
-          <w:sz w:val="26"/>
-          <w:szCs w:val="26"/>
-        </w:rPr>
+        <w:lastRenderedPageBreak/>
         <w:t>3.6. Thiết kế giao diện</w:t>
       </w:r>
     </w:p>
@@ -2765,6 +4039,232 @@
     </w:lvl>
   </w:abstractNum>
   <w:abstractNum w:abstractNumId="2" w15:restartNumberingAfterBreak="0">
+    <w:nsid w:val="09094046"/>
+    <w:multiLevelType w:val="hybridMultilevel"/>
+    <w:tmpl w:val="F4364E08"/>
+    <w:lvl w:ilvl="0" w:tplc="4E36BC90">
+      <w:start w:val="1"/>
+      <w:numFmt w:val="bullet"/>
+      <w:lvlText w:val=""/>
+      <w:lvlJc w:val="left"/>
+      <w:pPr>
+        <w:ind w:left="1440" w:hanging="360"/>
+      </w:pPr>
+      <w:rPr>
+        <w:rFonts w:ascii="Symbol" w:hAnsi="Symbol" w:hint="default"/>
+      </w:rPr>
+    </w:lvl>
+    <w:lvl w:ilvl="1" w:tplc="04090003" w:tentative="1">
+      <w:start w:val="1"/>
+      <w:numFmt w:val="bullet"/>
+      <w:lvlText w:val="o"/>
+      <w:lvlJc w:val="left"/>
+      <w:pPr>
+        <w:ind w:left="2160" w:hanging="360"/>
+      </w:pPr>
+      <w:rPr>
+        <w:rFonts w:ascii="Courier New" w:hAnsi="Courier New" w:cs="Courier New" w:hint="default"/>
+      </w:rPr>
+    </w:lvl>
+    <w:lvl w:ilvl="2" w:tplc="04090005" w:tentative="1">
+      <w:start w:val="1"/>
+      <w:numFmt w:val="bullet"/>
+      <w:lvlText w:val=""/>
+      <w:lvlJc w:val="left"/>
+      <w:pPr>
+        <w:ind w:left="2880" w:hanging="360"/>
+      </w:pPr>
+      <w:rPr>
+        <w:rFonts w:ascii="Wingdings" w:hAnsi="Wingdings" w:hint="default"/>
+      </w:rPr>
+    </w:lvl>
+    <w:lvl w:ilvl="3" w:tplc="04090001" w:tentative="1">
+      <w:start w:val="1"/>
+      <w:numFmt w:val="bullet"/>
+      <w:lvlText w:val=""/>
+      <w:lvlJc w:val="left"/>
+      <w:pPr>
+        <w:ind w:left="3600" w:hanging="360"/>
+      </w:pPr>
+      <w:rPr>
+        <w:rFonts w:ascii="Symbol" w:hAnsi="Symbol" w:hint="default"/>
+      </w:rPr>
+    </w:lvl>
+    <w:lvl w:ilvl="4" w:tplc="04090003" w:tentative="1">
+      <w:start w:val="1"/>
+      <w:numFmt w:val="bullet"/>
+      <w:lvlText w:val="o"/>
+      <w:lvlJc w:val="left"/>
+      <w:pPr>
+        <w:ind w:left="4320" w:hanging="360"/>
+      </w:pPr>
+      <w:rPr>
+        <w:rFonts w:ascii="Courier New" w:hAnsi="Courier New" w:cs="Courier New" w:hint="default"/>
+      </w:rPr>
+    </w:lvl>
+    <w:lvl w:ilvl="5" w:tplc="04090005" w:tentative="1">
+      <w:start w:val="1"/>
+      <w:numFmt w:val="bullet"/>
+      <w:lvlText w:val=""/>
+      <w:lvlJc w:val="left"/>
+      <w:pPr>
+        <w:ind w:left="5040" w:hanging="360"/>
+      </w:pPr>
+      <w:rPr>
+        <w:rFonts w:ascii="Wingdings" w:hAnsi="Wingdings" w:hint="default"/>
+      </w:rPr>
+    </w:lvl>
+    <w:lvl w:ilvl="6" w:tplc="04090001" w:tentative="1">
+      <w:start w:val="1"/>
+      <w:numFmt w:val="bullet"/>
+      <w:lvlText w:val=""/>
+      <w:lvlJc w:val="left"/>
+      <w:pPr>
+        <w:ind w:left="5760" w:hanging="360"/>
+      </w:pPr>
+      <w:rPr>
+        <w:rFonts w:ascii="Symbol" w:hAnsi="Symbol" w:hint="default"/>
+      </w:rPr>
+    </w:lvl>
+    <w:lvl w:ilvl="7" w:tplc="04090003" w:tentative="1">
+      <w:start w:val="1"/>
+      <w:numFmt w:val="bullet"/>
+      <w:lvlText w:val="o"/>
+      <w:lvlJc w:val="left"/>
+      <w:pPr>
+        <w:ind w:left="6480" w:hanging="360"/>
+      </w:pPr>
+      <w:rPr>
+        <w:rFonts w:ascii="Courier New" w:hAnsi="Courier New" w:cs="Courier New" w:hint="default"/>
+      </w:rPr>
+    </w:lvl>
+    <w:lvl w:ilvl="8" w:tplc="04090005" w:tentative="1">
+      <w:start w:val="1"/>
+      <w:numFmt w:val="bullet"/>
+      <w:lvlText w:val=""/>
+      <w:lvlJc w:val="left"/>
+      <w:pPr>
+        <w:ind w:left="7200" w:hanging="360"/>
+      </w:pPr>
+      <w:rPr>
+        <w:rFonts w:ascii="Wingdings" w:hAnsi="Wingdings" w:hint="default"/>
+      </w:rPr>
+    </w:lvl>
+  </w:abstractNum>
+  <w:abstractNum w:abstractNumId="3" w15:restartNumberingAfterBreak="0">
+    <w:nsid w:val="09BB7D93"/>
+    <w:multiLevelType w:val="hybridMultilevel"/>
+    <w:tmpl w:val="98F430BC"/>
+    <w:lvl w:ilvl="0" w:tplc="735CEB80">
+      <w:start w:val="1"/>
+      <w:numFmt w:val="bullet"/>
+      <w:lvlText w:val=""/>
+      <w:lvlJc w:val="left"/>
+      <w:pPr>
+        <w:ind w:left="720" w:hanging="360"/>
+      </w:pPr>
+      <w:rPr>
+        <w:rFonts w:ascii="Symbol" w:hAnsi="Symbol" w:hint="default"/>
+      </w:rPr>
+    </w:lvl>
+    <w:lvl w:ilvl="1" w:tplc="04090003" w:tentative="1">
+      <w:start w:val="1"/>
+      <w:numFmt w:val="bullet"/>
+      <w:lvlText w:val="o"/>
+      <w:lvlJc w:val="left"/>
+      <w:pPr>
+        <w:ind w:left="1440" w:hanging="360"/>
+      </w:pPr>
+      <w:rPr>
+        <w:rFonts w:ascii="Courier New" w:hAnsi="Courier New" w:cs="Courier New" w:hint="default"/>
+      </w:rPr>
+    </w:lvl>
+    <w:lvl w:ilvl="2" w:tplc="04090005" w:tentative="1">
+      <w:start w:val="1"/>
+      <w:numFmt w:val="bullet"/>
+      <w:lvlText w:val=""/>
+      <w:lvlJc w:val="left"/>
+      <w:pPr>
+        <w:ind w:left="2160" w:hanging="360"/>
+      </w:pPr>
+      <w:rPr>
+        <w:rFonts w:ascii="Wingdings" w:hAnsi="Wingdings" w:hint="default"/>
+      </w:rPr>
+    </w:lvl>
+    <w:lvl w:ilvl="3" w:tplc="04090001" w:tentative="1">
+      <w:start w:val="1"/>
+      <w:numFmt w:val="bullet"/>
+      <w:lvlText w:val=""/>
+      <w:lvlJc w:val="left"/>
+      <w:pPr>
+        <w:ind w:left="2880" w:hanging="360"/>
+      </w:pPr>
+      <w:rPr>
+        <w:rFonts w:ascii="Symbol" w:hAnsi="Symbol" w:hint="default"/>
+      </w:rPr>
+    </w:lvl>
+    <w:lvl w:ilvl="4" w:tplc="04090003" w:tentative="1">
+      <w:start w:val="1"/>
+      <w:numFmt w:val="bullet"/>
+      <w:lvlText w:val="o"/>
+      <w:lvlJc w:val="left"/>
+      <w:pPr>
+        <w:ind w:left="3600" w:hanging="360"/>
+      </w:pPr>
+      <w:rPr>
+        <w:rFonts w:ascii="Courier New" w:hAnsi="Courier New" w:cs="Courier New" w:hint="default"/>
+      </w:rPr>
+    </w:lvl>
+    <w:lvl w:ilvl="5" w:tplc="04090005" w:tentative="1">
+      <w:start w:val="1"/>
+      <w:numFmt w:val="bullet"/>
+      <w:lvlText w:val=""/>
+      <w:lvlJc w:val="left"/>
+      <w:pPr>
+        <w:ind w:left="4320" w:hanging="360"/>
+      </w:pPr>
+      <w:rPr>
+        <w:rFonts w:ascii="Wingdings" w:hAnsi="Wingdings" w:hint="default"/>
+      </w:rPr>
+    </w:lvl>
+    <w:lvl w:ilvl="6" w:tplc="04090001" w:tentative="1">
+      <w:start w:val="1"/>
+      <w:numFmt w:val="bullet"/>
+      <w:lvlText w:val=""/>
+      <w:lvlJc w:val="left"/>
+      <w:pPr>
+        <w:ind w:left="5040" w:hanging="360"/>
+      </w:pPr>
+      <w:rPr>
+        <w:rFonts w:ascii="Symbol" w:hAnsi="Symbol" w:hint="default"/>
+      </w:rPr>
+    </w:lvl>
+    <w:lvl w:ilvl="7" w:tplc="04090003" w:tentative="1">
+      <w:start w:val="1"/>
+      <w:numFmt w:val="bullet"/>
+      <w:lvlText w:val="o"/>
+      <w:lvlJc w:val="left"/>
+      <w:pPr>
+        <w:ind w:left="5760" w:hanging="360"/>
+      </w:pPr>
+      <w:rPr>
+        <w:rFonts w:ascii="Courier New" w:hAnsi="Courier New" w:cs="Courier New" w:hint="default"/>
+      </w:rPr>
+    </w:lvl>
+    <w:lvl w:ilvl="8" w:tplc="04090005" w:tentative="1">
+      <w:start w:val="1"/>
+      <w:numFmt w:val="bullet"/>
+      <w:lvlText w:val=""/>
+      <w:lvlJc w:val="left"/>
+      <w:pPr>
+        <w:ind w:left="6480" w:hanging="360"/>
+      </w:pPr>
+      <w:rPr>
+        <w:rFonts w:ascii="Wingdings" w:hAnsi="Wingdings" w:hint="default"/>
+      </w:rPr>
+    </w:lvl>
+  </w:abstractNum>
+  <w:abstractNum w:abstractNumId="4" w15:restartNumberingAfterBreak="0">
     <w:nsid w:val="0FDA4815"/>
     <w:multiLevelType w:val="multilevel"/>
     <w:tmpl w:val="4880C468"/>
@@ -2913,7 +4413,120 @@
       </w:rPr>
     </w:lvl>
   </w:abstractNum>
-  <w:abstractNum w:abstractNumId="3" w15:restartNumberingAfterBreak="0">
+  <w:abstractNum w:abstractNumId="5" w15:restartNumberingAfterBreak="0">
+    <w:nsid w:val="104562A8"/>
+    <w:multiLevelType w:val="hybridMultilevel"/>
+    <w:tmpl w:val="28F00638"/>
+    <w:lvl w:ilvl="0" w:tplc="735CEB80">
+      <w:start w:val="1"/>
+      <w:numFmt w:val="bullet"/>
+      <w:lvlText w:val=""/>
+      <w:lvlJc w:val="left"/>
+      <w:pPr>
+        <w:ind w:left="720" w:hanging="360"/>
+      </w:pPr>
+      <w:rPr>
+        <w:rFonts w:ascii="Symbol" w:hAnsi="Symbol" w:hint="default"/>
+      </w:rPr>
+    </w:lvl>
+    <w:lvl w:ilvl="1" w:tplc="04090003" w:tentative="1">
+      <w:start w:val="1"/>
+      <w:numFmt w:val="bullet"/>
+      <w:lvlText w:val="o"/>
+      <w:lvlJc w:val="left"/>
+      <w:pPr>
+        <w:ind w:left="1440" w:hanging="360"/>
+      </w:pPr>
+      <w:rPr>
+        <w:rFonts w:ascii="Courier New" w:hAnsi="Courier New" w:cs="Courier New" w:hint="default"/>
+      </w:rPr>
+    </w:lvl>
+    <w:lvl w:ilvl="2" w:tplc="04090005" w:tentative="1">
+      <w:start w:val="1"/>
+      <w:numFmt w:val="bullet"/>
+      <w:lvlText w:val=""/>
+      <w:lvlJc w:val="left"/>
+      <w:pPr>
+        <w:ind w:left="2160" w:hanging="360"/>
+      </w:pPr>
+      <w:rPr>
+        <w:rFonts w:ascii="Wingdings" w:hAnsi="Wingdings" w:hint="default"/>
+      </w:rPr>
+    </w:lvl>
+    <w:lvl w:ilvl="3" w:tplc="04090001" w:tentative="1">
+      <w:start w:val="1"/>
+      <w:numFmt w:val="bullet"/>
+      <w:lvlText w:val=""/>
+      <w:lvlJc w:val="left"/>
+      <w:pPr>
+        <w:ind w:left="2880" w:hanging="360"/>
+      </w:pPr>
+      <w:rPr>
+        <w:rFonts w:ascii="Symbol" w:hAnsi="Symbol" w:hint="default"/>
+      </w:rPr>
+    </w:lvl>
+    <w:lvl w:ilvl="4" w:tplc="04090003" w:tentative="1">
+      <w:start w:val="1"/>
+      <w:numFmt w:val="bullet"/>
+      <w:lvlText w:val="o"/>
+      <w:lvlJc w:val="left"/>
+      <w:pPr>
+        <w:ind w:left="3600" w:hanging="360"/>
+      </w:pPr>
+      <w:rPr>
+        <w:rFonts w:ascii="Courier New" w:hAnsi="Courier New" w:cs="Courier New" w:hint="default"/>
+      </w:rPr>
+    </w:lvl>
+    <w:lvl w:ilvl="5" w:tplc="04090005" w:tentative="1">
+      <w:start w:val="1"/>
+      <w:numFmt w:val="bullet"/>
+      <w:lvlText w:val=""/>
+      <w:lvlJc w:val="left"/>
+      <w:pPr>
+        <w:ind w:left="4320" w:hanging="360"/>
+      </w:pPr>
+      <w:rPr>
+        <w:rFonts w:ascii="Wingdings" w:hAnsi="Wingdings" w:hint="default"/>
+      </w:rPr>
+    </w:lvl>
+    <w:lvl w:ilvl="6" w:tplc="04090001" w:tentative="1">
+      <w:start w:val="1"/>
+      <w:numFmt w:val="bullet"/>
+      <w:lvlText w:val=""/>
+      <w:lvlJc w:val="left"/>
+      <w:pPr>
+        <w:ind w:left="5040" w:hanging="360"/>
+      </w:pPr>
+      <w:rPr>
+        <w:rFonts w:ascii="Symbol" w:hAnsi="Symbol" w:hint="default"/>
+      </w:rPr>
+    </w:lvl>
+    <w:lvl w:ilvl="7" w:tplc="04090003" w:tentative="1">
+      <w:start w:val="1"/>
+      <w:numFmt w:val="bullet"/>
+      <w:lvlText w:val="o"/>
+      <w:lvlJc w:val="left"/>
+      <w:pPr>
+        <w:ind w:left="5760" w:hanging="360"/>
+      </w:pPr>
+      <w:rPr>
+        <w:rFonts w:ascii="Courier New" w:hAnsi="Courier New" w:cs="Courier New" w:hint="default"/>
+      </w:rPr>
+    </w:lvl>
+    <w:lvl w:ilvl="8" w:tplc="04090005" w:tentative="1">
+      <w:start w:val="1"/>
+      <w:numFmt w:val="bullet"/>
+      <w:lvlText w:val=""/>
+      <w:lvlJc w:val="left"/>
+      <w:pPr>
+        <w:ind w:left="6480" w:hanging="360"/>
+      </w:pPr>
+      <w:rPr>
+        <w:rFonts w:ascii="Wingdings" w:hAnsi="Wingdings" w:hint="default"/>
+      </w:rPr>
+    </w:lvl>
+  </w:abstractNum>
+  <w:abstractNum w:abstractNumId="6" w15:restartNumberingAfterBreak="0">
     <w:nsid w:val="1D56361E"/>
     <w:multiLevelType w:val="hybridMultilevel"/>
     <w:tmpl w:val="C6D437DC"/>
@@ -3026,7 +4639,382 @@
       </w:rPr>
     </w:lvl>
   </w:abstractNum>
-  <w:abstractNum w:abstractNumId="4" w15:restartNumberingAfterBreak="0">
+  <w:abstractNum w:abstractNumId="7" w15:restartNumberingAfterBreak="0">
+    <w:nsid w:val="207978CD"/>
+    <w:multiLevelType w:val="hybridMultilevel"/>
+    <w:tmpl w:val="2EDAD51E"/>
+    <w:lvl w:ilvl="0" w:tplc="735CEB80">
+      <w:start w:val="1"/>
+      <w:numFmt w:val="bullet"/>
+      <w:lvlText w:val=""/>
+      <w:lvlJc w:val="left"/>
+      <w:pPr>
+        <w:ind w:left="720" w:hanging="360"/>
+      </w:pPr>
+      <w:rPr>
+        <w:rFonts w:ascii="Symbol" w:hAnsi="Symbol" w:hint="default"/>
+      </w:rPr>
+    </w:lvl>
+    <w:lvl w:ilvl="1" w:tplc="04090003" w:tentative="1">
+      <w:start w:val="1"/>
+      <w:numFmt w:val="bullet"/>
+      <w:lvlText w:val="o"/>
+      <w:lvlJc w:val="left"/>
+      <w:pPr>
+        <w:ind w:left="1440" w:hanging="360"/>
+      </w:pPr>
+      <w:rPr>
+        <w:rFonts w:ascii="Courier New" w:hAnsi="Courier New" w:cs="Courier New" w:hint="default"/>
+      </w:rPr>
+    </w:lvl>
+    <w:lvl w:ilvl="2" w:tplc="04090005" w:tentative="1">
+      <w:start w:val="1"/>
+      <w:numFmt w:val="bullet"/>
+      <w:lvlText w:val=""/>
+      <w:lvlJc w:val="left"/>
+      <w:pPr>
+        <w:ind w:left="2160" w:hanging="360"/>
+      </w:pPr>
+      <w:rPr>
+        <w:rFonts w:ascii="Wingdings" w:hAnsi="Wingdings" w:hint="default"/>
+      </w:rPr>
+    </w:lvl>
+    <w:lvl w:ilvl="3" w:tplc="04090001" w:tentative="1">
+      <w:start w:val="1"/>
+      <w:numFmt w:val="bullet"/>
+      <w:lvlText w:val=""/>
+      <w:lvlJc w:val="left"/>
+      <w:pPr>
+        <w:ind w:left="2880" w:hanging="360"/>
+      </w:pPr>
+      <w:rPr>
+        <w:rFonts w:ascii="Symbol" w:hAnsi="Symbol" w:hint="default"/>
+      </w:rPr>
+    </w:lvl>
+    <w:lvl w:ilvl="4" w:tplc="04090003" w:tentative="1">
+      <w:start w:val="1"/>
+      <w:numFmt w:val="bullet"/>
+      <w:lvlText w:val="o"/>
+      <w:lvlJc w:val="left"/>
+      <w:pPr>
+        <w:ind w:left="3600" w:hanging="360"/>
+      </w:pPr>
+      <w:rPr>
+        <w:rFonts w:ascii="Courier New" w:hAnsi="Courier New" w:cs="Courier New" w:hint="default"/>
+      </w:rPr>
+    </w:lvl>
+    <w:lvl w:ilvl="5" w:tplc="04090005" w:tentative="1">
+      <w:start w:val="1"/>
+      <w:numFmt w:val="bullet"/>
+      <w:lvlText w:val=""/>
+      <w:lvlJc w:val="left"/>
+      <w:pPr>
+        <w:ind w:left="4320" w:hanging="360"/>
+      </w:pPr>
+      <w:rPr>
+        <w:rFonts w:ascii="Wingdings" w:hAnsi="Wingdings" w:hint="default"/>
+      </w:rPr>
+    </w:lvl>
+    <w:lvl w:ilvl="6" w:tplc="04090001" w:tentative="1">
+      <w:start w:val="1"/>
+      <w:numFmt w:val="bullet"/>
+      <w:lvlText w:val=""/>
+      <w:lvlJc w:val="left"/>
+      <w:pPr>
+        <w:ind w:left="5040" w:hanging="360"/>
+      </w:pPr>
+      <w:rPr>
+        <w:rFonts w:ascii="Symbol" w:hAnsi="Symbol" w:hint="default"/>
+      </w:rPr>
+    </w:lvl>
+    <w:lvl w:ilvl="7" w:tplc="04090003" w:tentative="1">
+      <w:start w:val="1"/>
+      <w:numFmt w:val="bullet"/>
+      <w:lvlText w:val="o"/>
+      <w:lvlJc w:val="left"/>
+      <w:pPr>
+        <w:ind w:left="5760" w:hanging="360"/>
+      </w:pPr>
+      <w:rPr>
+        <w:rFonts w:ascii="Courier New" w:hAnsi="Courier New" w:cs="Courier New" w:hint="default"/>
+      </w:rPr>
+    </w:lvl>
+    <w:lvl w:ilvl="8" w:tplc="04090005" w:tentative="1">
+      <w:start w:val="1"/>
+      <w:numFmt w:val="bullet"/>
+      <w:lvlText w:val=""/>
+      <w:lvlJc w:val="left"/>
+      <w:pPr>
+        <w:ind w:left="6480" w:hanging="360"/>
+      </w:pPr>
+      <w:rPr>
+        <w:rFonts w:ascii="Wingdings" w:hAnsi="Wingdings" w:hint="default"/>
+      </w:rPr>
+    </w:lvl>
+  </w:abstractNum>
+  <w:abstractNum w:abstractNumId="8" w15:restartNumberingAfterBreak="0">
+    <w:nsid w:val="24895DE2"/>
+    <w:multiLevelType w:val="multilevel"/>
+    <w:tmpl w:val="D31A19C8"/>
+    <w:lvl w:ilvl="0">
+      <w:start w:val="1"/>
+      <w:numFmt w:val="bullet"/>
+      <w:lvlText w:val=""/>
+      <w:lvlJc w:val="left"/>
+      <w:pPr>
+        <w:tabs>
+          <w:tab w:val="num" w:pos="720"/>
+        </w:tabs>
+        <w:ind w:left="720" w:hanging="360"/>
+      </w:pPr>
+      <w:rPr>
+        <w:rFonts w:ascii="Symbol" w:hAnsi="Symbol" w:hint="default"/>
+        <w:sz w:val="20"/>
+      </w:rPr>
+    </w:lvl>
+    <w:lvl w:ilvl="1" w:tentative="1">
+      <w:start w:val="1"/>
+      <w:numFmt w:val="bullet"/>
+      <w:lvlText w:val="o"/>
+      <w:lvlJc w:val="left"/>
+      <w:pPr>
+        <w:tabs>
+          <w:tab w:val="num" w:pos="1440"/>
+        </w:tabs>
+        <w:ind w:left="1440" w:hanging="360"/>
+      </w:pPr>
+      <w:rPr>
+        <w:rFonts w:ascii="Courier New" w:hAnsi="Courier New" w:hint="default"/>
+        <w:sz w:val="20"/>
+      </w:rPr>
+    </w:lvl>
+    <w:lvl w:ilvl="2" w:tentative="1">
+      <w:start w:val="1"/>
+      <w:numFmt w:val="bullet"/>
+      <w:lvlText w:val=""/>
+      <w:lvlJc w:val="left"/>
+      <w:pPr>
+        <w:tabs>
+          <w:tab w:val="num" w:pos="2160"/>
+        </w:tabs>
+        <w:ind w:left="2160" w:hanging="360"/>
+      </w:pPr>
+      <w:rPr>
+        <w:rFonts w:ascii="Wingdings" w:hAnsi="Wingdings" w:hint="default"/>
+        <w:sz w:val="20"/>
+      </w:rPr>
+    </w:lvl>
+    <w:lvl w:ilvl="3" w:tentative="1">
+      <w:start w:val="1"/>
+      <w:numFmt w:val="bullet"/>
+      <w:lvlText w:val=""/>
+      <w:lvlJc w:val="left"/>
+      <w:pPr>
+        <w:tabs>
+          <w:tab w:val="num" w:pos="2880"/>
+        </w:tabs>
+        <w:ind w:left="2880" w:hanging="360"/>
+      </w:pPr>
+      <w:rPr>
+        <w:rFonts w:ascii="Wingdings" w:hAnsi="Wingdings" w:hint="default"/>
+        <w:sz w:val="20"/>
+      </w:rPr>
+    </w:lvl>
+    <w:lvl w:ilvl="4" w:tentative="1">
+      <w:start w:val="1"/>
+      <w:numFmt w:val="bullet"/>
+      <w:lvlText w:val=""/>
+      <w:lvlJc w:val="left"/>
+      <w:pPr>
+        <w:tabs>
+          <w:tab w:val="num" w:pos="3600"/>
+        </w:tabs>
+        <w:ind w:left="3600" w:hanging="360"/>
+      </w:pPr>
+      <w:rPr>
+        <w:rFonts w:ascii="Wingdings" w:hAnsi="Wingdings" w:hint="default"/>
+        <w:sz w:val="20"/>
+      </w:rPr>
+    </w:lvl>
+    <w:lvl w:ilvl="5" w:tentative="1">
+      <w:start w:val="1"/>
+      <w:numFmt w:val="bullet"/>
+      <w:lvlText w:val=""/>
+      <w:lvlJc w:val="left"/>
+      <w:pPr>
+        <w:tabs>
+          <w:tab w:val="num" w:pos="4320"/>
+        </w:tabs>
+        <w:ind w:left="4320" w:hanging="360"/>
+      </w:pPr>
+      <w:rPr>
+        <w:rFonts w:ascii="Wingdings" w:hAnsi="Wingdings" w:hint="default"/>
+        <w:sz w:val="20"/>
+      </w:rPr>
+    </w:lvl>
+    <w:lvl w:ilvl="6" w:tentative="1">
+      <w:start w:val="1"/>
+      <w:numFmt w:val="bullet"/>
+      <w:lvlText w:val=""/>
+      <w:lvlJc w:val="left"/>
+      <w:pPr>
+        <w:tabs>
+          <w:tab w:val="num" w:pos="5040"/>
+        </w:tabs>
+        <w:ind w:left="5040" w:hanging="360"/>
+      </w:pPr>
+      <w:rPr>
+        <w:rFonts w:ascii="Wingdings" w:hAnsi="Wingdings" w:hint="default"/>
+        <w:sz w:val="20"/>
+      </w:rPr>
+    </w:lvl>
+    <w:lvl w:ilvl="7" w:tentative="1">
+      <w:start w:val="1"/>
+      <w:numFmt w:val="bullet"/>
+      <w:lvlText w:val=""/>
+      <w:lvlJc w:val="left"/>
+      <w:pPr>
+        <w:tabs>
+          <w:tab w:val="num" w:pos="5760"/>
+        </w:tabs>
+        <w:ind w:left="5760" w:hanging="360"/>
+      </w:pPr>
+      <w:rPr>
+        <w:rFonts w:ascii="Wingdings" w:hAnsi="Wingdings" w:hint="default"/>
+        <w:sz w:val="20"/>
+      </w:rPr>
+    </w:lvl>
+    <w:lvl w:ilvl="8" w:tentative="1">
+      <w:start w:val="1"/>
+      <w:numFmt w:val="bullet"/>
+      <w:lvlText w:val=""/>
+      <w:lvlJc w:val="left"/>
+      <w:pPr>
+        <w:tabs>
+          <w:tab w:val="num" w:pos="6480"/>
+        </w:tabs>
+        <w:ind w:left="6480" w:hanging="360"/>
+      </w:pPr>
+      <w:rPr>
+        <w:rFonts w:ascii="Wingdings" w:hAnsi="Wingdings" w:hint="default"/>
+        <w:sz w:val="20"/>
+      </w:rPr>
+    </w:lvl>
+  </w:abstractNum>
+  <w:abstractNum w:abstractNumId="9" w15:restartNumberingAfterBreak="0">
+    <w:nsid w:val="3738171A"/>
+    <w:multiLevelType w:val="hybridMultilevel"/>
+    <w:tmpl w:val="D408F2DE"/>
+    <w:lvl w:ilvl="0" w:tplc="735CEB80">
+      <w:start w:val="1"/>
+      <w:numFmt w:val="bullet"/>
+      <w:lvlText w:val=""/>
+      <w:lvlJc w:val="left"/>
+      <w:pPr>
+        <w:ind w:left="720" w:hanging="360"/>
+      </w:pPr>
+      <w:rPr>
+        <w:rFonts w:ascii="Symbol" w:hAnsi="Symbol" w:hint="default"/>
+      </w:rPr>
+    </w:lvl>
+    <w:lvl w:ilvl="1" w:tplc="04090003" w:tentative="1">
+      <w:start w:val="1"/>
+      <w:numFmt w:val="bullet"/>
+      <w:lvlText w:val="o"/>
+      <w:lvlJc w:val="left"/>
+      <w:pPr>
+        <w:ind w:left="1440" w:hanging="360"/>
+      </w:pPr>
+      <w:rPr>
+        <w:rFonts w:ascii="Courier New" w:hAnsi="Courier New" w:cs="Courier New" w:hint="default"/>
+      </w:rPr>
+    </w:lvl>
+    <w:lvl w:ilvl="2" w:tplc="04090005" w:tentative="1">
+      <w:start w:val="1"/>
+      <w:numFmt w:val="bullet"/>
+      <w:lvlText w:val=""/>
+      <w:lvlJc w:val="left"/>
+      <w:pPr>
+        <w:ind w:left="2160" w:hanging="360"/>
+      </w:pPr>
+      <w:rPr>
+        <w:rFonts w:ascii="Wingdings" w:hAnsi="Wingdings" w:hint="default"/>
+      </w:rPr>
+    </w:lvl>
+    <w:lvl w:ilvl="3" w:tplc="04090001" w:tentative="1">
+      <w:start w:val="1"/>
+      <w:numFmt w:val="bullet"/>
+      <w:lvlText w:val=""/>
+      <w:lvlJc w:val="left"/>
+      <w:pPr>
+        <w:ind w:left="2880" w:hanging="360"/>
+      </w:pPr>
+      <w:rPr>
+        <w:rFonts w:ascii="Symbol" w:hAnsi="Symbol" w:hint="default"/>
+      </w:rPr>
+    </w:lvl>
+    <w:lvl w:ilvl="4" w:tplc="04090003" w:tentative="1">
+      <w:start w:val="1"/>
+      <w:numFmt w:val="bullet"/>
+      <w:lvlText w:val="o"/>
+      <w:lvlJc w:val="left"/>
+      <w:pPr>
+        <w:ind w:left="3600" w:hanging="360"/>
+      </w:pPr>
+      <w:rPr>
+        <w:rFonts w:ascii="Courier New" w:hAnsi="Courier New" w:cs="Courier New" w:hint="default"/>
+      </w:rPr>
+    </w:lvl>
+    <w:lvl w:ilvl="5" w:tplc="04090005" w:tentative="1">
+      <w:start w:val="1"/>
+      <w:numFmt w:val="bullet"/>
+      <w:lvlText w:val=""/>
+      <w:lvlJc w:val="left"/>
+      <w:pPr>
+        <w:ind w:left="4320" w:hanging="360"/>
+      </w:pPr>
+      <w:rPr>
+        <w:rFonts w:ascii="Wingdings" w:hAnsi="Wingdings" w:hint="default"/>
+      </w:rPr>
+    </w:lvl>
+    <w:lvl w:ilvl="6" w:tplc="04090001" w:tentative="1">
+      <w:start w:val="1"/>
+      <w:numFmt w:val="bullet"/>
+      <w:lvlText w:val=""/>
+      <w:lvlJc w:val="left"/>
+      <w:pPr>
+        <w:ind w:left="5040" w:hanging="360"/>
+      </w:pPr>
+      <w:rPr>
+        <w:rFonts w:ascii="Symbol" w:hAnsi="Symbol" w:hint="default"/>
+      </w:rPr>
+    </w:lvl>
+    <w:lvl w:ilvl="7" w:tplc="04090003" w:tentative="1">
+      <w:start w:val="1"/>
+      <w:numFmt w:val="bullet"/>
+      <w:lvlText w:val="o"/>
+      <w:lvlJc w:val="left"/>
+      <w:pPr>
+        <w:ind w:left="5760" w:hanging="360"/>
+      </w:pPr>
+      <w:rPr>
+        <w:rFonts w:ascii="Courier New" w:hAnsi="Courier New" w:cs="Courier New" w:hint="default"/>
+      </w:rPr>
+    </w:lvl>
+    <w:lvl w:ilvl="8" w:tplc="04090005" w:tentative="1">
+      <w:start w:val="1"/>
+      <w:numFmt w:val="bullet"/>
+      <w:lvlText w:val=""/>
+      <w:lvlJc w:val="left"/>
+      <w:pPr>
+        <w:ind w:left="6480" w:hanging="360"/>
+      </w:pPr>
+      <w:rPr>
+        <w:rFonts w:ascii="Wingdings" w:hAnsi="Wingdings" w:hint="default"/>
+      </w:rPr>
+    </w:lvl>
+  </w:abstractNum>
+  <w:abstractNum w:abstractNumId="10" w15:restartNumberingAfterBreak="0">
     <w:nsid w:val="39D30AA9"/>
     <w:multiLevelType w:val="multilevel"/>
     <w:tmpl w:val="28466B58"/>
@@ -3175,7 +5163,7 @@
       </w:rPr>
     </w:lvl>
   </w:abstractNum>
-  <w:abstractNum w:abstractNumId="5" w15:restartNumberingAfterBreak="0">
+  <w:abstractNum w:abstractNumId="11" w15:restartNumberingAfterBreak="0">
     <w:nsid w:val="401A66E2"/>
     <w:multiLevelType w:val="hybridMultilevel"/>
     <w:tmpl w:val="98405DDA"/>
@@ -3288,7 +5276,7 @@
       </w:rPr>
     </w:lvl>
   </w:abstractNum>
-  <w:abstractNum w:abstractNumId="6" w15:restartNumberingAfterBreak="0">
+  <w:abstractNum w:abstractNumId="12" w15:restartNumberingAfterBreak="0">
     <w:nsid w:val="45E77F97"/>
     <w:multiLevelType w:val="multilevel"/>
     <w:tmpl w:val="3B8A7398"/>
@@ -3437,7 +5425,156 @@
       </w:rPr>
     </w:lvl>
   </w:abstractNum>
-  <w:abstractNum w:abstractNumId="7" w15:restartNumberingAfterBreak="0">
+  <w:abstractNum w:abstractNumId="13" w15:restartNumberingAfterBreak="0">
+    <w:nsid w:val="465B4B33"/>
+    <w:multiLevelType w:val="multilevel"/>
+    <w:tmpl w:val="347A792E"/>
+    <w:lvl w:ilvl="0">
+      <w:start w:val="1"/>
+      <w:numFmt w:val="bullet"/>
+      <w:lvlText w:val=""/>
+      <w:lvlJc w:val="left"/>
+      <w:pPr>
+        <w:tabs>
+          <w:tab w:val="num" w:pos="720"/>
+        </w:tabs>
+        <w:ind w:left="720" w:hanging="360"/>
+      </w:pPr>
+      <w:rPr>
+        <w:rFonts w:ascii="Symbol" w:hAnsi="Symbol" w:hint="default"/>
+        <w:sz w:val="20"/>
+      </w:rPr>
+    </w:lvl>
+    <w:lvl w:ilvl="1" w:tentative="1">
+      <w:start w:val="1"/>
+      <w:numFmt w:val="bullet"/>
+      <w:lvlText w:val="o"/>
+      <w:lvlJc w:val="left"/>
+      <w:pPr>
+        <w:tabs>
+          <w:tab w:val="num" w:pos="1440"/>
+        </w:tabs>
+        <w:ind w:left="1440" w:hanging="360"/>
+      </w:pPr>
+      <w:rPr>
+        <w:rFonts w:ascii="Courier New" w:hAnsi="Courier New" w:hint="default"/>
+        <w:sz w:val="20"/>
+      </w:rPr>
+    </w:lvl>
+    <w:lvl w:ilvl="2" w:tentative="1">
+      <w:start w:val="1"/>
+      <w:numFmt w:val="bullet"/>
+      <w:lvlText w:val=""/>
+      <w:lvlJc w:val="left"/>
+      <w:pPr>
+        <w:tabs>
+          <w:tab w:val="num" w:pos="2160"/>
+        </w:tabs>
+        <w:ind w:left="2160" w:hanging="360"/>
+      </w:pPr>
+      <w:rPr>
+        <w:rFonts w:ascii="Wingdings" w:hAnsi="Wingdings" w:hint="default"/>
+        <w:sz w:val="20"/>
+      </w:rPr>
+    </w:lvl>
+    <w:lvl w:ilvl="3" w:tentative="1">
+      <w:start w:val="1"/>
+      <w:numFmt w:val="bullet"/>
+      <w:lvlText w:val=""/>
+      <w:lvlJc w:val="left"/>
+      <w:pPr>
+        <w:tabs>
+          <w:tab w:val="num" w:pos="2880"/>
+        </w:tabs>
+        <w:ind w:left="2880" w:hanging="360"/>
+      </w:pPr>
+      <w:rPr>
+        <w:rFonts w:ascii="Wingdings" w:hAnsi="Wingdings" w:hint="default"/>
+        <w:sz w:val="20"/>
+      </w:rPr>
+    </w:lvl>
+    <w:lvl w:ilvl="4" w:tentative="1">
+      <w:start w:val="1"/>
+      <w:numFmt w:val="bullet"/>
+      <w:lvlText w:val=""/>
+      <w:lvlJc w:val="left"/>
+      <w:pPr>
+        <w:tabs>
+          <w:tab w:val="num" w:pos="3600"/>
+        </w:tabs>
+        <w:ind w:left="3600" w:hanging="360"/>
+      </w:pPr>
+      <w:rPr>
+        <w:rFonts w:ascii="Wingdings" w:hAnsi="Wingdings" w:hint="default"/>
+        <w:sz w:val="20"/>
+      </w:rPr>
+    </w:lvl>
+    <w:lvl w:ilvl="5" w:tentative="1">
+      <w:start w:val="1"/>
+      <w:numFmt w:val="bullet"/>
+      <w:lvlText w:val=""/>
+      <w:lvlJc w:val="left"/>
+      <w:pPr>
+        <w:tabs>
+          <w:tab w:val="num" w:pos="4320"/>
+        </w:tabs>
+        <w:ind w:left="4320" w:hanging="360"/>
+      </w:pPr>
+      <w:rPr>
+        <w:rFonts w:ascii="Wingdings" w:hAnsi="Wingdings" w:hint="default"/>
+        <w:sz w:val="20"/>
+      </w:rPr>
+    </w:lvl>
+    <w:lvl w:ilvl="6" w:tentative="1">
+      <w:start w:val="1"/>
+      <w:numFmt w:val="bullet"/>
+      <w:lvlText w:val=""/>
+      <w:lvlJc w:val="left"/>
+      <w:pPr>
+        <w:tabs>
+          <w:tab w:val="num" w:pos="5040"/>
+        </w:tabs>
+        <w:ind w:left="5040" w:hanging="360"/>
+      </w:pPr>
+      <w:rPr>
+        <w:rFonts w:ascii="Wingdings" w:hAnsi="Wingdings" w:hint="default"/>
+        <w:sz w:val="20"/>
+      </w:rPr>
+    </w:lvl>
+    <w:lvl w:ilvl="7" w:tentative="1">
+      <w:start w:val="1"/>
+      <w:numFmt w:val="bullet"/>
+      <w:lvlText w:val=""/>
+      <w:lvlJc w:val="left"/>
+      <w:pPr>
+        <w:tabs>
+          <w:tab w:val="num" w:pos="5760"/>
+        </w:tabs>
+        <w:ind w:left="5760" w:hanging="360"/>
+      </w:pPr>
+      <w:rPr>
+        <w:rFonts w:ascii="Wingdings" w:hAnsi="Wingdings" w:hint="default"/>
+        <w:sz w:val="20"/>
+      </w:rPr>
+    </w:lvl>
+    <w:lvl w:ilvl="8" w:tentative="1">
+      <w:start w:val="1"/>
+      <w:numFmt w:val="bullet"/>
+      <w:lvlText w:val=""/>
+      <w:lvlJc w:val="left"/>
+      <w:pPr>
+        <w:tabs>
+          <w:tab w:val="num" w:pos="6480"/>
+        </w:tabs>
+        <w:ind w:left="6480" w:hanging="360"/>
+      </w:pPr>
+      <w:rPr>
+        <w:rFonts w:ascii="Wingdings" w:hAnsi="Wingdings" w:hint="default"/>
+        <w:sz w:val="20"/>
+      </w:rPr>
+    </w:lvl>
+  </w:abstractNum>
+  <w:abstractNum w:abstractNumId="14" w15:restartNumberingAfterBreak="0">
     <w:nsid w:val="4C4E1BDA"/>
     <w:multiLevelType w:val="hybridMultilevel"/>
     <w:tmpl w:val="446EC110"/>
@@ -3523,7 +5660,233 @@
       </w:pPr>
     </w:lvl>
   </w:abstractNum>
-  <w:abstractNum w:abstractNumId="8" w15:restartNumberingAfterBreak="0">
+  <w:abstractNum w:abstractNumId="15" w15:restartNumberingAfterBreak="0">
+    <w:nsid w:val="551D711E"/>
+    <w:multiLevelType w:val="hybridMultilevel"/>
+    <w:tmpl w:val="C2BAEAF4"/>
+    <w:lvl w:ilvl="0" w:tplc="735CEB80">
+      <w:start w:val="1"/>
+      <w:numFmt w:val="bullet"/>
+      <w:lvlText w:val=""/>
+      <w:lvlJc w:val="left"/>
+      <w:pPr>
+        <w:ind w:left="720" w:hanging="360"/>
+      </w:pPr>
+      <w:rPr>
+        <w:rFonts w:ascii="Symbol" w:hAnsi="Symbol" w:hint="default"/>
+      </w:rPr>
+    </w:lvl>
+    <w:lvl w:ilvl="1" w:tplc="04090003" w:tentative="1">
+      <w:start w:val="1"/>
+      <w:numFmt w:val="bullet"/>
+      <w:lvlText w:val="o"/>
+      <w:lvlJc w:val="left"/>
+      <w:pPr>
+        <w:ind w:left="1440" w:hanging="360"/>
+      </w:pPr>
+      <w:rPr>
+        <w:rFonts w:ascii="Courier New" w:hAnsi="Courier New" w:cs="Courier New" w:hint="default"/>
+      </w:rPr>
+    </w:lvl>
+    <w:lvl w:ilvl="2" w:tplc="04090005" w:tentative="1">
+      <w:start w:val="1"/>
+      <w:numFmt w:val="bullet"/>
+      <w:lvlText w:val=""/>
+      <w:lvlJc w:val="left"/>
+      <w:pPr>
+        <w:ind w:left="2160" w:hanging="360"/>
+      </w:pPr>
+      <w:rPr>
+        <w:rFonts w:ascii="Wingdings" w:hAnsi="Wingdings" w:hint="default"/>
+      </w:rPr>
+    </w:lvl>
+    <w:lvl w:ilvl="3" w:tplc="04090001" w:tentative="1">
+      <w:start w:val="1"/>
+      <w:numFmt w:val="bullet"/>
+      <w:lvlText w:val=""/>
+      <w:lvlJc w:val="left"/>
+      <w:pPr>
+        <w:ind w:left="2880" w:hanging="360"/>
+      </w:pPr>
+      <w:rPr>
+        <w:rFonts w:ascii="Symbol" w:hAnsi="Symbol" w:hint="default"/>
+      </w:rPr>
+    </w:lvl>
+    <w:lvl w:ilvl="4" w:tplc="04090003" w:tentative="1">
+      <w:start w:val="1"/>
+      <w:numFmt w:val="bullet"/>
+      <w:lvlText w:val="o"/>
+      <w:lvlJc w:val="left"/>
+      <w:pPr>
+        <w:ind w:left="3600" w:hanging="360"/>
+      </w:pPr>
+      <w:rPr>
+        <w:rFonts w:ascii="Courier New" w:hAnsi="Courier New" w:cs="Courier New" w:hint="default"/>
+      </w:rPr>
+    </w:lvl>
+    <w:lvl w:ilvl="5" w:tplc="04090005" w:tentative="1">
+      <w:start w:val="1"/>
+      <w:numFmt w:val="bullet"/>
+      <w:lvlText w:val=""/>
+      <w:lvlJc w:val="left"/>
+      <w:pPr>
+        <w:ind w:left="4320" w:hanging="360"/>
+      </w:pPr>
+      <w:rPr>
+        <w:rFonts w:ascii="Wingdings" w:hAnsi="Wingdings" w:hint="default"/>
+      </w:rPr>
+    </w:lvl>
+    <w:lvl w:ilvl="6" w:tplc="04090001" w:tentative="1">
+      <w:start w:val="1"/>
+      <w:numFmt w:val="bullet"/>
+      <w:lvlText w:val=""/>
+      <w:lvlJc w:val="left"/>
+      <w:pPr>
+        <w:ind w:left="5040" w:hanging="360"/>
+      </w:pPr>
+      <w:rPr>
+        <w:rFonts w:ascii="Symbol" w:hAnsi="Symbol" w:hint="default"/>
+      </w:rPr>
+    </w:lvl>
+    <w:lvl w:ilvl="7" w:tplc="04090003" w:tentative="1">
+      <w:start w:val="1"/>
+      <w:numFmt w:val="bullet"/>
+      <w:lvlText w:val="o"/>
+      <w:lvlJc w:val="left"/>
+      <w:pPr>
+        <w:ind w:left="5760" w:hanging="360"/>
+      </w:pPr>
+      <w:rPr>
+        <w:rFonts w:ascii="Courier New" w:hAnsi="Courier New" w:cs="Courier New" w:hint="default"/>
+      </w:rPr>
+    </w:lvl>
+    <w:lvl w:ilvl="8" w:tplc="04090005" w:tentative="1">
+      <w:start w:val="1"/>
+      <w:numFmt w:val="bullet"/>
+      <w:lvlText w:val=""/>
+      <w:lvlJc w:val="left"/>
+      <w:pPr>
+        <w:ind w:left="6480" w:hanging="360"/>
+      </w:pPr>
+      <w:rPr>
+        <w:rFonts w:ascii="Wingdings" w:hAnsi="Wingdings" w:hint="default"/>
+      </w:rPr>
+    </w:lvl>
+  </w:abstractNum>
+  <w:abstractNum w:abstractNumId="16" w15:restartNumberingAfterBreak="0">
+    <w:nsid w:val="696A4460"/>
+    <w:multiLevelType w:val="hybridMultilevel"/>
+    <w:tmpl w:val="A79A736A"/>
+    <w:lvl w:ilvl="0" w:tplc="735CEB80">
+      <w:start w:val="1"/>
+      <w:numFmt w:val="bullet"/>
+      <w:lvlText w:val=""/>
+      <w:lvlJc w:val="left"/>
+      <w:pPr>
+        <w:ind w:left="720" w:hanging="360"/>
+      </w:pPr>
+      <w:rPr>
+        <w:rFonts w:ascii="Symbol" w:hAnsi="Symbol" w:hint="default"/>
+      </w:rPr>
+    </w:lvl>
+    <w:lvl w:ilvl="1" w:tplc="04090003" w:tentative="1">
+      <w:start w:val="1"/>
+      <w:numFmt w:val="bullet"/>
+      <w:lvlText w:val="o"/>
+      <w:lvlJc w:val="left"/>
+      <w:pPr>
+        <w:ind w:left="1440" w:hanging="360"/>
+      </w:pPr>
+      <w:rPr>
+        <w:rFonts w:ascii="Courier New" w:hAnsi="Courier New" w:cs="Courier New" w:hint="default"/>
+      </w:rPr>
+    </w:lvl>
+    <w:lvl w:ilvl="2" w:tplc="04090005" w:tentative="1">
+      <w:start w:val="1"/>
+      <w:numFmt w:val="bullet"/>
+      <w:lvlText w:val=""/>
+      <w:lvlJc w:val="left"/>
+      <w:pPr>
+        <w:ind w:left="2160" w:hanging="360"/>
+      </w:pPr>
+      <w:rPr>
+        <w:rFonts w:ascii="Wingdings" w:hAnsi="Wingdings" w:hint="default"/>
+      </w:rPr>
+    </w:lvl>
+    <w:lvl w:ilvl="3" w:tplc="04090001" w:tentative="1">
+      <w:start w:val="1"/>
+      <w:numFmt w:val="bullet"/>
+      <w:lvlText w:val=""/>
+      <w:lvlJc w:val="left"/>
+      <w:pPr>
+        <w:ind w:left="2880" w:hanging="360"/>
+      </w:pPr>
+      <w:rPr>
+        <w:rFonts w:ascii="Symbol" w:hAnsi="Symbol" w:hint="default"/>
+      </w:rPr>
+    </w:lvl>
+    <w:lvl w:ilvl="4" w:tplc="04090003" w:tentative="1">
+      <w:start w:val="1"/>
+      <w:numFmt w:val="bullet"/>
+      <w:lvlText w:val="o"/>
+      <w:lvlJc w:val="left"/>
+      <w:pPr>
+        <w:ind w:left="3600" w:hanging="360"/>
+      </w:pPr>
+      <w:rPr>
+        <w:rFonts w:ascii="Courier New" w:hAnsi="Courier New" w:cs="Courier New" w:hint="default"/>
+      </w:rPr>
+    </w:lvl>
+    <w:lvl w:ilvl="5" w:tplc="04090005" w:tentative="1">
+      <w:start w:val="1"/>
+      <w:numFmt w:val="bullet"/>
+      <w:lvlText w:val=""/>
+      <w:lvlJc w:val="left"/>
+      <w:pPr>
+        <w:ind w:left="4320" w:hanging="360"/>
+      </w:pPr>
+      <w:rPr>
+        <w:rFonts w:ascii="Wingdings" w:hAnsi="Wingdings" w:hint="default"/>
+      </w:rPr>
+    </w:lvl>
+    <w:lvl w:ilvl="6" w:tplc="04090001" w:tentative="1">
+      <w:start w:val="1"/>
+      <w:numFmt w:val="bullet"/>
+      <w:lvlText w:val=""/>
+      <w:lvlJc w:val="left"/>
+      <w:pPr>
+        <w:ind w:left="5040" w:hanging="360"/>
+      </w:pPr>
+      <w:rPr>
+        <w:rFonts w:ascii="Symbol" w:hAnsi="Symbol" w:hint="default"/>
+      </w:rPr>
+    </w:lvl>
+    <w:lvl w:ilvl="7" w:tplc="04090003" w:tentative="1">
+      <w:start w:val="1"/>
+      <w:numFmt w:val="bullet"/>
+      <w:lvlText w:val="o"/>
+      <w:lvlJc w:val="left"/>
+      <w:pPr>
+        <w:ind w:left="5760" w:hanging="360"/>
+      </w:pPr>
+      <w:rPr>
+        <w:rFonts w:ascii="Courier New" w:hAnsi="Courier New" w:cs="Courier New" w:hint="default"/>
+      </w:rPr>
+    </w:lvl>
+    <w:lvl w:ilvl="8" w:tplc="04090005" w:tentative="1">
+      <w:start w:val="1"/>
+      <w:numFmt w:val="bullet"/>
+      <w:lvlText w:val=""/>
+      <w:lvlJc w:val="left"/>
+      <w:pPr>
+        <w:ind w:left="6480" w:hanging="360"/>
+      </w:pPr>
+      <w:rPr>
+        <w:rFonts w:ascii="Wingdings" w:hAnsi="Wingdings" w:hint="default"/>
+      </w:rPr>
+    </w:lvl>
+  </w:abstractNum>
+  <w:abstractNum w:abstractNumId="17" w15:restartNumberingAfterBreak="0">
     <w:nsid w:val="6A772E60"/>
     <w:multiLevelType w:val="multilevel"/>
     <w:tmpl w:val="AF9CA93E"/>
@@ -3636,7 +5999,7 @@
       </w:pPr>
     </w:lvl>
   </w:abstractNum>
-  <w:abstractNum w:abstractNumId="9" w15:restartNumberingAfterBreak="0">
+  <w:abstractNum w:abstractNumId="18" w15:restartNumberingAfterBreak="0">
     <w:nsid w:val="6CBC43C9"/>
     <w:multiLevelType w:val="hybridMultilevel"/>
     <w:tmpl w:val="4DC63066"/>
@@ -3749,35 +6112,330 @@
       </w:rPr>
     </w:lvl>
   </w:abstractNum>
+  <w:abstractNum w:abstractNumId="19" w15:restartNumberingAfterBreak="0">
+    <w:nsid w:val="6E8B2938"/>
+    <w:multiLevelType w:val="multilevel"/>
+    <w:tmpl w:val="FF82E35E"/>
+    <w:lvl w:ilvl="0">
+      <w:start w:val="1"/>
+      <w:numFmt w:val="bullet"/>
+      <w:lvlText w:val=""/>
+      <w:lvlJc w:val="left"/>
+      <w:pPr>
+        <w:tabs>
+          <w:tab w:val="num" w:pos="720"/>
+        </w:tabs>
+        <w:ind w:left="720" w:hanging="360"/>
+      </w:pPr>
+      <w:rPr>
+        <w:rFonts w:ascii="Symbol" w:hAnsi="Symbol" w:hint="default"/>
+        <w:sz w:val="20"/>
+      </w:rPr>
+    </w:lvl>
+    <w:lvl w:ilvl="1" w:tentative="1">
+      <w:start w:val="1"/>
+      <w:numFmt w:val="bullet"/>
+      <w:lvlText w:val="o"/>
+      <w:lvlJc w:val="left"/>
+      <w:pPr>
+        <w:tabs>
+          <w:tab w:val="num" w:pos="1440"/>
+        </w:tabs>
+        <w:ind w:left="1440" w:hanging="360"/>
+      </w:pPr>
+      <w:rPr>
+        <w:rFonts w:ascii="Courier New" w:hAnsi="Courier New" w:hint="default"/>
+        <w:sz w:val="20"/>
+      </w:rPr>
+    </w:lvl>
+    <w:lvl w:ilvl="2" w:tentative="1">
+      <w:start w:val="1"/>
+      <w:numFmt w:val="bullet"/>
+      <w:lvlText w:val=""/>
+      <w:lvlJc w:val="left"/>
+      <w:pPr>
+        <w:tabs>
+          <w:tab w:val="num" w:pos="2160"/>
+        </w:tabs>
+        <w:ind w:left="2160" w:hanging="360"/>
+      </w:pPr>
+      <w:rPr>
+        <w:rFonts w:ascii="Wingdings" w:hAnsi="Wingdings" w:hint="default"/>
+        <w:sz w:val="20"/>
+      </w:rPr>
+    </w:lvl>
+    <w:lvl w:ilvl="3" w:tentative="1">
+      <w:start w:val="1"/>
+      <w:numFmt w:val="bullet"/>
+      <w:lvlText w:val=""/>
+      <w:lvlJc w:val="left"/>
+      <w:pPr>
+        <w:tabs>
+          <w:tab w:val="num" w:pos="2880"/>
+        </w:tabs>
+        <w:ind w:left="2880" w:hanging="360"/>
+      </w:pPr>
+      <w:rPr>
+        <w:rFonts w:ascii="Wingdings" w:hAnsi="Wingdings" w:hint="default"/>
+        <w:sz w:val="20"/>
+      </w:rPr>
+    </w:lvl>
+    <w:lvl w:ilvl="4" w:tentative="1">
+      <w:start w:val="1"/>
+      <w:numFmt w:val="bullet"/>
+      <w:lvlText w:val=""/>
+      <w:lvlJc w:val="left"/>
+      <w:pPr>
+        <w:tabs>
+          <w:tab w:val="num" w:pos="3600"/>
+        </w:tabs>
+        <w:ind w:left="3600" w:hanging="360"/>
+      </w:pPr>
+      <w:rPr>
+        <w:rFonts w:ascii="Wingdings" w:hAnsi="Wingdings" w:hint="default"/>
+        <w:sz w:val="20"/>
+      </w:rPr>
+    </w:lvl>
+    <w:lvl w:ilvl="5" w:tentative="1">
+      <w:start w:val="1"/>
+      <w:numFmt w:val="bullet"/>
+      <w:lvlText w:val=""/>
+      <w:lvlJc w:val="left"/>
+      <w:pPr>
+        <w:tabs>
+          <w:tab w:val="num" w:pos="4320"/>
+        </w:tabs>
+        <w:ind w:left="4320" w:hanging="360"/>
+      </w:pPr>
+      <w:rPr>
+        <w:rFonts w:ascii="Wingdings" w:hAnsi="Wingdings" w:hint="default"/>
+        <w:sz w:val="20"/>
+      </w:rPr>
+    </w:lvl>
+    <w:lvl w:ilvl="6" w:tentative="1">
+      <w:start w:val="1"/>
+      <w:numFmt w:val="bullet"/>
+      <w:lvlText w:val=""/>
+      <w:lvlJc w:val="left"/>
+      <w:pPr>
+        <w:tabs>
+          <w:tab w:val="num" w:pos="5040"/>
+        </w:tabs>
+        <w:ind w:left="5040" w:hanging="360"/>
+      </w:pPr>
+      <w:rPr>
+        <w:rFonts w:ascii="Wingdings" w:hAnsi="Wingdings" w:hint="default"/>
+        <w:sz w:val="20"/>
+      </w:rPr>
+    </w:lvl>
+    <w:lvl w:ilvl="7" w:tentative="1">
+      <w:start w:val="1"/>
+      <w:numFmt w:val="bullet"/>
+      <w:lvlText w:val=""/>
+      <w:lvlJc w:val="left"/>
+      <w:pPr>
+        <w:tabs>
+          <w:tab w:val="num" w:pos="5760"/>
+        </w:tabs>
+        <w:ind w:left="5760" w:hanging="360"/>
+      </w:pPr>
+      <w:rPr>
+        <w:rFonts w:ascii="Wingdings" w:hAnsi="Wingdings" w:hint="default"/>
+        <w:sz w:val="20"/>
+      </w:rPr>
+    </w:lvl>
+    <w:lvl w:ilvl="8" w:tentative="1">
+      <w:start w:val="1"/>
+      <w:numFmt w:val="bullet"/>
+      <w:lvlText w:val=""/>
+      <w:lvlJc w:val="left"/>
+      <w:pPr>
+        <w:tabs>
+          <w:tab w:val="num" w:pos="6480"/>
+        </w:tabs>
+        <w:ind w:left="6480" w:hanging="360"/>
+      </w:pPr>
+      <w:rPr>
+        <w:rFonts w:ascii="Wingdings" w:hAnsi="Wingdings" w:hint="default"/>
+        <w:sz w:val="20"/>
+      </w:rPr>
+    </w:lvl>
+  </w:abstractNum>
+  <w:abstractNum w:abstractNumId="20" w15:restartNumberingAfterBreak="0">
+    <w:nsid w:val="7F1A5B68"/>
+    <w:multiLevelType w:val="hybridMultilevel"/>
+    <w:tmpl w:val="0068D906"/>
+    <w:lvl w:ilvl="0" w:tplc="735CEB80">
+      <w:start w:val="1"/>
+      <w:numFmt w:val="bullet"/>
+      <w:lvlText w:val=""/>
+      <w:lvlJc w:val="left"/>
+      <w:pPr>
+        <w:ind w:left="720" w:hanging="360"/>
+      </w:pPr>
+      <w:rPr>
+        <w:rFonts w:ascii="Symbol" w:hAnsi="Symbol" w:hint="default"/>
+      </w:rPr>
+    </w:lvl>
+    <w:lvl w:ilvl="1" w:tplc="04090003" w:tentative="1">
+      <w:start w:val="1"/>
+      <w:numFmt w:val="bullet"/>
+      <w:lvlText w:val="o"/>
+      <w:lvlJc w:val="left"/>
+      <w:pPr>
+        <w:ind w:left="1440" w:hanging="360"/>
+      </w:pPr>
+      <w:rPr>
+        <w:rFonts w:ascii="Courier New" w:hAnsi="Courier New" w:cs="Courier New" w:hint="default"/>
+      </w:rPr>
+    </w:lvl>
+    <w:lvl w:ilvl="2" w:tplc="04090005" w:tentative="1">
+      <w:start w:val="1"/>
+      <w:numFmt w:val="bullet"/>
+      <w:lvlText w:val=""/>
+      <w:lvlJc w:val="left"/>
+      <w:pPr>
+        <w:ind w:left="2160" w:hanging="360"/>
+      </w:pPr>
+      <w:rPr>
+        <w:rFonts w:ascii="Wingdings" w:hAnsi="Wingdings" w:hint="default"/>
+      </w:rPr>
+    </w:lvl>
+    <w:lvl w:ilvl="3" w:tplc="04090001" w:tentative="1">
+      <w:start w:val="1"/>
+      <w:numFmt w:val="bullet"/>
+      <w:lvlText w:val=""/>
+      <w:lvlJc w:val="left"/>
+      <w:pPr>
+        <w:ind w:left="2880" w:hanging="360"/>
+      </w:pPr>
+      <w:rPr>
+        <w:rFonts w:ascii="Symbol" w:hAnsi="Symbol" w:hint="default"/>
+      </w:rPr>
+    </w:lvl>
+    <w:lvl w:ilvl="4" w:tplc="04090003" w:tentative="1">
+      <w:start w:val="1"/>
+      <w:numFmt w:val="bullet"/>
+      <w:lvlText w:val="o"/>
+      <w:lvlJc w:val="left"/>
+      <w:pPr>
+        <w:ind w:left="3600" w:hanging="360"/>
+      </w:pPr>
+      <w:rPr>
+        <w:rFonts w:ascii="Courier New" w:hAnsi="Courier New" w:cs="Courier New" w:hint="default"/>
+      </w:rPr>
+    </w:lvl>
+    <w:lvl w:ilvl="5" w:tplc="04090005" w:tentative="1">
+      <w:start w:val="1"/>
+      <w:numFmt w:val="bullet"/>
+      <w:lvlText w:val=""/>
+      <w:lvlJc w:val="left"/>
+      <w:pPr>
+        <w:ind w:left="4320" w:hanging="360"/>
+      </w:pPr>
+      <w:rPr>
+        <w:rFonts w:ascii="Wingdings" w:hAnsi="Wingdings" w:hint="default"/>
+      </w:rPr>
+    </w:lvl>
+    <w:lvl w:ilvl="6" w:tplc="04090001" w:tentative="1">
+      <w:start w:val="1"/>
+      <w:numFmt w:val="bullet"/>
+      <w:lvlText w:val=""/>
+      <w:lvlJc w:val="left"/>
+      <w:pPr>
+        <w:ind w:left="5040" w:hanging="360"/>
+      </w:pPr>
+      <w:rPr>
+        <w:rFonts w:ascii="Symbol" w:hAnsi="Symbol" w:hint="default"/>
+      </w:rPr>
+    </w:lvl>
+    <w:lvl w:ilvl="7" w:tplc="04090003" w:tentative="1">
+      <w:start w:val="1"/>
+      <w:numFmt w:val="bullet"/>
+      <w:lvlText w:val="o"/>
+      <w:lvlJc w:val="left"/>
+      <w:pPr>
+        <w:ind w:left="5760" w:hanging="360"/>
+      </w:pPr>
+      <w:rPr>
+        <w:rFonts w:ascii="Courier New" w:hAnsi="Courier New" w:cs="Courier New" w:hint="default"/>
+      </w:rPr>
+    </w:lvl>
+    <w:lvl w:ilvl="8" w:tplc="04090005" w:tentative="1">
+      <w:start w:val="1"/>
+      <w:numFmt w:val="bullet"/>
+      <w:lvlText w:val=""/>
+      <w:lvlJc w:val="left"/>
+      <w:pPr>
+        <w:ind w:left="6480" w:hanging="360"/>
+      </w:pPr>
+      <w:rPr>
+        <w:rFonts w:ascii="Wingdings" w:hAnsi="Wingdings" w:hint="default"/>
+      </w:rPr>
+    </w:lvl>
+  </w:abstractNum>
   <w:num w:numId="1" w16cid:durableId="408385506">
-    <w:abstractNumId w:val="8"/>
+    <w:abstractNumId w:val="17"/>
   </w:num>
   <w:num w:numId="2" w16cid:durableId="1595093323">
-    <w:abstractNumId w:val="7"/>
+    <w:abstractNumId w:val="14"/>
   </w:num>
   <w:num w:numId="3" w16cid:durableId="1043794736">
-    <w:abstractNumId w:val="4"/>
+    <w:abstractNumId w:val="10"/>
   </w:num>
   <w:num w:numId="4" w16cid:durableId="105933096">
-    <w:abstractNumId w:val="6"/>
+    <w:abstractNumId w:val="12"/>
   </w:num>
   <w:num w:numId="5" w16cid:durableId="757674649">
-    <w:abstractNumId w:val="2"/>
+    <w:abstractNumId w:val="4"/>
   </w:num>
   <w:num w:numId="6" w16cid:durableId="156657523">
     <w:abstractNumId w:val="0"/>
   </w:num>
   <w:num w:numId="7" w16cid:durableId="40324540">
-    <w:abstractNumId w:val="9"/>
+    <w:abstractNumId w:val="18"/>
   </w:num>
   <w:num w:numId="8" w16cid:durableId="953515887">
     <w:abstractNumId w:val="1"/>
   </w:num>
   <w:num w:numId="9" w16cid:durableId="1103039426">
+    <w:abstractNumId w:val="11"/>
+  </w:num>
+  <w:num w:numId="10" w16cid:durableId="710424099">
+    <w:abstractNumId w:val="6"/>
+  </w:num>
+  <w:num w:numId="11" w16cid:durableId="2097439083">
+    <w:abstractNumId w:val="7"/>
+  </w:num>
+  <w:num w:numId="12" w16cid:durableId="149296729">
+    <w:abstractNumId w:val="19"/>
+  </w:num>
+  <w:num w:numId="13" w16cid:durableId="1937591852">
+    <w:abstractNumId w:val="9"/>
+  </w:num>
+  <w:num w:numId="14" w16cid:durableId="504633820">
+    <w:abstractNumId w:val="13"/>
+  </w:num>
+  <w:num w:numId="15" w16cid:durableId="272322862">
+    <w:abstractNumId w:val="3"/>
+  </w:num>
+  <w:num w:numId="16" w16cid:durableId="2050303344">
+    <w:abstractNumId w:val="20"/>
+  </w:num>
+  <w:num w:numId="17" w16cid:durableId="656346712">
+    <w:abstractNumId w:val="8"/>
+  </w:num>
+  <w:num w:numId="18" w16cid:durableId="508525855">
+    <w:abstractNumId w:val="16"/>
+  </w:num>
+  <w:num w:numId="19" w16cid:durableId="509105721">
+    <w:abstractNumId w:val="2"/>
+  </w:num>
+  <w:num w:numId="20" w16cid:durableId="719397933">
     <w:abstractNumId w:val="5"/>
   </w:num>
-  <w:num w:numId="10" w16cid:durableId="710424099">
-    <w:abstractNumId w:val="3"/>
+  <w:num w:numId="21" w16cid:durableId="1143082236">
+    <w:abstractNumId w:val="15"/>
   </w:num>
 </w:numbering>
 </file>
@@ -3803,8 +6461,8 @@
     <w:lsdException w:name="Normal" w:uiPriority="0"/>
     <w:lsdException w:name="heading 1" w:uiPriority="9"/>
     <w:lsdException w:name="heading 2" w:semiHidden="1" w:uiPriority="9" w:unhideWhenUsed="1"/>
-    <w:lsdException w:name="heading 3" w:semiHidden="1" w:uiPriority="9" w:unhideWhenUsed="1" w:qFormat="1"/>
-    <w:lsdException w:name="heading 4" w:semiHidden="1" w:uiPriority="9" w:unhideWhenUsed="1" w:qFormat="1"/>
+    <w:lsdException w:name="heading 3" w:semiHidden="1" w:uiPriority="9" w:unhideWhenUsed="1"/>
+    <w:lsdException w:name="heading 4" w:semiHidden="1" w:uiPriority="9" w:unhideWhenUsed="1"/>
     <w:lsdException w:name="heading 5" w:semiHidden="1" w:uiPriority="9" w:unhideWhenUsed="1" w:qFormat="1"/>
     <w:lsdException w:name="heading 6" w:semiHidden="1" w:uiPriority="9" w:unhideWhenUsed="1" w:qFormat="1"/>
     <w:lsdException w:name="heading 7" w:semiHidden="1" w:uiPriority="9" w:unhideWhenUsed="1" w:qFormat="1"/>
@@ -4181,6 +6839,24 @@
     <w:name w:val="Normal"/>
     <w:rsid w:val="00A85192"/>
   </w:style>
+  <w:style w:type="paragraph" w:styleId="Heading3">
+    <w:name w:val="heading 3"/>
+    <w:basedOn w:val="Normal"/>
+    <w:link w:val="Heading3Char"/>
+    <w:uiPriority w:val="9"/>
+    <w:rsid w:val="0012380F"/>
+    <w:pPr>
+      <w:spacing w:before="100" w:beforeAutospacing="1" w:after="100" w:afterAutospacing="1" w:line="240" w:lineRule="auto"/>
+      <w:outlineLvl w:val="2"/>
+    </w:pPr>
+    <w:rPr>
+      <w:rFonts w:eastAsia="Times New Roman" w:cs="Times New Roman"/>
+      <w:b/>
+      <w:bCs/>
+      <w:sz w:val="27"/>
+      <w:szCs w:val="27"/>
+    </w:rPr>
+  </w:style>
   <w:style w:type="character" w:default="1" w:styleId="DefaultParagraphFont">
     <w:name w:val="Default Paragraph Font"/>
     <w:uiPriority w:val="1"/>
@@ -4313,9 +6989,10 @@
     <w:basedOn w:val="Chuong"/>
     <w:link w:val="MucChar"/>
     <w:qFormat/>
-    <w:rsid w:val="00790E57"/>
+    <w:rsid w:val="006F469D"/>
     <w:pPr>
       <w:jc w:val="left"/>
+      <w:outlineLvl w:val="1"/>
     </w:pPr>
   </w:style>
   <w:style w:type="character" w:customStyle="1" w:styleId="NoiDungChar">
@@ -4350,7 +7027,7 @@
     <w:name w:val="Muc Char"/>
     <w:basedOn w:val="ChuongChar"/>
     <w:link w:val="Muc"/>
-    <w:rsid w:val="00790E57"/>
+    <w:rsid w:val="006F469D"/>
     <w:rPr>
       <w:b/>
       <w:color w:val="000000" w:themeColor="text1"/>
@@ -4386,7 +7063,10 @@
     <w:basedOn w:val="Style"/>
     <w:link w:val="SieuTieuMucChar"/>
     <w:qFormat/>
-    <w:rsid w:val="009A1D9D"/>
+    <w:rsid w:val="006F469D"/>
+    <w:pPr>
+      <w:outlineLvl w:val="2"/>
+    </w:pPr>
   </w:style>
   <w:style w:type="character" w:customStyle="1" w:styleId="StyleChar">
     <w:name w:val="Style Char"/>
@@ -4403,7 +7083,7 @@
     <w:name w:val="SieuTieuMuc Char"/>
     <w:basedOn w:val="StyleChar"/>
     <w:link w:val="SieuTieuMuc"/>
-    <w:rsid w:val="009A1D9D"/>
+    <w:rsid w:val="006F469D"/>
     <w:rPr>
       <w:b/>
       <w:color w:val="000000" w:themeColor="text1"/>
@@ -4454,6 +7134,66 @@
         <w:insideV w:val="single" w:sz="4" w:space="0" w:color="auto"/>
       </w:tblBorders>
     </w:tblPr>
+  </w:style>
+  <w:style w:type="character" w:customStyle="1" w:styleId="Heading3Char">
+    <w:name w:val="Heading 3 Char"/>
+    <w:basedOn w:val="DefaultParagraphFont"/>
+    <w:link w:val="Heading3"/>
+    <w:uiPriority w:val="9"/>
+    <w:rsid w:val="0012380F"/>
+    <w:rPr>
+      <w:rFonts w:eastAsia="Times New Roman" w:cs="Times New Roman"/>
+      <w:b/>
+      <w:bCs/>
+      <w:sz w:val="27"/>
+      <w:szCs w:val="27"/>
+    </w:rPr>
+  </w:style>
+  <w:style w:type="paragraph" w:styleId="ListParagraph">
+    <w:name w:val="List Paragraph"/>
+    <w:basedOn w:val="Normal"/>
+    <w:uiPriority w:val="34"/>
+    <w:rsid w:val="0012380F"/>
+    <w:pPr>
+      <w:ind w:left="720"/>
+      <w:contextualSpacing/>
+    </w:pPr>
+  </w:style>
+  <w:style w:type="paragraph" w:styleId="NormalWeb">
+    <w:name w:val="Normal (Web)"/>
+    <w:basedOn w:val="Normal"/>
+    <w:uiPriority w:val="99"/>
+    <w:semiHidden/>
+    <w:unhideWhenUsed/>
+    <w:rsid w:val="006F469D"/>
+    <w:rPr>
+      <w:rFonts w:cs="Times New Roman"/>
+      <w:sz w:val="24"/>
+      <w:szCs w:val="24"/>
+    </w:rPr>
+  </w:style>
+  <w:style w:type="paragraph" w:customStyle="1" w:styleId="Hinh">
+    <w:name w:val="Hinh"/>
+    <w:link w:val="HinhChar"/>
+    <w:qFormat/>
+    <w:rsid w:val="006F469D"/>
+    <w:pPr>
+      <w:jc w:val="center"/>
+    </w:pPr>
+    <w:rPr>
+      <w:color w:val="000000" w:themeColor="text1"/>
+      <w:sz w:val="26"/>
+    </w:rPr>
+  </w:style>
+  <w:style w:type="character" w:customStyle="1" w:styleId="HinhChar">
+    <w:name w:val="Hinh Char"/>
+    <w:basedOn w:val="DefaultParagraphFont"/>
+    <w:link w:val="Hinh"/>
+    <w:rsid w:val="006F469D"/>
+    <w:rPr>
+      <w:color w:val="000000" w:themeColor="text1"/>
+      <w:sz w:val="26"/>
+    </w:rPr>
   </w:style>
 </w:styles>
 </file>

</xml_diff>

<commit_message>
Bo sung chuong 2
</commit_message>
<xml_diff>
--- a/baocao.docx
+++ b/baocao.docx
@@ -3284,47 +3284,569 @@
     </w:p>
     <w:p>
       <w:pPr>
-        <w:pStyle w:val="VanBan"/>
-      </w:pPr>
-    </w:p>
-    <w:p>
-      <w:pPr>
-        <w:pStyle w:val="VanBan"/>
-      </w:pPr>
-    </w:p>
-    <w:p>
-      <w:pPr>
-        <w:pStyle w:val="VanBan"/>
-      </w:pPr>
-    </w:p>
-    <w:p>
-      <w:pPr>
-        <w:pStyle w:val="VanBan"/>
-      </w:pPr>
-    </w:p>
-    <w:p>
-      <w:pPr>
-        <w:pStyle w:val="VanBan"/>
-      </w:pPr>
-    </w:p>
-    <w:p>
-      <w:pPr>
-        <w:pStyle w:val="VanBan"/>
-      </w:pPr>
-    </w:p>
-    <w:p>
-      <w:pPr>
-        <w:pStyle w:val="VanBan"/>
-      </w:pPr>
-    </w:p>
-    <w:p>
-      <w:pPr>
-        <w:pStyle w:val="VanBan"/>
-      </w:pPr>
-    </w:p>
-    <w:p>
-      <w:pPr>
-        <w:pStyle w:val="VanBan"/>
+        <w:pStyle w:val="TieuMuc"/>
+      </w:pPr>
+      <w:r>
+        <w:t xml:space="preserve">   2.4.3. </w:t>
+      </w:r>
+      <w:r>
+        <w:t>Hệ thống quản lý mã nguồn Git và nền tảng GitHub</w:t>
+      </w:r>
+    </w:p>
+    <w:p>
+      <w:pPr>
+        <w:pStyle w:val="VanBan"/>
+        <w:jc w:val="both"/>
+      </w:pPr>
+      <w:r>
+        <w:tab/>
+      </w:r>
+      <w:r>
+        <w:t>Khái niệm về Git</w:t>
+      </w:r>
+      <w:r>
+        <w:t xml:space="preserve"> </w:t>
+      </w:r>
+      <w:r>
+        <w:t>: Git là một hệ thống quản lý phiên bản phân tán (Distributed Version Control System - DVCS) mã nguồn mở phổ biến nhất hiện nay. Git cho phép người phát triển theo dõi toàn bộ lịch sử thay đổi của mã nguồn trong quá trình viết code, dễ dàng khôi phục lại các phiên bản trước đó khi xảy ra lỗi, cũng như hỗ trợ làm việc nhóm hiệu quả thông qua cơ chế phân nhánh (branching) và hợp nhất (merging) mã nguồn mà không làm ảnh hưởng đến nhánh chính.</w:t>
+      </w:r>
+    </w:p>
+    <w:p>
+      <w:pPr>
+        <w:pStyle w:val="VanBan"/>
+        <w:jc w:val="both"/>
+      </w:pPr>
+      <w:r>
+        <w:t>Nền tảng GitHub</w:t>
+      </w:r>
+      <w:r>
+        <w:t xml:space="preserve"> </w:t>
+      </w:r>
+      <w:r>
+        <w:t>: GitHub là một dịch vụ đám mây lưu trữ các kho chứa mã nguồn (repositories) sử dụng Git. GitHub cung cấp giao diện trực quan và các công cụ mạnh mẽ hỗ trợ quản lý dự án, kiểm tra mã (Pull Request), theo dõi lỗi (Issues) và tích hợp các quy trình tự động hóa (CI/CD).</w:t>
+      </w:r>
+    </w:p>
+    <w:p>
+      <w:pPr>
+        <w:pStyle w:val="VanBan"/>
+        <w:jc w:val="both"/>
+      </w:pPr>
+      <w:r>
+        <w:lastRenderedPageBreak/>
+        <w:t>Vai trò trong đồ án</w:t>
+      </w:r>
+      <w:r>
+        <w:t xml:space="preserve"> </w:t>
+      </w:r>
+      <w:r>
+        <w:t>: Trong quá trình thực hiện đồ án quản lý bán hàng, Git và GitHub đóng vai trò cốt lõi trong việc quản lý mã nguồn xuyên suốt. Toàn bộ các tệp mã nguồn PHP, cơ sở dữ liệu và cấu hình Docker được lưu trữ và đồng bộ an toàn trên GitHub, giúp kiểm soát tốt các phiên bản cập nhật của ứng dụng và phòng ngừa rủi ro mất mát dữ liệu.</w:t>
+      </w:r>
+    </w:p>
+    <w:p>
+      <w:pPr>
+        <w:pStyle w:val="VanBan"/>
+        <w:jc w:val="center"/>
+      </w:pPr>
+      <w:r>
+        <w:rPr>
+          <w:noProof/>
+        </w:rPr>
+        <w:drawing>
+          <wp:inline distT="0" distB="0" distL="0" distR="0" wp14:anchorId="1028AD4E" wp14:editId="0929CA68">
+            <wp:extent cx="4306315" cy="2423160"/>
+            <wp:effectExtent l="0" t="0" r="0" b="0"/>
+            <wp:docPr id="1797621309" name="Picture 1" descr="Understanding Github Packages: A Comprehensive Guide – FDJY"/>
+            <wp:cNvGraphicFramePr>
+              <a:graphicFrameLocks xmlns:a="http://schemas.openxmlformats.org/drawingml/2006/main" noChangeAspect="1"/>
+            </wp:cNvGraphicFramePr>
+            <a:graphic xmlns:a="http://schemas.openxmlformats.org/drawingml/2006/main">
+              <a:graphicData uri="http://schemas.openxmlformats.org/drawingml/2006/picture">
+                <pic:pic xmlns:pic="http://schemas.openxmlformats.org/drawingml/2006/picture">
+                  <pic:nvPicPr>
+                    <pic:cNvPr id="0" name="Picture 1" descr="Understanding Github Packages: A Comprehensive Guide – FDJY"/>
+                    <pic:cNvPicPr>
+                      <a:picLocks noChangeAspect="1" noChangeArrowheads="1"/>
+                    </pic:cNvPicPr>
+                  </pic:nvPicPr>
+                  <pic:blipFill>
+                    <a:blip r:embed="rId16" cstate="print">
+                      <a:extLst>
+                        <a:ext uri="{28A0092B-C50C-407E-A947-70E740481C1C}">
+                          <a14:useLocalDpi xmlns:a14="http://schemas.microsoft.com/office/drawing/2010/main" val="0"/>
+                        </a:ext>
+                      </a:extLst>
+                    </a:blip>
+                    <a:srcRect/>
+                    <a:stretch>
+                      <a:fillRect/>
+                    </a:stretch>
+                  </pic:blipFill>
+                  <pic:spPr bwMode="auto">
+                    <a:xfrm>
+                      <a:off x="0" y="0"/>
+                      <a:ext cx="4311867" cy="2426284"/>
+                    </a:xfrm>
+                    <a:prstGeom prst="rect">
+                      <a:avLst/>
+                    </a:prstGeom>
+                    <a:noFill/>
+                    <a:ln>
+                      <a:noFill/>
+                    </a:ln>
+                  </pic:spPr>
+                </pic:pic>
+              </a:graphicData>
+            </a:graphic>
+          </wp:inline>
+        </w:drawing>
+      </w:r>
+    </w:p>
+    <w:p>
+      <w:pPr>
+        <w:pStyle w:val="Hinh"/>
+      </w:pPr>
+      <w:r>
+        <w:t>Hình 2.6. Git và GitHub</w:t>
+      </w:r>
+    </w:p>
+    <w:p>
+      <w:pPr>
+        <w:pStyle w:val="Muc"/>
+      </w:pPr>
+      <w:r>
+        <w:t xml:space="preserve">2.5. </w:t>
+      </w:r>
+      <w:r>
+        <w:t>Framework giao diện phía Client</w:t>
+      </w:r>
+    </w:p>
+    <w:p>
+      <w:pPr>
+        <w:pStyle w:val="TieuMuc"/>
+      </w:pPr>
+      <w:r>
+        <w:t xml:space="preserve">   2.5.1. Giới thiệu về Bootstrap5</w:t>
+      </w:r>
+    </w:p>
+    <w:p>
+      <w:pPr>
+        <w:pStyle w:val="VanBan"/>
+        <w:jc w:val="both"/>
+      </w:pPr>
+      <w:r>
+        <w:tab/>
+      </w:r>
+      <w:r>
+        <w:t>Bootstrap là một framework mã nguồn mở phổ biến và toàn diện nhất thế giới dùng để phát triển giao diện web Front-end nhanh chóng, trực quan và chuẩn hóa. Phiên bản Bootstrap 5 mang lại nhiều cải tiến đột phá, đáng chú ý nhất là việc loại bỏ hoàn toàn sự phụ thuộc vào thư viện jQuery, chuyển sang sử dụng JavaScript thuần (Vanilla JS) giúp tăng hiệu suất hoạt động của trang web. Ngoài ra, Bootstrap 5 cung cấp hệ thống lưới (Grid system) linh hoạt, các lớp tiện ích (Utility classes) phong phú và bộ thành phần giao diện (Components) có sẵn hiện đại.</w:t>
+      </w:r>
+    </w:p>
+    <w:p>
+      <w:pPr>
+        <w:pStyle w:val="VanBan"/>
+        <w:jc w:val="center"/>
+      </w:pPr>
+      <w:r>
+        <w:rPr>
+          <w:noProof/>
+        </w:rPr>
+        <w:drawing>
+          <wp:inline distT="0" distB="0" distL="0" distR="0" wp14:anchorId="1255132E" wp14:editId="75053FA2">
+            <wp:extent cx="2849880" cy="1602975"/>
+            <wp:effectExtent l="0" t="0" r="7620" b="0"/>
+            <wp:docPr id="787740314" name="Picture 2" descr="Bootstrap 5 - Building Layouts &amp; Projects"/>
+            <wp:cNvGraphicFramePr>
+              <a:graphicFrameLocks xmlns:a="http://schemas.openxmlformats.org/drawingml/2006/main" noChangeAspect="1"/>
+            </wp:cNvGraphicFramePr>
+            <a:graphic xmlns:a="http://schemas.openxmlformats.org/drawingml/2006/main">
+              <a:graphicData uri="http://schemas.openxmlformats.org/drawingml/2006/picture">
+                <pic:pic xmlns:pic="http://schemas.openxmlformats.org/drawingml/2006/picture">
+                  <pic:nvPicPr>
+                    <pic:cNvPr id="0" name="Picture 3" descr="Bootstrap 5 - Building Layouts &amp; Projects"/>
+                    <pic:cNvPicPr>
+                      <a:picLocks noChangeAspect="1" noChangeArrowheads="1"/>
+                    </pic:cNvPicPr>
+                  </pic:nvPicPr>
+                  <pic:blipFill>
+                    <a:blip r:embed="rId17" cstate="print">
+                      <a:extLst>
+                        <a:ext uri="{28A0092B-C50C-407E-A947-70E740481C1C}">
+                          <a14:useLocalDpi xmlns:a14="http://schemas.microsoft.com/office/drawing/2010/main" val="0"/>
+                        </a:ext>
+                      </a:extLst>
+                    </a:blip>
+                    <a:srcRect/>
+                    <a:stretch>
+                      <a:fillRect/>
+                    </a:stretch>
+                  </pic:blipFill>
+                  <pic:spPr bwMode="auto">
+                    <a:xfrm>
+                      <a:off x="0" y="0"/>
+                      <a:ext cx="2861180" cy="1609331"/>
+                    </a:xfrm>
+                    <a:prstGeom prst="rect">
+                      <a:avLst/>
+                    </a:prstGeom>
+                    <a:noFill/>
+                    <a:ln>
+                      <a:noFill/>
+                    </a:ln>
+                  </pic:spPr>
+                </pic:pic>
+              </a:graphicData>
+            </a:graphic>
+          </wp:inline>
+        </w:drawing>
+      </w:r>
+    </w:p>
+    <w:p>
+      <w:pPr>
+        <w:pStyle w:val="Hinh"/>
+      </w:pPr>
+      <w:r>
+        <w:t>Hình 2.7. Boostrap5</w:t>
+      </w:r>
+    </w:p>
+    <w:p>
+      <w:pPr>
+        <w:pStyle w:val="TieuMuc"/>
+      </w:pPr>
+      <w:r>
+        <w:lastRenderedPageBreak/>
+        <w:t xml:space="preserve">   2.5.2. </w:t>
+      </w:r>
+      <w:r>
+        <w:t>Đặc điểm kỹ thuật và ứng dụng trong đồ án</w:t>
+      </w:r>
+    </w:p>
+    <w:p>
+      <w:pPr>
+        <w:pStyle w:val="VanBan"/>
+        <w:jc w:val="both"/>
+      </w:pPr>
+      <w:r>
+        <w:tab/>
+      </w:r>
+      <w:r>
+        <w:t>Thiết kế đáp ứng</w:t>
+      </w:r>
+      <w:r>
+        <w:t xml:space="preserve"> </w:t>
+      </w:r>
+      <w:r>
+        <w:t>: Bootstrap 5 tích hợp hệ thống Grid dựa trên Flexbox, cho phép giao diện tự động co giãn và hiển thị mượt mà trên mọi kích thước màn hình khác nhau (từ máy tính để bàn, máy tính bảng cho đến điện thoại di động).</w:t>
+      </w:r>
+    </w:p>
+    <w:p>
+      <w:pPr>
+        <w:pStyle w:val="VanBan"/>
+        <w:jc w:val="both"/>
+      </w:pPr>
+      <w:r>
+        <w:t>Thành phần giao diện sẵn có</w:t>
+      </w:r>
+      <w:r>
+        <w:t xml:space="preserve"> </w:t>
+      </w:r>
+      <w:r>
+        <w:t>: Cung cấp các khối giao diện chuẩn mực như thanh điều hướng (Navbar), thẻ sản phẩm (Cards), bảng dữ liệu (Tables), biểu mẫu (Forms), hộp thoại thông báo (Modals) và nút bấm (Buttons).</w:t>
+      </w:r>
+    </w:p>
+    <w:p>
+      <w:pPr>
+        <w:pStyle w:val="VanBan"/>
+        <w:jc w:val="both"/>
+      </w:pPr>
+      <w:r>
+        <w:t>Vai trò trong đồ án</w:t>
+      </w:r>
+      <w:r>
+        <w:t xml:space="preserve"> </w:t>
+      </w:r>
+      <w:r>
+        <w:t>: Bootstrap 5 được sử dụng để xây dựng lớp giao diện người dùng cho cả phân hệ khách hàng (trang chủ, danh mục sản phẩm, giỏ hàng, thanh toán) và phân hệ quản trị viên. Nhờ đó, giao diện hệ thống đảm bảo được tính thẩm mỹ, đồng bộ, chuyên nghiệp và thân thiện với người dùng mà không mất quá nhiều thời gian tự viết mã CSS thủ công từ đầu.</w:t>
+      </w:r>
+    </w:p>
+    <w:p>
+      <w:pPr>
+        <w:pStyle w:val="Muc"/>
+      </w:pPr>
+      <w:r>
+        <w:t xml:space="preserve">2.6. </w:t>
+      </w:r>
+      <w:r>
+        <w:t>Khái niệm và kiến trúc REST API</w:t>
+      </w:r>
+    </w:p>
+    <w:p>
+      <w:pPr>
+        <w:pStyle w:val="TieuMuc"/>
+      </w:pPr>
+      <w:r>
+        <w:t xml:space="preserve">   2.6.1. </w:t>
+      </w:r>
+      <w:r>
+        <w:t>Khái niệm về REST API</w:t>
+      </w:r>
+    </w:p>
+    <w:p>
+      <w:pPr>
+        <w:pStyle w:val="VanBan"/>
+        <w:jc w:val="both"/>
+      </w:pPr>
+      <w:r>
+        <w:tab/>
+      </w:r>
+      <w:r>
+        <w:t>REST (Representational State Transfer) là một kiểu kiến trúc phần mềm phổ biến dùng để thiết kế các dịch vụ web. REST API (Application Programming Interface tuân theo chuẩn REST) là một giao diện lập trình ứng dụng cho phép các hệ thống hoặc các thành phần phần mềm khác nhau giao tiếp, trao đổi dữ liệu với nhau thông qua giao thức HTTP/HTTPS một cách độc lập về nền tảng và ngôn ngữ lập trình.</w:t>
+      </w:r>
+    </w:p>
+    <w:p>
+      <w:pPr>
+        <w:pStyle w:val="VanBan"/>
+        <w:jc w:val="center"/>
+      </w:pPr>
+      <w:r>
+        <w:rPr>
+          <w:noProof/>
+        </w:rPr>
+        <w:drawing>
+          <wp:inline distT="0" distB="0" distL="0" distR="0" wp14:anchorId="6BB5D9D2" wp14:editId="28E58EF8">
+            <wp:extent cx="4226773" cy="2377440"/>
+            <wp:effectExtent l="0" t="0" r="2540" b="3810"/>
+            <wp:docPr id="1594952932" name="Picture 3" descr="Zinob INC"/>
+            <wp:cNvGraphicFramePr>
+              <a:graphicFrameLocks xmlns:a="http://schemas.openxmlformats.org/drawingml/2006/main" noChangeAspect="1"/>
+            </wp:cNvGraphicFramePr>
+            <a:graphic xmlns:a="http://schemas.openxmlformats.org/drawingml/2006/main">
+              <a:graphicData uri="http://schemas.openxmlformats.org/drawingml/2006/picture">
+                <pic:pic xmlns:pic="http://schemas.openxmlformats.org/drawingml/2006/picture">
+                  <pic:nvPicPr>
+                    <pic:cNvPr id="0" name="Picture 5" descr="Zinob INC"/>
+                    <pic:cNvPicPr>
+                      <a:picLocks noChangeAspect="1" noChangeArrowheads="1"/>
+                    </pic:cNvPicPr>
+                  </pic:nvPicPr>
+                  <pic:blipFill>
+                    <a:blip r:embed="rId18">
+                      <a:extLst>
+                        <a:ext uri="{28A0092B-C50C-407E-A947-70E740481C1C}">
+                          <a14:useLocalDpi xmlns:a14="http://schemas.microsoft.com/office/drawing/2010/main" val="0"/>
+                        </a:ext>
+                      </a:extLst>
+                    </a:blip>
+                    <a:srcRect/>
+                    <a:stretch>
+                      <a:fillRect/>
+                    </a:stretch>
+                  </pic:blipFill>
+                  <pic:spPr bwMode="auto">
+                    <a:xfrm>
+                      <a:off x="0" y="0"/>
+                      <a:ext cx="4237683" cy="2383576"/>
+                    </a:xfrm>
+                    <a:prstGeom prst="rect">
+                      <a:avLst/>
+                    </a:prstGeom>
+                    <a:noFill/>
+                    <a:ln>
+                      <a:noFill/>
+                    </a:ln>
+                  </pic:spPr>
+                </pic:pic>
+              </a:graphicData>
+            </a:graphic>
+          </wp:inline>
+        </w:drawing>
+      </w:r>
+    </w:p>
+    <w:p>
+      <w:pPr>
+        <w:pStyle w:val="Hinh"/>
+      </w:pPr>
+      <w:r>
+        <w:t>Hình 2.8. REST API</w:t>
+      </w:r>
+    </w:p>
+    <w:p>
+      <w:pPr>
+        <w:pStyle w:val="TieuMuc"/>
+      </w:pPr>
+      <w:r>
+        <w:lastRenderedPageBreak/>
+        <w:t xml:space="preserve">   2.6.2. </w:t>
+      </w:r>
+      <w:r>
+        <w:t>Các nguyên tắc hoạt động cơ bản</w:t>
+      </w:r>
+    </w:p>
+    <w:p>
+      <w:pPr>
+        <w:pStyle w:val="VanBan"/>
+        <w:jc w:val="both"/>
+      </w:pPr>
+      <w:r>
+        <w:tab/>
+      </w:r>
+      <w:r>
+        <w:t>Một hệ thống REST API thường hoạt động dựa trên các phương thức HTTP tiêu chuẩn tương ứng với các thao tác dữ liệu (CRUD)</w:t>
+      </w:r>
+      <w:r>
+        <w:t xml:space="preserve"> </w:t>
+      </w:r>
+      <w:r>
+        <w:t>:</w:t>
+      </w:r>
+    </w:p>
+    <w:p>
+      <w:pPr>
+        <w:pStyle w:val="VanBan"/>
+        <w:numPr>
+          <w:ilvl w:val="0"/>
+          <w:numId w:val="29"/>
+        </w:numPr>
+        <w:jc w:val="both"/>
+      </w:pPr>
+      <w:r>
+        <w:t>GET: Truy xuất hoặc lấy thông tin tài nguyên từ máy chủ.</w:t>
+      </w:r>
+    </w:p>
+    <w:p>
+      <w:pPr>
+        <w:pStyle w:val="VanBan"/>
+        <w:numPr>
+          <w:ilvl w:val="0"/>
+          <w:numId w:val="29"/>
+        </w:numPr>
+        <w:jc w:val="both"/>
+      </w:pPr>
+      <w:r>
+        <w:t>POST: Tạo mới một tài nguyên trên máy chủ.</w:t>
+      </w:r>
+    </w:p>
+    <w:p>
+      <w:pPr>
+        <w:pStyle w:val="VanBan"/>
+        <w:numPr>
+          <w:ilvl w:val="0"/>
+          <w:numId w:val="29"/>
+        </w:numPr>
+        <w:jc w:val="both"/>
+      </w:pPr>
+      <w:r>
+        <w:t>PUT hoặc PATCH: Cập nhật thông tin của tài nguyên hiện có.</w:t>
+      </w:r>
+    </w:p>
+    <w:p>
+      <w:pPr>
+        <w:pStyle w:val="VanBan"/>
+        <w:numPr>
+          <w:ilvl w:val="0"/>
+          <w:numId w:val="29"/>
+        </w:numPr>
+        <w:jc w:val="both"/>
+      </w:pPr>
+      <w:r>
+        <w:t>DELETE: Xóa tài nguyên khỏi hệ thống.</w:t>
+      </w:r>
+    </w:p>
+    <w:p>
+      <w:pPr>
+        <w:pStyle w:val="VanBan"/>
+        <w:jc w:val="both"/>
+      </w:pPr>
+      <w:r>
+        <w:t>Dữ liệu trao đổi giữa Client và Server trong mô hình REST API thường được định dạng dưới dạng JSON (JavaScript Object Notation) hoặc XML, nhờ tính nhẹ, dễ đọc và dễ phân tích trên mọi ngôn ngữ.</w:t>
+      </w:r>
+    </w:p>
+    <w:p>
+      <w:pPr>
+        <w:pStyle w:val="TieuMuc"/>
+      </w:pPr>
+      <w:r>
+        <w:t xml:space="preserve">   2.6.3. Vai trò trong đồ án</w:t>
+      </w:r>
+    </w:p>
+    <w:p>
+      <w:pPr>
+        <w:pStyle w:val="VanBan"/>
+        <w:jc w:val="both"/>
+      </w:pPr>
+      <w:r>
+        <w:tab/>
+        <w:t>Trong hệ thống quản lý bán hàng, kiến trúc REST API được áp dụng để xử lý các yêu cầu bất đồng bộ (ví dụ</w:t>
+      </w:r>
+      <w:r>
+        <w:t xml:space="preserve"> </w:t>
+      </w:r>
+      <w:r>
+        <w:t>: thao tác thêm sản phẩm vào giỏ hàng, cập nhật số lượng tồn kho hoặc tìm kiếm sản phẩm nhanh mà không cần tải lại toàn bộ trang web - full page reload). Điều này giúp tối ưu hóa hiệu năng, giảm tải cho máy chủ, tăng tốc độ phản hồi và mang lại trải nghiệm mượt mà, hiện đại cho người dùng.</w:t>
+      </w:r>
+    </w:p>
+    <w:p>
+      <w:pPr>
+        <w:pStyle w:val="VanBan"/>
+        <w:jc w:val="both"/>
+      </w:pPr>
+    </w:p>
+    <w:p>
+      <w:pPr>
+        <w:pStyle w:val="VanBan"/>
+        <w:jc w:val="both"/>
+      </w:pPr>
+    </w:p>
+    <w:p>
+      <w:pPr>
+        <w:pStyle w:val="VanBan"/>
+        <w:jc w:val="both"/>
+      </w:pPr>
+    </w:p>
+    <w:p>
+      <w:pPr>
+        <w:pStyle w:val="VanBan"/>
+        <w:jc w:val="both"/>
+      </w:pPr>
+    </w:p>
+    <w:p>
+      <w:pPr>
+        <w:pStyle w:val="VanBan"/>
+        <w:jc w:val="both"/>
+      </w:pPr>
+    </w:p>
+    <w:p>
+      <w:pPr>
+        <w:pStyle w:val="VanBan"/>
+        <w:jc w:val="both"/>
+      </w:pPr>
+    </w:p>
+    <w:p>
+      <w:pPr>
+        <w:pStyle w:val="VanBan"/>
+        <w:jc w:val="both"/>
+      </w:pPr>
+    </w:p>
+    <w:p>
+      <w:pPr>
+        <w:pStyle w:val="VanBan"/>
+        <w:jc w:val="both"/>
+      </w:pPr>
+    </w:p>
+    <w:p>
+      <w:pPr>
+        <w:pStyle w:val="VanBan"/>
+        <w:jc w:val="both"/>
+      </w:pPr>
+    </w:p>
+    <w:p>
+      <w:pPr>
+        <w:pStyle w:val="VanBan"/>
+        <w:jc w:val="both"/>
+      </w:pPr>
+    </w:p>
+    <w:p>
+      <w:pPr>
+        <w:pStyle w:val="VanBan"/>
+        <w:jc w:val="both"/>
       </w:pPr>
     </w:p>
     <w:p>
@@ -3810,6 +4332,52 @@
     </w:p>
     <w:p>
       <w:pPr>
+        <w:pStyle w:val="VanBan"/>
+        <w:jc w:val="center"/>
+      </w:pPr>
+      <w:r>
+        <w:rPr>
+          <w:noProof/>
+        </w:rPr>
+        <w:drawing>
+          <wp:inline distT="0" distB="0" distL="0" distR="0" wp14:anchorId="62F56CE2" wp14:editId="175B4F24">
+            <wp:extent cx="4941947" cy="1592580"/>
+            <wp:effectExtent l="0" t="0" r="0" b="7620"/>
+            <wp:docPr id="367786367" name="Picture 1"/>
+            <wp:cNvGraphicFramePr>
+              <a:graphicFrameLocks xmlns:a="http://schemas.openxmlformats.org/drawingml/2006/main" noChangeAspect="1"/>
+            </wp:cNvGraphicFramePr>
+            <a:graphic xmlns:a="http://schemas.openxmlformats.org/drawingml/2006/main">
+              <a:graphicData uri="http://schemas.openxmlformats.org/drawingml/2006/picture">
+                <pic:pic xmlns:pic="http://schemas.openxmlformats.org/drawingml/2006/picture">
+                  <pic:nvPicPr>
+                    <pic:cNvPr id="367786367" name=""/>
+                    <pic:cNvPicPr/>
+                  </pic:nvPicPr>
+                  <pic:blipFill>
+                    <a:blip r:embed="rId19"/>
+                    <a:stretch>
+                      <a:fillRect/>
+                    </a:stretch>
+                  </pic:blipFill>
+                  <pic:spPr>
+                    <a:xfrm>
+                      <a:off x="0" y="0"/>
+                      <a:ext cx="4983458" cy="1605957"/>
+                    </a:xfrm>
+                    <a:prstGeom prst="rect">
+                      <a:avLst/>
+                    </a:prstGeom>
+                  </pic:spPr>
+                </pic:pic>
+              </a:graphicData>
+            </a:graphic>
+          </wp:inline>
+        </w:drawing>
+      </w:r>
+    </w:p>
+    <w:p>
+      <w:pPr>
         <w:pStyle w:val="Hinh"/>
       </w:pPr>
       <w:r>
@@ -3818,32 +4386,6 @@
       <w:r>
         <w:t>Sơ đồ kiến trúc hệ thống</w:t>
       </w:r>
-      <w:r>
-        <w:t xml:space="preserve"> </w:t>
-      </w:r>
-      <w:r>
-        <w:t>(thể hiện Client -&gt; Web Server PHP (Docker) -&gt; SQL Server (Docker)).</w:t>
-      </w:r>
-    </w:p>
-    <w:p>
-      <w:pPr>
-        <w:pStyle w:val="VanBan"/>
-      </w:pPr>
-    </w:p>
-    <w:p>
-      <w:pPr>
-        <w:pStyle w:val="VanBan"/>
-      </w:pPr>
-    </w:p>
-    <w:p>
-      <w:pPr>
-        <w:pStyle w:val="VanBan"/>
-      </w:pPr>
-    </w:p>
-    <w:p>
-      <w:pPr>
-        <w:pStyle w:val="VanBan"/>
-      </w:pPr>
     </w:p>
     <w:p>
       <w:pPr>
@@ -3889,6 +4431,7 @@
     <w:p>
       <w:pPr>
         <w:pStyle w:val="VanBan"/>
+        <w:jc w:val="center"/>
       </w:pPr>
       <w:r>
         <w:rPr>
@@ -3912,7 +4455,7 @@
                     </pic:cNvPicPr>
                   </pic:nvPicPr>
                   <pic:blipFill>
-                    <a:blip r:embed="rId16">
+                    <a:blip r:embed="rId20">
                       <a:extLst>
                         <a:ext uri="{28A0092B-C50C-407E-A947-70E740481C1C}">
                           <a14:useLocalDpi xmlns:a14="http://schemas.microsoft.com/office/drawing/2010/main" val="0"/>
@@ -10190,7 +10733,7 @@
                     </pic:cNvPicPr>
                   </pic:nvPicPr>
                   <pic:blipFill>
-                    <a:blip r:embed="rId17" cstate="print">
+                    <a:blip r:embed="rId21" cstate="print">
                       <a:extLst>
                         <a:ext uri="{28A0092B-C50C-407E-A947-70E740481C1C}">
                           <a14:useLocalDpi xmlns:a14="http://schemas.microsoft.com/office/drawing/2010/main" val="0"/>
@@ -10267,11 +10810,58 @@
         <w:pStyle w:val="VanBan"/>
         <w:jc w:val="both"/>
       </w:pPr>
+    </w:p>
+    <w:p>
+      <w:pPr>
+        <w:pStyle w:val="VanBan"/>
+        <w:jc w:val="both"/>
+      </w:pPr>
+    </w:p>
+    <w:p>
+      <w:pPr>
+        <w:pStyle w:val="VanBan"/>
+        <w:jc w:val="both"/>
+      </w:pPr>
+    </w:p>
+    <w:p>
+      <w:pPr>
+        <w:pStyle w:val="VanBan"/>
+        <w:jc w:val="both"/>
+      </w:pPr>
+    </w:p>
+    <w:p>
+      <w:pPr>
+        <w:pStyle w:val="VanBan"/>
+        <w:jc w:val="both"/>
+      </w:pPr>
+    </w:p>
+    <w:p>
+      <w:pPr>
+        <w:pStyle w:val="VanBan"/>
+        <w:jc w:val="both"/>
+      </w:pPr>
+    </w:p>
+    <w:p>
+      <w:pPr>
+        <w:pStyle w:val="VanBan"/>
+        <w:jc w:val="both"/>
+      </w:pPr>
+    </w:p>
+    <w:p>
+      <w:pPr>
+        <w:pStyle w:val="VanBan"/>
+        <w:jc w:val="both"/>
+      </w:pPr>
+    </w:p>
+    <w:p>
+      <w:pPr>
+        <w:pStyle w:val="VanBan"/>
+        <w:jc w:val="both"/>
+      </w:pPr>
       <w:r>
         <w:rPr>
           <w:noProof/>
         </w:rPr>
-        <w:lastRenderedPageBreak/>
         <w:drawing>
           <wp:inline distT="0" distB="0" distL="0" distR="0" wp14:anchorId="482A04E9" wp14:editId="27FA38F8">
             <wp:extent cx="5570220" cy="4754880"/>
@@ -10290,7 +10880,7 @@
                     </pic:cNvPicPr>
                   </pic:nvPicPr>
                   <pic:blipFill>
-                    <a:blip r:embed="rId18" cstate="print">
+                    <a:blip r:embed="rId22" cstate="print">
                       <a:extLst>
                         <a:ext uri="{28A0092B-C50C-407E-A947-70E740481C1C}">
                           <a14:useLocalDpi xmlns:a14="http://schemas.microsoft.com/office/drawing/2010/main" val="0"/>
@@ -10332,6 +10922,11 @@
     </w:p>
     <w:p>
       <w:pPr>
+        <w:pStyle w:val="VanBan"/>
+      </w:pPr>
+    </w:p>
+    <w:p>
+      <w:pPr>
         <w:pStyle w:val="Muc"/>
         <w:rPr>
           <w:szCs w:val="26"/>
@@ -10356,6 +10951,147 @@
           <w:szCs w:val="26"/>
         </w:rPr>
         <w:t xml:space="preserve">   3.6.1. Sơ đồ Website</w:t>
+      </w:r>
+    </w:p>
+    <w:p>
+      <w:pPr>
+        <w:pStyle w:val="VanBan"/>
+        <w:jc w:val="both"/>
+      </w:pPr>
+      <w:r>
+        <w:tab/>
+      </w:r>
+      <w:r>
+        <w:t>Sơ đồ cấu trúc website được chia thành hai phân hệ chính để phục vụ các nhóm đối tượng khác nhau:</w:t>
+      </w:r>
+    </w:p>
+    <w:p>
+      <w:pPr>
+        <w:pStyle w:val="VanBan"/>
+        <w:numPr>
+          <w:ilvl w:val="0"/>
+          <w:numId w:val="30"/>
+        </w:numPr>
+        <w:jc w:val="both"/>
+      </w:pPr>
+      <w:r>
+        <w:t>Phân hệ Khách hàng (Front-end)</w:t>
+      </w:r>
+      <w:r>
+        <w:t xml:space="preserve"> </w:t>
+      </w:r>
+      <w:r>
+        <w:t xml:space="preserve">: Gồm các trang phục vụ mua sắm trực tuyến như Trang chủ, Danh mục &amp; Lọc sản phẩm, Tìm kiếm, Chi tiết sản phẩm, Giỏ hàng và Thanh toán. </w:t>
+      </w:r>
+    </w:p>
+    <w:p>
+      <w:pPr>
+        <w:pStyle w:val="VanBan"/>
+        <w:numPr>
+          <w:ilvl w:val="0"/>
+          <w:numId w:val="30"/>
+        </w:numPr>
+        <w:jc w:val="both"/>
+      </w:pPr>
+      <w:r>
+        <w:t>Phân hệ Quản trị &amp; Nhân viên (Back-end)</w:t>
+      </w:r>
+      <w:r>
+        <w:t xml:space="preserve"> </w:t>
+      </w:r>
+      <w:r>
+        <w:t>: Gồm các chức năng quản trị sau khi đăng nhập như Dashboard thống kê, Quản lý danh mục/sản phẩm, Quản lý đơn hàng và Quản lý khách hàng/nhân sự.</w:t>
+      </w:r>
+    </w:p>
+    <w:p>
+      <w:pPr>
+        <w:pStyle w:val="VanBan"/>
+      </w:pPr>
+      <w:r>
+        <w:lastRenderedPageBreak/>
+        <w:drawing>
+          <wp:inline distT="0" distB="0" distL="0" distR="0" wp14:anchorId="6BB94180" wp14:editId="4BD6C3FE">
+            <wp:extent cx="5580380" cy="3114675"/>
+            <wp:effectExtent l="0" t="0" r="1270" b="9525"/>
+            <wp:docPr id="28470440" name="Picture 1"/>
+            <wp:cNvGraphicFramePr>
+              <a:graphicFrameLocks xmlns:a="http://schemas.openxmlformats.org/drawingml/2006/main" noChangeAspect="1"/>
+            </wp:cNvGraphicFramePr>
+            <a:graphic xmlns:a="http://schemas.openxmlformats.org/drawingml/2006/main">
+              <a:graphicData uri="http://schemas.openxmlformats.org/drawingml/2006/picture">
+                <pic:pic xmlns:pic="http://schemas.openxmlformats.org/drawingml/2006/picture">
+                  <pic:nvPicPr>
+                    <pic:cNvPr id="28470440" name=""/>
+                    <pic:cNvPicPr/>
+                  </pic:nvPicPr>
+                  <pic:blipFill>
+                    <a:blip r:embed="rId23"/>
+                    <a:stretch>
+                      <a:fillRect/>
+                    </a:stretch>
+                  </pic:blipFill>
+                  <pic:spPr>
+                    <a:xfrm>
+                      <a:off x="0" y="0"/>
+                      <a:ext cx="5580380" cy="3114675"/>
+                    </a:xfrm>
+                    <a:prstGeom prst="rect">
+                      <a:avLst/>
+                    </a:prstGeom>
+                  </pic:spPr>
+                </pic:pic>
+              </a:graphicData>
+            </a:graphic>
+          </wp:inline>
+        </w:drawing>
+      </w:r>
+    </w:p>
+    <w:p>
+      <w:pPr>
+        <w:pStyle w:val="Hinh"/>
+      </w:pPr>
+      <w:r>
+        <w:t>Hình 3.5. Sơ đồ Website</w:t>
+      </w:r>
+    </w:p>
+    <w:p>
+      <w:pPr>
+        <w:pStyle w:val="TieuMuc"/>
+        <w:rPr>
+          <w:szCs w:val="26"/>
+        </w:rPr>
+      </w:pPr>
+      <w:r>
+        <w:rPr>
+          <w:szCs w:val="26"/>
+        </w:rPr>
+        <w:t xml:space="preserve">   3.6.2. Phác thảo giao diện</w:t>
+      </w:r>
+    </w:p>
+    <w:p>
+      <w:pPr>
+        <w:pStyle w:val="SieuTieuMuc"/>
+        <w:rPr>
+          <w:szCs w:val="26"/>
+        </w:rPr>
+      </w:pPr>
+      <w:r>
+        <w:rPr>
+          <w:szCs w:val="26"/>
+        </w:rPr>
+        <w:tab/>
+      </w:r>
+      <w:r>
+        <w:rPr>
+          <w:szCs w:val="26"/>
+        </w:rPr>
+        <w:t>3.6.2.1. Giao diện</w:t>
+      </w:r>
+      <w:r>
+        <w:rPr>
+          <w:szCs w:val="26"/>
+        </w:rPr>
+        <w:t xml:space="preserve"> trang chủ, danh sách sản phẩm</w:t>
       </w:r>
     </w:p>
     <w:p>
@@ -10369,7 +11105,7 @@
     </w:p>
     <w:p>
       <w:pPr>
-        <w:pStyle w:val="TieuMuc"/>
+        <w:pStyle w:val="SieuTieuMuc"/>
         <w:rPr>
           <w:szCs w:val="26"/>
         </w:rPr>
@@ -10378,33 +11114,14 @@
         <w:rPr>
           <w:szCs w:val="26"/>
         </w:rPr>
-        <w:t xml:space="preserve">   3.6.2. Phác thảo giao diện</w:t>
-      </w:r>
-    </w:p>
-    <w:p>
-      <w:pPr>
-        <w:pStyle w:val="SieuTieuMuc"/>
+        <w:tab/>
+        <w:t>3.6.2.2. Giao diện</w:t>
+      </w:r>
+      <w:r>
         <w:rPr>
           <w:szCs w:val="26"/>
         </w:rPr>
-      </w:pPr>
-      <w:r>
-        <w:rPr>
-          <w:szCs w:val="26"/>
-        </w:rPr>
-        <w:tab/>
-      </w:r>
-      <w:r>
-        <w:rPr>
-          <w:szCs w:val="26"/>
-        </w:rPr>
-        <w:t>3.6.2.1. Giao diện</w:t>
-      </w:r>
-      <w:r>
-        <w:rPr>
-          <w:szCs w:val="26"/>
-        </w:rPr>
-        <w:t xml:space="preserve"> trang chủ, danh sách sản phẩm</w:t>
+        <w:t xml:space="preserve"> giỏ hàng, đặt hàng</w:t>
       </w:r>
     </w:p>
     <w:p>
@@ -10419,22 +11136,10 @@
     <w:p>
       <w:pPr>
         <w:pStyle w:val="SieuTieuMuc"/>
-        <w:rPr>
-          <w:szCs w:val="26"/>
-        </w:rPr>
-      </w:pPr>
-      <w:r>
-        <w:rPr>
-          <w:szCs w:val="26"/>
-        </w:rPr>
+      </w:pPr>
+      <w:r>
         <w:tab/>
-        <w:t>3.6.2.2. Giao diện</w:t>
-      </w:r>
-      <w:r>
-        <w:rPr>
-          <w:szCs w:val="26"/>
-        </w:rPr>
-        <w:t xml:space="preserve"> giỏ hàng, đặt hàng</w:t>
+        <w:t>3.6.2.3. Giao diện quản trị viên</w:t>
       </w:r>
     </w:p>
     <w:p>
@@ -10448,34 +11153,6 @@
     </w:p>
     <w:p>
       <w:pPr>
-        <w:pStyle w:val="SieuTieuMuc"/>
-      </w:pPr>
-      <w:r>
-        <w:tab/>
-        <w:t>3.6.2.3. Giao diện quản trị viên</w:t>
-      </w:r>
-    </w:p>
-    <w:p>
-      <w:pPr>
-        <w:pStyle w:val="VanBan"/>
-      </w:pPr>
-      <w:r>
-        <w:tab/>
-        <w:t>Chưa có</w:t>
-      </w:r>
-    </w:p>
-    <w:p>
-      <w:pPr>
-        <w:pStyle w:val="VanBan"/>
-      </w:pPr>
-    </w:p>
-    <w:p>
-      <w:pPr>
-        <w:pStyle w:val="VanBan"/>
-      </w:pPr>
-    </w:p>
-    <w:p>
-      <w:pPr>
         <w:pStyle w:val="Muc"/>
         <w:rPr>
           <w:szCs w:val="26"/>
@@ -10485,7 +11162,6 @@
         <w:rPr>
           <w:szCs w:val="26"/>
         </w:rPr>
-        <w:lastRenderedPageBreak/>
         <w:t>3.7. Kết chương</w:t>
       </w:r>
     </w:p>
@@ -10897,6 +11573,155 @@
     </w:lvl>
   </w:abstractNum>
   <w:abstractNum w:abstractNumId="2" w15:restartNumberingAfterBreak="0">
+    <w:nsid w:val="027872A8"/>
+    <w:multiLevelType w:val="multilevel"/>
+    <w:tmpl w:val="06F2B524"/>
+    <w:lvl w:ilvl="0">
+      <w:start w:val="1"/>
+      <w:numFmt w:val="bullet"/>
+      <w:lvlText w:val=""/>
+      <w:lvlJc w:val="left"/>
+      <w:pPr>
+        <w:tabs>
+          <w:tab w:val="num" w:pos="720"/>
+        </w:tabs>
+        <w:ind w:left="720" w:hanging="360"/>
+      </w:pPr>
+      <w:rPr>
+        <w:rFonts w:ascii="Symbol" w:hAnsi="Symbol" w:hint="default"/>
+        <w:sz w:val="20"/>
+      </w:rPr>
+    </w:lvl>
+    <w:lvl w:ilvl="1" w:tentative="1">
+      <w:start w:val="1"/>
+      <w:numFmt w:val="bullet"/>
+      <w:lvlText w:val="o"/>
+      <w:lvlJc w:val="left"/>
+      <w:pPr>
+        <w:tabs>
+          <w:tab w:val="num" w:pos="1440"/>
+        </w:tabs>
+        <w:ind w:left="1440" w:hanging="360"/>
+      </w:pPr>
+      <w:rPr>
+        <w:rFonts w:ascii="Courier New" w:hAnsi="Courier New" w:hint="default"/>
+        <w:sz w:val="20"/>
+      </w:rPr>
+    </w:lvl>
+    <w:lvl w:ilvl="2" w:tentative="1">
+      <w:start w:val="1"/>
+      <w:numFmt w:val="bullet"/>
+      <w:lvlText w:val=""/>
+      <w:lvlJc w:val="left"/>
+      <w:pPr>
+        <w:tabs>
+          <w:tab w:val="num" w:pos="2160"/>
+        </w:tabs>
+        <w:ind w:left="2160" w:hanging="360"/>
+      </w:pPr>
+      <w:rPr>
+        <w:rFonts w:ascii="Wingdings" w:hAnsi="Wingdings" w:hint="default"/>
+        <w:sz w:val="20"/>
+      </w:rPr>
+    </w:lvl>
+    <w:lvl w:ilvl="3" w:tentative="1">
+      <w:start w:val="1"/>
+      <w:numFmt w:val="bullet"/>
+      <w:lvlText w:val=""/>
+      <w:lvlJc w:val="left"/>
+      <w:pPr>
+        <w:tabs>
+          <w:tab w:val="num" w:pos="2880"/>
+        </w:tabs>
+        <w:ind w:left="2880" w:hanging="360"/>
+      </w:pPr>
+      <w:rPr>
+        <w:rFonts w:ascii="Wingdings" w:hAnsi="Wingdings" w:hint="default"/>
+        <w:sz w:val="20"/>
+      </w:rPr>
+    </w:lvl>
+    <w:lvl w:ilvl="4" w:tentative="1">
+      <w:start w:val="1"/>
+      <w:numFmt w:val="bullet"/>
+      <w:lvlText w:val=""/>
+      <w:lvlJc w:val="left"/>
+      <w:pPr>
+        <w:tabs>
+          <w:tab w:val="num" w:pos="3600"/>
+        </w:tabs>
+        <w:ind w:left="3600" w:hanging="360"/>
+      </w:pPr>
+      <w:rPr>
+        <w:rFonts w:ascii="Wingdings" w:hAnsi="Wingdings" w:hint="default"/>
+        <w:sz w:val="20"/>
+      </w:rPr>
+    </w:lvl>
+    <w:lvl w:ilvl="5" w:tentative="1">
+      <w:start w:val="1"/>
+      <w:numFmt w:val="bullet"/>
+      <w:lvlText w:val=""/>
+      <w:lvlJc w:val="left"/>
+      <w:pPr>
+        <w:tabs>
+          <w:tab w:val="num" w:pos="4320"/>
+        </w:tabs>
+        <w:ind w:left="4320" w:hanging="360"/>
+      </w:pPr>
+      <w:rPr>
+        <w:rFonts w:ascii="Wingdings" w:hAnsi="Wingdings" w:hint="default"/>
+        <w:sz w:val="20"/>
+      </w:rPr>
+    </w:lvl>
+    <w:lvl w:ilvl="6" w:tentative="1">
+      <w:start w:val="1"/>
+      <w:numFmt w:val="bullet"/>
+      <w:lvlText w:val=""/>
+      <w:lvlJc w:val="left"/>
+      <w:pPr>
+        <w:tabs>
+          <w:tab w:val="num" w:pos="5040"/>
+        </w:tabs>
+        <w:ind w:left="5040" w:hanging="360"/>
+      </w:pPr>
+      <w:rPr>
+        <w:rFonts w:ascii="Wingdings" w:hAnsi="Wingdings" w:hint="default"/>
+        <w:sz w:val="20"/>
+      </w:rPr>
+    </w:lvl>
+    <w:lvl w:ilvl="7" w:tentative="1">
+      <w:start w:val="1"/>
+      <w:numFmt w:val="bullet"/>
+      <w:lvlText w:val=""/>
+      <w:lvlJc w:val="left"/>
+      <w:pPr>
+        <w:tabs>
+          <w:tab w:val="num" w:pos="5760"/>
+        </w:tabs>
+        <w:ind w:left="5760" w:hanging="360"/>
+      </w:pPr>
+      <w:rPr>
+        <w:rFonts w:ascii="Wingdings" w:hAnsi="Wingdings" w:hint="default"/>
+        <w:sz w:val="20"/>
+      </w:rPr>
+    </w:lvl>
+    <w:lvl w:ilvl="8" w:tentative="1">
+      <w:start w:val="1"/>
+      <w:numFmt w:val="bullet"/>
+      <w:lvlText w:val=""/>
+      <w:lvlJc w:val="left"/>
+      <w:pPr>
+        <w:tabs>
+          <w:tab w:val="num" w:pos="6480"/>
+        </w:tabs>
+        <w:ind w:left="6480" w:hanging="360"/>
+      </w:pPr>
+      <w:rPr>
+        <w:rFonts w:ascii="Wingdings" w:hAnsi="Wingdings" w:hint="default"/>
+        <w:sz w:val="20"/>
+      </w:rPr>
+    </w:lvl>
+  </w:abstractNum>
+  <w:abstractNum w:abstractNumId="3" w15:restartNumberingAfterBreak="0">
     <w:nsid w:val="03D53A6E"/>
     <w:multiLevelType w:val="hybridMultilevel"/>
     <w:tmpl w:val="B5BCA63C"/>
@@ -11009,7 +11834,7 @@
       </w:rPr>
     </w:lvl>
   </w:abstractNum>
-  <w:abstractNum w:abstractNumId="3" w15:restartNumberingAfterBreak="0">
+  <w:abstractNum w:abstractNumId="4" w15:restartNumberingAfterBreak="0">
     <w:nsid w:val="080C634C"/>
     <w:multiLevelType w:val="hybridMultilevel"/>
     <w:tmpl w:val="4BFA1D82"/>
@@ -11122,7 +11947,7 @@
       </w:rPr>
     </w:lvl>
   </w:abstractNum>
-  <w:abstractNum w:abstractNumId="4" w15:restartNumberingAfterBreak="0">
+  <w:abstractNum w:abstractNumId="5" w15:restartNumberingAfterBreak="0">
     <w:nsid w:val="09094046"/>
     <w:multiLevelType w:val="hybridMultilevel"/>
     <w:tmpl w:val="F4364E08"/>
@@ -11235,7 +12060,7 @@
       </w:rPr>
     </w:lvl>
   </w:abstractNum>
-  <w:abstractNum w:abstractNumId="5" w15:restartNumberingAfterBreak="0">
+  <w:abstractNum w:abstractNumId="6" w15:restartNumberingAfterBreak="0">
     <w:nsid w:val="09BB7D93"/>
     <w:multiLevelType w:val="hybridMultilevel"/>
     <w:tmpl w:val="98F430BC"/>
@@ -11348,7 +12173,7 @@
       </w:rPr>
     </w:lvl>
   </w:abstractNum>
-  <w:abstractNum w:abstractNumId="6" w15:restartNumberingAfterBreak="0">
+  <w:abstractNum w:abstractNumId="7" w15:restartNumberingAfterBreak="0">
     <w:nsid w:val="0FDA4815"/>
     <w:multiLevelType w:val="multilevel"/>
     <w:tmpl w:val="4880C468"/>
@@ -11497,7 +12322,7 @@
       </w:rPr>
     </w:lvl>
   </w:abstractNum>
-  <w:abstractNum w:abstractNumId="7" w15:restartNumberingAfterBreak="0">
+  <w:abstractNum w:abstractNumId="8" w15:restartNumberingAfterBreak="0">
     <w:nsid w:val="104562A8"/>
     <w:multiLevelType w:val="hybridMultilevel"/>
     <w:tmpl w:val="28F00638"/>
@@ -11610,7 +12435,7 @@
       </w:rPr>
     </w:lvl>
   </w:abstractNum>
-  <w:abstractNum w:abstractNumId="8" w15:restartNumberingAfterBreak="0">
+  <w:abstractNum w:abstractNumId="9" w15:restartNumberingAfterBreak="0">
     <w:nsid w:val="1D56361E"/>
     <w:multiLevelType w:val="hybridMultilevel"/>
     <w:tmpl w:val="C6D437DC"/>
@@ -11723,7 +12548,7 @@
       </w:rPr>
     </w:lvl>
   </w:abstractNum>
-  <w:abstractNum w:abstractNumId="9" w15:restartNumberingAfterBreak="0">
+  <w:abstractNum w:abstractNumId="10" w15:restartNumberingAfterBreak="0">
     <w:nsid w:val="207978CD"/>
     <w:multiLevelType w:val="hybridMultilevel"/>
     <w:tmpl w:val="2EDAD51E"/>
@@ -11836,7 +12661,7 @@
       </w:rPr>
     </w:lvl>
   </w:abstractNum>
-  <w:abstractNum w:abstractNumId="10" w15:restartNumberingAfterBreak="0">
+  <w:abstractNum w:abstractNumId="11" w15:restartNumberingAfterBreak="0">
     <w:nsid w:val="20EA5A65"/>
     <w:multiLevelType w:val="hybridMultilevel"/>
     <w:tmpl w:val="FC285588"/>
@@ -11949,7 +12774,7 @@
       </w:rPr>
     </w:lvl>
   </w:abstractNum>
-  <w:abstractNum w:abstractNumId="11" w15:restartNumberingAfterBreak="0">
+  <w:abstractNum w:abstractNumId="12" w15:restartNumberingAfterBreak="0">
     <w:nsid w:val="24895DE2"/>
     <w:multiLevelType w:val="multilevel"/>
     <w:tmpl w:val="D31A19C8"/>
@@ -12098,7 +12923,7 @@
       </w:rPr>
     </w:lvl>
   </w:abstractNum>
-  <w:abstractNum w:abstractNumId="12" w15:restartNumberingAfterBreak="0">
+  <w:abstractNum w:abstractNumId="13" w15:restartNumberingAfterBreak="0">
     <w:nsid w:val="340E38D5"/>
     <w:multiLevelType w:val="hybridMultilevel"/>
     <w:tmpl w:val="0F5C8008"/>
@@ -12211,7 +13036,7 @@
       </w:rPr>
     </w:lvl>
   </w:abstractNum>
-  <w:abstractNum w:abstractNumId="13" w15:restartNumberingAfterBreak="0">
+  <w:abstractNum w:abstractNumId="14" w15:restartNumberingAfterBreak="0">
     <w:nsid w:val="3738171A"/>
     <w:multiLevelType w:val="hybridMultilevel"/>
     <w:tmpl w:val="D408F2DE"/>
@@ -12324,7 +13149,7 @@
       </w:rPr>
     </w:lvl>
   </w:abstractNum>
-  <w:abstractNum w:abstractNumId="14" w15:restartNumberingAfterBreak="0">
+  <w:abstractNum w:abstractNumId="15" w15:restartNumberingAfterBreak="0">
     <w:nsid w:val="39D30AA9"/>
     <w:multiLevelType w:val="multilevel"/>
     <w:tmpl w:val="28466B58"/>
@@ -12473,7 +13298,120 @@
       </w:rPr>
     </w:lvl>
   </w:abstractNum>
-  <w:abstractNum w:abstractNumId="15" w15:restartNumberingAfterBreak="0">
+  <w:abstractNum w:abstractNumId="16" w15:restartNumberingAfterBreak="0">
+    <w:nsid w:val="3FB83EF5"/>
+    <w:multiLevelType w:val="hybridMultilevel"/>
+    <w:tmpl w:val="F31895DE"/>
+    <w:lvl w:ilvl="0" w:tplc="735CEB80">
+      <w:start w:val="1"/>
+      <w:numFmt w:val="bullet"/>
+      <w:lvlText w:val=""/>
+      <w:lvlJc w:val="left"/>
+      <w:pPr>
+        <w:ind w:left="720" w:hanging="360"/>
+      </w:pPr>
+      <w:rPr>
+        <w:rFonts w:ascii="Symbol" w:hAnsi="Symbol" w:hint="default"/>
+      </w:rPr>
+    </w:lvl>
+    <w:lvl w:ilvl="1" w:tplc="04090003" w:tentative="1">
+      <w:start w:val="1"/>
+      <w:numFmt w:val="bullet"/>
+      <w:lvlText w:val="o"/>
+      <w:lvlJc w:val="left"/>
+      <w:pPr>
+        <w:ind w:left="1440" w:hanging="360"/>
+      </w:pPr>
+      <w:rPr>
+        <w:rFonts w:ascii="Courier New" w:hAnsi="Courier New" w:cs="Courier New" w:hint="default"/>
+      </w:rPr>
+    </w:lvl>
+    <w:lvl w:ilvl="2" w:tplc="04090005" w:tentative="1">
+      <w:start w:val="1"/>
+      <w:numFmt w:val="bullet"/>
+      <w:lvlText w:val=""/>
+      <w:lvlJc w:val="left"/>
+      <w:pPr>
+        <w:ind w:left="2160" w:hanging="360"/>
+      </w:pPr>
+      <w:rPr>
+        <w:rFonts w:ascii="Wingdings" w:hAnsi="Wingdings" w:hint="default"/>
+      </w:rPr>
+    </w:lvl>
+    <w:lvl w:ilvl="3" w:tplc="04090001" w:tentative="1">
+      <w:start w:val="1"/>
+      <w:numFmt w:val="bullet"/>
+      <w:lvlText w:val=""/>
+      <w:lvlJc w:val="left"/>
+      <w:pPr>
+        <w:ind w:left="2880" w:hanging="360"/>
+      </w:pPr>
+      <w:rPr>
+        <w:rFonts w:ascii="Symbol" w:hAnsi="Symbol" w:hint="default"/>
+      </w:rPr>
+    </w:lvl>
+    <w:lvl w:ilvl="4" w:tplc="04090003" w:tentative="1">
+      <w:start w:val="1"/>
+      <w:numFmt w:val="bullet"/>
+      <w:lvlText w:val="o"/>
+      <w:lvlJc w:val="left"/>
+      <w:pPr>
+        <w:ind w:left="3600" w:hanging="360"/>
+      </w:pPr>
+      <w:rPr>
+        <w:rFonts w:ascii="Courier New" w:hAnsi="Courier New" w:cs="Courier New" w:hint="default"/>
+      </w:rPr>
+    </w:lvl>
+    <w:lvl w:ilvl="5" w:tplc="04090005" w:tentative="1">
+      <w:start w:val="1"/>
+      <w:numFmt w:val="bullet"/>
+      <w:lvlText w:val=""/>
+      <w:lvlJc w:val="left"/>
+      <w:pPr>
+        <w:ind w:left="4320" w:hanging="360"/>
+      </w:pPr>
+      <w:rPr>
+        <w:rFonts w:ascii="Wingdings" w:hAnsi="Wingdings" w:hint="default"/>
+      </w:rPr>
+    </w:lvl>
+    <w:lvl w:ilvl="6" w:tplc="04090001" w:tentative="1">
+      <w:start w:val="1"/>
+      <w:numFmt w:val="bullet"/>
+      <w:lvlText w:val=""/>
+      <w:lvlJc w:val="left"/>
+      <w:pPr>
+        <w:ind w:left="5040" w:hanging="360"/>
+      </w:pPr>
+      <w:rPr>
+        <w:rFonts w:ascii="Symbol" w:hAnsi="Symbol" w:hint="default"/>
+      </w:rPr>
+    </w:lvl>
+    <w:lvl w:ilvl="7" w:tplc="04090003" w:tentative="1">
+      <w:start w:val="1"/>
+      <w:numFmt w:val="bullet"/>
+      <w:lvlText w:val="o"/>
+      <w:lvlJc w:val="left"/>
+      <w:pPr>
+        <w:ind w:left="5760" w:hanging="360"/>
+      </w:pPr>
+      <w:rPr>
+        <w:rFonts w:ascii="Courier New" w:hAnsi="Courier New" w:cs="Courier New" w:hint="default"/>
+      </w:rPr>
+    </w:lvl>
+    <w:lvl w:ilvl="8" w:tplc="04090005" w:tentative="1">
+      <w:start w:val="1"/>
+      <w:numFmt w:val="bullet"/>
+      <w:lvlText w:val=""/>
+      <w:lvlJc w:val="left"/>
+      <w:pPr>
+        <w:ind w:left="6480" w:hanging="360"/>
+      </w:pPr>
+      <w:rPr>
+        <w:rFonts w:ascii="Wingdings" w:hAnsi="Wingdings" w:hint="default"/>
+      </w:rPr>
+    </w:lvl>
+  </w:abstractNum>
+  <w:abstractNum w:abstractNumId="17" w15:restartNumberingAfterBreak="0">
     <w:nsid w:val="401A66E2"/>
     <w:multiLevelType w:val="hybridMultilevel"/>
     <w:tmpl w:val="98405DDA"/>
@@ -12586,7 +13524,7 @@
       </w:rPr>
     </w:lvl>
   </w:abstractNum>
-  <w:abstractNum w:abstractNumId="16" w15:restartNumberingAfterBreak="0">
+  <w:abstractNum w:abstractNumId="18" w15:restartNumberingAfterBreak="0">
     <w:nsid w:val="422E1153"/>
     <w:multiLevelType w:val="hybridMultilevel"/>
     <w:tmpl w:val="8A404CCE"/>
@@ -12699,7 +13637,7 @@
       </w:rPr>
     </w:lvl>
   </w:abstractNum>
-  <w:abstractNum w:abstractNumId="17" w15:restartNumberingAfterBreak="0">
+  <w:abstractNum w:abstractNumId="19" w15:restartNumberingAfterBreak="0">
     <w:nsid w:val="45E77F97"/>
     <w:multiLevelType w:val="multilevel"/>
     <w:tmpl w:val="3B8A7398"/>
@@ -12848,7 +13786,7 @@
       </w:rPr>
     </w:lvl>
   </w:abstractNum>
-  <w:abstractNum w:abstractNumId="18" w15:restartNumberingAfterBreak="0">
+  <w:abstractNum w:abstractNumId="20" w15:restartNumberingAfterBreak="0">
     <w:nsid w:val="465B4B33"/>
     <w:multiLevelType w:val="multilevel"/>
     <w:tmpl w:val="347A792E"/>
@@ -12997,7 +13935,7 @@
       </w:rPr>
     </w:lvl>
   </w:abstractNum>
-  <w:abstractNum w:abstractNumId="19" w15:restartNumberingAfterBreak="0">
+  <w:abstractNum w:abstractNumId="21" w15:restartNumberingAfterBreak="0">
     <w:nsid w:val="4C4E1BDA"/>
     <w:multiLevelType w:val="hybridMultilevel"/>
     <w:tmpl w:val="446EC110"/>
@@ -13083,7 +14021,7 @@
       </w:pPr>
     </w:lvl>
   </w:abstractNum>
-  <w:abstractNum w:abstractNumId="20" w15:restartNumberingAfterBreak="0">
+  <w:abstractNum w:abstractNumId="22" w15:restartNumberingAfterBreak="0">
     <w:nsid w:val="551D711E"/>
     <w:multiLevelType w:val="hybridMultilevel"/>
     <w:tmpl w:val="C2BAEAF4"/>
@@ -13196,7 +14134,7 @@
       </w:rPr>
     </w:lvl>
   </w:abstractNum>
-  <w:abstractNum w:abstractNumId="21" w15:restartNumberingAfterBreak="0">
+  <w:abstractNum w:abstractNumId="23" w15:restartNumberingAfterBreak="0">
     <w:nsid w:val="696A4460"/>
     <w:multiLevelType w:val="hybridMultilevel"/>
     <w:tmpl w:val="A79A736A"/>
@@ -13309,7 +14247,7 @@
       </w:rPr>
     </w:lvl>
   </w:abstractNum>
-  <w:abstractNum w:abstractNumId="22" w15:restartNumberingAfterBreak="0">
+  <w:abstractNum w:abstractNumId="24" w15:restartNumberingAfterBreak="0">
     <w:nsid w:val="6A772E60"/>
     <w:multiLevelType w:val="multilevel"/>
     <w:tmpl w:val="AF9CA93E"/>
@@ -13422,7 +14360,7 @@
       </w:pPr>
     </w:lvl>
   </w:abstractNum>
-  <w:abstractNum w:abstractNumId="23" w15:restartNumberingAfterBreak="0">
+  <w:abstractNum w:abstractNumId="25" w15:restartNumberingAfterBreak="0">
     <w:nsid w:val="6B0450DC"/>
     <w:multiLevelType w:val="hybridMultilevel"/>
     <w:tmpl w:val="A19091C0"/>
@@ -13535,7 +14473,7 @@
       </w:rPr>
     </w:lvl>
   </w:abstractNum>
-  <w:abstractNum w:abstractNumId="24" w15:restartNumberingAfterBreak="0">
+  <w:abstractNum w:abstractNumId="26" w15:restartNumberingAfterBreak="0">
     <w:nsid w:val="6CBC43C9"/>
     <w:multiLevelType w:val="hybridMultilevel"/>
     <w:tmpl w:val="4DC63066"/>
@@ -13648,7 +14586,7 @@
       </w:rPr>
     </w:lvl>
   </w:abstractNum>
-  <w:abstractNum w:abstractNumId="25" w15:restartNumberingAfterBreak="0">
+  <w:abstractNum w:abstractNumId="27" w15:restartNumberingAfterBreak="0">
     <w:nsid w:val="6E8B2938"/>
     <w:multiLevelType w:val="multilevel"/>
     <w:tmpl w:val="FF82E35E"/>
@@ -13797,7 +14735,7 @@
       </w:rPr>
     </w:lvl>
   </w:abstractNum>
-  <w:abstractNum w:abstractNumId="26" w15:restartNumberingAfterBreak="0">
+  <w:abstractNum w:abstractNumId="28" w15:restartNumberingAfterBreak="0">
     <w:nsid w:val="6F892EBD"/>
     <w:multiLevelType w:val="multilevel"/>
     <w:tmpl w:val="3294C836"/>
@@ -13946,7 +14884,7 @@
       </w:rPr>
     </w:lvl>
   </w:abstractNum>
-  <w:abstractNum w:abstractNumId="27" w15:restartNumberingAfterBreak="0">
+  <w:abstractNum w:abstractNumId="29" w15:restartNumberingAfterBreak="0">
     <w:nsid w:val="7F1A5B68"/>
     <w:multiLevelType w:val="hybridMultilevel"/>
     <w:tmpl w:val="0068D906"/>
@@ -14060,88 +14998,94 @@
     </w:lvl>
   </w:abstractNum>
   <w:num w:numId="1" w16cid:durableId="408385506">
-    <w:abstractNumId w:val="22"/>
+    <w:abstractNumId w:val="24"/>
   </w:num>
   <w:num w:numId="2" w16cid:durableId="1595093323">
+    <w:abstractNumId w:val="21"/>
+  </w:num>
+  <w:num w:numId="3" w16cid:durableId="1043794736">
+    <w:abstractNumId w:val="15"/>
+  </w:num>
+  <w:num w:numId="4" w16cid:durableId="105933096">
     <w:abstractNumId w:val="19"/>
   </w:num>
-  <w:num w:numId="3" w16cid:durableId="1043794736">
-    <w:abstractNumId w:val="14"/>
-  </w:num>
-  <w:num w:numId="4" w16cid:durableId="105933096">
-    <w:abstractNumId w:val="17"/>
-  </w:num>
   <w:num w:numId="5" w16cid:durableId="757674649">
-    <w:abstractNumId w:val="6"/>
+    <w:abstractNumId w:val="7"/>
   </w:num>
   <w:num w:numId="6" w16cid:durableId="156657523">
     <w:abstractNumId w:val="0"/>
   </w:num>
   <w:num w:numId="7" w16cid:durableId="40324540">
-    <w:abstractNumId w:val="24"/>
+    <w:abstractNumId w:val="26"/>
   </w:num>
   <w:num w:numId="8" w16cid:durableId="953515887">
+    <w:abstractNumId w:val="4"/>
+  </w:num>
+  <w:num w:numId="9" w16cid:durableId="1103039426">
+    <w:abstractNumId w:val="17"/>
+  </w:num>
+  <w:num w:numId="10" w16cid:durableId="710424099">
+    <w:abstractNumId w:val="9"/>
+  </w:num>
+  <w:num w:numId="11" w16cid:durableId="2097439083">
+    <w:abstractNumId w:val="10"/>
+  </w:num>
+  <w:num w:numId="12" w16cid:durableId="149296729">
+    <w:abstractNumId w:val="27"/>
+  </w:num>
+  <w:num w:numId="13" w16cid:durableId="1937591852">
+    <w:abstractNumId w:val="14"/>
+  </w:num>
+  <w:num w:numId="14" w16cid:durableId="504633820">
+    <w:abstractNumId w:val="20"/>
+  </w:num>
+  <w:num w:numId="15" w16cid:durableId="272322862">
+    <w:abstractNumId w:val="6"/>
+  </w:num>
+  <w:num w:numId="16" w16cid:durableId="2050303344">
+    <w:abstractNumId w:val="29"/>
+  </w:num>
+  <w:num w:numId="17" w16cid:durableId="656346712">
+    <w:abstractNumId w:val="12"/>
+  </w:num>
+  <w:num w:numId="18" w16cid:durableId="508525855">
+    <w:abstractNumId w:val="23"/>
+  </w:num>
+  <w:num w:numId="19" w16cid:durableId="509105721">
+    <w:abstractNumId w:val="5"/>
+  </w:num>
+  <w:num w:numId="20" w16cid:durableId="719397933">
+    <w:abstractNumId w:val="8"/>
+  </w:num>
+  <w:num w:numId="21" w16cid:durableId="1143082236">
+    <w:abstractNumId w:val="22"/>
+  </w:num>
+  <w:num w:numId="22" w16cid:durableId="1269695481">
+    <w:abstractNumId w:val="28"/>
+  </w:num>
+  <w:num w:numId="23" w16cid:durableId="1834641995">
     <w:abstractNumId w:val="3"/>
   </w:num>
-  <w:num w:numId="9" w16cid:durableId="1103039426">
-    <w:abstractNumId w:val="15"/>
+  <w:num w:numId="24" w16cid:durableId="659508306">
+    <w:abstractNumId w:val="11"/>
   </w:num>
-  <w:num w:numId="10" w16cid:durableId="710424099">
-    <w:abstractNumId w:val="8"/>
-  </w:num>
-  <w:num w:numId="11" w16cid:durableId="2097439083">
-    <w:abstractNumId w:val="9"/>
-  </w:num>
-  <w:num w:numId="12" w16cid:durableId="149296729">
-    <w:abstractNumId w:val="25"/>
-  </w:num>
-  <w:num w:numId="13" w16cid:durableId="1937591852">
-    <w:abstractNumId w:val="13"/>
-  </w:num>
-  <w:num w:numId="14" w16cid:durableId="504633820">
+  <w:num w:numId="25" w16cid:durableId="40634506">
     <w:abstractNumId w:val="18"/>
   </w:num>
-  <w:num w:numId="15" w16cid:durableId="272322862">
-    <w:abstractNumId w:val="5"/>
-  </w:num>
-  <w:num w:numId="16" w16cid:durableId="2050303344">
-    <w:abstractNumId w:val="27"/>
-  </w:num>
-  <w:num w:numId="17" w16cid:durableId="656346712">
-    <w:abstractNumId w:val="11"/>
-  </w:num>
-  <w:num w:numId="18" w16cid:durableId="508525855">
-    <w:abstractNumId w:val="21"/>
-  </w:num>
-  <w:num w:numId="19" w16cid:durableId="509105721">
-    <w:abstractNumId w:val="4"/>
-  </w:num>
-  <w:num w:numId="20" w16cid:durableId="719397933">
-    <w:abstractNumId w:val="7"/>
-  </w:num>
-  <w:num w:numId="21" w16cid:durableId="1143082236">
-    <w:abstractNumId w:val="20"/>
-  </w:num>
-  <w:num w:numId="22" w16cid:durableId="1269695481">
-    <w:abstractNumId w:val="26"/>
-  </w:num>
-  <w:num w:numId="23" w16cid:durableId="1834641995">
-    <w:abstractNumId w:val="2"/>
-  </w:num>
-  <w:num w:numId="24" w16cid:durableId="659508306">
-    <w:abstractNumId w:val="10"/>
-  </w:num>
-  <w:num w:numId="25" w16cid:durableId="40634506">
-    <w:abstractNumId w:val="16"/>
-  </w:num>
   <w:num w:numId="26" w16cid:durableId="1361011667">
-    <w:abstractNumId w:val="23"/>
+    <w:abstractNumId w:val="25"/>
   </w:num>
   <w:num w:numId="27" w16cid:durableId="1361779900">
     <w:abstractNumId w:val="1"/>
   </w:num>
   <w:num w:numId="28" w16cid:durableId="1917744136">
-    <w:abstractNumId w:val="12"/>
+    <w:abstractNumId w:val="13"/>
+  </w:num>
+  <w:num w:numId="29" w16cid:durableId="1692878874">
+    <w:abstractNumId w:val="16"/>
+  </w:num>
+  <w:num w:numId="30" w16cid:durableId="678627802">
+    <w:abstractNumId w:val="2"/>
   </w:num>
 </w:numbering>
 </file>

</xml_diff>

<commit_message>
Chinh sua bai bao cao va hoan thien chuong 3
</commit_message>
<xml_diff>
--- a/baocao.docx
+++ b/baocao.docx
@@ -719,7 +719,7 @@
         <w:rPr>
           <w:bCs/>
         </w:rPr>
-        <w:t>"XÂY DỰNG HỆ THỐNG QUẢN LÝ BÁN HÀNG"</w:t>
+        <w:t>Xây Dựng Hệ Thống Quản Lý Bán Hàng</w:t>
       </w:r>
       <w:r>
         <w:t xml:space="preserve"> là </w:t>
@@ -755,13 +755,7 @@
         <w:t>Em</w:t>
       </w:r>
       <w:r>
-        <w:t xml:space="preserve"> xin khẳng định</w:t>
-      </w:r>
-      <w:r>
-        <w:t xml:space="preserve"> </w:t>
-      </w:r>
-      <w:r>
-        <w:t>:</w:t>
+        <w:t xml:space="preserve"> xin khẳng định:</w:t>
       </w:r>
     </w:p>
     <w:p>
@@ -850,37 +844,44 @@
     </w:p>
     <w:p>
       <w:pPr>
-        <w:pStyle w:val="NoiDung"/>
-      </w:pPr>
-    </w:p>
-    <w:p>
-      <w:pPr>
-        <w:pStyle w:val="NoiDung"/>
-      </w:pPr>
-    </w:p>
-    <w:p>
-      <w:pPr>
-        <w:pStyle w:val="NoiDung"/>
-      </w:pPr>
-    </w:p>
-    <w:p>
-      <w:pPr>
-        <w:pStyle w:val="NoiDung"/>
-      </w:pPr>
-    </w:p>
-    <w:p>
-      <w:pPr>
-        <w:pStyle w:val="NoiDung"/>
-      </w:pPr>
-    </w:p>
-    <w:p>
-      <w:pPr>
-        <w:pStyle w:val="NoiDung"/>
-      </w:pPr>
-    </w:p>
-    <w:p>
-      <w:pPr>
-        <w:pStyle w:val="NoiDung"/>
+        <w:pStyle w:val="VanBan"/>
+        <w:jc w:val="both"/>
+      </w:pPr>
+    </w:p>
+    <w:p>
+      <w:pPr>
+        <w:pStyle w:val="VanBan"/>
+        <w:jc w:val="both"/>
+      </w:pPr>
+    </w:p>
+    <w:p>
+      <w:pPr>
+        <w:pStyle w:val="VanBan"/>
+        <w:jc w:val="both"/>
+      </w:pPr>
+    </w:p>
+    <w:p>
+      <w:pPr>
+        <w:pStyle w:val="VanBan"/>
+        <w:jc w:val="both"/>
+      </w:pPr>
+    </w:p>
+    <w:p>
+      <w:pPr>
+        <w:pStyle w:val="VanBan"/>
+        <w:jc w:val="both"/>
+      </w:pPr>
+    </w:p>
+    <w:p>
+      <w:pPr>
+        <w:pStyle w:val="VanBan"/>
+        <w:jc w:val="both"/>
+      </w:pPr>
+    </w:p>
+    <w:p>
+      <w:pPr>
+        <w:pStyle w:val="VanBan"/>
+        <w:jc w:val="both"/>
       </w:pPr>
     </w:p>
     <w:p>
@@ -990,44 +991,58 @@
         <w:t xml:space="preserve">. Cô luôn chỉ bảo, định hướng và giúp đỡ em tháo gỡ những khó khăn trong suốt quá trình nghiên cứu và thực hiện đồ án môn học </w:t>
       </w:r>
       <w:r>
-        <w:rPr>
-          <w:i/>
-          <w:iCs/>
-        </w:rPr>
-        <w:t>"</w:t>
-      </w:r>
-      <w:r>
-        <w:t>Phát triển ứng dụng Web với mã nguồn mở</w:t>
-      </w:r>
-      <w:r>
-        <w:rPr>
-          <w:i/>
-          <w:iCs/>
-        </w:rPr>
-        <w:t>"</w:t>
+        <w:t>P</w:t>
+      </w:r>
+      <w:r>
+        <w:t xml:space="preserve">hát </w:t>
+      </w:r>
+      <w:r>
+        <w:t>T</w:t>
+      </w:r>
+      <w:r>
+        <w:t xml:space="preserve">riển </w:t>
+      </w:r>
+      <w:r>
+        <w:t>Ứ</w:t>
+      </w:r>
+      <w:r>
+        <w:t xml:space="preserve">ng </w:t>
+      </w:r>
+      <w:r>
+        <w:t>D</w:t>
+      </w:r>
+      <w:r>
+        <w:t xml:space="preserve">ụng Web </w:t>
+      </w:r>
+      <w:r>
+        <w:t>V</w:t>
+      </w:r>
+      <w:r>
+        <w:t xml:space="preserve">ới </w:t>
+      </w:r>
+      <w:r>
+        <w:t>M</w:t>
+      </w:r>
+      <w:r>
+        <w:t xml:space="preserve">ã </w:t>
+      </w:r>
+      <w:r>
+        <w:t>N</w:t>
+      </w:r>
+      <w:r>
+        <w:t xml:space="preserve">guồn </w:t>
+      </w:r>
+      <w:r>
+        <w:t>M</w:t>
+      </w:r>
+      <w:r>
+        <w:t>ở</w:t>
       </w:r>
       <w:r>
         <w:t xml:space="preserve"> với đề tài </w:t>
       </w:r>
       <w:r>
-        <w:rPr>
-          <w:b/>
-          <w:bCs/>
-        </w:rPr>
-        <w:t>"</w:t>
-      </w:r>
-      <w:r>
-        <w:t>XÂY DỰNG HỆ THỐNG QUẢN LÝ BÁN HÀNG</w:t>
-      </w:r>
-      <w:r>
-        <w:rPr>
-          <w:b/>
-          <w:bCs/>
-        </w:rPr>
-        <w:t>"</w:t>
-      </w:r>
-      <w:r>
-        <w:t xml:space="preserve">. </w:t>
+        <w:t>Xây Dựng Hệ Thống Quản Lý Bán Hàng.</w:t>
       </w:r>
     </w:p>
     <w:p>
@@ -1342,27 +1357,55 @@
         <w:jc w:val="both"/>
       </w:pPr>
       <w:r>
-        <w:t xml:space="preserve">Song song đó, việc nắm vững quy trình phát triển ứng dụng Web mã nguồn mở kết hợp với quản trị dữ liệu là mục tiêu cốt lõi của môn học </w:t>
-      </w:r>
-      <w:r>
-        <w:rPr>
-          <w:i/>
-          <w:iCs/>
-        </w:rPr>
-        <w:t>"</w:t>
-      </w:r>
-      <w:r>
-        <w:t>Phát triển ứng dụng Web với mã nguồn mở</w:t>
-      </w:r>
-      <w:r>
-        <w:rPr>
-          <w:i/>
-          <w:iCs/>
-        </w:rPr>
-        <w:t>"</w:t>
-      </w:r>
-      <w:r>
-        <w:t>. Xuất phát từ nhu cầu thực tế cùng mong muốn củng cố kiến thức đã được tích lũy qua các bài học và bài tập thực hành, tác giả quyết định lựa chọn đề tài "XÂY DỰNG HỆ THỐNG QUẢN LÝ BÁN HÀNG" làm đồ án môn học.</w:t>
+        <w:t xml:space="preserve">Song song đó, việc nắm vững quy trình phát triển ứng dụng Web mã nguồn mở kết hợp với quản trị dữ liệu là mục tiêu cốt lõi của môn học Phát </w:t>
+      </w:r>
+      <w:r>
+        <w:t>T</w:t>
+      </w:r>
+      <w:r>
+        <w:t xml:space="preserve">riển </w:t>
+      </w:r>
+      <w:r>
+        <w:t>Ứ</w:t>
+      </w:r>
+      <w:r>
+        <w:t xml:space="preserve">ng </w:t>
+      </w:r>
+      <w:r>
+        <w:t>D</w:t>
+      </w:r>
+      <w:r>
+        <w:t xml:space="preserve">ụng Web </w:t>
+      </w:r>
+      <w:r>
+        <w:t>V</w:t>
+      </w:r>
+      <w:r>
+        <w:t xml:space="preserve">ới </w:t>
+      </w:r>
+      <w:r>
+        <w:t>M</w:t>
+      </w:r>
+      <w:r>
+        <w:t xml:space="preserve">ã </w:t>
+      </w:r>
+      <w:r>
+        <w:t>N</w:t>
+      </w:r>
+      <w:r>
+        <w:t xml:space="preserve">guồn </w:t>
+      </w:r>
+      <w:r>
+        <w:t>M</w:t>
+      </w:r>
+      <w:r>
+        <w:t xml:space="preserve">ở. Xuất phát từ nhu cầu thực tế cùng mong muốn củng cố kiến thức đã được tích lũy qua các bài học và bài tập thực hành, tác giả quyết định lựa chọn đề tài </w:t>
+      </w:r>
+      <w:r>
+        <w:t xml:space="preserve">Xây Dựng Hệ Thống Quản Lý Bán Hàng </w:t>
+      </w:r>
+      <w:r>
+        <w:t>làm đồ án môn học.</w:t>
       </w:r>
     </w:p>
     <w:p>
@@ -1390,13 +1433,7 @@
         <w:tab/>
       </w:r>
       <w:r>
-        <w:t>Mục tiêu tổng quát</w:t>
-      </w:r>
-      <w:r>
-        <w:t xml:space="preserve"> </w:t>
-      </w:r>
-      <w:r>
-        <w:t>: Xây dựng thành công một ứng dụng Web quản lý bán hàng hoàn chỉnh, đáp ứng được các nghiệp vụ cơ bản như xem</w:t>
+        <w:t>Mục tiêu tổng quát: Xây dựng thành công một ứng dụng Web quản lý bán hàng hoàn chỉnh, đáp ứng được các nghiệp vụ cơ bản như xem</w:t>
       </w:r>
       <w:r>
         <w:t xml:space="preserve">, </w:t>
@@ -1411,13 +1448,7 @@
         <w:jc w:val="both"/>
       </w:pPr>
       <w:r>
-        <w:t>Mục tiêu cụ thể</w:t>
-      </w:r>
-      <w:r>
-        <w:t xml:space="preserve"> </w:t>
-      </w:r>
-      <w:r>
-        <w:t>:</w:t>
+        <w:t>Mục tiêu cụ thể:</w:t>
       </w:r>
     </w:p>
     <w:p>
@@ -1430,13 +1461,7 @@
         <w:jc w:val="both"/>
       </w:pPr>
       <w:r>
-        <w:t>Nghiên cứu công nghệ</w:t>
-      </w:r>
-      <w:r>
-        <w:t xml:space="preserve"> </w:t>
-      </w:r>
-      <w:r>
-        <w:t>: Tìm hiểu và ứng dụng ngôn ngữ kịch bản PHP trong việc xử lý logic ứng dụng, truy vấn dữ liệu và hiển thị giao diện.</w:t>
+        <w:t>Nghiên cứu công nghệ: Tìm hiểu và ứng dụng ngôn ngữ kịch bản PHP trong việc xử lý logic ứng dụng, truy vấn dữ liệu và hiển thị giao diện.</w:t>
       </w:r>
     </w:p>
     <w:p>
@@ -1449,13 +1474,7 @@
         <w:jc w:val="both"/>
       </w:pPr>
       <w:r>
-        <w:t>Quản trị cơ sở dữ liệu</w:t>
-      </w:r>
-      <w:r>
-        <w:t xml:space="preserve"> </w:t>
-      </w:r>
-      <w:r>
-        <w:t>: Thiết kế và triển khai CSDL</w:t>
+        <w:t>Quản trị cơ sở dữ liệu: Thiết kế và triển khai CSDL</w:t>
       </w:r>
       <w:r>
         <w:t xml:space="preserve"> </w:t>
@@ -1474,13 +1493,7 @@
         <w:jc w:val="both"/>
       </w:pPr>
       <w:r>
-        <w:t>Chuẩn hóa môi trường</w:t>
-      </w:r>
-      <w:r>
-        <w:t xml:space="preserve"> </w:t>
-      </w:r>
-      <w:r>
-        <w:t>: Sử dụng công nghệ ảo hóa container Docker để đóng gói toàn bộ ứng dụng và CSDL, giúp đảm bảo tính đồng nhất môi trường phát triển và dễ dàng triển khai.</w:t>
+        <w:t>Chuẩn hóa môi trường: Sử dụng công nghệ ảo hóa container Docker để đóng gói toàn bộ ứng dụng và CSDL, giúp đảm bảo tính đồng nhất môi trường phát triển và dễ dàng triển khai.</w:t>
       </w:r>
     </w:p>
     <w:p>
@@ -1493,13 +1506,7 @@
         <w:jc w:val="both"/>
       </w:pPr>
       <w:r>
-        <w:t>Hoàn thiện chức năng</w:t>
-      </w:r>
-      <w:r>
-        <w:t xml:space="preserve"> </w:t>
-      </w:r>
-      <w:r>
-        <w:t>: Thiết kế các chức năng cơ bản cho người dùng (xem sản phẩm, thêm vào giỏ hàng, đặt hàng) và quản trị viên</w:t>
+        <w:t>Hoàn thiện chức năng: Thiết kế các chức năng cơ bản cho người dùng (xem sản phẩm, thêm vào giỏ hàng, đặt hàng) và quản trị viên</w:t>
       </w:r>
       <w:r>
         <w:t xml:space="preserve">, </w:t>
@@ -1549,7 +1556,7 @@
         <w:jc w:val="both"/>
       </w:pPr>
       <w:r>
-        <w:t>Đối tượng nghiên cứu :</w:t>
+        <w:t>Đối tượng nghiên cứu:</w:t>
       </w:r>
     </w:p>
     <w:p>
@@ -1610,7 +1617,7 @@
         <w:jc w:val="both"/>
       </w:pPr>
       <w:r>
-        <w:t>Phạm vi nghiên cứu :</w:t>
+        <w:t>Phạm vi nghiên cứu:</w:t>
       </w:r>
     </w:p>
     <w:p>
@@ -1623,13 +1630,7 @@
         <w:jc w:val="both"/>
       </w:pPr>
       <w:r>
-        <w:t>Về nghiệp vụ</w:t>
-      </w:r>
-      <w:r>
-        <w:t xml:space="preserve"> </w:t>
-      </w:r>
-      <w:r>
-        <w:t>: Đồ án tập trung vào các chức năng cốt lõi của hệ thống quản lý bán hàng ở quy mô đồ án môn học.</w:t>
+        <w:t>Về nghiệp vụ: Đồ án tập trung vào các chức năng cốt lõi của hệ thống quản lý bán hàng ở quy mô đồ án môn học.</w:t>
       </w:r>
     </w:p>
     <w:p>
@@ -1642,13 +1643,7 @@
         <w:jc w:val="both"/>
       </w:pPr>
       <w:r>
-        <w:t>Về kỹ thuật</w:t>
-      </w:r>
-      <w:r>
-        <w:t xml:space="preserve"> </w:t>
-      </w:r>
-      <w:r>
-        <w:t>: Tích hợp trực tiếp các đoạn kịch bản xử lý, mã HTML/CSS/JS và câu lệnh truy vấn SQL Server ngay trong các tệp tin PHP</w:t>
+        <w:t>Về kỹ thuật: Tích hợp trực tiếp các đoạn kịch bản xử lý, mã HTML/CSS/JS và câu lệnh truy vấn SQL Server ngay trong các tệp tin PHP</w:t>
       </w:r>
       <w:r>
         <w:t>,</w:t>
@@ -1682,28 +1677,16 @@
         <w:tab/>
       </w:r>
       <w:r>
-        <w:t>Phương pháp thu thập và phân tích</w:t>
-      </w:r>
-      <w:r>
-        <w:t xml:space="preserve"> </w:t>
-      </w:r>
-      <w:r>
-        <w:t>: Tìm hiểu các yêu cầu nghiệp vụ quản lý bán hàng thực tế và tham khảo kiến thức hướng dẫn từ giảng viên ThS. Nguyễn Ngọc Đan Thanh.</w:t>
-      </w:r>
-    </w:p>
-    <w:p>
-      <w:pPr>
-        <w:pStyle w:val="VanBan"/>
-        <w:jc w:val="both"/>
-      </w:pPr>
-      <w:r>
-        <w:t>Phương pháp thiết kế và phát triển</w:t>
-      </w:r>
-      <w:r>
-        <w:t xml:space="preserve"> </w:t>
-      </w:r>
-      <w:r>
-        <w:t>:</w:t>
+        <w:t>Phương pháp thu thập và phân tích: Tìm hiểu các yêu cầu nghiệp vụ quản lý bán hàng thực tế và tham khảo kiến thức hướng dẫn từ giảng viên ThS. Nguyễn Ngọc Đan Thanh.</w:t>
+      </w:r>
+    </w:p>
+    <w:p>
+      <w:pPr>
+        <w:pStyle w:val="VanBan"/>
+        <w:jc w:val="both"/>
+      </w:pPr>
+      <w:r>
+        <w:t>Phương pháp thiết kế và phát triển:</w:t>
       </w:r>
     </w:p>
     <w:p>
@@ -1751,13 +1734,7 @@
         <w:jc w:val="both"/>
       </w:pPr>
       <w:r>
-        <w:t>Phương pháp kiểm thử</w:t>
-      </w:r>
-      <w:r>
-        <w:t xml:space="preserve"> </w:t>
-      </w:r>
-      <w:r>
-        <w:t>: Thực hiện kiểm thử chức năng trực tiếp trên môi trường chạy thử nghiệm để phát hiện và sửa lỗi hệ thống.</w:t>
+        <w:t>Phương pháp kiểm thử: Thực hiện kiểm thử chức năng trực tiếp trên môi trường chạy thử nghiệm để phát hiện và sửa lỗi hệ thống.</w:t>
       </w:r>
     </w:p>
     <w:p>
@@ -1801,13 +1778,7 @@
         <w:jc w:val="both"/>
       </w:pPr>
       <w:r>
-        <w:t>Báo cáo đồ án được bố cục gồm các phần chính sau</w:t>
-      </w:r>
-      <w:r>
-        <w:t xml:space="preserve"> </w:t>
-      </w:r>
-      <w:r>
-        <w:t>:</w:t>
+        <w:t>Báo cáo đồ án được bố cục gồm các phần chính sau:</w:t>
       </w:r>
     </w:p>
     <w:p>
@@ -1820,13 +1791,7 @@
         <w:jc w:val="both"/>
       </w:pPr>
       <w:r>
-        <w:t>CHƯƠNG MỞ ĐẦU</w:t>
-      </w:r>
-      <w:r>
-        <w:t xml:space="preserve"> </w:t>
-      </w:r>
-      <w:r>
-        <w:t xml:space="preserve">: Giới thiệu bối cảnh, mục tiêu, phạm vi và phương pháp thực hiện đề tài. </w:t>
+        <w:t xml:space="preserve">CHƯƠNG MỞ ĐẦU: Giới thiệu bối cảnh, mục tiêu, phạm vi và phương pháp thực hiện đề tài. </w:t>
       </w:r>
     </w:p>
     <w:p>
@@ -1839,19 +1804,7 @@
         <w:jc w:val="both"/>
       </w:pPr>
       <w:r>
-        <w:t>CHƯƠNG 1</w:t>
-      </w:r>
-      <w:r>
-        <w:t xml:space="preserve"> </w:t>
-      </w:r>
-      <w:r>
-        <w:t>: TỔNG QUAN NGHIÊN CỨU</w:t>
-      </w:r>
-      <w:r>
-        <w:t xml:space="preserve"> </w:t>
-      </w:r>
-      <w:r>
-        <w:t xml:space="preserve">: Tổng quan về lĩnh vực quản lý bán hàng và các giải pháp hiện có. </w:t>
+        <w:t xml:space="preserve">CHƯƠNG 1: TỔNG QUAN NGHIÊN CỨU: Tổng quan về lĩnh vực quản lý bán hàng và các giải pháp hiện có. </w:t>
       </w:r>
     </w:p>
     <w:p>
@@ -1864,19 +1817,7 @@
         <w:jc w:val="both"/>
       </w:pPr>
       <w:r>
-        <w:t>CHƯƠNG 2</w:t>
-      </w:r>
-      <w:r>
-        <w:t xml:space="preserve"> </w:t>
-      </w:r>
-      <w:r>
-        <w:t>: CƠ SỞ LÝ THUYẾT</w:t>
-      </w:r>
-      <w:r>
-        <w:t xml:space="preserve"> </w:t>
-      </w:r>
-      <w:r>
-        <w:t xml:space="preserve">: Trình bày tổng quan các công nghệ sử dụng như Docker, PHP và SQL Server. </w:t>
+        <w:t xml:space="preserve">CHƯƠNG 2: CƠ SỞ LÝ THUYẾT: Trình bày tổng quan các công nghệ sử dụng như Docker, PHP và SQL Server. </w:t>
       </w:r>
     </w:p>
     <w:p>
@@ -1889,13 +1830,7 @@
         <w:jc w:val="both"/>
       </w:pPr>
       <w:r>
-        <w:t>CHƯƠNG 3</w:t>
-      </w:r>
-      <w:r>
-        <w:t xml:space="preserve"> </w:t>
-      </w:r>
-      <w:r>
-        <w:t>: THIẾT KẾ VÀ TRIỂN KHAI HỆ THỐNG</w:t>
+        <w:t>CHƯƠNG 3: THIẾT KẾ VÀ TRIỂN KHAI HỆ THỐNG</w:t>
       </w:r>
       <w:r>
         <w:t xml:space="preserve"> </w:t>
@@ -1914,19 +1849,7 @@
         <w:jc w:val="both"/>
       </w:pPr>
       <w:r>
-        <w:t>CHƯƠNG 4</w:t>
-      </w:r>
-      <w:r>
-        <w:t xml:space="preserve"> </w:t>
-      </w:r>
-      <w:r>
-        <w:t>: KẾT QUẢ THỰC HIỆN VÀ KIỂM THỬ</w:t>
-      </w:r>
-      <w:r>
-        <w:t xml:space="preserve"> </w:t>
-      </w:r>
-      <w:r>
-        <w:t xml:space="preserve">: Trình bày kết quả đạt được, hình ảnh giao diện thực tế và kết quả thử nghiệm. </w:t>
+        <w:t xml:space="preserve">CHƯƠNG 4: KẾT QUẢ THỰC HIỆN VÀ KIỂM THỬ: Trình bày kết quả đạt được, hình ảnh giao diện thực tế và kết quả thử nghiệm. </w:t>
       </w:r>
     </w:p>
     <w:p>
@@ -1939,19 +1862,7 @@
         <w:jc w:val="both"/>
       </w:pPr>
       <w:r>
-        <w:t>CHƯƠNG 5</w:t>
-      </w:r>
-      <w:r>
-        <w:t xml:space="preserve"> </w:t>
-      </w:r>
-      <w:r>
-        <w:t>: KẾT LUẬN VÀ HƯỚNG PHÁT TRIỂN</w:t>
-      </w:r>
-      <w:r>
-        <w:t xml:space="preserve"> </w:t>
-      </w:r>
-      <w:r>
-        <w:t>: Đánh giá ưu</w:t>
+        <w:t>CHƯƠNG 5: KẾT LUẬN VÀ HƯỚNG PHÁT TRIỂN: Đánh giá ưu</w:t>
       </w:r>
       <w:r>
         <w:t xml:space="preserve"> và </w:t>
@@ -2016,13 +1927,7 @@
         <w:tab/>
       </w:r>
       <w:r>
-        <w:t>Hiện nay, thương mại điện tử và các hoạt động kinh doanh trực tuyến đang phát triển mạnh mẽ. Đối với bất kỳ doanh nghiệp hay cửa hàng bán lẻ nào, việc sở hữu một hệ thống quản lý bán hàng là điều kiện tiên quyết để duy trì khả năng cạnh tranh. Trước đây, nhiều cửa hàng vẫn sử dụng sổ sách hoặc các bảng tính Excel để quản lý hàng hóa, ghi nhận đơn hàng và lưu trữ thông tin khách hàng. Phương pháp thủ công này bộc lộ nhiều hạn chế như</w:t>
-      </w:r>
-      <w:r>
-        <w:t xml:space="preserve"> </w:t>
-      </w:r>
-      <w:r>
-        <w:t>:</w:t>
+        <w:t>Hiện nay, thương mại điện tử và các hoạt động kinh doanh trực tuyến đang phát triển mạnh mẽ. Đối với bất kỳ doanh nghiệp hay cửa hàng bán lẻ nào, việc sở hữu một hệ thống quản lý bán hàng là điều kiện tiên quyết để duy trì khả năng cạnh tranh. Trước đây, nhiều cửa hàng vẫn sử dụng sổ sách hoặc các bảng tính Excel để quản lý hàng hóa, ghi nhận đơn hàng và lưu trữ thông tin khách hàng. Phương pháp thủ công này bộc lộ nhiều hạn chế như:</w:t>
       </w:r>
     </w:p>
     <w:p>
@@ -2061,7 +1966,7 @@
         <w:jc w:val="both"/>
       </w:pPr>
       <w:r>
-        <w:t>Không thể quản lý hàng hóa và đơn hàng theo thời gian thực (real-time).</w:t>
+        <w:t>Không thể quản lý hàng hóa và đơn hàng theo thời gian thực.</w:t>
       </w:r>
     </w:p>
     <w:p>
@@ -2151,7 +2056,7 @@
         <w:t>Để giải quyết bài toán trên và hoàn thành mục tiêu môn học, đồ án lựa chọn hướng tiếp cận thực tế, sử dụng các công nghệ mã nguồn mở và nền tảng cơ sở dữ liệu mạnh mẽ</w:t>
       </w:r>
       <w:r>
-        <w:t xml:space="preserve"> : </w:t>
+        <w:t xml:space="preserve">: </w:t>
       </w:r>
     </w:p>
     <w:p>
@@ -2164,13 +2069,7 @@
         <w:jc w:val="both"/>
       </w:pPr>
       <w:r>
-        <w:t>Môi trường vận hành</w:t>
-      </w:r>
-      <w:r>
-        <w:t xml:space="preserve"> </w:t>
-      </w:r>
-      <w:r>
-        <w:t>: Đề tài sử dụng nền tảng Docker để đóng gói toàn bộ môi trường chạy ứng dụng. Việc ảo hóa bằng container giúp giải quyết triệt để vấn đề "chạy được trên máy này nhưng lỗi trên máy khác", đồng thời giúp quá trình triển khai (deploy) trở nên nhanh chóng và đồng nhất.</w:t>
+        <w:t>Môi trường vận hành: Đề tài sử dụng nền tảng Docker để đóng gói toàn bộ môi trường chạy ứng dụng. Việc ảo hóa bằng container giúp giải quyết triệt để vấn đề chạy được trên máy này nhưng lỗi trên máy khác, đồng thời giúp quá trình triển khai (deploy) trở nên nhanh chóng và đồng nhất.</w:t>
       </w:r>
     </w:p>
     <w:p>
@@ -2183,13 +2082,13 @@
         <w:jc w:val="both"/>
       </w:pPr>
       <w:r>
-        <w:t>Ngôn ngữ phát triển</w:t>
-      </w:r>
-      <w:r>
-        <w:t xml:space="preserve"> </w:t>
-      </w:r>
-      <w:r>
-        <w:t>: Ứng dụng được xây dựng chủ yếu bằng PHP – một ngôn ngữ kịch bản phía máy chủ mạnh mẽ và phổ biến nhất trong phát triển Web. PHP sẽ đóng vai trò xử lý logic, nhận yêu cầu từ người dùng, thao tác với CSDL và trả về kết quả dưới dạng giao diện (HTML/CSS/JS).</w:t>
+        <w:t xml:space="preserve">Ngôn ngữ phát triển: Ứng dụng được xây dựng chủ yếu bằng PHP </w:t>
+      </w:r>
+      <w:r>
+        <w:t>-</w:t>
+      </w:r>
+      <w:r>
+        <w:t xml:space="preserve"> một ngôn ngữ kịch bản phía máy chủ mạnh mẽ và phổ biến nhất trong phát triển Web. PHP sẽ đóng vai trò xử lý logic, nhận yêu cầu từ người dùng, thao tác với CSDL và trả về kết quả dưới dạng giao diện (HTML/CSS/JS).</w:t>
       </w:r>
     </w:p>
     <w:p>
@@ -2202,13 +2101,7 @@
         <w:jc w:val="both"/>
       </w:pPr>
       <w:r>
-        <w:t>Hệ quản trị CSDL</w:t>
-      </w:r>
-      <w:r>
-        <w:t xml:space="preserve"> </w:t>
-      </w:r>
-      <w:r>
-        <w:t>: Dữ liệu của hệ thống được lưu trữ và quản lý tập trung bằng SQL Server. Đây là một hệ quản trị cơ sở dữ liệu quan hệ (RDBMS) ổn định, an toàn và tối ưu cho các bài toán quản lý.</w:t>
+        <w:t>Hệ quản trị CSDL: Dữ liệu của hệ thống được lưu trữ và quản lý tập trung bằng SQL Server. Đây là một hệ quản trị cơ sở dữ liệu quan hệ ổn định, an toàn và tối ưu cho các bài toán quản lý.</w:t>
       </w:r>
     </w:p>
     <w:p>
@@ -2277,12 +2170,6 @@
     <w:p>
       <w:pPr>
         <w:pStyle w:val="VanBan"/>
-        <w:jc w:val="both"/>
-      </w:pPr>
-    </w:p>
-    <w:p>
-      <w:pPr>
-        <w:pStyle w:val="VanBan"/>
         <w:jc w:val="center"/>
       </w:pPr>
       <w:r>
@@ -2290,8 +2177,8 @@
           <w:noProof/>
         </w:rPr>
         <w:drawing>
-          <wp:inline distT="0" distB="0" distL="0" distR="0" wp14:anchorId="644BB081" wp14:editId="01DCBB26">
-            <wp:extent cx="3264913" cy="1836420"/>
+          <wp:inline distT="0" distB="0" distL="0" distR="0" wp14:anchorId="644BB081" wp14:editId="344A22A2">
+            <wp:extent cx="2844947" cy="1600200"/>
             <wp:effectExtent l="0" t="0" r="0" b="0"/>
             <wp:docPr id="191782173" name="Picture 1" descr="SIT Portfolio"/>
             <wp:cNvGraphicFramePr>
@@ -2322,7 +2209,7 @@
                   <pic:spPr bwMode="auto">
                     <a:xfrm>
                       <a:off x="0" y="0"/>
-                      <a:ext cx="3290286" cy="1850692"/>
+                      <a:ext cx="2904976" cy="1633965"/>
                     </a:xfrm>
                     <a:prstGeom prst="rect">
                       <a:avLst/>
@@ -2349,11 +2236,6 @@
     </w:p>
     <w:p>
       <w:pPr>
-        <w:pStyle w:val="VanBan"/>
-      </w:pPr>
-    </w:p>
-    <w:p>
-      <w:pPr>
         <w:pStyle w:val="TieuMuc"/>
       </w:pPr>
       <w:r>
@@ -2369,13 +2251,7 @@
         <w:tab/>
       </w:r>
       <w:r>
-        <w:t>Trong đồ án này, môi trường phát triển đòi hỏi sự phối hợp giữa nhiều thành phần như Web Server và Database Server. Docker giải quyết các vấn đề sau</w:t>
-      </w:r>
-      <w:r>
-        <w:t xml:space="preserve"> </w:t>
-      </w:r>
-      <w:r>
-        <w:t>:</w:t>
+        <w:t>Trong đồ án này, môi trường phát triển đòi hỏi sự phối hợp giữa nhiều thành phần như Web Server và Database Server. Docker giải quyết các vấn đề sau:</w:t>
       </w:r>
     </w:p>
     <w:p>
@@ -2388,13 +2264,10 @@
         <w:jc w:val="both"/>
       </w:pPr>
       <w:r>
-        <w:t>Tính nhất quán</w:t>
-      </w:r>
-      <w:r>
-        <w:t xml:space="preserve"> </w:t>
-      </w:r>
-      <w:r>
-        <w:t>: Đảm bảo ứng dụng hoạt động giống hệt nhau trên máy tính cá nhân của người phát triển, máy chủ thử nghiệm hay môi trường thực tế, triệt tiêu lỗi "it works on my machine".</w:t>
+        <w:t>Tính nhất quán: Đảm bảo ứng dụng hoạt động giống hệt nhau trên máy tính cá nhân của người phát triển, máy chủ thử nghiệm hay môi trường thực tế</w:t>
+      </w:r>
+      <w:r>
+        <w:t>.</w:t>
       </w:r>
     </w:p>
     <w:p>
@@ -2407,13 +2280,7 @@
         <w:jc w:val="both"/>
       </w:pPr>
       <w:r>
-        <w:t>Đóng gói và triển khai dễ dàng</w:t>
-      </w:r>
-      <w:r>
-        <w:t xml:space="preserve"> </w:t>
-      </w:r>
-      <w:r>
-        <w:t>: Thông qua Dockerfile (định nghĩa môi trường cho PHP) và docker-compose.yml (định nghĩa và liên kết các dịch vụ PHP, SQL Server), toàn bộ hệ thống có thể được khởi động chỉ với một câu lệnh đơn giản, không cần cài đặt thủ công từng phần mềm rườm rà.</w:t>
+        <w:t>Đóng gói và triển khai dễ dàng: Thông qua Dockerfile (định nghĩa môi trường cho PHP) và docker-compose.yml (định nghĩa và liên kết các dịch vụ PHP, SQL Server), toàn bộ hệ thống có thể được khởi động chỉ với một câu lệnh đơn giản, không cần cài đặt thủ công từng phần mềm rườm rà.</w:t>
       </w:r>
     </w:p>
     <w:p>
@@ -2426,21 +2293,15 @@
         <w:jc w:val="both"/>
       </w:pPr>
       <w:r>
+        <w:t>Tính cô lập: Các dịch vụ như Web Server và CSDL chạy trong các container riêng biệt, tránh xung đột về thư viện hay cổng mạng với các ứng dụng khác đang chạy trên máy chủ.</w:t>
+      </w:r>
+    </w:p>
+    <w:p>
+      <w:pPr>
+        <w:pStyle w:val="Muc"/>
+      </w:pPr>
+      <w:r>
         <w:lastRenderedPageBreak/>
-        <w:t>Tính cô lập</w:t>
-      </w:r>
-      <w:r>
-        <w:t xml:space="preserve"> </w:t>
-      </w:r>
-      <w:r>
-        <w:t>: Các dịch vụ như Web Server và CSDL chạy trong các container riêng biệt, tránh xung đột về thư viện hay cổng mạng với các ứng dụng khác đang chạy trên máy chủ.</w:t>
-      </w:r>
-    </w:p>
-    <w:p>
-      <w:pPr>
-        <w:pStyle w:val="Muc"/>
-      </w:pPr>
-      <w:r>
         <w:t>2.2. Ngôn ngữ kịch bản phía Server</w:t>
       </w:r>
     </w:p>
@@ -2479,12 +2340,6 @@
     <w:p>
       <w:pPr>
         <w:pStyle w:val="VanBan"/>
-        <w:jc w:val="both"/>
-      </w:pPr>
-    </w:p>
-    <w:p>
-      <w:pPr>
-        <w:pStyle w:val="VanBan"/>
         <w:jc w:val="center"/>
       </w:pPr>
       <w:r>
@@ -2492,8 +2347,8 @@
           <w:noProof/>
         </w:rPr>
         <w:drawing>
-          <wp:inline distT="0" distB="0" distL="0" distR="0" wp14:anchorId="5315C178" wp14:editId="5D773CF9">
-            <wp:extent cx="3947160" cy="1973580"/>
+          <wp:inline distT="0" distB="0" distL="0" distR="0" wp14:anchorId="5315C178" wp14:editId="34B0FCA3">
+            <wp:extent cx="4404360" cy="2202180"/>
             <wp:effectExtent l="0" t="0" r="0" b="7620"/>
             <wp:docPr id="1922874511" name="Picture 5" descr="Php Logo large resolution 2048x1024 PNG picture - Transparent ..."/>
             <wp:cNvGraphicFramePr>
@@ -2524,7 +2379,7 @@
                   <pic:spPr bwMode="auto">
                     <a:xfrm>
                       <a:off x="0" y="0"/>
-                      <a:ext cx="3947160" cy="1973580"/>
+                      <a:ext cx="4404360" cy="2202180"/>
                     </a:xfrm>
                     <a:prstGeom prst="rect">
                       <a:avLst/>
@@ -2551,11 +2406,6 @@
     </w:p>
     <w:p>
       <w:pPr>
-        <w:pStyle w:val="VanBan"/>
-      </w:pPr>
-    </w:p>
-    <w:p>
-      <w:pPr>
         <w:pStyle w:val="TieuMuc"/>
       </w:pPr>
       <w:r>
@@ -2574,13 +2424,7 @@
         <w:tab/>
       </w:r>
       <w:r>
-        <w:t>Với định hướng tích hợp toàn bộ các thành phần trong cùng một tệp, PHP thể hiện sự linh hoạt mạnh mẽ</w:t>
-      </w:r>
-      <w:r>
-        <w:t xml:space="preserve"> </w:t>
-      </w:r>
-      <w:r>
-        <w:t>:</w:t>
+        <w:t>Với định hướng tích hợp toàn bộ các thành phần trong cùng một tệp, PHP thể hiện sự linh hoạt mạnh mẽ:</w:t>
       </w:r>
     </w:p>
     <w:p>
@@ -2593,13 +2437,7 @@
         <w:jc w:val="both"/>
       </w:pPr>
       <w:r>
-        <w:t>Nhúng trực tiếp vào HTML</w:t>
-      </w:r>
-      <w:r>
-        <w:t xml:space="preserve"> </w:t>
-      </w:r>
-      <w:r>
-        <w:t>: Mã PHP được đặt bên trong các thẻ &lt;?php ... ?&gt; và có thể xen kẽ trực tiếp với cấu trúc HTML. Điều này giúp dễ dàng hiển thị động các dữ liệu, chẳng hạn như danh sách sản phẩm hay thông tin giỏ hàng.</w:t>
+        <w:t>Nhúng trực tiếp vào HTML: Mã PHP được đặt bên trong các thẻ &lt;?php ... ?&gt; và có thể xen kẽ trực tiếp với cấu trúc HTML. Điều này giúp dễ dàng hiển thị động các dữ liệu, chẳng hạn như danh sách sản phẩm hay thông tin giỏ hàng.</w:t>
       </w:r>
     </w:p>
     <w:p>
@@ -2612,14 +2450,7 @@
         <w:jc w:val="both"/>
       </w:pPr>
       <w:r>
-        <w:lastRenderedPageBreak/>
-        <w:t>Xử lý form và dữ liệu người dùng</w:t>
-      </w:r>
-      <w:r>
-        <w:t xml:space="preserve"> </w:t>
-      </w:r>
-      <w:r>
-        <w:t>: PHP có khả năng thu thập dữ liệu từ các form HTML (thông qua phương thức GET, POST), xử lý các logic như tính toán tổng tiền, kiểm tra đăng nhập.</w:t>
+        <w:t>Xử lý form và dữ liệu người dùng: PHP có khả năng thu thập dữ liệu từ các form HTML (thông qua phương thức GET, POST), xử lý các logic như tính toán tổng tiền, kiểm tra đăng nhập.</w:t>
       </w:r>
     </w:p>
     <w:p>
@@ -2632,13 +2463,7 @@
         <w:jc w:val="both"/>
       </w:pPr>
       <w:r>
-        <w:t>Quản lý Session/Cookie</w:t>
-      </w:r>
-      <w:r>
-        <w:t xml:space="preserve"> </w:t>
-      </w:r>
-      <w:r>
-        <w:t>: PHP hỗ trợ mạnh mẽ việc lưu trữ trạng thái người dùng (ví dụ</w:t>
+        <w:t>Quản lý Session/Cookie: PHP hỗ trợ mạnh mẽ việc lưu trữ trạng thái người dùng (ví dụ</w:t>
       </w:r>
       <w:r>
         <w:t xml:space="preserve"> </w:t>
@@ -2657,13 +2482,8 @@
         <w:jc w:val="both"/>
       </w:pPr>
       <w:r>
-        <w:t>Kết nối cơ sở dữ liệu</w:t>
-      </w:r>
-      <w:r>
-        <w:t xml:space="preserve"> </w:t>
-      </w:r>
-      <w:r>
-        <w:t>: PHP cung cấp các phần mở rộng (extensions) như PDO hoặc SQLSRV, cho phép thực thi trực tiếp các câu lệnh truy vấn tới SQL Server ngay bên trong tệp nguồn PHP.</w:t>
+        <w:lastRenderedPageBreak/>
+        <w:t>Kết nối cơ sở dữ liệu: PHP cung cấp các phần mở rộng (extensions) như PDO hoặc SQLSRV, cho phép thực thi trực tiếp các câu lệnh truy vấn tới SQL Server ngay bên trong tệp nguồn PHP.</w:t>
       </w:r>
     </w:p>
     <w:p>
@@ -2694,7 +2514,7 @@
         <w:tab/>
       </w:r>
       <w:r>
-        <w:t>Microsoft SQL Server là một Hệ quản trị cơ sở dữ liệu quan hệ (RDBMS) mạnh mẽ, được sử dụng rộng rãi trong môi trường doanh nghiệp. Chức năng chính của nó là lưu trữ và truy xuất dữ liệu theo yêu cầu của các ứng dụng phần mềm.</w:t>
+        <w:t>Microsoft SQL Server là một Hệ quản trị cơ sở dữ liệu quan hệ mạnh mẽ, được sử dụng rộng rãi trong môi trường doanh nghiệp. Chức năng chính của nó là lưu trữ và truy xuất dữ liệu theo yêu cầu của các ứng dụng phần mềm.</w:t>
       </w:r>
     </w:p>
     <w:p>
@@ -2705,12 +2525,6 @@
       <w:r>
         <w:t>Trong đồ án này, SQL Server được chọn làm nơi lưu trữ toàn bộ dữ liệu của hệ thống bán hàng bao gồm: thông tin người dùng, danh mục, sản phẩm, đơn hàng và chi tiết hóa đơn. Tính toàn vẹn dữ liệu, khả năng xử lý giao dịch (Transaction) an toàn và hiệu suất truy vấn cao là những lý do chính để lựa chọn SQL Server thay vì các hệ thống cơ sở dữ liệu nhỏ hơn.</w:t>
       </w:r>
-    </w:p>
-    <w:p>
-      <w:pPr>
-        <w:pStyle w:val="VanBan"/>
-        <w:jc w:val="both"/>
-      </w:pPr>
     </w:p>
     <w:p>
       <w:pPr>
@@ -2781,15 +2595,9 @@
     </w:p>
     <w:p>
       <w:pPr>
-        <w:pStyle w:val="VanBan"/>
-      </w:pPr>
-    </w:p>
-    <w:p>
-      <w:pPr>
         <w:pStyle w:val="TieuMuc"/>
       </w:pPr>
       <w:r>
-        <w:lastRenderedPageBreak/>
         <w:t xml:space="preserve">   </w:t>
       </w:r>
       <w:r>
@@ -2824,13 +2632,7 @@
         <w:jc w:val="both"/>
       </w:pPr>
       <w:r>
-        <w:t>DDL (Data Definition Language)</w:t>
-      </w:r>
-      <w:r>
-        <w:t xml:space="preserve"> </w:t>
-      </w:r>
-      <w:r>
-        <w:t>: Các câu lệnh như CREATE TABLE, ALTER TABLE được dùng để thiết kế cấu trúc các bảng dữ liệu (Bảng Sản phẩm, Bảng Đơn hàng,...) ở giai đoạn khởi tạo.</w:t>
+        <w:t>DDL (Data Definition Language): Các câu lệnh như CREATE TABLE, ALTER TABLE được dùng để thiết kế cấu trúc các bảng dữ liệu (Bảng Sản phẩm, Bảng Đơn hàng,...) ở giai đoạn khởi tạo.</w:t>
       </w:r>
     </w:p>
     <w:p>
@@ -2843,13 +2645,8 @@
         <w:jc w:val="both"/>
       </w:pPr>
       <w:r>
-        <w:t>DML (Data Manipulation Language)</w:t>
-      </w:r>
-      <w:r>
-        <w:t xml:space="preserve"> </w:t>
-      </w:r>
-      <w:r>
-        <w:t>: Đây là nhóm lệnh được sử dụng nhiều nhất trong mã nguồn PHP:</w:t>
+        <w:lastRenderedPageBreak/>
+        <w:t>DML (Data Manipulation Language): Đây là nhóm lệnh được sử dụng nhiều nhất trong mã nguồn PHP:</w:t>
       </w:r>
     </w:p>
     <w:p>
@@ -2862,13 +2659,7 @@
         <w:jc w:val="both"/>
       </w:pPr>
       <w:r>
-        <w:t>SELECT</w:t>
-      </w:r>
-      <w:r>
-        <w:t xml:space="preserve"> </w:t>
-      </w:r>
-      <w:r>
-        <w:t>: Truy xuất danh sách sản phẩm, hiển thị chi tiết hóa đơn.</w:t>
+        <w:t>SELECT: Truy xuất danh sách sản phẩm, hiển thị chi tiết hóa đơn.</w:t>
       </w:r>
     </w:p>
     <w:p>
@@ -2881,13 +2672,7 @@
         <w:jc w:val="both"/>
       </w:pPr>
       <w:r>
-        <w:t>INSERT</w:t>
-      </w:r>
-      <w:r>
-        <w:t xml:space="preserve"> </w:t>
-      </w:r>
-      <w:r>
-        <w:t>: Thêm đơn hàng mới khi khách hàng nhấn đặt mua.</w:t>
+        <w:t>INSERT: Thêm đơn hàng mới khi khách hàng nhấn đặt mua.</w:t>
       </w:r>
     </w:p>
     <w:p>
@@ -2900,13 +2685,13 @@
         <w:jc w:val="both"/>
       </w:pPr>
       <w:r>
-        <w:t>UPDATE</w:t>
-      </w:r>
-      <w:r>
-        <w:t xml:space="preserve"> </w:t>
-      </w:r>
-      <w:r>
-        <w:t>: Cập nhật trạng thái đơn hàng, điều chỉnh số lượng tồn kho.</w:t>
+        <w:t>UPDA</w:t>
+      </w:r>
+      <w:r>
+        <w:t>T</w:t>
+      </w:r>
+      <w:r>
+        <w:t>E: Cập nhật trạng thái đơn hàng, điều chỉnh số lượng tồn kho.</w:t>
       </w:r>
     </w:p>
     <w:p>
@@ -2919,13 +2704,7 @@
         <w:jc w:val="both"/>
       </w:pPr>
       <w:r>
-        <w:t>DELETE</w:t>
-      </w:r>
-      <w:r>
-        <w:t xml:space="preserve"> </w:t>
-      </w:r>
-      <w:r>
-        <w:t>: Xóa sản phẩm khỏi giỏ hàng hoặc xóa danh mục (đối với quyền Admin).</w:t>
+        <w:t>DELETE: Xóa sản phẩm khỏi giỏ hàng hoặc xóa danh mục (đối với quyền Admin).</w:t>
       </w:r>
     </w:p>
     <w:p>
@@ -2938,13 +2717,7 @@
         <w:jc w:val="both"/>
       </w:pPr>
       <w:r>
-        <w:t>Kết nối các bảng (JOIN)</w:t>
-      </w:r>
-      <w:r>
-        <w:t xml:space="preserve"> </w:t>
-      </w:r>
-      <w:r>
-        <w:t>: Sử dụng INNER JOIN, LEFT JOIN để lấy dữ liệu kết hợp từ nhiều bảng, ví dụ lấy tên sản phẩm và tên danh mục cùng lúc để hiển thị ra giao diện.</w:t>
+        <w:t>Kết nối các bảng (JOIN): Sử dụng INNER JOIN, LEFT JOIN để lấy dữ liệu kết hợp từ nhiều bảng, ví dụ lấy tên sản phẩm và tên danh mục cùng lúc để hiển thị ra giao diện.</w:t>
       </w:r>
     </w:p>
     <w:p>
@@ -2993,13 +2766,7 @@
         <w:jc w:val="both"/>
       </w:pPr>
       <w:r>
-        <w:t>Trong quá trình thực hiện đồ án, VS Code đóng vai trò là công cụ lập trình cốt lõi với các nhiệm vụ chính</w:t>
-      </w:r>
-      <w:r>
-        <w:t xml:space="preserve"> </w:t>
-      </w:r>
-      <w:r>
-        <w:t>:</w:t>
+        <w:t>Trong quá trình thực hiện đồ án, VS Code đóng vai trò là công cụ lập trình cốt lõi với các nhiệm vụ chính:</w:t>
       </w:r>
     </w:p>
     <w:p>
@@ -3012,14 +2779,7 @@
         <w:jc w:val="both"/>
       </w:pPr>
       <w:r>
-        <w:lastRenderedPageBreak/>
-        <w:t>Soạn thảo và tích hợp mã nguồn</w:t>
-      </w:r>
-      <w:r>
-        <w:t xml:space="preserve"> </w:t>
-      </w:r>
-      <w:r>
-        <w:t>: Cung cấp môi trường để viết và định dạng mã kịch bản PHP, kết hợp linh hoạt với HTML/CSS/JavaScript và các câu truy vấn SQL Server trực tiếp bên trong cùng một tệp.</w:t>
+        <w:t>Soạn thảo và tích hợp mã nguồn: Cung cấp môi trường để viết và định dạng mã kịch bản PHP, kết hợp linh hoạt với HTML/CSS/JavaScript và các câu truy vấn SQL Server trực tiếp bên trong cùng một tệp.</w:t>
       </w:r>
     </w:p>
     <w:p>
@@ -3032,13 +2792,7 @@
         <w:jc w:val="both"/>
       </w:pPr>
       <w:r>
-        <w:t>Quản lý Docker tích hợp</w:t>
-      </w:r>
-      <w:r>
-        <w:t xml:space="preserve"> </w:t>
-      </w:r>
-      <w:r>
-        <w:t>: Cấu trúc dự án với Dockerfile và docker-compose.yml được soạn thảo dễ dàng nhờ tính năng nhận diện cú pháp thông minh. Terminal tích hợp sẵn trong VS Code cho phép thực thi trực tiếp các câu lệnh khởi chạy, quản lý và gỡ lỗi container Docker mà không cần chuyển đổi qua lại giữa các cửa sổ.</w:t>
+        <w:t>Quản lý Docker tích hợp: Cấu trúc dự án với Dockerfile và docker-compose.yml được soạn thảo dễ dàng nhờ tính năng nhận diện cú pháp thông minh. Terminal tích hợp sẵn trong VS Code cho phép thực thi trực tiếp các câu lệnh khởi chạy, quản lý và gỡ lỗi container Docker mà không cần chuyển đổi qua lại giữa các cửa sổ.</w:t>
       </w:r>
     </w:p>
     <w:p>
@@ -3051,20 +2805,9 @@
         <w:jc w:val="both"/>
       </w:pPr>
       <w:r>
-        <w:t>Hỗ trợ gỡ lỗi và làm sạch mã</w:t>
-      </w:r>
-      <w:r>
-        <w:t xml:space="preserve"> </w:t>
-      </w:r>
-      <w:r>
-        <w:t>: Các tiện ích mở rộng về định dạng (formatter) và gợi ý mã (IntelliSense) giúp quá trình viết code PHP, SQL hạn chế tối đa các lỗi cú pháp cơ bản.</w:t>
-      </w:r>
-    </w:p>
-    <w:p>
-      <w:pPr>
-        <w:pStyle w:val="VanBan"/>
-        <w:jc w:val="both"/>
-      </w:pPr>
+        <w:lastRenderedPageBreak/>
+        <w:t>Hỗ trợ gỡ lỗi và làm sạch mã: Các tiện ích mở rộng về định dạng (formatter) và gợi ý mã (IntelliSense) giúp quá trình viết code PHP, SQL hạn chế tối đa các lỗi cú pháp cơ bản.</w:t>
+      </w:r>
     </w:p>
     <w:p>
       <w:pPr>
@@ -3135,11 +2878,6 @@
     </w:p>
     <w:p>
       <w:pPr>
-        <w:pStyle w:val="VanBan"/>
-      </w:pPr>
-    </w:p>
-    <w:p>
-      <w:pPr>
         <w:pStyle w:val="TieuMuc"/>
       </w:pPr>
       <w:r>
@@ -3167,13 +2905,7 @@
         <w:jc w:val="both"/>
       </w:pPr>
       <w:r>
-        <w:t>Đối với hệ thống quản lý bán hàng, PowerDesigner được sử dụng để thực hiện các bước thiết kế quan trọng</w:t>
-      </w:r>
-      <w:r>
-        <w:t xml:space="preserve"> </w:t>
-      </w:r>
-      <w:r>
-        <w:t>:</w:t>
+        <w:t>Đối với hệ thống quản lý bán hàng, PowerDesigner được sử dụng để thực hiện các bước thiết kế quan trọng:</w:t>
       </w:r>
     </w:p>
     <w:p>
@@ -3186,14 +2918,7 @@
         <w:jc w:val="both"/>
       </w:pPr>
       <w:r>
-        <w:lastRenderedPageBreak/>
-        <w:t>Thiết kế CSDL</w:t>
-      </w:r>
-      <w:r>
-        <w:t xml:space="preserve"> </w:t>
-      </w:r>
-      <w:r>
-        <w:t>: Xây dựng Mô hình thực thể kết hợp ERD. Công cụ này giúp phân tích và biểu diễn trực quan các thực thể (như Người dùng, Sản phẩm, Danh mục, Đơn hàng), các thuộc tính đi kèm và thiết lập chuẩn xác các mối quan hệ (1-1, 1-n, n-n) trước khi chuyển đổi thành các bảng vật lý trên SQL Server.</w:t>
+        <w:t>Thiết kế CSDL: Xây dựng Mô hình thực thể kết hợp ERD. Công cụ này giúp phân tích và biểu diễn trực quan các thực thể (như Người dùng, Sản phẩm, Danh mục, Đơn hàng), các thuộc tính đi kèm và thiết lập chuẩn xác các mối quan hệ (1-1, 1-n, n-n) trước khi chuyển đổi thành các bảng vật lý trên SQL Server.</w:t>
       </w:r>
     </w:p>
     <w:p>
@@ -3206,13 +2931,7 @@
         <w:jc w:val="both"/>
       </w:pPr>
       <w:r>
-        <w:t>Thiết kế xử lý</w:t>
-      </w:r>
-      <w:r>
-        <w:t xml:space="preserve"> </w:t>
-      </w:r>
-      <w:r>
-        <w:t>: Xây dựng Sơ đồ luồng dữ liệu DFD từ mức ngữ cảnh đến mức phân rã chức năng chi tiết. Việc này giúp vẽ ra lộ trình di chuyển của luồng thông tin (từ khi khách hàng xem sản phẩm, thêm vào giỏ hàng đến khi hoàn tất thanh toán) cũng như phân định rõ các chức năng quản lý của hệ thống.</w:t>
+        <w:t>Thiết kế xử lý: Xây dựng Sơ đồ luồng dữ liệu DFD từ mức ngữ cảnh đến mức phân rã chức năng chi tiết. Việc này giúp vẽ ra lộ trình di chuyển của luồng thông tin (từ khi khách hàng xem sản phẩm, thêm vào giỏ hàng đến khi hoàn tất thanh toán) cũng như phân định rõ các chức năng quản lý của hệ thống.</w:t>
       </w:r>
     </w:p>
     <w:p>
@@ -3224,6 +2943,7 @@
         <w:rPr>
           <w:noProof/>
         </w:rPr>
+        <w:lastRenderedPageBreak/>
         <w:drawing>
           <wp:inline distT="0" distB="0" distL="0" distR="0" wp14:anchorId="6A1E53E8" wp14:editId="336B5089">
             <wp:extent cx="2628900" cy="2628900"/>
@@ -3302,57 +3022,39 @@
         <w:tab/>
       </w:r>
       <w:r>
-        <w:t>Khái niệm về Git</w:t>
-      </w:r>
-      <w:r>
-        <w:t xml:space="preserve"> </w:t>
-      </w:r>
-      <w:r>
-        <w:t>: Git là một hệ thống quản lý phiên bản phân tán (Distributed Version Control System - DVCS) mã nguồn mở phổ biến nhất hiện nay. Git cho phép người phát triển theo dõi toàn bộ lịch sử thay đổi của mã nguồn trong quá trình viết code, dễ dàng khôi phục lại các phiên bản trước đó khi xảy ra lỗi, cũng như hỗ trợ làm việc nhóm hiệu quả thông qua cơ chế phân nhánh (branching) và hợp nhất (merging) mã nguồn mà không làm ảnh hưởng đến nhánh chính.</w:t>
-      </w:r>
-    </w:p>
-    <w:p>
-      <w:pPr>
-        <w:pStyle w:val="VanBan"/>
-        <w:jc w:val="both"/>
-      </w:pPr>
-      <w:r>
-        <w:t>Nền tảng GitHub</w:t>
-      </w:r>
-      <w:r>
-        <w:t xml:space="preserve"> </w:t>
-      </w:r>
-      <w:r>
-        <w:t>: GitHub là một dịch vụ đám mây lưu trữ các kho chứa mã nguồn (repositories) sử dụng Git. GitHub cung cấp giao diện trực quan và các công cụ mạnh mẽ hỗ trợ quản lý dự án, kiểm tra mã (Pull Request), theo dõi lỗi (Issues) và tích hợp các quy trình tự động hóa (CI/CD).</w:t>
-      </w:r>
-    </w:p>
-    <w:p>
-      <w:pPr>
-        <w:pStyle w:val="VanBan"/>
-        <w:jc w:val="both"/>
-      </w:pPr>
-      <w:r>
+        <w:t>Khái niệm về Git: Git là một hệ thống quản lý phiên bản phân tán (Distributed Version Control System - DVCS) mã nguồn mở phổ biến nhất hiện nay. Git cho phép người phát triển theo dõi toàn bộ lịch sử thay đổi của mã nguồn trong quá trình viết code, dễ dàng khôi phục lại các phiên bản trước đó khi xảy ra lỗi, cũng như hỗ trợ làm việc nhóm hiệu quả thông qua cơ chế phân nhánh (branching) và hợp nhất (merging) mã nguồn mà không làm ảnh hưởng đến nhánh chính.</w:t>
+      </w:r>
+    </w:p>
+    <w:p>
+      <w:pPr>
+        <w:pStyle w:val="VanBan"/>
+        <w:jc w:val="both"/>
+      </w:pPr>
+      <w:r>
+        <w:t>Nền tảng GitHub: GitHub là một dịch vụ đám mây lưu trữ các kho chứa mã nguồn (repositories) sử dụng Git. GitHub cung cấp giao diện trực quan và các công cụ mạnh mẽ hỗ trợ quản lý dự án, kiểm tra mã (Pull Request), theo dõi lỗi (Issues) và tích hợp các quy trình tự động hóa (CI/CD).</w:t>
+      </w:r>
+    </w:p>
+    <w:p>
+      <w:pPr>
+        <w:pStyle w:val="VanBan"/>
+        <w:jc w:val="both"/>
+      </w:pPr>
+      <w:r>
+        <w:t>Vai trò trong đồ án: Trong quá trình thực hiện đồ án quản lý bán hàng, Git và GitHub đóng vai trò cốt lõi trong việc quản lý mã nguồn xuyên suốt. Toàn bộ các tệp mã nguồn PHP, cơ sở dữ liệu và cấu hình Docker được lưu trữ và đồng bộ an toàn trên GitHub, giúp kiểm soát tốt các phiên bản cập nhật của ứng dụng và phòng ngừa rủi ro mất mát dữ liệu.</w:t>
+      </w:r>
+    </w:p>
+    <w:p>
+      <w:pPr>
+        <w:pStyle w:val="VanBan"/>
+        <w:jc w:val="center"/>
+      </w:pPr>
+      <w:r>
+        <w:rPr>
+          <w:noProof/>
+        </w:rPr>
         <w:lastRenderedPageBreak/>
-        <w:t>Vai trò trong đồ án</w:t>
-      </w:r>
-      <w:r>
-        <w:t xml:space="preserve"> </w:t>
-      </w:r>
-      <w:r>
-        <w:t>: Trong quá trình thực hiện đồ án quản lý bán hàng, Git và GitHub đóng vai trò cốt lõi trong việc quản lý mã nguồn xuyên suốt. Toàn bộ các tệp mã nguồn PHP, cơ sở dữ liệu và cấu hình Docker được lưu trữ và đồng bộ an toàn trên GitHub, giúp kiểm soát tốt các phiên bản cập nhật của ứng dụng và phòng ngừa rủi ro mất mát dữ liệu.</w:t>
-      </w:r>
-    </w:p>
-    <w:p>
-      <w:pPr>
-        <w:pStyle w:val="VanBan"/>
-        <w:jc w:val="center"/>
-      </w:pPr>
-      <w:r>
-        <w:rPr>
-          <w:noProof/>
-        </w:rPr>
         <w:drawing>
-          <wp:inline distT="0" distB="0" distL="0" distR="0" wp14:anchorId="1028AD4E" wp14:editId="0929CA68">
+          <wp:inline distT="0" distB="0" distL="0" distR="0" wp14:anchorId="1028AD4E" wp14:editId="3181A47C">
             <wp:extent cx="4306315" cy="2423160"/>
             <wp:effectExtent l="0" t="0" r="0" b="0"/>
             <wp:docPr id="1797621309" name="Picture 1" descr="Understanding Github Packages: A Comprehensive Guide – FDJY"/>
@@ -3509,6 +3211,26 @@
     </w:p>
     <w:p>
       <w:pPr>
+        <w:pStyle w:val="VanBan"/>
+      </w:pPr>
+    </w:p>
+    <w:p>
+      <w:pPr>
+        <w:pStyle w:val="VanBan"/>
+      </w:pPr>
+    </w:p>
+    <w:p>
+      <w:pPr>
+        <w:pStyle w:val="VanBan"/>
+      </w:pPr>
+    </w:p>
+    <w:p>
+      <w:pPr>
+        <w:pStyle w:val="VanBan"/>
+      </w:pPr>
+    </w:p>
+    <w:p>
+      <w:pPr>
         <w:pStyle w:val="TieuMuc"/>
       </w:pPr>
       <w:r>
@@ -3528,43 +3250,25 @@
         <w:tab/>
       </w:r>
       <w:r>
-        <w:t>Thiết kế đáp ứng</w:t>
-      </w:r>
-      <w:r>
-        <w:t xml:space="preserve"> </w:t>
-      </w:r>
-      <w:r>
-        <w:t>: Bootstrap 5 tích hợp hệ thống Grid dựa trên Flexbox, cho phép giao diện tự động co giãn và hiển thị mượt mà trên mọi kích thước màn hình khác nhau (từ máy tính để bàn, máy tính bảng cho đến điện thoại di động).</w:t>
-      </w:r>
-    </w:p>
-    <w:p>
-      <w:pPr>
-        <w:pStyle w:val="VanBan"/>
-        <w:jc w:val="both"/>
-      </w:pPr>
-      <w:r>
-        <w:t>Thành phần giao diện sẵn có</w:t>
-      </w:r>
-      <w:r>
-        <w:t xml:space="preserve"> </w:t>
-      </w:r>
-      <w:r>
-        <w:t>: Cung cấp các khối giao diện chuẩn mực như thanh điều hướng (Navbar), thẻ sản phẩm (Cards), bảng dữ liệu (Tables), biểu mẫu (Forms), hộp thoại thông báo (Modals) và nút bấm (Buttons).</w:t>
-      </w:r>
-    </w:p>
-    <w:p>
-      <w:pPr>
-        <w:pStyle w:val="VanBan"/>
-        <w:jc w:val="both"/>
-      </w:pPr>
-      <w:r>
-        <w:t>Vai trò trong đồ án</w:t>
-      </w:r>
-      <w:r>
-        <w:t xml:space="preserve"> </w:t>
-      </w:r>
-      <w:r>
-        <w:t>: Bootstrap 5 được sử dụng để xây dựng lớp giao diện người dùng cho cả phân hệ khách hàng (trang chủ, danh mục sản phẩm, giỏ hàng, thanh toán) và phân hệ quản trị viên. Nhờ đó, giao diện hệ thống đảm bảo được tính thẩm mỹ, đồng bộ, chuyên nghiệp và thân thiện với người dùng mà không mất quá nhiều thời gian tự viết mã CSS thủ công từ đầu.</w:t>
+        <w:t>Thiết kế đáp ứng: Bootstrap 5 tích hợp hệ thống Grid dựa trên Flexbox, cho phép giao diện tự động co giãn và hiển thị mượt mà trên mọi kích thước màn hình khác nhau (từ máy tính để bàn, máy tính bảng cho đến điện thoại di động).</w:t>
+      </w:r>
+    </w:p>
+    <w:p>
+      <w:pPr>
+        <w:pStyle w:val="VanBan"/>
+        <w:jc w:val="both"/>
+      </w:pPr>
+      <w:r>
+        <w:t>Thành phần giao diện sẵn có: Cung cấp các khối giao diện chuẩn mực như thanh điều hướng (Navbar), thẻ sản phẩm (Cards), bảng dữ liệu (Tables), biểu mẫu (Forms), hộp thoại thông báo (Modals) và nút bấm (Buttons).</w:t>
+      </w:r>
+    </w:p>
+    <w:p>
+      <w:pPr>
+        <w:pStyle w:val="VanBan"/>
+        <w:jc w:val="both"/>
+      </w:pPr>
+      <w:r>
+        <w:t>Vai trò trong đồ án: Bootstrap 5 được sử dụng để xây dựng lớp giao diện người dùng cho cả phân hệ khách hàng (trang chủ, danh mục sản phẩm, giỏ hàng, thanh toán) và phân hệ quản trị viên. Nhờ đó, giao diện hệ thống đảm bảo được tính thẩm mỹ, đồng bộ, chuyên nghiệp và thân thiện với người dùng mà không mất quá nhiều thời gian tự viết mã CSS thủ công từ đầu.</w:t>
       </w:r>
     </w:p>
     <w:p>
@@ -3689,13 +3393,7 @@
         <w:tab/>
       </w:r>
       <w:r>
-        <w:t>Một hệ thống REST API thường hoạt động dựa trên các phương thức HTTP tiêu chuẩn tương ứng với các thao tác dữ liệu (CRUD)</w:t>
-      </w:r>
-      <w:r>
-        <w:t xml:space="preserve"> </w:t>
-      </w:r>
-      <w:r>
-        <w:t>:</w:t>
+        <w:t>Một hệ thống REST API thường hoạt động dựa trên các phương thức HTTP tiêu chuẩn tương ứng với các thao tác dữ liệu (CRUD):</w:t>
       </w:r>
     </w:p>
     <w:p>
@@ -3774,13 +3472,7 @@
       </w:pPr>
       <w:r>
         <w:tab/>
-        <w:t>Trong hệ thống quản lý bán hàng, kiến trúc REST API được áp dụng để xử lý các yêu cầu bất đồng bộ (ví dụ</w:t>
-      </w:r>
-      <w:r>
-        <w:t xml:space="preserve"> </w:t>
-      </w:r>
-      <w:r>
-        <w:t>: thao tác thêm sản phẩm vào giỏ hàng, cập nhật số lượng tồn kho hoặc tìm kiếm sản phẩm nhanh mà không cần tải lại toàn bộ trang web - full page reload). Điều này giúp tối ưu hóa hiệu năng, giảm tải cho máy chủ, tăng tốc độ phản hồi và mang lại trải nghiệm mượt mà, hiện đại cho người dùng.</w:t>
+        <w:t>Trong hệ thống quản lý bán hàng, kiến trúc REST API được áp dụng để xử lý các yêu cầu bất đồng bộ (ví dụ: thao tác thêm sản phẩm vào giỏ hàng, cập nhật số lượng tồn kho hoặc tìm kiếm sản phẩm nhanh mà không cần tải lại toàn bộ trang web - full page reload). Điều này giúp tối ưu hóa hiệu năng, giảm tải cho máy chủ, tăng tốc độ phản hồi và mang lại trải nghiệm mượt mà, hiện đại cho người dùng.</w:t>
       </w:r>
     </w:p>
     <w:p>
@@ -3896,13 +3588,7 @@
         <w:tab/>
       </w:r>
       <w:r>
-        <w:t>Từ những hạn chế trong việc quản lý bán hàng thủ công đã được phân tích ở các chương trước, bài toán đặt ra là cần xây dựng một hệ thống phần mềm nền web nhằm tin học hóa quy trình kinh doanh. Hệ thống cần phục vụ hai đối tượng chính</w:t>
-      </w:r>
-      <w:r>
-        <w:t xml:space="preserve"> </w:t>
-      </w:r>
-      <w:r>
-        <w:t>:</w:t>
+        <w:t>Từ những hạn chế trong việc quản lý bán hàng thủ công đã được phân tích ở các chương trước, bài toán đặt ra là cần xây dựng một hệ thống phần mềm nền web nhằm tin học hóa quy trình kinh doanh. Hệ thống cần phục vụ hai đối tượng chính:</w:t>
       </w:r>
     </w:p>
     <w:p>
@@ -3915,13 +3601,7 @@
         <w:jc w:val="both"/>
       </w:pPr>
       <w:r>
-        <w:t>Khách hàng</w:t>
-      </w:r>
-      <w:r>
-        <w:t xml:space="preserve"> </w:t>
-      </w:r>
-      <w:r>
-        <w:t>: Có nhu cầu xem thông tin, tìm kiếm các sản phẩm theo danh mục, thêm sản phẩm vào giỏ hàng và tiến hành đặt hàng trực tuyến một cách dễ dàng.</w:t>
+        <w:t>Khách hàng: Có nhu cầu xem thông tin, tìm kiếm các sản phẩm theo danh mục, thêm sản phẩm vào giỏ hàng và tiến hành đặt hàng trực tuyến một cách dễ dàng.</w:t>
       </w:r>
     </w:p>
     <w:p>
@@ -3934,13 +3614,7 @@
         <w:jc w:val="both"/>
       </w:pPr>
       <w:r>
-        <w:t>Quản trị viên (Admin)</w:t>
-      </w:r>
-      <w:r>
-        <w:t xml:space="preserve"> </w:t>
-      </w:r>
-      <w:r>
-        <w:t>: Có nhiệm vụ quản lý kho hàng (thêm, sửa, xóa sản phẩm, danh mục) và theo dõi, cập nhật trạng thái các đơn đặt hàng của khách hàng.</w:t>
+        <w:t>Quản trị viên (Admin): Có nhiệm vụ quản lý kho hàng (thêm, sửa, xóa sản phẩm, danh mục) và theo dõi, cập nhật trạng thái các đơn đặt hàng của khách hàng.</w:t>
       </w:r>
     </w:p>
     <w:p>
@@ -3995,13 +3669,7 @@
         <w:tab/>
       </w:r>
       <w:r>
-        <w:t>Dựa trên mô tả bài toán, hệ thống được xác định các yêu cầu chức năng cơ bản sau</w:t>
-      </w:r>
-      <w:r>
-        <w:t xml:space="preserve"> </w:t>
-      </w:r>
-      <w:r>
-        <w:t>:</w:t>
+        <w:t>Dựa trên mô tả bài toán, hệ thống được xác định các yêu cầu chức năng cơ bản sau:</w:t>
       </w:r>
     </w:p>
     <w:p>
@@ -4014,13 +3682,7 @@
         <w:jc w:val="both"/>
       </w:pPr>
       <w:r>
-        <w:t>Phân hệ Khách hàng</w:t>
-      </w:r>
-      <w:r>
-        <w:t xml:space="preserve"> </w:t>
-      </w:r>
-      <w:r>
-        <w:t>:</w:t>
+        <w:t>Phân hệ Khách hàng:</w:t>
       </w:r>
     </w:p>
     <w:p>
@@ -4085,13 +3747,7 @@
         <w:jc w:val="both"/>
       </w:pPr>
       <w:r>
-        <w:t>Phân hệ Quản trị viên</w:t>
-      </w:r>
-      <w:r>
-        <w:t xml:space="preserve"> </w:t>
-      </w:r>
-      <w:r>
-        <w:t>:</w:t>
+        <w:t>Phân hệ Quản trị viên:</w:t>
       </w:r>
     </w:p>
     <w:p>
@@ -4171,13 +3827,7 @@
         <w:jc w:val="both"/>
       </w:pPr>
       <w:r>
-        <w:t>Giao diện</w:t>
-      </w:r>
-      <w:r>
-        <w:t xml:space="preserve"> </w:t>
-      </w:r>
-      <w:r>
-        <w:t>: Trực quan, thân thiện, tương thích với nhiều kích thước màn hình</w:t>
+        <w:t>Giao diện: Trực quan, thân thiện, tương thích với nhiều kích thước màn hình</w:t>
       </w:r>
       <w:r>
         <w:t>.</w:t>
@@ -4193,13 +3843,7 @@
         <w:jc w:val="both"/>
       </w:pPr>
       <w:r>
-        <w:t>Hiệu năng</w:t>
-      </w:r>
-      <w:r>
-        <w:t xml:space="preserve"> </w:t>
-      </w:r>
-      <w:r>
-        <w:t>: Hệ thống phản hồi nhanh, các câu lệnh truy vấn SQL Server phải được tối ưu để tránh tình trạng thắt cổ chai khi có nhiều lượt truy cập.</w:t>
+        <w:t>Hiệu năng: Hệ thống phản hồi nhanh, các câu lệnh truy vấn SQL Server phải được tối ưu để tránh tình trạng thắt cổ chai khi có nhiều lượt truy cập.</w:t>
       </w:r>
     </w:p>
     <w:p>
@@ -4212,13 +3856,7 @@
         <w:jc w:val="both"/>
       </w:pPr>
       <w:r>
-        <w:t>Bảo mật</w:t>
-      </w:r>
-      <w:r>
-        <w:t xml:space="preserve"> </w:t>
-      </w:r>
-      <w:r>
-        <w:t>: Phòng chống các lỗ hổng Web cơ bản như SQL Injection (thông qua Prepared Statements của PHP), bảo mật phiên đăng nhập (Session) của quản trị viên.</w:t>
+        <w:t>Bảo mật: Phòng chống các lỗ hổng Web cơ bản như SQL Injection (thông qua Prepared Statements của PHP), bảo mật phiên đăng nhập (Session) của quản trị viên.</w:t>
       </w:r>
     </w:p>
     <w:p>
@@ -4231,13 +3869,7 @@
         <w:jc w:val="both"/>
       </w:pPr>
       <w:r>
-        <w:t>Triển khai</w:t>
-      </w:r>
-      <w:r>
-        <w:t xml:space="preserve"> </w:t>
-      </w:r>
-      <w:r>
-        <w:t>: Ứng dụng phải được đóng gói bằng Docker và Docker Compose để đảm bảo khả năng triển khai nhanh chóng trên các môi trường khác nhau.</w:t>
+        <w:t>Triển khai: Ứng dụng phải được đóng gói bằng Docker và Docker Compose để đảm bảo khả năng triển khai nhanh chóng trên các môi trường khác nhau.</w:t>
       </w:r>
     </w:p>
     <w:p>
@@ -4276,7 +3908,7 @@
         <w:jc w:val="both"/>
       </w:pPr>
       <w:r>
-        <w:t>Tầng Client : Giao diện người dùng sử dụng HTML, CSS, JavaScript hiển thị trên trình duyệt Web.</w:t>
+        <w:t>Tầng Client: Giao diện người dùng sử dụng HTML, CSS, JavaScript hiển thị trên trình duyệt Web.</w:t>
       </w:r>
     </w:p>
     <w:p>
@@ -4289,7 +3921,7 @@
         <w:jc w:val="both"/>
       </w:pPr>
       <w:r>
-        <w:t>Tầng Server : Đóng gói trong Docker bao gồm 2 container chính :</w:t>
+        <w:t>Tầng Server: Đóng gói trong Docker bao gồm 2 container chính:</w:t>
       </w:r>
     </w:p>
     <w:p>
@@ -4302,13 +3934,7 @@
         <w:jc w:val="both"/>
       </w:pPr>
       <w:r>
-        <w:t>Container Web Server</w:t>
-      </w:r>
-      <w:r>
-        <w:t xml:space="preserve"> </w:t>
-      </w:r>
-      <w:r>
-        <w:t>: Chạy Apache/Nginx kết hợp bộ xử lý PHP. Tầng này nhận Request từ Client, xử lý logic nghiệp vụ và trả về Response.</w:t>
+        <w:t>Container Web Server: Chạy Apache/Nginx kết hợp bộ xử lý PHP. Tầng này nhận Request từ Client, xử lý logic nghiệp vụ và trả về Response.</w:t>
       </w:r>
     </w:p>
     <w:p>
@@ -4321,13 +3947,7 @@
         <w:jc w:val="both"/>
       </w:pPr>
       <w:r>
-        <w:t>Container Database Server</w:t>
-      </w:r>
-      <w:r>
-        <w:t xml:space="preserve"> </w:t>
-      </w:r>
-      <w:r>
-        <w:t>: Chạy hệ quản trị cơ sở dữ liệu Microsoft SQL Server lưu trữ dữ liệu tập trung.</w:t>
+        <w:t>Container Database Server: Chạy hệ quản trị cơ sở dữ liệu Microsoft SQL Server lưu trữ dữ liệu tập trung.</w:t>
       </w:r>
     </w:p>
     <w:p>
@@ -4501,13 +4121,7 @@
         <w:jc w:val="both"/>
       </w:pPr>
       <w:r>
-        <w:t>Mô tả các mối quan hệ chính</w:t>
-      </w:r>
-      <w:r>
-        <w:t xml:space="preserve"> </w:t>
-      </w:r>
-      <w:r>
-        <w:t>:</w:t>
+        <w:t>Mô tả các mối quan hệ chính:</w:t>
       </w:r>
     </w:p>
     <w:p>
@@ -4520,13 +4134,7 @@
         <w:jc w:val="both"/>
       </w:pPr>
       <w:r>
-        <w:t>Phân loại (1-N)</w:t>
-      </w:r>
-      <w:r>
-        <w:t xml:space="preserve"> </w:t>
-      </w:r>
-      <w:r>
-        <w:t xml:space="preserve">: Một </w:t>
+        <w:t xml:space="preserve">Phân loại (1-N): Một </w:t>
       </w:r>
       <w:r>
         <w:t>t</w:t>
@@ -4551,13 +4159,7 @@
         <w:jc w:val="both"/>
       </w:pPr>
       <w:r>
-        <w:t>Cung cấp (1-N)</w:t>
-      </w:r>
-      <w:r>
-        <w:t xml:space="preserve"> </w:t>
-      </w:r>
-      <w:r>
-        <w:t xml:space="preserve">: Một </w:t>
+        <w:t xml:space="preserve">Cung cấp (1-N): Một </w:t>
       </w:r>
       <w:r>
         <w:t>n</w:t>
@@ -4582,13 +4184,7 @@
         <w:jc w:val="both"/>
       </w:pPr>
       <w:r>
-        <w:t>Có ảnh (1-N)</w:t>
-      </w:r>
-      <w:r>
-        <w:t xml:space="preserve"> </w:t>
-      </w:r>
-      <w:r>
-        <w:t xml:space="preserve">: Một </w:t>
+        <w:t xml:space="preserve">Có ảnh (1-N): Một </w:t>
       </w:r>
       <w:r>
         <w:t>s</w:t>
@@ -4613,13 +4209,7 @@
         <w:jc w:val="both"/>
       </w:pPr>
       <w:r>
-        <w:t>Đặt, Xử lý, Vận chuyển (1-N)</w:t>
-      </w:r>
-      <w:r>
-        <w:t xml:space="preserve"> </w:t>
-      </w:r>
-      <w:r>
-        <w:t xml:space="preserve">: Một </w:t>
+        <w:t xml:space="preserve">Đặt, Xử lý, Vận chuyển (1-N): Một </w:t>
       </w:r>
       <w:r>
         <w:t>đ</w:t>
@@ -4656,13 +4246,7 @@
         <w:jc w:val="both"/>
       </w:pPr>
       <w:r>
-        <w:t>Gồm, Được bán trong (1-N &amp; N-1)</w:t>
-      </w:r>
-      <w:r>
-        <w:t xml:space="preserve"> </w:t>
-      </w:r>
-      <w:r>
-        <w:t xml:space="preserve">: Bảng </w:t>
+        <w:t xml:space="preserve">Gồm, Được bán trong (1-N &amp; N-1): Bảng </w:t>
       </w:r>
       <w:r>
         <w:t>c</w:t>
@@ -4760,7 +4344,7 @@
           <w:p>
             <w:pPr>
               <w:pStyle w:val="VanBan"/>
-              <w:spacing w:after="0"/>
+              <w:spacing w:line="240" w:lineRule="auto"/>
               <w:jc w:val="center"/>
               <w:rPr>
                 <w:rFonts w:cs="Times New Roman"/>
@@ -4783,7 +4367,7 @@
           <w:p>
             <w:pPr>
               <w:pStyle w:val="VanBan"/>
-              <w:spacing w:after="0"/>
+              <w:spacing w:line="240" w:lineRule="auto"/>
               <w:jc w:val="center"/>
               <w:rPr>
                 <w:rFonts w:cs="Times New Roman"/>
@@ -4806,7 +4390,7 @@
           <w:p>
             <w:pPr>
               <w:pStyle w:val="VanBan"/>
-              <w:spacing w:after="0"/>
+              <w:spacing w:line="240" w:lineRule="auto"/>
               <w:jc w:val="center"/>
               <w:rPr>
                 <w:rFonts w:cs="Times New Roman"/>
@@ -4829,7 +4413,7 @@
           <w:p>
             <w:pPr>
               <w:pStyle w:val="VanBan"/>
-              <w:spacing w:after="0"/>
+              <w:spacing w:line="240" w:lineRule="auto"/>
               <w:jc w:val="center"/>
               <w:rPr>
                 <w:rFonts w:cs="Times New Roman"/>
@@ -4857,7 +4441,7 @@
           <w:p>
             <w:pPr>
               <w:pStyle w:val="VanBan"/>
-              <w:spacing w:before="240"/>
+              <w:spacing w:before="0" w:after="0" w:line="240" w:lineRule="auto"/>
               <w:jc w:val="center"/>
               <w:rPr>
                 <w:rFonts w:cs="Times New Roman"/>
@@ -4879,7 +4463,7 @@
           <w:p>
             <w:pPr>
               <w:pStyle w:val="VanBan"/>
-              <w:spacing w:before="240"/>
+              <w:spacing w:before="0" w:after="0" w:line="240" w:lineRule="auto"/>
               <w:jc w:val="center"/>
               <w:rPr>
                 <w:rFonts w:cs="Times New Roman"/>
@@ -4901,7 +4485,7 @@
           <w:p>
             <w:pPr>
               <w:pStyle w:val="VanBan"/>
-              <w:spacing w:before="240"/>
+              <w:spacing w:before="0" w:after="0" w:line="240" w:lineRule="auto"/>
               <w:jc w:val="center"/>
               <w:rPr>
                 <w:rFonts w:cs="Times New Roman"/>
@@ -4923,7 +4507,7 @@
           <w:p>
             <w:pPr>
               <w:pStyle w:val="VanBan"/>
-              <w:spacing w:before="240"/>
+              <w:spacing w:before="0" w:after="0" w:line="240" w:lineRule="auto"/>
               <w:jc w:val="center"/>
               <w:rPr>
                 <w:rFonts w:cs="Times New Roman"/>
@@ -4950,7 +4534,7 @@
           <w:p>
             <w:pPr>
               <w:pStyle w:val="VanBan"/>
-              <w:spacing w:before="240"/>
+              <w:spacing w:before="0" w:after="0" w:line="240" w:lineRule="auto"/>
               <w:jc w:val="center"/>
               <w:rPr>
                 <w:rFonts w:cs="Times New Roman"/>
@@ -4972,7 +4556,7 @@
           <w:p>
             <w:pPr>
               <w:pStyle w:val="VanBan"/>
-              <w:spacing w:before="240"/>
+              <w:spacing w:before="0" w:after="0" w:line="240" w:lineRule="auto"/>
               <w:jc w:val="center"/>
               <w:rPr>
                 <w:rFonts w:cs="Times New Roman"/>
@@ -4994,7 +4578,7 @@
           <w:p>
             <w:pPr>
               <w:pStyle w:val="VanBan"/>
-              <w:spacing w:before="240"/>
+              <w:spacing w:before="0" w:after="0" w:line="240" w:lineRule="auto"/>
               <w:jc w:val="center"/>
               <w:rPr>
                 <w:rFonts w:cs="Times New Roman"/>
@@ -5016,7 +4600,7 @@
           <w:p>
             <w:pPr>
               <w:pStyle w:val="VanBan"/>
-              <w:spacing w:before="240"/>
+              <w:spacing w:before="0" w:after="0" w:line="240" w:lineRule="auto"/>
               <w:jc w:val="center"/>
               <w:rPr>
                 <w:rFonts w:cs="Times New Roman"/>
@@ -5043,7 +4627,7 @@
           <w:p>
             <w:pPr>
               <w:pStyle w:val="VanBan"/>
-              <w:spacing w:before="240"/>
+              <w:spacing w:before="0" w:after="0" w:line="240" w:lineRule="auto"/>
               <w:jc w:val="center"/>
               <w:rPr>
                 <w:rFonts w:cs="Times New Roman"/>
@@ -5065,7 +4649,7 @@
           <w:p>
             <w:pPr>
               <w:pStyle w:val="VanBan"/>
-              <w:spacing w:before="240"/>
+              <w:spacing w:before="0" w:after="0" w:line="240" w:lineRule="auto"/>
               <w:jc w:val="center"/>
               <w:rPr>
                 <w:rFonts w:cs="Times New Roman"/>
@@ -5087,7 +4671,7 @@
           <w:p>
             <w:pPr>
               <w:pStyle w:val="VanBan"/>
-              <w:spacing w:before="240"/>
+              <w:spacing w:before="0" w:after="0" w:line="240" w:lineRule="auto"/>
               <w:jc w:val="center"/>
               <w:rPr>
                 <w:rFonts w:cs="Times New Roman"/>
@@ -5109,7 +4693,7 @@
           <w:p>
             <w:pPr>
               <w:pStyle w:val="VanBan"/>
-              <w:spacing w:before="240"/>
+              <w:spacing w:before="0" w:after="0" w:line="240" w:lineRule="auto"/>
               <w:jc w:val="center"/>
               <w:rPr>
                 <w:rFonts w:cs="Times New Roman"/>
@@ -5128,6 +4712,7 @@
     <w:p>
       <w:pPr>
         <w:pStyle w:val="VanBan"/>
+        <w:spacing w:line="240" w:lineRule="auto"/>
       </w:pPr>
     </w:p>
     <w:p>
@@ -5169,7 +4754,7 @@
           <w:p>
             <w:pPr>
               <w:pStyle w:val="VanBan"/>
-              <w:spacing w:before="240"/>
+              <w:spacing w:line="240" w:lineRule="auto"/>
               <w:jc w:val="center"/>
               <w:rPr>
                 <w:rFonts w:cs="Times New Roman"/>
@@ -5192,7 +4777,7 @@
           <w:p>
             <w:pPr>
               <w:pStyle w:val="VanBan"/>
-              <w:spacing w:before="240"/>
+              <w:spacing w:line="240" w:lineRule="auto"/>
               <w:jc w:val="center"/>
               <w:rPr>
                 <w:rFonts w:cs="Times New Roman"/>
@@ -5215,7 +4800,7 @@
           <w:p>
             <w:pPr>
               <w:pStyle w:val="VanBan"/>
-              <w:spacing w:before="240"/>
+              <w:spacing w:line="240" w:lineRule="auto"/>
               <w:jc w:val="center"/>
               <w:rPr>
                 <w:rFonts w:cs="Times New Roman"/>
@@ -5238,7 +4823,7 @@
           <w:p>
             <w:pPr>
               <w:pStyle w:val="VanBan"/>
-              <w:spacing w:before="240"/>
+              <w:spacing w:line="240" w:lineRule="auto"/>
               <w:jc w:val="center"/>
               <w:rPr>
                 <w:rFonts w:cs="Times New Roman"/>
@@ -5266,7 +4851,7 @@
           <w:p>
             <w:pPr>
               <w:pStyle w:val="VanBan"/>
-              <w:spacing w:before="240"/>
+              <w:spacing w:before="0" w:after="0" w:line="240" w:lineRule="auto"/>
               <w:jc w:val="center"/>
               <w:rPr>
                 <w:rFonts w:cs="Times New Roman"/>
@@ -5288,7 +4873,7 @@
           <w:p>
             <w:pPr>
               <w:pStyle w:val="VanBan"/>
-              <w:spacing w:before="240"/>
+              <w:spacing w:before="0" w:after="0" w:line="240" w:lineRule="auto"/>
               <w:jc w:val="center"/>
               <w:rPr>
                 <w:rFonts w:cs="Times New Roman"/>
@@ -5310,7 +4895,7 @@
           <w:p>
             <w:pPr>
               <w:pStyle w:val="VanBan"/>
-              <w:spacing w:before="240"/>
+              <w:spacing w:before="0" w:after="0" w:line="240" w:lineRule="auto"/>
               <w:jc w:val="center"/>
               <w:rPr>
                 <w:rFonts w:cs="Times New Roman"/>
@@ -5332,7 +4917,7 @@
           <w:p>
             <w:pPr>
               <w:pStyle w:val="VanBan"/>
-              <w:spacing w:before="240"/>
+              <w:spacing w:before="0" w:after="0" w:line="240" w:lineRule="auto"/>
               <w:jc w:val="center"/>
               <w:rPr>
                 <w:rFonts w:cs="Times New Roman"/>
@@ -5359,7 +4944,7 @@
           <w:p>
             <w:pPr>
               <w:pStyle w:val="VanBan"/>
-              <w:spacing w:before="240"/>
+              <w:spacing w:before="0" w:after="0" w:line="240" w:lineRule="auto"/>
               <w:jc w:val="center"/>
               <w:rPr>
                 <w:rFonts w:cs="Times New Roman"/>
@@ -5381,7 +4966,7 @@
           <w:p>
             <w:pPr>
               <w:pStyle w:val="VanBan"/>
-              <w:spacing w:before="240"/>
+              <w:spacing w:before="0" w:after="0" w:line="240" w:lineRule="auto"/>
               <w:jc w:val="center"/>
               <w:rPr>
                 <w:rFonts w:cs="Times New Roman"/>
@@ -5403,7 +4988,7 @@
           <w:p>
             <w:pPr>
               <w:pStyle w:val="VanBan"/>
-              <w:spacing w:before="240"/>
+              <w:spacing w:before="0" w:after="0" w:line="240" w:lineRule="auto"/>
               <w:jc w:val="center"/>
               <w:rPr>
                 <w:rFonts w:cs="Times New Roman"/>
@@ -5425,7 +5010,7 @@
           <w:p>
             <w:pPr>
               <w:pStyle w:val="VanBan"/>
-              <w:spacing w:before="240"/>
+              <w:spacing w:before="0" w:after="0" w:line="240" w:lineRule="auto"/>
               <w:jc w:val="center"/>
               <w:rPr>
                 <w:rFonts w:cs="Times New Roman"/>
@@ -5452,7 +5037,7 @@
           <w:p>
             <w:pPr>
               <w:pStyle w:val="VanBan"/>
-              <w:spacing w:before="240"/>
+              <w:spacing w:before="0" w:after="0" w:line="240" w:lineRule="auto"/>
               <w:jc w:val="center"/>
               <w:rPr>
                 <w:rFonts w:cs="Times New Roman"/>
@@ -5474,7 +5059,7 @@
           <w:p>
             <w:pPr>
               <w:pStyle w:val="VanBan"/>
-              <w:spacing w:before="240"/>
+              <w:spacing w:before="0" w:after="0" w:line="240" w:lineRule="auto"/>
               <w:jc w:val="center"/>
               <w:rPr>
                 <w:rFonts w:cs="Times New Roman"/>
@@ -5496,7 +5081,7 @@
           <w:p>
             <w:pPr>
               <w:pStyle w:val="VanBan"/>
-              <w:spacing w:before="240"/>
+              <w:spacing w:before="0" w:after="0" w:line="240" w:lineRule="auto"/>
               <w:jc w:val="center"/>
               <w:rPr>
                 <w:rFonts w:cs="Times New Roman"/>
@@ -5518,7 +5103,7 @@
           <w:p>
             <w:pPr>
               <w:pStyle w:val="VanBan"/>
-              <w:spacing w:before="240"/>
+              <w:spacing w:before="0" w:after="0" w:line="240" w:lineRule="auto"/>
               <w:jc w:val="center"/>
               <w:rPr>
                 <w:rFonts w:cs="Times New Roman"/>
@@ -5545,7 +5130,7 @@
           <w:p>
             <w:pPr>
               <w:pStyle w:val="VanBan"/>
-              <w:spacing w:before="240"/>
+              <w:spacing w:before="0" w:after="0" w:line="240" w:lineRule="auto"/>
               <w:jc w:val="center"/>
               <w:rPr>
                 <w:rFonts w:cs="Times New Roman"/>
@@ -5567,7 +5152,7 @@
           <w:p>
             <w:pPr>
               <w:pStyle w:val="VanBan"/>
-              <w:spacing w:before="240"/>
+              <w:spacing w:before="0" w:after="0" w:line="240" w:lineRule="auto"/>
               <w:jc w:val="center"/>
               <w:rPr>
                 <w:rFonts w:cs="Times New Roman"/>
@@ -5589,7 +5174,7 @@
           <w:p>
             <w:pPr>
               <w:pStyle w:val="VanBan"/>
-              <w:spacing w:before="240"/>
+              <w:spacing w:before="0" w:after="0" w:line="240" w:lineRule="auto"/>
               <w:jc w:val="center"/>
               <w:rPr>
                 <w:rFonts w:cs="Times New Roman"/>
@@ -5611,7 +5196,7 @@
           <w:p>
             <w:pPr>
               <w:pStyle w:val="VanBan"/>
-              <w:spacing w:before="240"/>
+              <w:spacing w:before="0" w:after="0" w:line="240" w:lineRule="auto"/>
               <w:jc w:val="center"/>
               <w:rPr>
                 <w:rFonts w:cs="Times New Roman"/>
@@ -5638,7 +5223,7 @@
           <w:p>
             <w:pPr>
               <w:pStyle w:val="VanBan"/>
-              <w:spacing w:before="240"/>
+              <w:spacing w:before="0" w:after="0" w:line="240" w:lineRule="auto"/>
               <w:jc w:val="center"/>
               <w:rPr>
                 <w:rFonts w:cs="Times New Roman"/>
@@ -5660,7 +5245,7 @@
           <w:p>
             <w:pPr>
               <w:pStyle w:val="VanBan"/>
-              <w:spacing w:before="240"/>
+              <w:spacing w:before="0" w:after="0" w:line="240" w:lineRule="auto"/>
               <w:jc w:val="center"/>
               <w:rPr>
                 <w:rFonts w:cs="Times New Roman"/>
@@ -5682,7 +5267,7 @@
           <w:p>
             <w:pPr>
               <w:pStyle w:val="VanBan"/>
-              <w:spacing w:before="240"/>
+              <w:spacing w:before="0" w:after="0" w:line="240" w:lineRule="auto"/>
               <w:jc w:val="center"/>
               <w:rPr>
                 <w:rFonts w:cs="Times New Roman"/>
@@ -5704,7 +5289,7 @@
           <w:p>
             <w:pPr>
               <w:pStyle w:val="VanBan"/>
-              <w:spacing w:before="240"/>
+              <w:spacing w:before="0" w:after="0" w:line="240" w:lineRule="auto"/>
               <w:jc w:val="center"/>
               <w:rPr>
                 <w:rFonts w:cs="Times New Roman"/>
@@ -5731,7 +5316,7 @@
           <w:p>
             <w:pPr>
               <w:pStyle w:val="VanBan"/>
-              <w:spacing w:before="240"/>
+              <w:spacing w:before="0" w:after="0" w:line="240" w:lineRule="auto"/>
               <w:jc w:val="center"/>
               <w:rPr>
                 <w:rFonts w:cs="Times New Roman"/>
@@ -5753,7 +5338,7 @@
           <w:p>
             <w:pPr>
               <w:pStyle w:val="VanBan"/>
-              <w:spacing w:before="240"/>
+              <w:spacing w:before="0" w:after="0" w:line="240" w:lineRule="auto"/>
               <w:jc w:val="center"/>
               <w:rPr>
                 <w:rFonts w:cs="Times New Roman"/>
@@ -5775,7 +5360,7 @@
           <w:p>
             <w:pPr>
               <w:pStyle w:val="VanBan"/>
-              <w:spacing w:before="240"/>
+              <w:spacing w:before="0" w:after="0" w:line="240" w:lineRule="auto"/>
               <w:jc w:val="center"/>
               <w:rPr>
                 <w:rFonts w:cs="Times New Roman"/>
@@ -5797,7 +5382,7 @@
           <w:p>
             <w:pPr>
               <w:pStyle w:val="VanBan"/>
-              <w:spacing w:before="240"/>
+              <w:spacing w:before="0" w:after="0" w:line="240" w:lineRule="auto"/>
               <w:jc w:val="center"/>
               <w:rPr>
                 <w:rFonts w:cs="Times New Roman"/>
@@ -5824,7 +5409,7 @@
           <w:p>
             <w:pPr>
               <w:pStyle w:val="VanBan"/>
-              <w:spacing w:before="240"/>
+              <w:spacing w:before="0" w:after="0" w:line="240" w:lineRule="auto"/>
               <w:jc w:val="center"/>
               <w:rPr>
                 <w:rFonts w:cs="Times New Roman"/>
@@ -5846,7 +5431,7 @@
           <w:p>
             <w:pPr>
               <w:pStyle w:val="VanBan"/>
-              <w:spacing w:before="240"/>
+              <w:spacing w:before="0" w:after="0" w:line="240" w:lineRule="auto"/>
               <w:jc w:val="center"/>
               <w:rPr>
                 <w:rFonts w:cs="Times New Roman"/>
@@ -5868,7 +5453,7 @@
           <w:p>
             <w:pPr>
               <w:pStyle w:val="VanBan"/>
-              <w:spacing w:before="240"/>
+              <w:spacing w:before="0" w:after="0" w:line="240" w:lineRule="auto"/>
               <w:jc w:val="center"/>
               <w:rPr>
                 <w:rFonts w:cs="Times New Roman"/>
@@ -5890,7 +5475,7 @@
           <w:p>
             <w:pPr>
               <w:pStyle w:val="VanBan"/>
-              <w:spacing w:before="240"/>
+              <w:spacing w:before="0" w:after="0" w:line="240" w:lineRule="auto"/>
               <w:jc w:val="center"/>
               <w:rPr>
                 <w:rFonts w:cs="Times New Roman"/>
@@ -5917,7 +5502,7 @@
           <w:p>
             <w:pPr>
               <w:pStyle w:val="VanBan"/>
-              <w:spacing w:before="240"/>
+              <w:spacing w:before="0" w:after="0" w:line="240" w:lineRule="auto"/>
               <w:jc w:val="center"/>
               <w:rPr>
                 <w:rFonts w:cs="Times New Roman"/>
@@ -5939,7 +5524,7 @@
           <w:p>
             <w:pPr>
               <w:pStyle w:val="VanBan"/>
-              <w:spacing w:before="240"/>
+              <w:spacing w:before="0" w:after="0" w:line="240" w:lineRule="auto"/>
               <w:jc w:val="center"/>
               <w:rPr>
                 <w:rFonts w:cs="Times New Roman"/>
@@ -5961,7 +5546,7 @@
           <w:p>
             <w:pPr>
               <w:pStyle w:val="VanBan"/>
-              <w:spacing w:before="240"/>
+              <w:spacing w:before="0" w:after="0" w:line="240" w:lineRule="auto"/>
               <w:jc w:val="center"/>
               <w:rPr>
                 <w:rFonts w:cs="Times New Roman"/>
@@ -5983,7 +5568,7 @@
           <w:p>
             <w:pPr>
               <w:pStyle w:val="VanBan"/>
-              <w:spacing w:before="240"/>
+              <w:spacing w:before="0" w:after="0" w:line="240" w:lineRule="auto"/>
               <w:jc w:val="center"/>
               <w:rPr>
                 <w:rFonts w:cs="Times New Roman"/>
@@ -6018,7 +5603,6 @@
         <w:rPr>
           <w:rFonts w:cs="Times New Roman"/>
         </w:rPr>
-        <w:lastRenderedPageBreak/>
         <w:t>Bảng 3.3. Khách Hàng</w:t>
       </w:r>
     </w:p>
@@ -6043,7 +5627,7 @@
           <w:p>
             <w:pPr>
               <w:pStyle w:val="VanBan"/>
-              <w:spacing w:before="240"/>
+              <w:spacing w:line="240" w:lineRule="auto"/>
               <w:jc w:val="center"/>
               <w:rPr>
                 <w:rFonts w:cs="Times New Roman"/>
@@ -6066,7 +5650,7 @@
           <w:p>
             <w:pPr>
               <w:pStyle w:val="VanBan"/>
-              <w:spacing w:before="240"/>
+              <w:spacing w:line="240" w:lineRule="auto"/>
               <w:jc w:val="center"/>
               <w:rPr>
                 <w:rFonts w:cs="Times New Roman"/>
@@ -6089,7 +5673,7 @@
           <w:p>
             <w:pPr>
               <w:pStyle w:val="VanBan"/>
-              <w:spacing w:before="240"/>
+              <w:spacing w:line="240" w:lineRule="auto"/>
               <w:jc w:val="center"/>
               <w:rPr>
                 <w:rFonts w:cs="Times New Roman"/>
@@ -6112,7 +5696,7 @@
           <w:p>
             <w:pPr>
               <w:pStyle w:val="VanBan"/>
-              <w:spacing w:before="240"/>
+              <w:spacing w:line="240" w:lineRule="auto"/>
               <w:jc w:val="center"/>
               <w:rPr>
                 <w:rFonts w:cs="Times New Roman"/>
@@ -6137,6 +5721,7 @@
           <w:p>
             <w:pPr>
               <w:pStyle w:val="VanBan"/>
+              <w:spacing w:before="0" w:after="0" w:line="240" w:lineRule="auto"/>
               <w:jc w:val="center"/>
               <w:rPr>
                 <w:rFonts w:cs="Times New Roman"/>
@@ -6158,6 +5743,7 @@
           <w:p>
             <w:pPr>
               <w:pStyle w:val="VanBan"/>
+              <w:spacing w:before="0" w:after="0" w:line="240" w:lineRule="auto"/>
               <w:jc w:val="center"/>
               <w:rPr>
                 <w:rFonts w:cs="Times New Roman"/>
@@ -6179,6 +5765,7 @@
           <w:p>
             <w:pPr>
               <w:pStyle w:val="VanBan"/>
+              <w:spacing w:before="0" w:after="0" w:line="240" w:lineRule="auto"/>
               <w:jc w:val="center"/>
               <w:rPr>
                 <w:rFonts w:cs="Times New Roman"/>
@@ -6200,6 +5787,7 @@
           <w:p>
             <w:pPr>
               <w:pStyle w:val="VanBan"/>
+              <w:spacing w:before="0" w:after="0" w:line="240" w:lineRule="auto"/>
               <w:jc w:val="center"/>
               <w:rPr>
                 <w:rFonts w:cs="Times New Roman"/>
@@ -6223,6 +5811,7 @@
           <w:p>
             <w:pPr>
               <w:pStyle w:val="VanBan"/>
+              <w:spacing w:before="0" w:after="0" w:line="240" w:lineRule="auto"/>
               <w:jc w:val="center"/>
               <w:rPr>
                 <w:rFonts w:cs="Times New Roman"/>
@@ -6244,6 +5833,7 @@
           <w:p>
             <w:pPr>
               <w:pStyle w:val="VanBan"/>
+              <w:spacing w:before="0" w:after="0" w:line="240" w:lineRule="auto"/>
               <w:jc w:val="center"/>
               <w:rPr>
                 <w:rFonts w:cs="Times New Roman"/>
@@ -6265,6 +5855,7 @@
           <w:p>
             <w:pPr>
               <w:pStyle w:val="VanBan"/>
+              <w:spacing w:before="0" w:after="0" w:line="240" w:lineRule="auto"/>
               <w:jc w:val="center"/>
               <w:rPr>
                 <w:rFonts w:cs="Times New Roman"/>
@@ -6286,6 +5877,7 @@
           <w:p>
             <w:pPr>
               <w:pStyle w:val="VanBan"/>
+              <w:spacing w:before="0" w:after="0" w:line="240" w:lineRule="auto"/>
               <w:jc w:val="center"/>
               <w:rPr>
                 <w:rFonts w:cs="Times New Roman"/>
@@ -6309,6 +5901,7 @@
           <w:p>
             <w:pPr>
               <w:pStyle w:val="VanBan"/>
+              <w:spacing w:before="0" w:after="0" w:line="240" w:lineRule="auto"/>
               <w:jc w:val="center"/>
               <w:rPr>
                 <w:rFonts w:cs="Times New Roman"/>
@@ -6330,6 +5923,7 @@
           <w:p>
             <w:pPr>
               <w:pStyle w:val="VanBan"/>
+              <w:spacing w:before="0" w:after="0" w:line="240" w:lineRule="auto"/>
               <w:jc w:val="center"/>
               <w:rPr>
                 <w:rFonts w:cs="Times New Roman"/>
@@ -6351,6 +5945,7 @@
           <w:p>
             <w:pPr>
               <w:pStyle w:val="VanBan"/>
+              <w:spacing w:before="0" w:after="0" w:line="240" w:lineRule="auto"/>
               <w:jc w:val="center"/>
               <w:rPr>
                 <w:rFonts w:cs="Times New Roman"/>
@@ -6372,6 +5967,7 @@
           <w:p>
             <w:pPr>
               <w:pStyle w:val="VanBan"/>
+              <w:spacing w:before="0" w:after="0" w:line="240" w:lineRule="auto"/>
               <w:jc w:val="center"/>
               <w:rPr>
                 <w:rFonts w:cs="Times New Roman"/>
@@ -6395,6 +5991,7 @@
           <w:p>
             <w:pPr>
               <w:pStyle w:val="VanBan"/>
+              <w:spacing w:before="0" w:after="0" w:line="240" w:lineRule="auto"/>
               <w:jc w:val="center"/>
               <w:rPr>
                 <w:rFonts w:cs="Times New Roman"/>
@@ -6416,6 +6013,7 @@
           <w:p>
             <w:pPr>
               <w:pStyle w:val="VanBan"/>
+              <w:spacing w:before="0" w:after="0" w:line="240" w:lineRule="auto"/>
               <w:jc w:val="center"/>
               <w:rPr>
                 <w:rFonts w:cs="Times New Roman"/>
@@ -6437,6 +6035,7 @@
           <w:p>
             <w:pPr>
               <w:pStyle w:val="VanBan"/>
+              <w:spacing w:before="0" w:after="0" w:line="240" w:lineRule="auto"/>
               <w:jc w:val="center"/>
               <w:rPr>
                 <w:rFonts w:cs="Times New Roman"/>
@@ -6458,6 +6057,7 @@
           <w:p>
             <w:pPr>
               <w:pStyle w:val="VanBan"/>
+              <w:spacing w:before="0" w:after="0" w:line="240" w:lineRule="auto"/>
               <w:jc w:val="center"/>
               <w:rPr>
                 <w:rFonts w:cs="Times New Roman"/>
@@ -6481,6 +6081,7 @@
           <w:p>
             <w:pPr>
               <w:pStyle w:val="VanBan"/>
+              <w:spacing w:before="0" w:after="0" w:line="240" w:lineRule="auto"/>
               <w:jc w:val="center"/>
               <w:rPr>
                 <w:rFonts w:cs="Times New Roman"/>
@@ -6502,6 +6103,7 @@
           <w:p>
             <w:pPr>
               <w:pStyle w:val="VanBan"/>
+              <w:spacing w:before="0" w:after="0" w:line="240" w:lineRule="auto"/>
               <w:jc w:val="center"/>
               <w:rPr>
                 <w:rFonts w:cs="Times New Roman"/>
@@ -6523,6 +6125,7 @@
           <w:p>
             <w:pPr>
               <w:pStyle w:val="VanBan"/>
+              <w:spacing w:before="0" w:after="0" w:line="240" w:lineRule="auto"/>
               <w:jc w:val="center"/>
               <w:rPr>
                 <w:rFonts w:cs="Times New Roman"/>
@@ -6544,6 +6147,7 @@
           <w:p>
             <w:pPr>
               <w:pStyle w:val="VanBan"/>
+              <w:spacing w:before="0" w:after="0" w:line="240" w:lineRule="auto"/>
               <w:jc w:val="center"/>
               <w:rPr>
                 <w:rFonts w:cs="Times New Roman"/>
@@ -6567,6 +6171,7 @@
           <w:p>
             <w:pPr>
               <w:pStyle w:val="VanBan"/>
+              <w:spacing w:before="0" w:after="0" w:line="240" w:lineRule="auto"/>
               <w:jc w:val="center"/>
               <w:rPr>
                 <w:rFonts w:cs="Times New Roman"/>
@@ -6588,6 +6193,7 @@
           <w:p>
             <w:pPr>
               <w:pStyle w:val="VanBan"/>
+              <w:spacing w:before="0" w:after="0" w:line="240" w:lineRule="auto"/>
               <w:jc w:val="center"/>
               <w:rPr>
                 <w:rFonts w:cs="Times New Roman"/>
@@ -6609,6 +6215,7 @@
           <w:p>
             <w:pPr>
               <w:pStyle w:val="VanBan"/>
+              <w:spacing w:before="0" w:after="0" w:line="240" w:lineRule="auto"/>
               <w:jc w:val="center"/>
               <w:rPr>
                 <w:rFonts w:cs="Times New Roman"/>
@@ -6630,6 +6237,7 @@
           <w:p>
             <w:pPr>
               <w:pStyle w:val="VanBan"/>
+              <w:spacing w:before="0" w:after="0" w:line="240" w:lineRule="auto"/>
               <w:jc w:val="center"/>
               <w:rPr>
                 <w:rFonts w:cs="Times New Roman"/>
@@ -6653,6 +6261,7 @@
           <w:p>
             <w:pPr>
               <w:pStyle w:val="VanBan"/>
+              <w:spacing w:before="0" w:after="0" w:line="240" w:lineRule="auto"/>
               <w:jc w:val="center"/>
               <w:rPr>
                 <w:rFonts w:cs="Times New Roman"/>
@@ -6674,6 +6283,7 @@
           <w:p>
             <w:pPr>
               <w:pStyle w:val="VanBan"/>
+              <w:spacing w:before="0" w:after="0" w:line="240" w:lineRule="auto"/>
               <w:jc w:val="center"/>
               <w:rPr>
                 <w:rFonts w:cs="Times New Roman"/>
@@ -6695,6 +6305,7 @@
           <w:p>
             <w:pPr>
               <w:pStyle w:val="VanBan"/>
+              <w:spacing w:before="0" w:after="0" w:line="240" w:lineRule="auto"/>
               <w:jc w:val="center"/>
               <w:rPr>
                 <w:rFonts w:cs="Times New Roman"/>
@@ -6716,6 +6327,7 @@
           <w:p>
             <w:pPr>
               <w:pStyle w:val="VanBan"/>
+              <w:spacing w:before="0" w:after="0" w:line="240" w:lineRule="auto"/>
               <w:jc w:val="center"/>
               <w:rPr>
                 <w:rFonts w:cs="Times New Roman"/>
@@ -6738,6 +6350,26 @@
     </w:p>
     <w:p>
       <w:pPr>
+        <w:pStyle w:val="VanBan"/>
+      </w:pPr>
+    </w:p>
+    <w:p>
+      <w:pPr>
+        <w:pStyle w:val="VanBan"/>
+      </w:pPr>
+    </w:p>
+    <w:p>
+      <w:pPr>
+        <w:pStyle w:val="VanBan"/>
+      </w:pPr>
+    </w:p>
+    <w:p>
+      <w:pPr>
+        <w:pStyle w:val="VanBan"/>
+      </w:pPr>
+    </w:p>
+    <w:p>
+      <w:pPr>
         <w:pStyle w:val="Bang"/>
         <w:rPr>
           <w:rFonts w:cs="Times New Roman"/>
@@ -6747,6 +6379,7 @@
         <w:rPr>
           <w:rFonts w:cs="Times New Roman"/>
         </w:rPr>
+        <w:lastRenderedPageBreak/>
         <w:t>Bảng 3.4. Nhân Viên</w:t>
       </w:r>
     </w:p>
@@ -6771,7 +6404,7 @@
           <w:p>
             <w:pPr>
               <w:pStyle w:val="VanBan"/>
-              <w:spacing w:before="240"/>
+              <w:spacing w:line="240" w:lineRule="auto"/>
               <w:jc w:val="center"/>
               <w:rPr>
                 <w:rFonts w:cs="Times New Roman"/>
@@ -6794,7 +6427,7 @@
           <w:p>
             <w:pPr>
               <w:pStyle w:val="VanBan"/>
-              <w:spacing w:before="240"/>
+              <w:spacing w:line="240" w:lineRule="auto"/>
               <w:jc w:val="center"/>
               <w:rPr>
                 <w:rFonts w:cs="Times New Roman"/>
@@ -6817,7 +6450,7 @@
           <w:p>
             <w:pPr>
               <w:pStyle w:val="VanBan"/>
-              <w:spacing w:before="240"/>
+              <w:spacing w:line="240" w:lineRule="auto"/>
               <w:jc w:val="center"/>
               <w:rPr>
                 <w:rFonts w:cs="Times New Roman"/>
@@ -6840,7 +6473,7 @@
           <w:p>
             <w:pPr>
               <w:pStyle w:val="VanBan"/>
-              <w:spacing w:before="240"/>
+              <w:spacing w:line="240" w:lineRule="auto"/>
               <w:jc w:val="center"/>
               <w:rPr>
                 <w:rFonts w:cs="Times New Roman"/>
@@ -6865,6 +6498,7 @@
           <w:p>
             <w:pPr>
               <w:pStyle w:val="VanBan"/>
+              <w:spacing w:before="0" w:after="0" w:line="240" w:lineRule="auto"/>
               <w:jc w:val="center"/>
               <w:rPr>
                 <w:rFonts w:cs="Times New Roman"/>
@@ -6886,6 +6520,7 @@
           <w:p>
             <w:pPr>
               <w:pStyle w:val="VanBan"/>
+              <w:spacing w:before="0" w:after="0" w:line="240" w:lineRule="auto"/>
               <w:jc w:val="center"/>
               <w:rPr>
                 <w:rFonts w:cs="Times New Roman"/>
@@ -6907,6 +6542,7 @@
           <w:p>
             <w:pPr>
               <w:pStyle w:val="VanBan"/>
+              <w:spacing w:before="0" w:after="0" w:line="240" w:lineRule="auto"/>
               <w:jc w:val="center"/>
               <w:rPr>
                 <w:rFonts w:cs="Times New Roman"/>
@@ -6928,6 +6564,7 @@
           <w:p>
             <w:pPr>
               <w:pStyle w:val="VanBan"/>
+              <w:spacing w:before="0" w:after="0" w:line="240" w:lineRule="auto"/>
               <w:jc w:val="center"/>
               <w:rPr>
                 <w:rFonts w:cs="Times New Roman"/>
@@ -6951,6 +6588,7 @@
           <w:p>
             <w:pPr>
               <w:pStyle w:val="VanBan"/>
+              <w:spacing w:before="0" w:after="0" w:line="240" w:lineRule="auto"/>
               <w:jc w:val="center"/>
               <w:rPr>
                 <w:rFonts w:cs="Times New Roman"/>
@@ -6972,6 +6610,7 @@
           <w:p>
             <w:pPr>
               <w:pStyle w:val="VanBan"/>
+              <w:spacing w:before="0" w:after="0" w:line="240" w:lineRule="auto"/>
               <w:jc w:val="center"/>
               <w:rPr>
                 <w:rFonts w:cs="Times New Roman"/>
@@ -6993,6 +6632,7 @@
           <w:p>
             <w:pPr>
               <w:pStyle w:val="VanBan"/>
+              <w:spacing w:before="0" w:after="0" w:line="240" w:lineRule="auto"/>
               <w:jc w:val="center"/>
               <w:rPr>
                 <w:rFonts w:cs="Times New Roman"/>
@@ -7014,6 +6654,7 @@
           <w:p>
             <w:pPr>
               <w:pStyle w:val="VanBan"/>
+              <w:spacing w:before="0" w:after="0" w:line="240" w:lineRule="auto"/>
               <w:jc w:val="center"/>
               <w:rPr>
                 <w:rFonts w:cs="Times New Roman"/>
@@ -7037,6 +6678,7 @@
           <w:p>
             <w:pPr>
               <w:pStyle w:val="VanBan"/>
+              <w:spacing w:before="0" w:after="0" w:line="240" w:lineRule="auto"/>
               <w:jc w:val="center"/>
               <w:rPr>
                 <w:rFonts w:cs="Times New Roman"/>
@@ -7058,6 +6700,7 @@
           <w:p>
             <w:pPr>
               <w:pStyle w:val="VanBan"/>
+              <w:spacing w:before="0" w:after="0" w:line="240" w:lineRule="auto"/>
               <w:jc w:val="center"/>
               <w:rPr>
                 <w:rFonts w:cs="Times New Roman"/>
@@ -7079,6 +6722,7 @@
           <w:p>
             <w:pPr>
               <w:pStyle w:val="VanBan"/>
+              <w:spacing w:before="0" w:after="0" w:line="240" w:lineRule="auto"/>
               <w:jc w:val="center"/>
               <w:rPr>
                 <w:rFonts w:cs="Times New Roman"/>
@@ -7100,6 +6744,7 @@
           <w:p>
             <w:pPr>
               <w:pStyle w:val="VanBan"/>
+              <w:spacing w:before="0" w:after="0" w:line="240" w:lineRule="auto"/>
               <w:jc w:val="center"/>
               <w:rPr>
                 <w:rFonts w:cs="Times New Roman"/>
@@ -7123,6 +6768,7 @@
           <w:p>
             <w:pPr>
               <w:pStyle w:val="VanBan"/>
+              <w:spacing w:before="0" w:after="0" w:line="240" w:lineRule="auto"/>
               <w:jc w:val="center"/>
               <w:rPr>
                 <w:rFonts w:cs="Times New Roman"/>
@@ -7144,6 +6790,7 @@
           <w:p>
             <w:pPr>
               <w:pStyle w:val="VanBan"/>
+              <w:spacing w:before="0" w:after="0" w:line="240" w:lineRule="auto"/>
               <w:jc w:val="center"/>
               <w:rPr>
                 <w:rFonts w:cs="Times New Roman"/>
@@ -7165,6 +6812,7 @@
           <w:p>
             <w:pPr>
               <w:pStyle w:val="VanBan"/>
+              <w:spacing w:before="0" w:after="0" w:line="240" w:lineRule="auto"/>
               <w:jc w:val="center"/>
               <w:rPr>
                 <w:rFonts w:cs="Times New Roman"/>
@@ -7186,6 +6834,7 @@
           <w:p>
             <w:pPr>
               <w:pStyle w:val="VanBan"/>
+              <w:spacing w:before="0" w:after="0" w:line="240" w:lineRule="auto"/>
               <w:jc w:val="center"/>
               <w:rPr>
                 <w:rFonts w:cs="Times New Roman"/>
@@ -7209,6 +6858,7 @@
           <w:p>
             <w:pPr>
               <w:pStyle w:val="VanBan"/>
+              <w:spacing w:before="0" w:after="0" w:line="240" w:lineRule="auto"/>
               <w:jc w:val="center"/>
               <w:rPr>
                 <w:rFonts w:cs="Times New Roman"/>
@@ -7230,6 +6880,7 @@
           <w:p>
             <w:pPr>
               <w:pStyle w:val="VanBan"/>
+              <w:spacing w:before="0" w:after="0" w:line="240" w:lineRule="auto"/>
               <w:jc w:val="center"/>
               <w:rPr>
                 <w:rFonts w:cs="Times New Roman"/>
@@ -7251,6 +6902,7 @@
           <w:p>
             <w:pPr>
               <w:pStyle w:val="VanBan"/>
+              <w:spacing w:before="0" w:after="0" w:line="240" w:lineRule="auto"/>
               <w:jc w:val="center"/>
               <w:rPr>
                 <w:rFonts w:cs="Times New Roman"/>
@@ -7272,6 +6924,7 @@
           <w:p>
             <w:pPr>
               <w:pStyle w:val="VanBan"/>
+              <w:spacing w:before="0" w:after="0" w:line="240" w:lineRule="auto"/>
               <w:jc w:val="center"/>
               <w:rPr>
                 <w:rFonts w:cs="Times New Roman"/>
@@ -7295,6 +6948,7 @@
           <w:p>
             <w:pPr>
               <w:pStyle w:val="VanBan"/>
+              <w:spacing w:before="0" w:after="0" w:line="240" w:lineRule="auto"/>
               <w:jc w:val="center"/>
               <w:rPr>
                 <w:rFonts w:cs="Times New Roman"/>
@@ -7316,6 +6970,7 @@
           <w:p>
             <w:pPr>
               <w:pStyle w:val="VanBan"/>
+              <w:spacing w:before="0" w:after="0" w:line="240" w:lineRule="auto"/>
               <w:jc w:val="center"/>
               <w:rPr>
                 <w:rFonts w:cs="Times New Roman"/>
@@ -7337,6 +6992,7 @@
           <w:p>
             <w:pPr>
               <w:pStyle w:val="VanBan"/>
+              <w:spacing w:before="0" w:after="0" w:line="240" w:lineRule="auto"/>
               <w:jc w:val="center"/>
               <w:rPr>
                 <w:rFonts w:cs="Times New Roman"/>
@@ -7358,6 +7014,7 @@
           <w:p>
             <w:pPr>
               <w:pStyle w:val="VanBan"/>
+              <w:spacing w:before="0" w:after="0" w:line="240" w:lineRule="auto"/>
               <w:jc w:val="center"/>
               <w:rPr>
                 <w:rFonts w:cs="Times New Roman"/>
@@ -7383,32 +7040,15 @@
     </w:p>
     <w:p>
       <w:pPr>
-        <w:pStyle w:val="VanBan"/>
+        <w:pStyle w:val="Bang"/>
         <w:rPr>
           <w:rFonts w:cs="Times New Roman"/>
         </w:rPr>
       </w:pPr>
-    </w:p>
-    <w:p>
-      <w:pPr>
-        <w:pStyle w:val="VanBan"/>
+      <w:r>
         <w:rPr>
           <w:rFonts w:cs="Times New Roman"/>
         </w:rPr>
-      </w:pPr>
-    </w:p>
-    <w:p>
-      <w:pPr>
-        <w:pStyle w:val="Bang"/>
-        <w:rPr>
-          <w:rFonts w:cs="Times New Roman"/>
-        </w:rPr>
-      </w:pPr>
-      <w:r>
-        <w:rPr>
-          <w:rFonts w:cs="Times New Roman"/>
-        </w:rPr>
-        <w:lastRenderedPageBreak/>
         <w:t>Bảng 3.5. Đơn Vị Vận Chuyển</w:t>
       </w:r>
     </w:p>
@@ -7437,7 +7077,7 @@
           <w:p>
             <w:pPr>
               <w:pStyle w:val="VanBan"/>
-              <w:spacing w:before="240"/>
+              <w:spacing w:line="240" w:lineRule="auto"/>
               <w:jc w:val="center"/>
               <w:rPr>
                 <w:rFonts w:cs="Times New Roman"/>
@@ -7460,7 +7100,7 @@
           <w:p>
             <w:pPr>
               <w:pStyle w:val="VanBan"/>
-              <w:spacing w:before="240"/>
+              <w:spacing w:line="240" w:lineRule="auto"/>
               <w:jc w:val="center"/>
               <w:rPr>
                 <w:rFonts w:cs="Times New Roman"/>
@@ -7483,7 +7123,7 @@
           <w:p>
             <w:pPr>
               <w:pStyle w:val="VanBan"/>
-              <w:spacing w:before="240"/>
+              <w:spacing w:line="240" w:lineRule="auto"/>
               <w:jc w:val="center"/>
               <w:rPr>
                 <w:rFonts w:cs="Times New Roman"/>
@@ -7506,7 +7146,7 @@
           <w:p>
             <w:pPr>
               <w:pStyle w:val="VanBan"/>
-              <w:spacing w:before="240"/>
+              <w:spacing w:line="240" w:lineRule="auto"/>
               <w:jc w:val="center"/>
               <w:rPr>
                 <w:rFonts w:cs="Times New Roman"/>
@@ -7534,6 +7174,7 @@
           <w:p>
             <w:pPr>
               <w:pStyle w:val="VanBan"/>
+              <w:spacing w:before="0" w:after="0" w:line="240" w:lineRule="auto"/>
               <w:jc w:val="center"/>
               <w:rPr>
                 <w:rFonts w:cs="Times New Roman"/>
@@ -7555,6 +7196,7 @@
           <w:p>
             <w:pPr>
               <w:pStyle w:val="VanBan"/>
+              <w:spacing w:before="0" w:after="0" w:line="240" w:lineRule="auto"/>
               <w:jc w:val="center"/>
               <w:rPr>
                 <w:rFonts w:cs="Times New Roman"/>
@@ -7576,6 +7218,7 @@
           <w:p>
             <w:pPr>
               <w:pStyle w:val="VanBan"/>
+              <w:spacing w:before="0" w:after="0" w:line="240" w:lineRule="auto"/>
               <w:jc w:val="center"/>
               <w:rPr>
                 <w:rFonts w:cs="Times New Roman"/>
@@ -7597,6 +7240,7 @@
           <w:p>
             <w:pPr>
               <w:pStyle w:val="VanBan"/>
+              <w:spacing w:before="0" w:after="0" w:line="240" w:lineRule="auto"/>
               <w:jc w:val="center"/>
               <w:rPr>
                 <w:rFonts w:cs="Times New Roman"/>
@@ -7623,6 +7267,7 @@
           <w:p>
             <w:pPr>
               <w:pStyle w:val="VanBan"/>
+              <w:spacing w:before="0" w:after="0" w:line="240" w:lineRule="auto"/>
               <w:jc w:val="center"/>
               <w:rPr>
                 <w:rFonts w:cs="Times New Roman"/>
@@ -7644,6 +7289,7 @@
           <w:p>
             <w:pPr>
               <w:pStyle w:val="VanBan"/>
+              <w:spacing w:before="0" w:after="0" w:line="240" w:lineRule="auto"/>
               <w:jc w:val="center"/>
               <w:rPr>
                 <w:rFonts w:cs="Times New Roman"/>
@@ -7665,6 +7311,7 @@
           <w:p>
             <w:pPr>
               <w:pStyle w:val="VanBan"/>
+              <w:spacing w:before="0" w:after="0" w:line="240" w:lineRule="auto"/>
               <w:jc w:val="center"/>
               <w:rPr>
                 <w:rFonts w:cs="Times New Roman"/>
@@ -7686,6 +7333,7 @@
           <w:p>
             <w:pPr>
               <w:pStyle w:val="VanBan"/>
+              <w:spacing w:before="0" w:after="0" w:line="240" w:lineRule="auto"/>
               <w:jc w:val="center"/>
               <w:rPr>
                 <w:rFonts w:cs="Times New Roman"/>
@@ -7712,6 +7360,7 @@
           <w:p>
             <w:pPr>
               <w:pStyle w:val="VanBan"/>
+              <w:spacing w:before="0" w:after="0" w:line="240" w:lineRule="auto"/>
               <w:jc w:val="center"/>
               <w:rPr>
                 <w:rFonts w:cs="Times New Roman"/>
@@ -7733,6 +7382,7 @@
           <w:p>
             <w:pPr>
               <w:pStyle w:val="VanBan"/>
+              <w:spacing w:before="0" w:after="0" w:line="240" w:lineRule="auto"/>
               <w:jc w:val="center"/>
               <w:rPr>
                 <w:rFonts w:cs="Times New Roman"/>
@@ -7754,6 +7404,7 @@
           <w:p>
             <w:pPr>
               <w:pStyle w:val="VanBan"/>
+              <w:spacing w:before="0" w:after="0" w:line="240" w:lineRule="auto"/>
               <w:jc w:val="center"/>
               <w:rPr>
                 <w:rFonts w:cs="Times New Roman"/>
@@ -7775,6 +7426,7 @@
           <w:p>
             <w:pPr>
               <w:pStyle w:val="VanBan"/>
+              <w:spacing w:before="0" w:after="0" w:line="240" w:lineRule="auto"/>
               <w:jc w:val="center"/>
               <w:rPr>
                 <w:rFonts w:cs="Times New Roman"/>
@@ -7835,7 +7487,7 @@
           <w:p>
             <w:pPr>
               <w:pStyle w:val="VanBan"/>
-              <w:spacing w:before="240"/>
+              <w:spacing w:line="240" w:lineRule="auto"/>
               <w:jc w:val="center"/>
               <w:rPr>
                 <w:rFonts w:cs="Times New Roman"/>
@@ -7858,7 +7510,7 @@
           <w:p>
             <w:pPr>
               <w:pStyle w:val="VanBan"/>
-              <w:spacing w:before="240"/>
+              <w:spacing w:line="240" w:lineRule="auto"/>
               <w:jc w:val="center"/>
               <w:rPr>
                 <w:rFonts w:cs="Times New Roman"/>
@@ -7881,7 +7533,7 @@
           <w:p>
             <w:pPr>
               <w:pStyle w:val="VanBan"/>
-              <w:spacing w:before="240"/>
+              <w:spacing w:line="240" w:lineRule="auto"/>
               <w:jc w:val="center"/>
               <w:rPr>
                 <w:rFonts w:cs="Times New Roman"/>
@@ -7904,7 +7556,7 @@
           <w:p>
             <w:pPr>
               <w:pStyle w:val="VanBan"/>
-              <w:spacing w:before="240"/>
+              <w:spacing w:line="240" w:lineRule="auto"/>
               <w:jc w:val="center"/>
               <w:rPr>
                 <w:rFonts w:cs="Times New Roman"/>
@@ -7932,7 +7584,7 @@
           <w:p>
             <w:pPr>
               <w:pStyle w:val="VanBan"/>
-              <w:spacing w:before="240"/>
+              <w:spacing w:before="0" w:after="0" w:line="240" w:lineRule="auto"/>
               <w:jc w:val="center"/>
               <w:rPr>
                 <w:rFonts w:cs="Times New Roman"/>
@@ -7954,7 +7606,7 @@
           <w:p>
             <w:pPr>
               <w:pStyle w:val="VanBan"/>
-              <w:spacing w:before="240"/>
+              <w:spacing w:before="0" w:after="0" w:line="240" w:lineRule="auto"/>
               <w:jc w:val="center"/>
               <w:rPr>
                 <w:rFonts w:cs="Times New Roman"/>
@@ -7976,7 +7628,7 @@
           <w:p>
             <w:pPr>
               <w:pStyle w:val="VanBan"/>
-              <w:spacing w:before="240"/>
+              <w:spacing w:before="0" w:after="0" w:line="240" w:lineRule="auto"/>
               <w:jc w:val="center"/>
               <w:rPr>
                 <w:rFonts w:cs="Times New Roman"/>
@@ -7998,7 +7650,7 @@
           <w:p>
             <w:pPr>
               <w:pStyle w:val="VanBan"/>
-              <w:spacing w:before="240"/>
+              <w:spacing w:before="0" w:after="0" w:line="240" w:lineRule="auto"/>
               <w:jc w:val="center"/>
               <w:rPr>
                 <w:rFonts w:cs="Times New Roman"/>
@@ -8025,7 +7677,7 @@
           <w:p>
             <w:pPr>
               <w:pStyle w:val="VanBan"/>
-              <w:spacing w:before="240"/>
+              <w:spacing w:before="0" w:after="0" w:line="240" w:lineRule="auto"/>
               <w:jc w:val="center"/>
               <w:rPr>
                 <w:rFonts w:cs="Times New Roman"/>
@@ -8047,7 +7699,7 @@
           <w:p>
             <w:pPr>
               <w:pStyle w:val="VanBan"/>
-              <w:spacing w:before="240"/>
+              <w:spacing w:before="0" w:after="0" w:line="240" w:lineRule="auto"/>
               <w:jc w:val="center"/>
               <w:rPr>
                 <w:rFonts w:cs="Times New Roman"/>
@@ -8069,7 +7721,7 @@
           <w:p>
             <w:pPr>
               <w:pStyle w:val="VanBan"/>
-              <w:spacing w:before="240"/>
+              <w:spacing w:before="0" w:after="0" w:line="240" w:lineRule="auto"/>
               <w:jc w:val="center"/>
               <w:rPr>
                 <w:rFonts w:cs="Times New Roman"/>
@@ -8091,7 +7743,7 @@
           <w:p>
             <w:pPr>
               <w:pStyle w:val="VanBan"/>
-              <w:spacing w:before="240"/>
+              <w:spacing w:before="0" w:after="0" w:line="240" w:lineRule="auto"/>
               <w:jc w:val="center"/>
               <w:rPr>
                 <w:rFonts w:cs="Times New Roman"/>
@@ -8118,7 +7770,7 @@
           <w:p>
             <w:pPr>
               <w:pStyle w:val="VanBan"/>
-              <w:spacing w:before="240"/>
+              <w:spacing w:before="0" w:after="0" w:line="240" w:lineRule="auto"/>
               <w:jc w:val="center"/>
               <w:rPr>
                 <w:rFonts w:cs="Times New Roman"/>
@@ -8140,7 +7792,7 @@
           <w:p>
             <w:pPr>
               <w:pStyle w:val="VanBan"/>
-              <w:spacing w:before="240"/>
+              <w:spacing w:before="0" w:after="0" w:line="240" w:lineRule="auto"/>
               <w:jc w:val="center"/>
               <w:rPr>
                 <w:rFonts w:cs="Times New Roman"/>
@@ -8162,7 +7814,7 @@
           <w:p>
             <w:pPr>
               <w:pStyle w:val="VanBan"/>
-              <w:spacing w:before="240"/>
+              <w:spacing w:before="0" w:after="0" w:line="240" w:lineRule="auto"/>
               <w:jc w:val="center"/>
               <w:rPr>
                 <w:rFonts w:cs="Times New Roman"/>
@@ -8184,7 +7836,7 @@
           <w:p>
             <w:pPr>
               <w:pStyle w:val="VanBan"/>
-              <w:spacing w:before="240"/>
+              <w:spacing w:before="0" w:after="0" w:line="240" w:lineRule="auto"/>
               <w:jc w:val="center"/>
               <w:rPr>
                 <w:rFonts w:cs="Times New Roman"/>
@@ -8211,7 +7863,7 @@
           <w:p>
             <w:pPr>
               <w:pStyle w:val="VanBan"/>
-              <w:spacing w:before="240"/>
+              <w:spacing w:before="0" w:after="0" w:line="240" w:lineRule="auto"/>
               <w:jc w:val="center"/>
               <w:rPr>
                 <w:rFonts w:cs="Times New Roman"/>
@@ -8233,7 +7885,7 @@
           <w:p>
             <w:pPr>
               <w:pStyle w:val="VanBan"/>
-              <w:spacing w:before="240"/>
+              <w:spacing w:before="0" w:after="0" w:line="240" w:lineRule="auto"/>
               <w:jc w:val="center"/>
               <w:rPr>
                 <w:rFonts w:cs="Times New Roman"/>
@@ -8255,7 +7907,7 @@
           <w:p>
             <w:pPr>
               <w:pStyle w:val="VanBan"/>
-              <w:spacing w:before="240"/>
+              <w:spacing w:before="0" w:after="0" w:line="240" w:lineRule="auto"/>
               <w:jc w:val="center"/>
               <w:rPr>
                 <w:rFonts w:cs="Times New Roman"/>
@@ -8277,7 +7929,7 @@
           <w:p>
             <w:pPr>
               <w:pStyle w:val="VanBan"/>
-              <w:spacing w:before="240"/>
+              <w:spacing w:before="0" w:after="0" w:line="240" w:lineRule="auto"/>
               <w:jc w:val="center"/>
               <w:rPr>
                 <w:rFonts w:cs="Times New Roman"/>
@@ -8304,7 +7956,7 @@
           <w:p>
             <w:pPr>
               <w:pStyle w:val="VanBan"/>
-              <w:spacing w:before="240"/>
+              <w:spacing w:before="0" w:after="0" w:line="240" w:lineRule="auto"/>
               <w:jc w:val="center"/>
               <w:rPr>
                 <w:rFonts w:cs="Times New Roman"/>
@@ -8326,7 +7978,7 @@
           <w:p>
             <w:pPr>
               <w:pStyle w:val="VanBan"/>
-              <w:spacing w:before="240"/>
+              <w:spacing w:before="0" w:after="0" w:line="240" w:lineRule="auto"/>
               <w:jc w:val="center"/>
               <w:rPr>
                 <w:rFonts w:cs="Times New Roman"/>
@@ -8348,7 +8000,7 @@
           <w:p>
             <w:pPr>
               <w:pStyle w:val="VanBan"/>
-              <w:spacing w:before="240"/>
+              <w:spacing w:before="0" w:after="0" w:line="240" w:lineRule="auto"/>
               <w:jc w:val="center"/>
               <w:rPr>
                 <w:rFonts w:cs="Times New Roman"/>
@@ -8370,7 +8022,7 @@
           <w:p>
             <w:pPr>
               <w:pStyle w:val="VanBan"/>
-              <w:spacing w:before="240"/>
+              <w:spacing w:before="0" w:after="0" w:line="240" w:lineRule="auto"/>
               <w:jc w:val="center"/>
               <w:rPr>
                 <w:rFonts w:cs="Times New Roman"/>
@@ -8397,7 +8049,7 @@
           <w:p>
             <w:pPr>
               <w:pStyle w:val="VanBan"/>
-              <w:spacing w:before="240"/>
+              <w:spacing w:before="0" w:after="0" w:line="240" w:lineRule="auto"/>
               <w:jc w:val="center"/>
               <w:rPr>
                 <w:rFonts w:cs="Times New Roman"/>
@@ -8419,7 +8071,7 @@
           <w:p>
             <w:pPr>
               <w:pStyle w:val="VanBan"/>
-              <w:spacing w:before="240"/>
+              <w:spacing w:before="0" w:after="0" w:line="240" w:lineRule="auto"/>
               <w:jc w:val="center"/>
               <w:rPr>
                 <w:rFonts w:cs="Times New Roman"/>
@@ -8441,7 +8093,7 @@
           <w:p>
             <w:pPr>
               <w:pStyle w:val="VanBan"/>
-              <w:spacing w:before="240"/>
+              <w:spacing w:before="0" w:after="0" w:line="240" w:lineRule="auto"/>
               <w:jc w:val="center"/>
               <w:rPr>
                 <w:rFonts w:cs="Times New Roman"/>
@@ -8463,7 +8115,7 @@
           <w:p>
             <w:pPr>
               <w:pStyle w:val="VanBan"/>
-              <w:spacing w:before="240"/>
+              <w:spacing w:before="0" w:after="0" w:line="240" w:lineRule="auto"/>
               <w:jc w:val="center"/>
               <w:rPr>
                 <w:rFonts w:cs="Times New Roman"/>
@@ -8490,7 +8142,7 @@
           <w:p>
             <w:pPr>
               <w:pStyle w:val="VanBan"/>
-              <w:spacing w:before="240"/>
+              <w:spacing w:before="0" w:after="0" w:line="240" w:lineRule="auto"/>
               <w:jc w:val="center"/>
               <w:rPr>
                 <w:rFonts w:cs="Times New Roman"/>
@@ -8512,7 +8164,7 @@
           <w:p>
             <w:pPr>
               <w:pStyle w:val="VanBan"/>
-              <w:spacing w:before="240"/>
+              <w:spacing w:before="0" w:after="0" w:line="240" w:lineRule="auto"/>
               <w:jc w:val="center"/>
               <w:rPr>
                 <w:rFonts w:cs="Times New Roman"/>
@@ -8534,7 +8186,7 @@
           <w:p>
             <w:pPr>
               <w:pStyle w:val="VanBan"/>
-              <w:spacing w:before="240"/>
+              <w:spacing w:before="0" w:after="0" w:line="240" w:lineRule="auto"/>
               <w:jc w:val="center"/>
               <w:rPr>
                 <w:rFonts w:cs="Times New Roman"/>
@@ -8556,7 +8208,7 @@
           <w:p>
             <w:pPr>
               <w:pStyle w:val="VanBan"/>
-              <w:spacing w:before="240"/>
+              <w:spacing w:before="0" w:after="0" w:line="240" w:lineRule="auto"/>
               <w:jc w:val="center"/>
               <w:rPr>
                 <w:rFonts w:cs="Times New Roman"/>
@@ -8583,17 +8235,16 @@
           <w:p>
             <w:pPr>
               <w:pStyle w:val="VanBan"/>
-              <w:spacing w:before="240"/>
-              <w:jc w:val="center"/>
-              <w:rPr>
-                <w:rFonts w:cs="Times New Roman"/>
-              </w:rPr>
-            </w:pPr>
-            <w:r>
-              <w:rPr>
-                <w:rFonts w:cs="Times New Roman"/>
-              </w:rPr>
-              <w:lastRenderedPageBreak/>
+              <w:spacing w:before="0" w:after="0" w:line="240" w:lineRule="auto"/>
+              <w:jc w:val="center"/>
+              <w:rPr>
+                <w:rFonts w:cs="Times New Roman"/>
+              </w:rPr>
+            </w:pPr>
+            <w:r>
+              <w:rPr>
+                <w:rFonts w:cs="Times New Roman"/>
+              </w:rPr>
               <w:t>TrangThai</w:t>
             </w:r>
           </w:p>
@@ -8606,7 +8257,7 @@
           <w:p>
             <w:pPr>
               <w:pStyle w:val="VanBan"/>
-              <w:spacing w:before="240"/>
+              <w:spacing w:before="0" w:after="0" w:line="240" w:lineRule="auto"/>
               <w:jc w:val="center"/>
               <w:rPr>
                 <w:rFonts w:cs="Times New Roman"/>
@@ -8628,7 +8279,7 @@
           <w:p>
             <w:pPr>
               <w:pStyle w:val="VanBan"/>
-              <w:spacing w:before="240"/>
+              <w:spacing w:before="0" w:after="0" w:line="240" w:lineRule="auto"/>
               <w:jc w:val="center"/>
               <w:rPr>
                 <w:rFonts w:cs="Times New Roman"/>
@@ -8650,7 +8301,7 @@
           <w:p>
             <w:pPr>
               <w:pStyle w:val="VanBan"/>
-              <w:spacing w:before="240"/>
+              <w:spacing w:before="0" w:after="0" w:line="240" w:lineRule="auto"/>
               <w:jc w:val="center"/>
               <w:rPr>
                 <w:rFonts w:cs="Times New Roman"/>
@@ -8677,7 +8328,7 @@
           <w:p>
             <w:pPr>
               <w:pStyle w:val="VanBan"/>
-              <w:spacing w:before="240"/>
+              <w:spacing w:before="0" w:after="0" w:line="240" w:lineRule="auto"/>
               <w:jc w:val="center"/>
               <w:rPr>
                 <w:rFonts w:cs="Times New Roman"/>
@@ -8699,7 +8350,7 @@
           <w:p>
             <w:pPr>
               <w:pStyle w:val="VanBan"/>
-              <w:spacing w:before="240"/>
+              <w:spacing w:before="0" w:after="0" w:line="240" w:lineRule="auto"/>
               <w:jc w:val="center"/>
               <w:rPr>
                 <w:rFonts w:cs="Times New Roman"/>
@@ -8721,7 +8372,7 @@
           <w:p>
             <w:pPr>
               <w:pStyle w:val="VanBan"/>
-              <w:spacing w:before="240"/>
+              <w:spacing w:before="0" w:after="0" w:line="240" w:lineRule="auto"/>
               <w:jc w:val="center"/>
               <w:rPr>
                 <w:rFonts w:cs="Times New Roman"/>
@@ -8743,7 +8394,7 @@
           <w:p>
             <w:pPr>
               <w:pStyle w:val="VanBan"/>
-              <w:spacing w:before="240"/>
+              <w:spacing w:before="0" w:after="0" w:line="240" w:lineRule="auto"/>
               <w:jc w:val="center"/>
               <w:rPr>
                 <w:rFonts w:cs="Times New Roman"/>
@@ -8770,7 +8421,7 @@
           <w:p>
             <w:pPr>
               <w:pStyle w:val="VanBan"/>
-              <w:spacing w:before="240"/>
+              <w:spacing w:before="0" w:after="0" w:line="240" w:lineRule="auto"/>
               <w:jc w:val="center"/>
               <w:rPr>
                 <w:rFonts w:cs="Times New Roman"/>
@@ -8792,7 +8443,7 @@
           <w:p>
             <w:pPr>
               <w:pStyle w:val="VanBan"/>
-              <w:spacing w:before="240"/>
+              <w:spacing w:before="0" w:after="0" w:line="240" w:lineRule="auto"/>
               <w:jc w:val="center"/>
               <w:rPr>
                 <w:rFonts w:cs="Times New Roman"/>
@@ -8814,7 +8465,7 @@
           <w:p>
             <w:pPr>
               <w:pStyle w:val="VanBan"/>
-              <w:spacing w:before="240"/>
+              <w:spacing w:before="0" w:after="0" w:line="240" w:lineRule="auto"/>
               <w:jc w:val="center"/>
               <w:rPr>
                 <w:rFonts w:cs="Times New Roman"/>
@@ -8836,7 +8487,7 @@
           <w:p>
             <w:pPr>
               <w:pStyle w:val="VanBan"/>
-              <w:spacing w:before="240"/>
+              <w:spacing w:before="0" w:after="0" w:line="240" w:lineRule="auto"/>
               <w:jc w:val="center"/>
               <w:rPr>
                 <w:rFonts w:cs="Times New Roman"/>
@@ -8859,6 +8510,11 @@
     </w:p>
     <w:p>
       <w:pPr>
+        <w:pStyle w:val="VanBan"/>
+      </w:pPr>
+    </w:p>
+    <w:p>
+      <w:pPr>
         <w:pStyle w:val="Bang"/>
         <w:rPr>
           <w:rFonts w:cs="Times New Roman"/>
@@ -8868,6 +8524,7 @@
         <w:rPr>
           <w:rFonts w:cs="Times New Roman"/>
         </w:rPr>
+        <w:lastRenderedPageBreak/>
         <w:t>Bảng 3.7. Hình Ảnh Sản Phẩm</w:t>
       </w:r>
     </w:p>
@@ -8892,7 +8549,7 @@
           <w:p>
             <w:pPr>
               <w:pStyle w:val="VanBan"/>
-              <w:spacing w:before="240"/>
+              <w:spacing w:line="240" w:lineRule="auto"/>
               <w:jc w:val="center"/>
               <w:rPr>
                 <w:rFonts w:cs="Times New Roman"/>
@@ -8915,7 +8572,7 @@
           <w:p>
             <w:pPr>
               <w:pStyle w:val="VanBan"/>
-              <w:spacing w:before="240"/>
+              <w:spacing w:line="240" w:lineRule="auto"/>
               <w:jc w:val="center"/>
               <w:rPr>
                 <w:rFonts w:cs="Times New Roman"/>
@@ -8938,7 +8595,7 @@
           <w:p>
             <w:pPr>
               <w:pStyle w:val="VanBan"/>
-              <w:spacing w:before="240"/>
+              <w:spacing w:line="240" w:lineRule="auto"/>
               <w:jc w:val="center"/>
               <w:rPr>
                 <w:rFonts w:cs="Times New Roman"/>
@@ -8961,7 +8618,7 @@
           <w:p>
             <w:pPr>
               <w:pStyle w:val="VanBan"/>
-              <w:spacing w:before="240"/>
+              <w:spacing w:line="240" w:lineRule="auto"/>
               <w:jc w:val="center"/>
               <w:rPr>
                 <w:rFonts w:cs="Times New Roman"/>
@@ -8986,6 +8643,7 @@
           <w:p>
             <w:pPr>
               <w:pStyle w:val="VanBan"/>
+              <w:spacing w:before="0" w:after="0" w:line="240" w:lineRule="auto"/>
               <w:jc w:val="center"/>
               <w:rPr>
                 <w:rFonts w:cs="Times New Roman"/>
@@ -9007,6 +8665,7 @@
           <w:p>
             <w:pPr>
               <w:pStyle w:val="VanBan"/>
+              <w:spacing w:before="0" w:after="0" w:line="240" w:lineRule="auto"/>
               <w:jc w:val="center"/>
               <w:rPr>
                 <w:rFonts w:cs="Times New Roman"/>
@@ -9028,6 +8687,7 @@
           <w:p>
             <w:pPr>
               <w:pStyle w:val="VanBan"/>
+              <w:spacing w:before="0" w:after="0" w:line="240" w:lineRule="auto"/>
               <w:jc w:val="center"/>
               <w:rPr>
                 <w:rFonts w:cs="Times New Roman"/>
@@ -9049,6 +8709,7 @@
           <w:p>
             <w:pPr>
               <w:pStyle w:val="VanBan"/>
+              <w:spacing w:before="0" w:after="0" w:line="240" w:lineRule="auto"/>
               <w:jc w:val="center"/>
               <w:rPr>
                 <w:rFonts w:cs="Times New Roman"/>
@@ -9072,6 +8733,7 @@
           <w:p>
             <w:pPr>
               <w:pStyle w:val="VanBan"/>
+              <w:spacing w:before="0" w:after="0" w:line="240" w:lineRule="auto"/>
               <w:jc w:val="center"/>
               <w:rPr>
                 <w:rFonts w:cs="Times New Roman"/>
@@ -9093,6 +8755,7 @@
           <w:p>
             <w:pPr>
               <w:pStyle w:val="VanBan"/>
+              <w:spacing w:before="0" w:after="0" w:line="240" w:lineRule="auto"/>
               <w:jc w:val="center"/>
               <w:rPr>
                 <w:rFonts w:cs="Times New Roman"/>
@@ -9114,6 +8777,7 @@
           <w:p>
             <w:pPr>
               <w:pStyle w:val="VanBan"/>
+              <w:spacing w:before="0" w:after="0" w:line="240" w:lineRule="auto"/>
               <w:jc w:val="center"/>
               <w:rPr>
                 <w:rFonts w:cs="Times New Roman"/>
@@ -9135,6 +8799,7 @@
           <w:p>
             <w:pPr>
               <w:pStyle w:val="VanBan"/>
+              <w:spacing w:before="0" w:after="0" w:line="240" w:lineRule="auto"/>
               <w:jc w:val="center"/>
               <w:rPr>
                 <w:rFonts w:cs="Times New Roman"/>
@@ -9158,6 +8823,7 @@
           <w:p>
             <w:pPr>
               <w:pStyle w:val="VanBan"/>
+              <w:spacing w:before="0" w:after="0" w:line="240" w:lineRule="auto"/>
               <w:jc w:val="center"/>
               <w:rPr>
                 <w:rFonts w:cs="Times New Roman"/>
@@ -9179,6 +8845,7 @@
           <w:p>
             <w:pPr>
               <w:pStyle w:val="VanBan"/>
+              <w:spacing w:before="0" w:after="0" w:line="240" w:lineRule="auto"/>
               <w:jc w:val="center"/>
               <w:rPr>
                 <w:rFonts w:cs="Times New Roman"/>
@@ -9200,6 +8867,7 @@
           <w:p>
             <w:pPr>
               <w:pStyle w:val="VanBan"/>
+              <w:spacing w:before="0" w:after="0" w:line="240" w:lineRule="auto"/>
               <w:jc w:val="center"/>
               <w:rPr>
                 <w:rFonts w:cs="Times New Roman"/>
@@ -9221,6 +8889,7 @@
           <w:p>
             <w:pPr>
               <w:pStyle w:val="VanBan"/>
+              <w:spacing w:before="0" w:after="0" w:line="240" w:lineRule="auto"/>
               <w:jc w:val="center"/>
               <w:rPr>
                 <w:rFonts w:cs="Times New Roman"/>
@@ -9244,6 +8913,7 @@
           <w:p>
             <w:pPr>
               <w:pStyle w:val="VanBan"/>
+              <w:spacing w:before="0" w:after="0" w:line="240" w:lineRule="auto"/>
               <w:jc w:val="center"/>
               <w:rPr>
                 <w:rFonts w:cs="Times New Roman"/>
@@ -9265,6 +8935,7 @@
           <w:p>
             <w:pPr>
               <w:pStyle w:val="VanBan"/>
+              <w:spacing w:before="0" w:after="0" w:line="240" w:lineRule="auto"/>
               <w:jc w:val="center"/>
               <w:rPr>
                 <w:rFonts w:cs="Times New Roman"/>
@@ -9286,6 +8957,7 @@
           <w:p>
             <w:pPr>
               <w:pStyle w:val="VanBan"/>
+              <w:spacing w:before="0" w:after="0" w:line="240" w:lineRule="auto"/>
               <w:jc w:val="center"/>
               <w:rPr>
                 <w:rFonts w:cs="Times New Roman"/>
@@ -9307,6 +8979,7 @@
           <w:p>
             <w:pPr>
               <w:pStyle w:val="VanBan"/>
+              <w:spacing w:before="0" w:after="0" w:line="240" w:lineRule="auto"/>
               <w:jc w:val="center"/>
               <w:rPr>
                 <w:rFonts w:cs="Times New Roman"/>
@@ -9330,6 +9003,7 @@
           <w:p>
             <w:pPr>
               <w:pStyle w:val="VanBan"/>
+              <w:spacing w:before="0" w:after="0" w:line="240" w:lineRule="auto"/>
               <w:jc w:val="center"/>
               <w:rPr>
                 <w:rFonts w:cs="Times New Roman"/>
@@ -9351,6 +9025,7 @@
           <w:p>
             <w:pPr>
               <w:pStyle w:val="VanBan"/>
+              <w:spacing w:before="0" w:after="0" w:line="240" w:lineRule="auto"/>
               <w:jc w:val="center"/>
               <w:rPr>
                 <w:rFonts w:cs="Times New Roman"/>
@@ -9372,6 +9047,7 @@
           <w:p>
             <w:pPr>
               <w:pStyle w:val="VanBan"/>
+              <w:spacing w:before="0" w:after="0" w:line="240" w:lineRule="auto"/>
               <w:jc w:val="center"/>
               <w:rPr>
                 <w:rFonts w:cs="Times New Roman"/>
@@ -9393,6 +9069,7 @@
           <w:p>
             <w:pPr>
               <w:pStyle w:val="VanBan"/>
+              <w:spacing w:before="0" w:after="0" w:line="240" w:lineRule="auto"/>
               <w:jc w:val="center"/>
               <w:rPr>
                 <w:rFonts w:cs="Times New Roman"/>
@@ -9416,6 +9093,7 @@
           <w:p>
             <w:pPr>
               <w:pStyle w:val="VanBan"/>
+              <w:spacing w:before="0" w:after="0" w:line="240" w:lineRule="auto"/>
               <w:jc w:val="center"/>
               <w:rPr>
                 <w:rFonts w:cs="Times New Roman"/>
@@ -9437,6 +9115,7 @@
           <w:p>
             <w:pPr>
               <w:pStyle w:val="VanBan"/>
+              <w:spacing w:before="0" w:after="0" w:line="240" w:lineRule="auto"/>
               <w:jc w:val="center"/>
               <w:rPr>
                 <w:rFonts w:cs="Times New Roman"/>
@@ -9458,6 +9137,7 @@
           <w:p>
             <w:pPr>
               <w:pStyle w:val="VanBan"/>
+              <w:spacing w:before="0" w:after="0" w:line="240" w:lineRule="auto"/>
               <w:jc w:val="center"/>
               <w:rPr>
                 <w:rFonts w:cs="Times New Roman"/>
@@ -9479,6 +9159,7 @@
           <w:p>
             <w:pPr>
               <w:pStyle w:val="VanBan"/>
+              <w:spacing w:before="0" w:after="0" w:line="240" w:lineRule="auto"/>
               <w:jc w:val="center"/>
               <w:rPr>
                 <w:rFonts w:cs="Times New Roman"/>
@@ -9496,6 +9177,11 @@
     </w:tbl>
     <w:p>
       <w:pPr>
+        <w:pStyle w:val="VanBan"/>
+      </w:pPr>
+    </w:p>
+    <w:p>
+      <w:pPr>
         <w:pStyle w:val="Bang"/>
         <w:rPr>
           <w:rFonts w:cs="Times New Roman"/>
@@ -9505,7 +9191,6 @@
         <w:rPr>
           <w:rFonts w:cs="Times New Roman"/>
         </w:rPr>
-        <w:lastRenderedPageBreak/>
         <w:t>Bảng 3.8. Hóa Đơn</w:t>
       </w:r>
     </w:p>
@@ -9534,7 +9219,7 @@
           <w:p>
             <w:pPr>
               <w:pStyle w:val="VanBan"/>
-              <w:spacing w:before="240"/>
+              <w:spacing w:line="240" w:lineRule="auto"/>
               <w:jc w:val="center"/>
               <w:rPr>
                 <w:rFonts w:cs="Times New Roman"/>
@@ -9557,7 +9242,7 @@
           <w:p>
             <w:pPr>
               <w:pStyle w:val="VanBan"/>
-              <w:spacing w:before="240"/>
+              <w:spacing w:line="240" w:lineRule="auto"/>
               <w:jc w:val="center"/>
               <w:rPr>
                 <w:rFonts w:cs="Times New Roman"/>
@@ -9580,7 +9265,7 @@
           <w:p>
             <w:pPr>
               <w:pStyle w:val="VanBan"/>
-              <w:spacing w:before="240"/>
+              <w:spacing w:line="240" w:lineRule="auto"/>
               <w:jc w:val="center"/>
               <w:rPr>
                 <w:rFonts w:cs="Times New Roman"/>
@@ -9603,7 +9288,7 @@
           <w:p>
             <w:pPr>
               <w:pStyle w:val="VanBan"/>
-              <w:spacing w:before="240"/>
+              <w:spacing w:line="240" w:lineRule="auto"/>
               <w:jc w:val="center"/>
               <w:rPr>
                 <w:rFonts w:cs="Times New Roman"/>
@@ -9631,7 +9316,7 @@
           <w:p>
             <w:pPr>
               <w:pStyle w:val="VanBan"/>
-              <w:spacing w:before="240"/>
+              <w:spacing w:before="0" w:after="0" w:line="240" w:lineRule="auto"/>
               <w:jc w:val="center"/>
               <w:rPr>
                 <w:rFonts w:cs="Times New Roman"/>
@@ -9653,7 +9338,7 @@
           <w:p>
             <w:pPr>
               <w:pStyle w:val="VanBan"/>
-              <w:spacing w:before="240"/>
+              <w:spacing w:before="0" w:after="0" w:line="240" w:lineRule="auto"/>
               <w:jc w:val="center"/>
               <w:rPr>
                 <w:rFonts w:cs="Times New Roman"/>
@@ -9675,7 +9360,7 @@
           <w:p>
             <w:pPr>
               <w:pStyle w:val="VanBan"/>
-              <w:spacing w:before="240"/>
+              <w:spacing w:before="0" w:after="0" w:line="240" w:lineRule="auto"/>
               <w:jc w:val="center"/>
               <w:rPr>
                 <w:rFonts w:cs="Times New Roman"/>
@@ -9697,7 +9382,7 @@
           <w:p>
             <w:pPr>
               <w:pStyle w:val="VanBan"/>
-              <w:spacing w:before="240"/>
+              <w:spacing w:before="0" w:after="0" w:line="240" w:lineRule="auto"/>
               <w:jc w:val="center"/>
               <w:rPr>
                 <w:rFonts w:cs="Times New Roman"/>
@@ -9724,7 +9409,7 @@
           <w:p>
             <w:pPr>
               <w:pStyle w:val="VanBan"/>
-              <w:spacing w:before="240"/>
+              <w:spacing w:before="0" w:after="0" w:line="240" w:lineRule="auto"/>
               <w:jc w:val="center"/>
               <w:rPr>
                 <w:rFonts w:cs="Times New Roman"/>
@@ -9746,7 +9431,7 @@
           <w:p>
             <w:pPr>
               <w:pStyle w:val="VanBan"/>
-              <w:spacing w:before="240"/>
+              <w:spacing w:before="0" w:after="0" w:line="240" w:lineRule="auto"/>
               <w:jc w:val="center"/>
               <w:rPr>
                 <w:rFonts w:cs="Times New Roman"/>
@@ -9768,7 +9453,7 @@
           <w:p>
             <w:pPr>
               <w:pStyle w:val="VanBan"/>
-              <w:spacing w:before="240"/>
+              <w:spacing w:before="0" w:after="0" w:line="240" w:lineRule="auto"/>
               <w:jc w:val="center"/>
               <w:rPr>
                 <w:rFonts w:cs="Times New Roman"/>
@@ -9790,7 +9475,7 @@
           <w:p>
             <w:pPr>
               <w:pStyle w:val="VanBan"/>
-              <w:spacing w:before="240"/>
+              <w:spacing w:before="0" w:after="0" w:line="240" w:lineRule="auto"/>
               <w:jc w:val="center"/>
               <w:rPr>
                 <w:rFonts w:cs="Times New Roman"/>
@@ -9817,7 +9502,7 @@
           <w:p>
             <w:pPr>
               <w:pStyle w:val="VanBan"/>
-              <w:spacing w:before="240"/>
+              <w:spacing w:before="0" w:after="0" w:line="240" w:lineRule="auto"/>
               <w:jc w:val="center"/>
               <w:rPr>
                 <w:rFonts w:cs="Times New Roman"/>
@@ -9839,7 +9524,7 @@
           <w:p>
             <w:pPr>
               <w:pStyle w:val="VanBan"/>
-              <w:spacing w:before="240"/>
+              <w:spacing w:before="0" w:after="0" w:line="240" w:lineRule="auto"/>
               <w:jc w:val="center"/>
               <w:rPr>
                 <w:rFonts w:cs="Times New Roman"/>
@@ -9861,7 +9546,7 @@
           <w:p>
             <w:pPr>
               <w:pStyle w:val="VanBan"/>
-              <w:spacing w:before="240"/>
+              <w:spacing w:before="0" w:after="0" w:line="240" w:lineRule="auto"/>
               <w:jc w:val="center"/>
               <w:rPr>
                 <w:rFonts w:cs="Times New Roman"/>
@@ -9883,7 +9568,7 @@
           <w:p>
             <w:pPr>
               <w:pStyle w:val="VanBan"/>
-              <w:spacing w:before="240"/>
+              <w:spacing w:before="0" w:after="0" w:line="240" w:lineRule="auto"/>
               <w:jc w:val="center"/>
               <w:rPr>
                 <w:rFonts w:cs="Times New Roman"/>
@@ -9910,7 +9595,7 @@
           <w:p>
             <w:pPr>
               <w:pStyle w:val="VanBan"/>
-              <w:spacing w:before="240"/>
+              <w:spacing w:before="0" w:after="0" w:line="240" w:lineRule="auto"/>
               <w:jc w:val="center"/>
               <w:rPr>
                 <w:rFonts w:cs="Times New Roman"/>
@@ -9932,7 +9617,7 @@
           <w:p>
             <w:pPr>
               <w:pStyle w:val="VanBan"/>
-              <w:spacing w:before="240"/>
+              <w:spacing w:before="0" w:after="0" w:line="240" w:lineRule="auto"/>
               <w:jc w:val="center"/>
               <w:rPr>
                 <w:rFonts w:cs="Times New Roman"/>
@@ -9954,7 +9639,7 @@
           <w:p>
             <w:pPr>
               <w:pStyle w:val="VanBan"/>
-              <w:spacing w:before="240"/>
+              <w:spacing w:before="0" w:after="0" w:line="240" w:lineRule="auto"/>
               <w:jc w:val="center"/>
               <w:rPr>
                 <w:rFonts w:cs="Times New Roman"/>
@@ -9976,7 +9661,7 @@
           <w:p>
             <w:pPr>
               <w:pStyle w:val="VanBan"/>
-              <w:spacing w:before="240"/>
+              <w:spacing w:before="0" w:after="0" w:line="240" w:lineRule="auto"/>
               <w:jc w:val="center"/>
               <w:rPr>
                 <w:rFonts w:cs="Times New Roman"/>
@@ -10003,7 +9688,7 @@
           <w:p>
             <w:pPr>
               <w:pStyle w:val="VanBan"/>
-              <w:spacing w:before="240"/>
+              <w:spacing w:before="0" w:after="0" w:line="240" w:lineRule="auto"/>
               <w:jc w:val="center"/>
               <w:rPr>
                 <w:rFonts w:cs="Times New Roman"/>
@@ -10025,7 +9710,7 @@
           <w:p>
             <w:pPr>
               <w:pStyle w:val="VanBan"/>
-              <w:spacing w:before="240"/>
+              <w:spacing w:before="0" w:after="0" w:line="240" w:lineRule="auto"/>
               <w:jc w:val="center"/>
               <w:rPr>
                 <w:rFonts w:cs="Times New Roman"/>
@@ -10047,7 +9732,7 @@
           <w:p>
             <w:pPr>
               <w:pStyle w:val="VanBan"/>
-              <w:spacing w:before="240"/>
+              <w:spacing w:before="0" w:after="0" w:line="240" w:lineRule="auto"/>
               <w:jc w:val="center"/>
               <w:rPr>
                 <w:rFonts w:cs="Times New Roman"/>
@@ -10069,7 +9754,7 @@
           <w:p>
             <w:pPr>
               <w:pStyle w:val="VanBan"/>
-              <w:spacing w:before="240"/>
+              <w:spacing w:before="0" w:after="0" w:line="240" w:lineRule="auto"/>
               <w:jc w:val="center"/>
               <w:rPr>
                 <w:rFonts w:cs="Times New Roman"/>
@@ -10117,6 +9802,9 @@
         <w:gridCol w:w="1808"/>
       </w:tblGrid>
       <w:tr>
+        <w:trPr>
+          <w:tblHeader/>
+        </w:trPr>
         <w:tc>
           <w:tcPr>
             <w:tcW w:w="2194" w:type="dxa"/>
@@ -10125,7 +9813,7 @@
           <w:p>
             <w:pPr>
               <w:pStyle w:val="VanBan"/>
-              <w:spacing w:before="240"/>
+              <w:spacing w:line="240" w:lineRule="auto"/>
               <w:jc w:val="center"/>
               <w:rPr>
                 <w:rFonts w:cs="Times New Roman"/>
@@ -10148,7 +9836,7 @@
           <w:p>
             <w:pPr>
               <w:pStyle w:val="VanBan"/>
-              <w:spacing w:before="240"/>
+              <w:spacing w:line="240" w:lineRule="auto"/>
               <w:jc w:val="center"/>
               <w:rPr>
                 <w:rFonts w:cs="Times New Roman"/>
@@ -10171,7 +9859,7 @@
           <w:p>
             <w:pPr>
               <w:pStyle w:val="VanBan"/>
-              <w:spacing w:before="240"/>
+              <w:spacing w:line="240" w:lineRule="auto"/>
               <w:jc w:val="center"/>
               <w:rPr>
                 <w:rFonts w:cs="Times New Roman"/>
@@ -10194,7 +9882,7 @@
           <w:p>
             <w:pPr>
               <w:pStyle w:val="VanBan"/>
-              <w:spacing w:before="240"/>
+              <w:spacing w:line="240" w:lineRule="auto"/>
               <w:jc w:val="center"/>
               <w:rPr>
                 <w:rFonts w:cs="Times New Roman"/>
@@ -10219,7 +9907,7 @@
           <w:p>
             <w:pPr>
               <w:pStyle w:val="VanBan"/>
-              <w:spacing w:before="240"/>
+              <w:spacing w:before="0" w:after="0" w:line="240" w:lineRule="auto"/>
               <w:jc w:val="center"/>
               <w:rPr>
                 <w:rFonts w:cs="Times New Roman"/>
@@ -10241,7 +9929,7 @@
           <w:p>
             <w:pPr>
               <w:pStyle w:val="VanBan"/>
-              <w:spacing w:before="240"/>
+              <w:spacing w:before="0" w:after="0" w:line="240" w:lineRule="auto"/>
               <w:jc w:val="center"/>
               <w:rPr>
                 <w:rFonts w:cs="Times New Roman"/>
@@ -10263,7 +9951,7 @@
           <w:p>
             <w:pPr>
               <w:pStyle w:val="VanBan"/>
-              <w:spacing w:before="240"/>
+              <w:spacing w:before="0" w:after="0" w:line="240" w:lineRule="auto"/>
               <w:jc w:val="center"/>
               <w:rPr>
                 <w:rFonts w:cs="Times New Roman"/>
@@ -10285,7 +9973,7 @@
           <w:p>
             <w:pPr>
               <w:pStyle w:val="VanBan"/>
-              <w:spacing w:before="240"/>
+              <w:spacing w:before="0" w:after="0" w:line="240" w:lineRule="auto"/>
               <w:jc w:val="center"/>
               <w:rPr>
                 <w:rFonts w:cs="Times New Roman"/>
@@ -10309,7 +9997,7 @@
           <w:p>
             <w:pPr>
               <w:pStyle w:val="VanBan"/>
-              <w:spacing w:before="240"/>
+              <w:spacing w:before="0" w:after="0" w:line="240" w:lineRule="auto"/>
               <w:jc w:val="center"/>
               <w:rPr>
                 <w:rFonts w:cs="Times New Roman"/>
@@ -10331,7 +10019,7 @@
           <w:p>
             <w:pPr>
               <w:pStyle w:val="VanBan"/>
-              <w:spacing w:before="240"/>
+              <w:spacing w:before="0" w:after="0" w:line="240" w:lineRule="auto"/>
               <w:jc w:val="center"/>
               <w:rPr>
                 <w:rFonts w:cs="Times New Roman"/>
@@ -10353,7 +10041,7 @@
           <w:p>
             <w:pPr>
               <w:pStyle w:val="VanBan"/>
-              <w:spacing w:before="240"/>
+              <w:spacing w:before="0" w:after="0" w:line="240" w:lineRule="auto"/>
               <w:jc w:val="center"/>
               <w:rPr>
                 <w:rFonts w:cs="Times New Roman"/>
@@ -10375,7 +10063,7 @@
           <w:p>
             <w:pPr>
               <w:pStyle w:val="VanBan"/>
-              <w:spacing w:before="240"/>
+              <w:spacing w:before="0" w:after="0" w:line="240" w:lineRule="auto"/>
               <w:jc w:val="center"/>
               <w:rPr>
                 <w:rFonts w:cs="Times New Roman"/>
@@ -10399,7 +10087,7 @@
           <w:p>
             <w:pPr>
               <w:pStyle w:val="VanBan"/>
-              <w:spacing w:before="240"/>
+              <w:spacing w:before="0" w:after="0" w:line="240" w:lineRule="auto"/>
               <w:jc w:val="center"/>
               <w:rPr>
                 <w:rFonts w:cs="Times New Roman"/>
@@ -10421,7 +10109,7 @@
           <w:p>
             <w:pPr>
               <w:pStyle w:val="VanBan"/>
-              <w:spacing w:before="240"/>
+              <w:spacing w:before="0" w:after="0" w:line="240" w:lineRule="auto"/>
               <w:jc w:val="center"/>
               <w:rPr>
                 <w:rFonts w:cs="Times New Roman"/>
@@ -10443,7 +10131,7 @@
           <w:p>
             <w:pPr>
               <w:pStyle w:val="VanBan"/>
-              <w:spacing w:before="240"/>
+              <w:spacing w:before="0" w:after="0" w:line="240" w:lineRule="auto"/>
               <w:jc w:val="center"/>
               <w:rPr>
                 <w:rFonts w:cs="Times New Roman"/>
@@ -10465,7 +10153,7 @@
           <w:p>
             <w:pPr>
               <w:pStyle w:val="VanBan"/>
-              <w:spacing w:before="240"/>
+              <w:spacing w:before="0" w:after="0" w:line="240" w:lineRule="auto"/>
               <w:jc w:val="center"/>
               <w:rPr>
                 <w:rFonts w:cs="Times New Roman"/>
@@ -10489,7 +10177,7 @@
           <w:p>
             <w:pPr>
               <w:pStyle w:val="VanBan"/>
-              <w:spacing w:before="240"/>
+              <w:spacing w:before="0" w:after="0" w:line="240" w:lineRule="auto"/>
               <w:jc w:val="center"/>
               <w:rPr>
                 <w:rFonts w:cs="Times New Roman"/>
@@ -10511,7 +10199,7 @@
           <w:p>
             <w:pPr>
               <w:pStyle w:val="VanBan"/>
-              <w:spacing w:before="240"/>
+              <w:spacing w:before="0" w:after="0" w:line="240" w:lineRule="auto"/>
               <w:jc w:val="center"/>
               <w:rPr>
                 <w:rFonts w:cs="Times New Roman"/>
@@ -10533,7 +10221,7 @@
           <w:p>
             <w:pPr>
               <w:pStyle w:val="VanBan"/>
-              <w:spacing w:before="240"/>
+              <w:spacing w:before="0" w:after="0" w:line="240" w:lineRule="auto"/>
               <w:jc w:val="center"/>
               <w:rPr>
                 <w:rFonts w:cs="Times New Roman"/>
@@ -10555,7 +10243,7 @@
           <w:p>
             <w:pPr>
               <w:pStyle w:val="VanBan"/>
-              <w:spacing w:before="240"/>
+              <w:spacing w:before="0" w:after="0" w:line="240" w:lineRule="auto"/>
               <w:jc w:val="center"/>
               <w:rPr>
                 <w:rFonts w:cs="Times New Roman"/>
@@ -10579,7 +10267,7 @@
           <w:p>
             <w:pPr>
               <w:pStyle w:val="VanBan"/>
-              <w:spacing w:before="240"/>
+              <w:spacing w:before="0" w:after="0" w:line="240" w:lineRule="auto"/>
               <w:jc w:val="center"/>
               <w:rPr>
                 <w:rFonts w:cs="Times New Roman"/>
@@ -10601,7 +10289,7 @@
           <w:p>
             <w:pPr>
               <w:pStyle w:val="VanBan"/>
-              <w:spacing w:before="240"/>
+              <w:spacing w:before="0" w:after="0" w:line="240" w:lineRule="auto"/>
               <w:jc w:val="center"/>
               <w:rPr>
                 <w:rFonts w:cs="Times New Roman"/>
@@ -10623,7 +10311,7 @@
           <w:p>
             <w:pPr>
               <w:pStyle w:val="VanBan"/>
-              <w:spacing w:before="240"/>
+              <w:spacing w:before="0" w:after="0" w:line="240" w:lineRule="auto"/>
               <w:jc w:val="center"/>
               <w:rPr>
                 <w:rFonts w:cs="Times New Roman"/>
@@ -10645,7 +10333,7 @@
           <w:p>
             <w:pPr>
               <w:pStyle w:val="VanBan"/>
-              <w:spacing w:before="240"/>
+              <w:spacing w:before="0" w:after="0" w:line="240" w:lineRule="auto"/>
               <w:jc w:val="center"/>
               <w:rPr>
                 <w:rFonts w:cs="Times New Roman"/>
@@ -10796,74 +10484,21 @@
         <w:tab/>
       </w:r>
       <w:r>
-        <w:t>Sơ đồ mô tả chi tiết các tiến trình xử lý bên trong hệ thống như</w:t>
-      </w:r>
-      <w:r>
-        <w:t xml:space="preserve"> </w:t>
-      </w:r>
-      <w:r>
-        <w:t>: Quản lý danh mục, Quản lý sản phẩm, Xử lý giỏ hàng, Thanh toán và Quản lý đơn hàng.</w:t>
-      </w:r>
-    </w:p>
-    <w:p>
-      <w:pPr>
-        <w:pStyle w:val="VanBan"/>
-        <w:jc w:val="both"/>
-      </w:pPr>
-    </w:p>
-    <w:p>
-      <w:pPr>
-        <w:pStyle w:val="VanBan"/>
-        <w:jc w:val="both"/>
-      </w:pPr>
-    </w:p>
-    <w:p>
-      <w:pPr>
-        <w:pStyle w:val="VanBan"/>
-        <w:jc w:val="both"/>
-      </w:pPr>
-    </w:p>
-    <w:p>
-      <w:pPr>
-        <w:pStyle w:val="VanBan"/>
-        <w:jc w:val="both"/>
-      </w:pPr>
-    </w:p>
-    <w:p>
-      <w:pPr>
-        <w:pStyle w:val="VanBan"/>
-        <w:jc w:val="both"/>
-      </w:pPr>
-    </w:p>
-    <w:p>
-      <w:pPr>
-        <w:pStyle w:val="VanBan"/>
-        <w:jc w:val="both"/>
-      </w:pPr>
-    </w:p>
-    <w:p>
-      <w:pPr>
-        <w:pStyle w:val="VanBan"/>
-        <w:jc w:val="both"/>
-      </w:pPr>
-    </w:p>
-    <w:p>
-      <w:pPr>
-        <w:pStyle w:val="VanBan"/>
-        <w:jc w:val="both"/>
-      </w:pPr>
-    </w:p>
-    <w:p>
-      <w:pPr>
-        <w:pStyle w:val="VanBan"/>
-        <w:jc w:val="both"/>
+        <w:t>Sơ đồ mô tả chi tiết các tiến trình xử lý bên trong hệ thống như: Quản lý danh mục, Quản lý sản phẩm, Xử lý giỏ hàng, Thanh toán và Quản lý đơn hàng.</w:t>
+      </w:r>
+    </w:p>
+    <w:p>
+      <w:pPr>
+        <w:pStyle w:val="VanBan"/>
+        <w:jc w:val="center"/>
       </w:pPr>
       <w:r>
         <w:rPr>
           <w:noProof/>
         </w:rPr>
+        <w:lastRenderedPageBreak/>
         <w:drawing>
-          <wp:inline distT="0" distB="0" distL="0" distR="0" wp14:anchorId="482A04E9" wp14:editId="27FA38F8">
+          <wp:inline distT="0" distB="0" distL="0" distR="0" wp14:anchorId="482A04E9" wp14:editId="6C546059">
             <wp:extent cx="5570220" cy="4754880"/>
             <wp:effectExtent l="0" t="0" r="0" b="0"/>
             <wp:docPr id="290611484" name="Picture 2"/>
@@ -10922,11 +10557,6 @@
     </w:p>
     <w:p>
       <w:pPr>
-        <w:pStyle w:val="VanBan"/>
-      </w:pPr>
-    </w:p>
-    <w:p>
-      <w:pPr>
         <w:pStyle w:val="Muc"/>
         <w:rPr>
           <w:szCs w:val="26"/>
@@ -10975,13 +10605,7 @@
         <w:jc w:val="both"/>
       </w:pPr>
       <w:r>
-        <w:t>Phân hệ Khách hàng (Front-end)</w:t>
-      </w:r>
-      <w:r>
-        <w:t xml:space="preserve"> </w:t>
-      </w:r>
-      <w:r>
-        <w:t xml:space="preserve">: Gồm các trang phục vụ mua sắm trực tuyến như Trang chủ, Danh mục &amp; Lọc sản phẩm, Tìm kiếm, Chi tiết sản phẩm, Giỏ hàng và Thanh toán. </w:t>
+        <w:t xml:space="preserve">Phân hệ Khách hàng (Front-end): Gồm các trang phục vụ mua sắm trực tuyến như Trang chủ, Danh mục &amp; Lọc sản phẩm, Tìm kiếm, Chi tiết sản phẩm, Giỏ hàng và Thanh toán. </w:t>
       </w:r>
     </w:p>
     <w:p>
@@ -10994,20 +10618,17 @@
         <w:jc w:val="both"/>
       </w:pPr>
       <w:r>
-        <w:t>Phân hệ Quản trị &amp; Nhân viên (Back-end)</w:t>
-      </w:r>
-      <w:r>
-        <w:t xml:space="preserve"> </w:t>
-      </w:r>
-      <w:r>
-        <w:t>: Gồm các chức năng quản trị sau khi đăng nhập như Dashboard thống kê, Quản lý danh mục/sản phẩm, Quản lý đơn hàng và Quản lý khách hàng/nhân sự.</w:t>
-      </w:r>
-    </w:p>
-    <w:p>
-      <w:pPr>
-        <w:pStyle w:val="VanBan"/>
-      </w:pPr>
-      <w:r>
+        <w:t>Phân hệ Quản trị &amp; Nhân viên (Back-end): Gồm các chức năng quản trị sau khi đăng nhập như Dashboard thống kê, Quản lý danh mục/sản phẩm, Quản lý đơn hàng và Quản lý khách hàng/nhân sự.</w:t>
+      </w:r>
+    </w:p>
+    <w:p>
+      <w:pPr>
+        <w:pStyle w:val="VanBan"/>
+      </w:pPr>
+      <w:r>
+        <w:rPr>
+          <w:noProof/>
+        </w:rPr>
         <w:lastRenderedPageBreak/>
         <w:drawing>
           <wp:inline distT="0" distB="0" distL="0" distR="0" wp14:anchorId="6BB94180" wp14:editId="4BD6C3FE">
@@ -11097,10 +10718,104 @@
     <w:p>
       <w:pPr>
         <w:pStyle w:val="VanBan"/>
-      </w:pPr>
-      <w:r>
-        <w:tab/>
-        <w:t>Chưa có</w:t>
+        <w:jc w:val="center"/>
+      </w:pPr>
+      <w:r>
+        <w:drawing>
+          <wp:inline distT="0" distB="0" distL="0" distR="0" wp14:anchorId="13BE3D58" wp14:editId="044422B4">
+            <wp:extent cx="4259949" cy="4480948"/>
+            <wp:effectExtent l="0" t="0" r="7620" b="0"/>
+            <wp:docPr id="1174878857" name="Picture 1"/>
+            <wp:cNvGraphicFramePr>
+              <a:graphicFrameLocks xmlns:a="http://schemas.openxmlformats.org/drawingml/2006/main" noChangeAspect="1"/>
+            </wp:cNvGraphicFramePr>
+            <a:graphic xmlns:a="http://schemas.openxmlformats.org/drawingml/2006/main">
+              <a:graphicData uri="http://schemas.openxmlformats.org/drawingml/2006/picture">
+                <pic:pic xmlns:pic="http://schemas.openxmlformats.org/drawingml/2006/picture">
+                  <pic:nvPicPr>
+                    <pic:cNvPr id="1174878857" name=""/>
+                    <pic:cNvPicPr/>
+                  </pic:nvPicPr>
+                  <pic:blipFill>
+                    <a:blip r:embed="rId24"/>
+                    <a:stretch>
+                      <a:fillRect/>
+                    </a:stretch>
+                  </pic:blipFill>
+                  <pic:spPr>
+                    <a:xfrm>
+                      <a:off x="0" y="0"/>
+                      <a:ext cx="4259949" cy="4480948"/>
+                    </a:xfrm>
+                    <a:prstGeom prst="rect">
+                      <a:avLst/>
+                    </a:prstGeom>
+                  </pic:spPr>
+                </pic:pic>
+              </a:graphicData>
+            </a:graphic>
+          </wp:inline>
+        </w:drawing>
+      </w:r>
+    </w:p>
+    <w:p>
+      <w:pPr>
+        <w:pStyle w:val="Hinh"/>
+      </w:pPr>
+      <w:r>
+        <w:t>Hình 3.6. Phát thảo giao diện trang chủ</w:t>
+      </w:r>
+    </w:p>
+    <w:p>
+      <w:pPr>
+        <w:pStyle w:val="VanBan"/>
+        <w:jc w:val="center"/>
+      </w:pPr>
+      <w:r>
+        <w:lastRenderedPageBreak/>
+        <w:drawing>
+          <wp:inline distT="0" distB="0" distL="0" distR="0" wp14:anchorId="6A4ACD24" wp14:editId="52ACDC7B">
+            <wp:extent cx="3977985" cy="4023709"/>
+            <wp:effectExtent l="0" t="0" r="3810" b="0"/>
+            <wp:docPr id="619935717" name="Picture 1"/>
+            <wp:cNvGraphicFramePr>
+              <a:graphicFrameLocks xmlns:a="http://schemas.openxmlformats.org/drawingml/2006/main" noChangeAspect="1"/>
+            </wp:cNvGraphicFramePr>
+            <a:graphic xmlns:a="http://schemas.openxmlformats.org/drawingml/2006/main">
+              <a:graphicData uri="http://schemas.openxmlformats.org/drawingml/2006/picture">
+                <pic:pic xmlns:pic="http://schemas.openxmlformats.org/drawingml/2006/picture">
+                  <pic:nvPicPr>
+                    <pic:cNvPr id="619935717" name=""/>
+                    <pic:cNvPicPr/>
+                  </pic:nvPicPr>
+                  <pic:blipFill>
+                    <a:blip r:embed="rId25"/>
+                    <a:stretch>
+                      <a:fillRect/>
+                    </a:stretch>
+                  </pic:blipFill>
+                  <pic:spPr>
+                    <a:xfrm>
+                      <a:off x="0" y="0"/>
+                      <a:ext cx="3977985" cy="4023709"/>
+                    </a:xfrm>
+                    <a:prstGeom prst="rect">
+                      <a:avLst/>
+                    </a:prstGeom>
+                  </pic:spPr>
+                </pic:pic>
+              </a:graphicData>
+            </a:graphic>
+          </wp:inline>
+        </w:drawing>
+      </w:r>
+    </w:p>
+    <w:p>
+      <w:pPr>
+        <w:pStyle w:val="Hinh"/>
+      </w:pPr>
+      <w:r>
+        <w:t>Hình 3.7. Phát thảo giao diện trang sản phẩm</w:t>
       </w:r>
     </w:p>
     <w:p>
@@ -11127,10 +10842,104 @@
     <w:p>
       <w:pPr>
         <w:pStyle w:val="VanBan"/>
-      </w:pPr>
-      <w:r>
-        <w:tab/>
-        <w:t>Chưa có</w:t>
+        <w:jc w:val="center"/>
+      </w:pPr>
+      <w:r>
+        <w:drawing>
+          <wp:inline distT="0" distB="0" distL="0" distR="0" wp14:anchorId="219ABA57" wp14:editId="47EB6257">
+            <wp:extent cx="3993226" cy="4031329"/>
+            <wp:effectExtent l="0" t="0" r="7620" b="7620"/>
+            <wp:docPr id="1700779191" name="Picture 1"/>
+            <wp:cNvGraphicFramePr>
+              <a:graphicFrameLocks xmlns:a="http://schemas.openxmlformats.org/drawingml/2006/main" noChangeAspect="1"/>
+            </wp:cNvGraphicFramePr>
+            <a:graphic xmlns:a="http://schemas.openxmlformats.org/drawingml/2006/main">
+              <a:graphicData uri="http://schemas.openxmlformats.org/drawingml/2006/picture">
+                <pic:pic xmlns:pic="http://schemas.openxmlformats.org/drawingml/2006/picture">
+                  <pic:nvPicPr>
+                    <pic:cNvPr id="1700779191" name=""/>
+                    <pic:cNvPicPr/>
+                  </pic:nvPicPr>
+                  <pic:blipFill>
+                    <a:blip r:embed="rId26"/>
+                    <a:stretch>
+                      <a:fillRect/>
+                    </a:stretch>
+                  </pic:blipFill>
+                  <pic:spPr>
+                    <a:xfrm>
+                      <a:off x="0" y="0"/>
+                      <a:ext cx="3993226" cy="4031329"/>
+                    </a:xfrm>
+                    <a:prstGeom prst="rect">
+                      <a:avLst/>
+                    </a:prstGeom>
+                  </pic:spPr>
+                </pic:pic>
+              </a:graphicData>
+            </a:graphic>
+          </wp:inline>
+        </w:drawing>
+      </w:r>
+    </w:p>
+    <w:p>
+      <w:pPr>
+        <w:pStyle w:val="Hinh"/>
+      </w:pPr>
+      <w:r>
+        <w:t>Hình 3.8. Phát thảo giao diện trang giỏ hàng</w:t>
+      </w:r>
+    </w:p>
+    <w:p>
+      <w:pPr>
+        <w:pStyle w:val="VanBan"/>
+        <w:jc w:val="center"/>
+      </w:pPr>
+      <w:r>
+        <w:lastRenderedPageBreak/>
+        <w:drawing>
+          <wp:inline distT="0" distB="0" distL="0" distR="0" wp14:anchorId="5D211B23" wp14:editId="5A1B0513">
+            <wp:extent cx="4023709" cy="4031329"/>
+            <wp:effectExtent l="0" t="0" r="0" b="7620"/>
+            <wp:docPr id="1139020997" name="Picture 1"/>
+            <wp:cNvGraphicFramePr>
+              <a:graphicFrameLocks xmlns:a="http://schemas.openxmlformats.org/drawingml/2006/main" noChangeAspect="1"/>
+            </wp:cNvGraphicFramePr>
+            <a:graphic xmlns:a="http://schemas.openxmlformats.org/drawingml/2006/main">
+              <a:graphicData uri="http://schemas.openxmlformats.org/drawingml/2006/picture">
+                <pic:pic xmlns:pic="http://schemas.openxmlformats.org/drawingml/2006/picture">
+                  <pic:nvPicPr>
+                    <pic:cNvPr id="1139020997" name=""/>
+                    <pic:cNvPicPr/>
+                  </pic:nvPicPr>
+                  <pic:blipFill>
+                    <a:blip r:embed="rId27"/>
+                    <a:stretch>
+                      <a:fillRect/>
+                    </a:stretch>
+                  </pic:blipFill>
+                  <pic:spPr>
+                    <a:xfrm>
+                      <a:off x="0" y="0"/>
+                      <a:ext cx="4023709" cy="4031329"/>
+                    </a:xfrm>
+                    <a:prstGeom prst="rect">
+                      <a:avLst/>
+                    </a:prstGeom>
+                  </pic:spPr>
+                </pic:pic>
+              </a:graphicData>
+            </a:graphic>
+          </wp:inline>
+        </w:drawing>
+      </w:r>
+    </w:p>
+    <w:p>
+      <w:pPr>
+        <w:pStyle w:val="Hinh"/>
+      </w:pPr>
+      <w:r>
+        <w:t>Hình 3.9. Phát thảo giao diện trang đặt hàng</w:t>
       </w:r>
     </w:p>
     <w:p>
@@ -11145,10 +10954,52 @@
     <w:p>
       <w:pPr>
         <w:pStyle w:val="VanBan"/>
-      </w:pPr>
-      <w:r>
-        <w:tab/>
-        <w:t>Chưa có</w:t>
+        <w:jc w:val="center"/>
+      </w:pPr>
+      <w:r>
+        <w:drawing>
+          <wp:inline distT="0" distB="0" distL="0" distR="0" wp14:anchorId="4A8B2CD2" wp14:editId="58435505">
+            <wp:extent cx="4000847" cy="4031329"/>
+            <wp:effectExtent l="0" t="0" r="0" b="7620"/>
+            <wp:docPr id="125198557" name="Picture 1"/>
+            <wp:cNvGraphicFramePr>
+              <a:graphicFrameLocks xmlns:a="http://schemas.openxmlformats.org/drawingml/2006/main" noChangeAspect="1"/>
+            </wp:cNvGraphicFramePr>
+            <a:graphic xmlns:a="http://schemas.openxmlformats.org/drawingml/2006/main">
+              <a:graphicData uri="http://schemas.openxmlformats.org/drawingml/2006/picture">
+                <pic:pic xmlns:pic="http://schemas.openxmlformats.org/drawingml/2006/picture">
+                  <pic:nvPicPr>
+                    <pic:cNvPr id="125198557" name=""/>
+                    <pic:cNvPicPr/>
+                  </pic:nvPicPr>
+                  <pic:blipFill>
+                    <a:blip r:embed="rId28"/>
+                    <a:stretch>
+                      <a:fillRect/>
+                    </a:stretch>
+                  </pic:blipFill>
+                  <pic:spPr>
+                    <a:xfrm>
+                      <a:off x="0" y="0"/>
+                      <a:ext cx="4000847" cy="4031329"/>
+                    </a:xfrm>
+                    <a:prstGeom prst="rect">
+                      <a:avLst/>
+                    </a:prstGeom>
+                  </pic:spPr>
+                </pic:pic>
+              </a:graphicData>
+            </a:graphic>
+          </wp:inline>
+        </w:drawing>
+      </w:r>
+    </w:p>
+    <w:p>
+      <w:pPr>
+        <w:pStyle w:val="Hinh"/>
+      </w:pPr>
+      <w:r>
+        <w:t>Hình 3.10. Phát thảo giao diện trang quản trị viên</w:t>
       </w:r>
     </w:p>
     <w:p>
@@ -11162,6 +11013,7 @@
         <w:rPr>
           <w:szCs w:val="26"/>
         </w:rPr>
+        <w:lastRenderedPageBreak/>
         <w:t>3.7. Kết chương</w:t>
       </w:r>
     </w:p>
@@ -11292,13 +11144,7 @@
   <w:p>
     <w:pPr>
       <w:pStyle w:val="Footer"/>
-      <w:pBdr>
-        <w:bottom w:val="single" w:sz="4" w:space="1" w:color="auto"/>
-      </w:pBdr>
     </w:pPr>
-    <w:r>
-      <w:t>Trương Quang Khải - DA23TTA</w:t>
-    </w:r>
   </w:p>
 </w:ftr>
 </file>
@@ -11333,13 +11179,7 @@
   <w:p>
     <w:pPr>
       <w:pStyle w:val="Header"/>
-      <w:pBdr>
-        <w:bottom w:val="single" w:sz="4" w:space="1" w:color="auto"/>
-      </w:pBdr>
     </w:pPr>
-    <w:r>
-      <w:t>Xây Dựng Hệ Thống Quản Lý Bán Hàng</w:t>
-    </w:r>
   </w:p>
 </w:hdr>
 </file>
@@ -15510,6 +15350,7 @@
   <w:style w:type="character" w:default="1" w:styleId="DefaultParagraphFont">
     <w:name w:val="Default Paragraph Font"/>
     <w:uiPriority w:val="1"/>
+    <w:semiHidden/>
     <w:unhideWhenUsed/>
   </w:style>
   <w:style w:type="table" w:default="1" w:styleId="TableNormal">

</xml_diff>